<commit_message>
quick patch for v0.4.7.5
</commit_message>
<xml_diff>
--- a/PATCH_NOTES_v0.4.7.5.docx
+++ b/PATCH_NOTES_v0.4.7.5.docx
@@ -3193,6 +3193,4560 @@
       </w:r>
       <w:r>
         <w:t xml:space="preserve"> 121 game tests and 39 service tests pass (new ones cover collisions, straps, badge caps, the OVR path, moves, passing, box-outs, AI, green releases, Got Next priority, bounties, AI growth, the Inventory, the soundtrack and bug reports).</w:t>
+      </w:r>
+    </w:p>
+    <w:p>
+      <w:pPr>
+        <w:pBdr>
+          <w:bottom w:val="single" w:color="BFBFBF" w:sz="6" w:space="1"/>
+        </w:pBdr>
+        <w:spacing w:after="120"/>
+      </w:pPr>
+    </w:p>
+    <w:p>
+      <w:pPr>
+        <w:pStyle w:val="Title"/>
+      </w:pPr>
+      <w:r>
+        <w:t xml:space="preserve">Quick patch</w:t>
+      </w:r>
+    </w:p>
+    <w:p>
+      <w:pPr>
+        <w:spacing w:after="120"/>
+      </w:pPr>
+      <w:r>
+        <w:t xml:space="preserve">Everything below came after the first v0.4.7.5 build. Your save, players, VC and AI world carry over; nothing in </w:t>
+      </w:r>
+      <w:r>
+        <w:rPr>
+          <w:rFonts w:ascii="Consolas" w:cs="Consolas" w:eastAsia="Consolas" w:hAnsi="Consolas"/>
+        </w:rPr>
+        <w:t xml:space="preserve">data/</w:t>
+      </w:r>
+      <w:r>
+        <w:t xml:space="preserve"> is touched.</w:t>
+      </w:r>
+    </w:p>
+    <w:p>
+      <w:pPr>
+        <w:pStyle w:val="Heading1"/>
+      </w:pPr>
+      <w:r>
+        <w:t xml:space="preserve">Shooting</w:t>
+      </w:r>
+    </w:p>
+    <w:p>
+      <w:pPr>
+        <w:pStyle w:val="Heading2"/>
+      </w:pPr>
+      <w:r>
+        <w:t xml:space="preserve">Shooters and non-shooters</w:t>
+      </w:r>
+    </w:p>
+    <w:p>
+      <w:pPr>
+        <w:pStyle w:val="ListParagraph"/>
+        <w:numPr>
+          <w:ilvl w:val="0"/>
+          <w:numId w:val="2"/>
+        </w:numPr>
+      </w:pPr>
+      <w:r>
+        <w:rPr>
+          <w:b/>
+          <w:bCs/>
+        </w:rPr>
+        <w:t xml:space="preserve">Only shooters get a sure green from three.</w:t>
+      </w:r>
+      <w:r>
+        <w:t xml:space="preserve"> That means Sharpshooters and Stretch Bigs. For everyone else, a green from 3PT range and beyond is a big boost, not a guaranteed make. The meter draws that window outlined, not solid.</w:t>
+      </w:r>
+    </w:p>
+    <w:p>
+      <w:pPr>
+        <w:pStyle w:val="ListParagraph"/>
+        <w:numPr>
+          <w:ilvl w:val="1"/>
+          <w:numId w:val="2"/>
+        </w:numPr>
+      </w:pPr>
+      <w:r>
+        <w:t xml:space="preserve">From mid-range, a green still goes in for everyone.</w:t>
+      </w:r>
+    </w:p>
+    <w:p>
+      <w:pPr>
+        <w:pStyle w:val="ListParagraph"/>
+        <w:numPr>
+          <w:ilvl w:val="1"/>
+          <w:numId w:val="2"/>
+        </w:numPr>
+      </w:pPr>
+      <w:r>
+        <w:t xml:space="preserve">A non-shooter's green from three goes in about 50–70% of the time, depending on his 3PT rating and the contest.</w:t>
+      </w:r>
+    </w:p>
+    <w:p>
+      <w:pPr>
+        <w:pStyle w:val="ListParagraph"/>
+        <w:numPr>
+          <w:ilvl w:val="0"/>
+          <w:numId w:val="2"/>
+        </w:numPr>
+      </w:pPr>
+      <w:r>
+        <w:rPr>
+          <w:b/>
+          <w:bCs/>
+        </w:rPr>
+        <w:t xml:space="preserve">Non-shooters' jumper windows are 10% smaller</w:t>
+      </w:r>
+      <w:r>
+        <w:t xml:space="preserve">, on top of everything else.</w:t>
+      </w:r>
+    </w:p>
+    <w:p>
+      <w:pPr>
+        <w:pStyle w:val="Heading2"/>
+      </w:pPr>
+      <w:r>
+        <w:t xml:space="preserve">Green windows</w:t>
+      </w:r>
+    </w:p>
+    <w:p>
+      <w:pPr>
+        <w:pStyle w:val="ListParagraph"/>
+        <w:numPr>
+          <w:ilvl w:val="0"/>
+          <w:numId w:val="2"/>
+        </w:numPr>
+      </w:pPr>
+      <w:r>
+        <w:rPr>
+          <w:b/>
+          <w:bCs/>
+        </w:rPr>
+        <w:t xml:space="preserve">Every green window in the game is 10% smaller again.</w:t>
+      </w:r>
+      <w:r>
+        <w:t xml:space="preserve"> That covers jumpers, layups and free throws, badge and animation bonuses included.</w:t>
+      </w:r>
+    </w:p>
+    <w:p>
+      <w:pPr>
+        <w:pStyle w:val="Heading2"/>
+      </w:pPr>
+      <w:r>
+        <w:t xml:space="preserve">Smothered means no make</w:t>
+      </w:r>
+    </w:p>
+    <w:p>
+      <w:pPr>
+        <w:pStyle w:val="ListParagraph"/>
+        <w:numPr>
+          <w:ilvl w:val="0"/>
+          <w:numId w:val="2"/>
+        </w:numPr>
+      </w:pPr>
+      <w:r>
+        <w:rPr>
+          <w:b/>
+          <w:bCs/>
+        </w:rPr>
+        <w:t xml:space="preserve">A smothered shot never goes in.</w:t>
+      </w:r>
+    </w:p>
+    <w:p>
+      <w:pPr>
+        <w:pStyle w:val="ListParagraph"/>
+        <w:numPr>
+          <w:ilvl w:val="1"/>
+          <w:numId w:val="2"/>
+        </w:numPr>
+      </w:pPr>
+      <w:r>
+        <w:t xml:space="preserve">It shows no green window, and nothing can add one back: not a badge, an Icon badge, a takeover or a jumpshot base.</w:t>
+      </w:r>
+    </w:p>
+    <w:p>
+      <w:pPr>
+        <w:pStyle w:val="ListParagraph"/>
+        <w:numPr>
+          <w:ilvl w:val="1"/>
+          <w:numId w:val="2"/>
+        </w:numPr>
+      </w:pPr>
+      <w:r>
+        <w:t xml:space="preserve">It used to keep up to 3% from slightly early or late timing.</w:t>
+      </w:r>
+    </w:p>
+    <w:p>
+      <w:pPr>
+        <w:pStyle w:val="ListParagraph"/>
+        <w:numPr>
+          <w:ilvl w:val="0"/>
+          <w:numId w:val="2"/>
+        </w:numPr>
+      </w:pPr>
+      <w:r>
+        <w:rPr>
+          <w:b/>
+          <w:bCs/>
+        </w:rPr>
+        <w:t xml:space="preserve">Layups and close shots are measured on their own scale.</w:t>
+      </w:r>
+    </w:p>
+    <w:p>
+      <w:pPr>
+        <w:pStyle w:val="ListParagraph"/>
+        <w:numPr>
+          <w:ilvl w:val="1"/>
+          <w:numId w:val="2"/>
+        </w:numPr>
+      </w:pPr>
+      <w:r>
+        <w:t xml:space="preserve">Around the rim the old contest number topped out on nearly every finish, because somebody is always there. Four in five layups were labelled "Smothered" and still went in about half the time.</w:t>
+      </w:r>
+    </w:p>
+    <w:p>
+      <w:pPr>
+        <w:pStyle w:val="ListParagraph"/>
+        <w:numPr>
+          <w:ilvl w:val="1"/>
+          <w:numId w:val="2"/>
+        </w:numPr>
+      </w:pPr>
+      <w:r>
+        <w:t xml:space="preserve">Now Smothered on a finish means a real wall-up: a defender squarely in front with his hands at the ball. That's about one finish in six in AI games, and those never go in.</w:t>
+      </w:r>
+    </w:p>
+    <w:p>
+      <w:pPr>
+        <w:pStyle w:val="ListParagraph"/>
+        <w:numPr>
+          <w:ilvl w:val="1"/>
+          <w:numId w:val="2"/>
+        </w:numPr>
+      </w:pPr>
+      <w:r>
+        <w:t xml:space="preserve">A Contact Finisher's push-off can take you out of it.</w:t>
+      </w:r>
+    </w:p>
+    <w:p>
+      <w:pPr>
+        <w:pStyle w:val="ListParagraph"/>
+        <w:numPr>
+          <w:ilvl w:val="0"/>
+          <w:numId w:val="2"/>
+        </w:numPr>
+      </w:pPr>
+      <w:r>
+        <w:rPr>
+          <w:b/>
+          <w:bCs/>
+        </w:rPr>
+        <w:t xml:space="preserve">The record scratch:</w:t>
+      </w:r>
+    </w:p>
+    <w:p>
+      <w:pPr>
+        <w:pStyle w:val="ListParagraph"/>
+        <w:numPr>
+          <w:ilvl w:val="1"/>
+          <w:numId w:val="2"/>
+        </w:numPr>
+      </w:pPr>
+      <w:r>
+        <w:t xml:space="preserve">If a green is blocked in flight, a record scratch cuts its green sound off.</w:t>
+      </w:r>
+    </w:p>
+    <w:p>
+      <w:pPr>
+        <w:pStyle w:val="ListParagraph"/>
+        <w:numPr>
+          <w:ilvl w:val="1"/>
+          <w:numId w:val="2"/>
+        </w:numPr>
+      </w:pPr>
+      <w:r>
+        <w:t xml:space="preserve">If you time a release perfectly into a smothering contest, the green sound starts and the scratch cuts it off. That tells you the timing was right but the defense won.</w:t>
+      </w:r>
+    </w:p>
+    <w:p>
+      <w:pPr>
+        <w:pStyle w:val="ListParagraph"/>
+        <w:numPr>
+          <w:ilvl w:val="1"/>
+          <w:numId w:val="2"/>
+        </w:numPr>
+      </w:pPr>
+      <w:r>
+        <w:t xml:space="preserve">The AI's green sounds get the same treatment.</w:t>
+      </w:r>
+    </w:p>
+    <w:p>
+      <w:pPr>
+        <w:pStyle w:val="Heading2"/>
+      </w:pPr>
+      <w:r>
+        <w:t xml:space="preserve">Contests count at the release</w:t>
+      </w:r>
+    </w:p>
+    <w:p>
+      <w:pPr>
+        <w:pStyle w:val="ListParagraph"/>
+        <w:numPr>
+          <w:ilvl w:val="0"/>
+          <w:numId w:val="2"/>
+        </w:numPr>
+      </w:pPr>
+      <w:r>
+        <w:rPr>
+          <w:b/>
+          <w:bCs/>
+        </w:rPr>
+        <w:t xml:space="preserve">The AI's shots now answer to the defense at the release, not just at the start of the shot.</w:t>
+      </w:r>
+    </w:p>
+    <w:p>
+      <w:pPr>
+        <w:pStyle w:val="ListParagraph"/>
+        <w:numPr>
+          <w:ilvl w:val="1"/>
+          <w:numId w:val="2"/>
+        </w:numPr>
+      </w:pPr>
+      <w:r>
+        <w:t xml:space="preserve">The AI picks its timing when it rises, from the contest it expects then.</w:t>
+      </w:r>
+    </w:p>
+    <w:p>
+      <w:pPr>
+        <w:pStyle w:val="ListParagraph"/>
+        <w:numPr>
+          <w:ilvl w:val="1"/>
+          <w:numId w:val="2"/>
+        </w:numPr>
+      </w:pPr>
+      <w:r>
+        <w:t xml:space="preserve">A closeout that arrives in time now shrinks the window it was aiming at, and its green slips to a near miss as often as the window shrank.</w:t>
+      </w:r>
+    </w:p>
+    <w:p>
+      <w:pPr>
+        <w:pStyle w:val="ListParagraph"/>
+        <w:numPr>
+          <w:ilvl w:val="1"/>
+          <w:numId w:val="2"/>
+        </w:numPr>
+      </w:pPr>
+      <w:r>
+        <w:t xml:space="preserve">A defender who backs off can turn a near miss into a green.</w:t>
+      </w:r>
+    </w:p>
+    <w:p>
+      <w:pPr>
+        <w:pStyle w:val="ListParagraph"/>
+        <w:numPr>
+          <w:ilvl w:val="1"/>
+          <w:numId w:val="2"/>
+        </w:numPr>
+      </w:pPr>
+      <w:r>
+        <w:t xml:space="preserve">Your own shots were already graded on the contest at the release; the meter shows it live.</w:t>
+      </w:r>
+    </w:p>
+    <w:p>
+      <w:pPr>
+        <w:pStyle w:val="ListParagraph"/>
+        <w:numPr>
+          <w:ilvl w:val="0"/>
+          <w:numId w:val="2"/>
+        </w:numPr>
+      </w:pPr>
+      <w:r>
+        <w:rPr>
+          <w:b/>
+          <w:bCs/>
+        </w:rPr>
+        <w:t xml:space="preserve">Release height against reach counts for more out on the floor.</w:t>
+      </w:r>
+      <w:r>
+        <w:t xml:space="preserve"> A high release over a shorter (or later) contest is less of a penalty; a long defender who gets a hand up at the release is more of one.</w:t>
+      </w:r>
+    </w:p>
+    <w:p>
+      <w:pPr>
+        <w:pStyle w:val="ListParagraph"/>
+        <w:numPr>
+          <w:ilvl w:val="0"/>
+          <w:numId w:val="2"/>
+        </w:numPr>
+      </w:pPr>
+      <w:r>
+        <w:rPr>
+          <w:b/>
+          <w:bCs/>
+        </w:rPr>
+        <w:t xml:space="preserve">In the paint, weight matters:</w:t>
+      </w:r>
+      <w:r>
+        <w:t xml:space="preserve"> a heavier defender walls off a little more of a finish (up to ±10%).</w:t>
+      </w:r>
+    </w:p>
+    <w:p>
+      <w:pPr>
+        <w:pStyle w:val="ListParagraph"/>
+        <w:numPr>
+          <w:ilvl w:val="0"/>
+          <w:numId w:val="2"/>
+        </w:numPr>
+      </w:pPr>
+      <w:r>
+        <w:rPr>
+          <w:b/>
+          <w:bCs/>
+        </w:rPr>
+        <w:t xml:space="preserve">AI percentages were re-measured afterwards</w:t>
+      </w:r>
+      <w:r>
+        <w:t xml:space="preserve"> over 72 AI park games:</w:t>
+      </w:r>
+    </w:p>
+    <w:tbl>
+      <w:tblPr>
+        <w:tblW w:type="dxa" w:w="9360"/>
+        <w:tblBorders>
+          <w:top w:val="single" w:color="auto" w:sz="4"/>
+          <w:left w:val="single" w:color="auto" w:sz="4"/>
+          <w:bottom w:val="single" w:color="auto" w:sz="4"/>
+          <w:right w:val="single" w:color="auto" w:sz="4"/>
+          <w:insideH w:val="single" w:color="auto" w:sz="4"/>
+          <w:insideV w:val="single" w:color="auto" w:sz="4"/>
+        </w:tblBorders>
+      </w:tblPr>
+      <w:tblGrid>
+        <w:gridCol w:w="3120"/>
+        <w:gridCol w:w="3120"/>
+        <w:gridCol w:w="3120"/>
+      </w:tblGrid>
+      <w:tr>
+        <w:trPr>
+          <w:tblHeader/>
+        </w:trPr>
+        <w:tc>
+          <w:tcPr>
+            <w:tcW w:type="dxa" w:w="3120"/>
+            <w:shd w:fill="DCE6F1" w:color="auto" w:val="clear"/>
+            <w:tcMar>
+              <w:top w:type="dxa" w:w="60"/>
+              <w:left w:type="dxa" w:w="100"/>
+              <w:bottom w:type="dxa" w:w="60"/>
+              <w:right w:type="dxa" w:w="100"/>
+            </w:tcMar>
+          </w:tcPr>
+          <w:p>
+            <w:r>
+              <w:rPr>
+                <w:b/>
+                <w:bCs/>
+              </w:rPr>
+              <w:t xml:space="preserve">Shot</w:t>
+            </w:r>
+          </w:p>
+        </w:tc>
+        <w:tc>
+          <w:tcPr>
+            <w:tcW w:type="dxa" w:w="3120"/>
+            <w:shd w:fill="DCE6F1" w:color="auto" w:val="clear"/>
+            <w:tcMar>
+              <w:top w:type="dxa" w:w="60"/>
+              <w:left w:type="dxa" w:w="100"/>
+              <w:bottom w:type="dxa" w:w="60"/>
+              <w:right w:type="dxa" w:w="100"/>
+            </w:tcMar>
+          </w:tcPr>
+          <w:p>
+            <w:r>
+              <w:rPr>
+                <w:b/>
+                <w:bCs/>
+              </w:rPr>
+              <w:t xml:space="preserve">v0.4.7.5</w:t>
+            </w:r>
+          </w:p>
+        </w:tc>
+        <w:tc>
+          <w:tcPr>
+            <w:tcW w:type="dxa" w:w="3120"/>
+            <w:shd w:fill="DCE6F1" w:color="auto" w:val="clear"/>
+            <w:tcMar>
+              <w:top w:type="dxa" w:w="60"/>
+              <w:left w:type="dxa" w:w="100"/>
+              <w:bottom w:type="dxa" w:w="60"/>
+              <w:right w:type="dxa" w:w="100"/>
+            </w:tcMar>
+          </w:tcPr>
+          <w:p>
+            <w:r>
+              <w:rPr>
+                <w:b/>
+                <w:bCs/>
+              </w:rPr>
+              <w:t xml:space="preserve">Quick patch</w:t>
+            </w:r>
+          </w:p>
+        </w:tc>
+      </w:tr>
+      <w:tr>
+        <w:trPr>
+          <w:tblHeader w:val="false"/>
+        </w:trPr>
+        <w:tc>
+          <w:tcPr>
+            <w:tcW w:type="dxa" w:w="3120"/>
+            <w:tcMar>
+              <w:top w:type="dxa" w:w="60"/>
+              <w:left w:type="dxa" w:w="100"/>
+              <w:bottom w:type="dxa" w:w="60"/>
+              <w:right w:type="dxa" w:w="100"/>
+            </w:tcMar>
+          </w:tcPr>
+          <w:p>
+            <w:r>
+              <w:t xml:space="preserve">Mid-range</w:t>
+            </w:r>
+          </w:p>
+        </w:tc>
+        <w:tc>
+          <w:tcPr>
+            <w:tcW w:type="dxa" w:w="3120"/>
+            <w:tcMar>
+              <w:top w:type="dxa" w:w="60"/>
+              <w:left w:type="dxa" w:w="100"/>
+              <w:bottom w:type="dxa" w:w="60"/>
+              <w:right w:type="dxa" w:w="100"/>
+            </w:tcMar>
+          </w:tcPr>
+          <w:p>
+            <w:r>
+              <w:t xml:space="preserve">34.6%</w:t>
+            </w:r>
+          </w:p>
+        </w:tc>
+        <w:tc>
+          <w:tcPr>
+            <w:tcW w:type="dxa" w:w="3120"/>
+            <w:tcMar>
+              <w:top w:type="dxa" w:w="60"/>
+              <w:left w:type="dxa" w:w="100"/>
+              <w:bottom w:type="dxa" w:w="60"/>
+              <w:right w:type="dxa" w:w="100"/>
+            </w:tcMar>
+          </w:tcPr>
+          <w:p>
+            <w:r>
+              <w:t xml:space="preserve">34.9%</w:t>
+            </w:r>
+          </w:p>
+        </w:tc>
+      </w:tr>
+      <w:tr>
+        <w:trPr>
+          <w:tblHeader w:val="false"/>
+        </w:trPr>
+        <w:tc>
+          <w:tcPr>
+            <w:tcW w:type="dxa" w:w="3120"/>
+            <w:tcMar>
+              <w:top w:type="dxa" w:w="60"/>
+              <w:left w:type="dxa" w:w="100"/>
+              <w:bottom w:type="dxa" w:w="60"/>
+              <w:right w:type="dxa" w:w="100"/>
+            </w:tcMar>
+          </w:tcPr>
+          <w:p>
+            <w:r>
+              <w:t xml:space="preserve">Layups</w:t>
+            </w:r>
+          </w:p>
+        </w:tc>
+        <w:tc>
+          <w:tcPr>
+            <w:tcW w:type="dxa" w:w="3120"/>
+            <w:tcMar>
+              <w:top w:type="dxa" w:w="60"/>
+              <w:left w:type="dxa" w:w="100"/>
+              <w:bottom w:type="dxa" w:w="60"/>
+              <w:right w:type="dxa" w:w="100"/>
+            </w:tcMar>
+          </w:tcPr>
+          <w:p>
+            <w:r>
+              <w:t xml:space="preserve">53.0%</w:t>
+            </w:r>
+          </w:p>
+        </w:tc>
+        <w:tc>
+          <w:tcPr>
+            <w:tcW w:type="dxa" w:w="3120"/>
+            <w:tcMar>
+              <w:top w:type="dxa" w:w="60"/>
+              <w:left w:type="dxa" w:w="100"/>
+              <w:bottom w:type="dxa" w:w="60"/>
+              <w:right w:type="dxa" w:w="100"/>
+            </w:tcMar>
+          </w:tcPr>
+          <w:p>
+            <w:r>
+              <w:t xml:space="preserve">51.5%</w:t>
+            </w:r>
+          </w:p>
+        </w:tc>
+      </w:tr>
+      <w:tr>
+        <w:trPr>
+          <w:tblHeader w:val="false"/>
+        </w:trPr>
+        <w:tc>
+          <w:tcPr>
+            <w:tcW w:type="dxa" w:w="3120"/>
+            <w:tcMar>
+              <w:top w:type="dxa" w:w="60"/>
+              <w:left w:type="dxa" w:w="100"/>
+              <w:bottom w:type="dxa" w:w="60"/>
+              <w:right w:type="dxa" w:w="100"/>
+            </w:tcMar>
+          </w:tcPr>
+          <w:p>
+            <w:r>
+              <w:t xml:space="preserve">Threes, all</w:t>
+            </w:r>
+          </w:p>
+        </w:tc>
+        <w:tc>
+          <w:tcPr>
+            <w:tcW w:type="dxa" w:w="3120"/>
+            <w:tcMar>
+              <w:top w:type="dxa" w:w="60"/>
+              <w:left w:type="dxa" w:w="100"/>
+              <w:bottom w:type="dxa" w:w="60"/>
+              <w:right w:type="dxa" w:w="100"/>
+            </w:tcMar>
+          </w:tcPr>
+          <w:p>
+            <w:r>
+              <w:t xml:space="preserve">31.9%</w:t>
+            </w:r>
+          </w:p>
+        </w:tc>
+        <w:tc>
+          <w:tcPr>
+            <w:tcW w:type="dxa" w:w="3120"/>
+            <w:tcMar>
+              <w:top w:type="dxa" w:w="60"/>
+              <w:left w:type="dxa" w:w="100"/>
+              <w:bottom w:type="dxa" w:w="60"/>
+              <w:right w:type="dxa" w:w="100"/>
+            </w:tcMar>
+          </w:tcPr>
+          <w:p>
+            <w:r>
+              <w:t xml:space="preserve">28.1%</w:t>
+            </w:r>
+          </w:p>
+        </w:tc>
+      </w:tr>
+      <w:tr>
+        <w:trPr>
+          <w:tblHeader w:val="false"/>
+        </w:trPr>
+        <w:tc>
+          <w:tcPr>
+            <w:tcW w:type="dxa" w:w="3120"/>
+            <w:tcMar>
+              <w:top w:type="dxa" w:w="60"/>
+              <w:left w:type="dxa" w:w="100"/>
+              <w:bottom w:type="dxa" w:w="60"/>
+              <w:right w:type="dxa" w:w="100"/>
+            </w:tcMar>
+          </w:tcPr>
+          <w:p>
+            <w:r>
+              <w:t xml:space="preserve">Threes, shooters</w:t>
+            </w:r>
+          </w:p>
+        </w:tc>
+        <w:tc>
+          <w:tcPr>
+            <w:tcW w:type="dxa" w:w="3120"/>
+            <w:tcMar>
+              <w:top w:type="dxa" w:w="60"/>
+              <w:left w:type="dxa" w:w="100"/>
+              <w:bottom w:type="dxa" w:w="60"/>
+              <w:right w:type="dxa" w:w="100"/>
+            </w:tcMar>
+          </w:tcPr>
+          <w:p>
+            <w:r>
+              <w:t xml:space="preserve">n/a</w:t>
+            </w:r>
+          </w:p>
+        </w:tc>
+        <w:tc>
+          <w:tcPr>
+            <w:tcW w:type="dxa" w:w="3120"/>
+            <w:tcMar>
+              <w:top w:type="dxa" w:w="60"/>
+              <w:left w:type="dxa" w:w="100"/>
+              <w:bottom w:type="dxa" w:w="60"/>
+              <w:right w:type="dxa" w:w="100"/>
+            </w:tcMar>
+          </w:tcPr>
+          <w:p>
+            <w:r>
+              <w:t xml:space="preserve">35.6%</w:t>
+            </w:r>
+          </w:p>
+        </w:tc>
+      </w:tr>
+      <w:tr>
+        <w:trPr>
+          <w:tblHeader w:val="false"/>
+        </w:trPr>
+        <w:tc>
+          <w:tcPr>
+            <w:tcW w:type="dxa" w:w="3120"/>
+            <w:tcMar>
+              <w:top w:type="dxa" w:w="60"/>
+              <w:left w:type="dxa" w:w="100"/>
+              <w:bottom w:type="dxa" w:w="60"/>
+              <w:right w:type="dxa" w:w="100"/>
+            </w:tcMar>
+          </w:tcPr>
+          <w:p>
+            <w:r>
+              <w:t xml:space="preserve">Threes, non-shooters</w:t>
+            </w:r>
+          </w:p>
+        </w:tc>
+        <w:tc>
+          <w:tcPr>
+            <w:tcW w:type="dxa" w:w="3120"/>
+            <w:tcMar>
+              <w:top w:type="dxa" w:w="60"/>
+              <w:left w:type="dxa" w:w="100"/>
+              <w:bottom w:type="dxa" w:w="60"/>
+              <w:right w:type="dxa" w:w="100"/>
+            </w:tcMar>
+          </w:tcPr>
+          <w:p>
+            <w:r>
+              <w:t xml:space="preserve">n/a</w:t>
+            </w:r>
+          </w:p>
+        </w:tc>
+        <w:tc>
+          <w:tcPr>
+            <w:tcW w:type="dxa" w:w="3120"/>
+            <w:tcMar>
+              <w:top w:type="dxa" w:w="60"/>
+              <w:left w:type="dxa" w:w="100"/>
+              <w:bottom w:type="dxa" w:w="60"/>
+              <w:right w:type="dxa" w:w="100"/>
+            </w:tcMar>
+          </w:tcPr>
+          <w:p>
+            <w:r>
+              <w:t xml:space="preserve">24.3%</w:t>
+            </w:r>
+          </w:p>
+        </w:tc>
+      </w:tr>
+    </w:tbl>
+    <w:p>
+      <w:pPr>
+        <w:spacing w:after="60"/>
+      </w:pPr>
+    </w:p>
+    <w:p>
+      <w:pPr>
+        <w:pStyle w:val="Heading1"/>
+      </w:pPr>
+      <w:r>
+        <w:t xml:space="preserve">Dribbling, passing and defense</w:t>
+      </w:r>
+    </w:p>
+    <w:p>
+      <w:pPr>
+        <w:pStyle w:val="Heading2"/>
+      </w:pPr>
+      <w:r>
+        <w:t xml:space="preserve">Repeated moves</w:t>
+      </w:r>
+    </w:p>
+    <w:p>
+      <w:pPr>
+        <w:pStyle w:val="ListParagraph"/>
+        <w:numPr>
+          <w:ilvl w:val="0"/>
+          <w:numId w:val="2"/>
+        </w:numPr>
+      </w:pPr>
+      <w:r>
+        <w:rPr>
+          <w:b/>
+          <w:bCs/>
+        </w:rPr>
+        <w:t xml:space="preserve">Spamming a move costs more stamina.</w:t>
+      </w:r>
+    </w:p>
+    <w:p>
+      <w:pPr>
+        <w:pStyle w:val="ListParagraph"/>
+        <w:numPr>
+          <w:ilvl w:val="1"/>
+          <w:numId w:val="2"/>
+        </w:numPr>
+      </w:pPr>
+      <w:r>
+        <w:t xml:space="preserve">More than 3 of the same move in a row still doubles your stamina drain (+0.1× per repeat after that).</w:t>
+      </w:r>
+    </w:p>
+    <w:p>
+      <w:pPr>
+        <w:pStyle w:val="ListParagraph"/>
+        <w:numPr>
+          <w:ilvl w:val="1"/>
+          <w:numId w:val="2"/>
+        </w:numPr>
+      </w:pPr>
+      <w:r>
+        <w:rPr>
+          <w:b/>
+          <w:bCs/>
+        </w:rPr>
+        <w:t xml:space="preserve">More than 6 in a row doubles that penalty again:</w:t>
+      </w:r>
+      <w:r>
+        <w:t xml:space="preserve"> 4.6× at the 7th, up to 6×.</w:t>
+      </w:r>
+    </w:p>
+    <w:p>
+      <w:pPr>
+        <w:pStyle w:val="ListParagraph"/>
+        <w:numPr>
+          <w:ilvl w:val="1"/>
+          <w:numId w:val="2"/>
+        </w:numPr>
+      </w:pPr>
+      <w:r>
+        <w:t xml:space="preserve">A repeat is the same move again within 3 seconds while you still have the ball. Passing, shooting, picking it up or losing it ends the run.</w:t>
+      </w:r>
+    </w:p>
+    <w:p>
+      <w:pPr>
+        <w:pStyle w:val="ListParagraph"/>
+        <w:numPr>
+          <w:ilvl w:val="1"/>
+          <w:numId w:val="2"/>
+        </w:numPr>
+      </w:pPr>
+      <w:r>
+        <w:t xml:space="preserve">Before, a run could carry over after a steal and keep draining you on defense.</w:t>
+      </w:r>
+    </w:p>
+    <w:p>
+      <w:pPr>
+        <w:pStyle w:val="Heading2"/>
+      </w:pPr>
+      <w:r>
+        <w:t xml:space="preserve">The stick's diagonals</w:t>
+      </w:r>
+    </w:p>
+    <w:p>
+      <w:pPr>
+        <w:spacing w:after="120"/>
+      </w:pPr>
+      <w:r>
+        <w:rPr>
+          <w:b/>
+          <w:bCs/>
+        </w:rPr>
+        <w:t xml:space="preserve">Every diagonal now does two things</w:t>
+      </w:r>
+      <w:r>
+        <w:t xml:space="preserve">, depending on whether you're moving with the left stick:</w:t>
+      </w:r>
+    </w:p>
+    <w:tbl>
+      <w:tblPr>
+        <w:tblW w:type="dxa" w:w="9360"/>
+        <w:tblBorders>
+          <w:top w:val="single" w:color="auto" w:sz="4"/>
+          <w:left w:val="single" w:color="auto" w:sz="4"/>
+          <w:bottom w:val="single" w:color="auto" w:sz="4"/>
+          <w:right w:val="single" w:color="auto" w:sz="4"/>
+          <w:insideH w:val="single" w:color="auto" w:sz="4"/>
+          <w:insideV w:val="single" w:color="auto" w:sz="4"/>
+        </w:tblBorders>
+      </w:tblPr>
+      <w:tblGrid>
+        <w:gridCol w:w="3120"/>
+        <w:gridCol w:w="3120"/>
+        <w:gridCol w:w="3120"/>
+      </w:tblGrid>
+      <w:tr>
+        <w:trPr>
+          <w:tblHeader/>
+        </w:trPr>
+        <w:tc>
+          <w:tcPr>
+            <w:tcW w:type="dxa" w:w="3120"/>
+            <w:shd w:fill="DCE6F1" w:color="auto" w:val="clear"/>
+            <w:tcMar>
+              <w:top w:type="dxa" w:w="60"/>
+              <w:left w:type="dxa" w:w="100"/>
+              <w:bottom w:type="dxa" w:w="60"/>
+              <w:right w:type="dxa" w:w="100"/>
+            </w:tcMar>
+          </w:tcPr>
+          <w:p>
+            <w:r>
+              <w:rPr>
+                <w:b/>
+                <w:bCs/>
+              </w:rPr>
+              <w:t xml:space="preserve">Diagonal</w:t>
+            </w:r>
+          </w:p>
+        </w:tc>
+        <w:tc>
+          <w:tcPr>
+            <w:tcW w:type="dxa" w:w="3120"/>
+            <w:shd w:fill="DCE6F1" w:color="auto" w:val="clear"/>
+            <w:tcMar>
+              <w:top w:type="dxa" w:w="60"/>
+              <w:left w:type="dxa" w:w="100"/>
+              <w:bottom w:type="dxa" w:w="60"/>
+              <w:right w:type="dxa" w:w="100"/>
+            </w:tcMar>
+          </w:tcPr>
+          <w:p>
+            <w:r>
+              <w:rPr>
+                <w:b/>
+                <w:bCs/>
+              </w:rPr>
+              <w:t xml:space="preserve">Standing</w:t>
+            </w:r>
+          </w:p>
+        </w:tc>
+        <w:tc>
+          <w:tcPr>
+            <w:tcW w:type="dxa" w:w="3120"/>
+            <w:shd w:fill="DCE6F1" w:color="auto" w:val="clear"/>
+            <w:tcMar>
+              <w:top w:type="dxa" w:w="60"/>
+              <w:left w:type="dxa" w:w="100"/>
+              <w:bottom w:type="dxa" w:w="60"/>
+              <w:right w:type="dxa" w:w="100"/>
+            </w:tcMar>
+          </w:tcPr>
+          <w:p>
+            <w:r>
+              <w:rPr>
+                <w:b/>
+                <w:bCs/>
+              </w:rPr>
+              <w:t xml:space="preserve">On the move</w:t>
+            </w:r>
+          </w:p>
+        </w:tc>
+      </w:tr>
+      <w:tr>
+        <w:trPr>
+          <w:tblHeader w:val="false"/>
+        </w:trPr>
+        <w:tc>
+          <w:tcPr>
+            <w:tcW w:type="dxa" w:w="3120"/>
+            <w:tcMar>
+              <w:top w:type="dxa" w:w="60"/>
+              <w:left w:type="dxa" w:w="100"/>
+              <w:bottom w:type="dxa" w:w="60"/>
+              <w:right w:type="dxa" w:w="100"/>
+            </w:tcMar>
+          </w:tcPr>
+          <w:p>
+            <w:r>
+              <w:t xml:space="preserve">Up, to the ball's side</w:t>
+            </w:r>
+          </w:p>
+        </w:tc>
+        <w:tc>
+          <w:tcPr>
+            <w:tcW w:type="dxa" w:w="3120"/>
+            <w:tcMar>
+              <w:top w:type="dxa" w:w="60"/>
+              <w:left w:type="dxa" w:w="100"/>
+              <w:bottom w:type="dxa" w:w="60"/>
+              <w:right w:type="dxa" w:w="100"/>
+            </w:tcMar>
+          </w:tcPr>
+          <w:p>
+            <w:r>
+              <w:t xml:space="preserve">Stutter-step</w:t>
+            </w:r>
+          </w:p>
+        </w:tc>
+        <w:tc>
+          <w:tcPr>
+            <w:tcW w:type="dxa" w:w="3120"/>
+            <w:tcMar>
+              <w:top w:type="dxa" w:w="60"/>
+              <w:left w:type="dxa" w:w="100"/>
+              <w:bottom w:type="dxa" w:w="60"/>
+              <w:right w:type="dxa" w:w="100"/>
+            </w:tcMar>
+          </w:tcPr>
+          <w:p>
+            <w:r>
+              <w:rPr>
+                <w:b/>
+                <w:bCs/>
+              </w:rPr>
+              <w:t xml:space="preserve">Jab step</w:t>
+            </w:r>
+            <w:r>
+              <w:t xml:space="preserve"> (new)</w:t>
+            </w:r>
+          </w:p>
+        </w:tc>
+      </w:tr>
+      <w:tr>
+        <w:trPr>
+          <w:tblHeader w:val="false"/>
+        </w:trPr>
+        <w:tc>
+          <w:tcPr>
+            <w:tcW w:type="dxa" w:w="3120"/>
+            <w:tcMar>
+              <w:top w:type="dxa" w:w="60"/>
+              <w:left w:type="dxa" w:w="100"/>
+              <w:bottom w:type="dxa" w:w="60"/>
+              <w:right w:type="dxa" w:w="100"/>
+            </w:tcMar>
+          </w:tcPr>
+          <w:p>
+            <w:r>
+              <w:t xml:space="preserve">Up, to the other hand</w:t>
+            </w:r>
+          </w:p>
+        </w:tc>
+        <w:tc>
+          <w:tcPr>
+            <w:tcW w:type="dxa" w:w="3120"/>
+            <w:tcMar>
+              <w:top w:type="dxa" w:w="60"/>
+              <w:left w:type="dxa" w:w="100"/>
+              <w:bottom w:type="dxa" w:w="60"/>
+              <w:right w:type="dxa" w:w="100"/>
+            </w:tcMar>
+          </w:tcPr>
+          <w:p>
+            <w:r>
+              <w:rPr>
+                <w:b/>
+                <w:bCs/>
+              </w:rPr>
+              <w:t xml:space="preserve">Push-pull crossover</w:t>
+            </w:r>
+            <w:r>
+              <w:t xml:space="preserve"> (new); a slow push is a stutter</w:t>
+            </w:r>
+          </w:p>
+        </w:tc>
+        <w:tc>
+          <w:tcPr>
+            <w:tcW w:type="dxa" w:w="3120"/>
+            <w:tcMar>
+              <w:top w:type="dxa" w:w="60"/>
+              <w:left w:type="dxa" w:w="100"/>
+              <w:bottom w:type="dxa" w:w="60"/>
+              <w:right w:type="dxa" w:w="100"/>
+            </w:tcMar>
+          </w:tcPr>
+          <w:p>
+            <w:r>
+              <w:rPr>
+                <w:b/>
+                <w:bCs/>
+              </w:rPr>
+              <w:t xml:space="preserve">Push-pull crossover</w:t>
+            </w:r>
+          </w:p>
+        </w:tc>
+      </w:tr>
+      <w:tr>
+        <w:trPr>
+          <w:tblHeader w:val="false"/>
+        </w:trPr>
+        <w:tc>
+          <w:tcPr>
+            <w:tcW w:type="dxa" w:w="3120"/>
+            <w:tcMar>
+              <w:top w:type="dxa" w:w="60"/>
+              <w:left w:type="dxa" w:w="100"/>
+              <w:bottom w:type="dxa" w:w="60"/>
+              <w:right w:type="dxa" w:w="100"/>
+            </w:tcMar>
+          </w:tcPr>
+          <w:p>
+            <w:r>
+              <w:t xml:space="preserve">Down, to the ball's side</w:t>
+            </w:r>
+          </w:p>
+        </w:tc>
+        <w:tc>
+          <w:tcPr>
+            <w:tcW w:type="dxa" w:w="3120"/>
+            <w:tcMar>
+              <w:top w:type="dxa" w:w="60"/>
+              <w:left w:type="dxa" w:w="100"/>
+              <w:bottom w:type="dxa" w:w="60"/>
+              <w:right w:type="dxa" w:w="100"/>
+            </w:tcMar>
+          </w:tcPr>
+          <w:p>
+            <w:r>
+              <w:t xml:space="preserve">Sidestep</w:t>
+            </w:r>
+          </w:p>
+        </w:tc>
+        <w:tc>
+          <w:tcPr>
+            <w:tcW w:type="dxa" w:w="3120"/>
+            <w:tcMar>
+              <w:top w:type="dxa" w:w="60"/>
+              <w:left w:type="dxa" w:w="100"/>
+              <w:bottom w:type="dxa" w:w="60"/>
+              <w:right w:type="dxa" w:w="100"/>
+            </w:tcMar>
+          </w:tcPr>
+          <w:p>
+            <w:r>
+              <w:rPr>
+                <w:b/>
+                <w:bCs/>
+              </w:rPr>
+              <w:t xml:space="preserve">Snatch-back</w:t>
+            </w:r>
+            <w:r>
+              <w:t xml:space="preserve"> (new)</w:t>
+            </w:r>
+          </w:p>
+        </w:tc>
+      </w:tr>
+      <w:tr>
+        <w:trPr>
+          <w:tblHeader w:val="false"/>
+        </w:trPr>
+        <w:tc>
+          <w:tcPr>
+            <w:tcW w:type="dxa" w:w="3120"/>
+            <w:tcMar>
+              <w:top w:type="dxa" w:w="60"/>
+              <w:left w:type="dxa" w:w="100"/>
+              <w:bottom w:type="dxa" w:w="60"/>
+              <w:right w:type="dxa" w:w="100"/>
+            </w:tcMar>
+          </w:tcPr>
+          <w:p>
+            <w:r>
+              <w:t xml:space="preserve">Down, to the other hand</w:t>
+            </w:r>
+          </w:p>
+        </w:tc>
+        <w:tc>
+          <w:tcPr>
+            <w:tcW w:type="dxa" w:w="3120"/>
+            <w:tcMar>
+              <w:top w:type="dxa" w:w="60"/>
+              <w:left w:type="dxa" w:w="100"/>
+              <w:bottom w:type="dxa" w:w="60"/>
+              <w:right w:type="dxa" w:w="100"/>
+            </w:tcMar>
+          </w:tcPr>
+          <w:p>
+            <w:r>
+              <w:rPr>
+                <w:b/>
+                <w:bCs/>
+              </w:rPr>
+              <w:t xml:space="preserve">Pull-back</w:t>
+            </w:r>
+            <w:r>
+              <w:t xml:space="preserve"> (new: between the legs, stepping back)</w:t>
+            </w:r>
+          </w:p>
+        </w:tc>
+        <w:tc>
+          <w:tcPr>
+            <w:tcW w:type="dxa" w:w="3120"/>
+            <w:tcMar>
+              <w:top w:type="dxa" w:w="60"/>
+              <w:left w:type="dxa" w:w="100"/>
+              <w:bottom w:type="dxa" w:w="60"/>
+              <w:right w:type="dxa" w:w="100"/>
+            </w:tcMar>
+          </w:tcPr>
+          <w:p>
+            <w:r>
+              <w:t xml:space="preserve">Wrap</w:t>
+            </w:r>
+          </w:p>
+        </w:tc>
+      </w:tr>
+    </w:tbl>
+    <w:p>
+      <w:pPr>
+        <w:spacing w:after="60"/>
+      </w:pPr>
+    </w:p>
+    <w:p>
+      <w:pPr>
+        <w:pStyle w:val="ListParagraph"/>
+        <w:numPr>
+          <w:ilvl w:val="0"/>
+          <w:numId w:val="2"/>
+        </w:numPr>
+      </w:pPr>
+      <w:r>
+        <w:rPr>
+          <w:b/>
+          <w:bCs/>
+        </w:rPr>
+        <w:t xml:space="preserve">17 new named combos</w:t>
+      </w:r>
+      <w:r>
+        <w:t xml:space="preserve">, for example: Jab crossover, Push-pull stepback, Snatch-back crossover, Pull-back and go and Hesi push-pull.</w:t>
+      </w:r>
+    </w:p>
+    <w:p>
+      <w:pPr>
+        <w:pStyle w:val="ListParagraph"/>
+        <w:numPr>
+          <w:ilvl w:val="0"/>
+          <w:numId w:val="2"/>
+        </w:numPr>
+      </w:pPr>
+      <w:r>
+        <w:t xml:space="preserve">A few size-up packages count the new moves as signatures: Jab, Rocker, Elite, Blur, Pound, Crab and Pendulum.</w:t>
+      </w:r>
+    </w:p>
+    <w:p>
+      <w:pPr>
+        <w:pStyle w:val="ListParagraph"/>
+        <w:numPr>
+          <w:ilvl w:val="0"/>
+          <w:numId w:val="2"/>
+        </w:numPr>
+      </w:pPr>
+      <w:r>
+        <w:t xml:space="preserve">The AI uses the new moves too.</w:t>
+      </w:r>
+    </w:p>
+    <w:p>
+      <w:pPr>
+        <w:pStyle w:val="Heading2"/>
+      </w:pPr>
+      <w:r>
+        <w:t xml:space="preserve">Dribble speed and game speed</w:t>
+      </w:r>
+    </w:p>
+    <w:p>
+      <w:pPr>
+        <w:pStyle w:val="ListParagraph"/>
+        <w:numPr>
+          <w:ilvl w:val="0"/>
+          <w:numId w:val="2"/>
+        </w:numPr>
+      </w:pPr>
+      <w:r>
+        <w:rPr>
+          <w:b/>
+          <w:bCs/>
+        </w:rPr>
+        <w:t xml:space="preserve">Every dribble move is 20% slower</w:t>
+      </w:r>
+      <w:r>
+        <w:t xml:space="preserve">, in every package and at every rating. That covers stick moves and size-up combos in place.</w:t>
+      </w:r>
+    </w:p>
+    <w:p>
+      <w:pPr>
+        <w:pStyle w:val="ListParagraph"/>
+        <w:numPr>
+          <w:ilvl w:val="1"/>
+          <w:numId w:val="2"/>
+        </w:numPr>
+      </w:pPr>
+      <w:r>
+        <w:t xml:space="preserve">Better packages and handles are still quicker, in the same proportions as before.</w:t>
+      </w:r>
+    </w:p>
+    <w:p>
+      <w:pPr>
+        <w:pStyle w:val="ListParagraph"/>
+        <w:numPr>
+          <w:ilvl w:val="1"/>
+          <w:numId w:val="2"/>
+        </w:numPr>
+      </w:pPr>
+      <w:r>
+        <w:t xml:space="preserve">The burst eases off less than the timing slows, so moves still cover about the same ground. A stepback still makes its space.</w:t>
+      </w:r>
+    </w:p>
+    <w:p>
+      <w:pPr>
+        <w:pStyle w:val="ListParagraph"/>
+        <w:numPr>
+          <w:ilvl w:val="0"/>
+          <w:numId w:val="2"/>
+        </w:numPr>
+      </w:pPr>
+      <w:r>
+        <w:rPr>
+          <w:b/>
+          <w:bCs/>
+        </w:rPr>
+        <w:t xml:space="preserve">The game as a whole runs 2.5% quicker</w:t>
+      </w:r>
+      <w:r>
+        <w:t xml:space="preserve"> to meet it halfway.</w:t>
+      </w:r>
+    </w:p>
+    <w:p>
+      <w:pPr>
+        <w:pStyle w:val="Heading2"/>
+      </w:pPr>
+      <w:r>
+        <w:t xml:space="preserve">Passing</w:t>
+      </w:r>
+    </w:p>
+    <w:p>
+      <w:pPr>
+        <w:pStyle w:val="ListParagraph"/>
+        <w:numPr>
+          <w:ilvl w:val="0"/>
+          <w:numId w:val="2"/>
+        </w:numPr>
+      </w:pPr>
+      <w:r>
+        <w:rPr>
+          <w:b/>
+          <w:bCs/>
+        </w:rPr>
+        <w:t xml:space="preserve">Every pass is 10% more accurate:</w:t>
+      </w:r>
+      <w:r>
+        <w:t xml:space="preserve"> 10% less aim error, and the ball steers onto the receiver 10% better in flight.</w:t>
+      </w:r>
+    </w:p>
+    <w:p>
+      <w:pPr>
+        <w:pStyle w:val="Heading2"/>
+      </w:pPr>
+      <w:r>
+        <w:t xml:space="preserve">Reach-in fouls</w:t>
+      </w:r>
+    </w:p>
+    <w:p>
+      <w:pPr>
+        <w:pStyle w:val="ListParagraph"/>
+        <w:numPr>
+          <w:ilvl w:val="0"/>
+          <w:numId w:val="2"/>
+        </w:numPr>
+      </w:pPr>
+      <w:r>
+        <w:rPr>
+          <w:b/>
+          <w:bCs/>
+        </w:rPr>
+        <w:t xml:space="preserve">Reach-ins are called on contact, not on chance.</w:t>
+      </w:r>
+    </w:p>
+    <w:p>
+      <w:pPr>
+        <w:pStyle w:val="ListParagraph"/>
+        <w:numPr>
+          <w:ilvl w:val="1"/>
+          <w:numId w:val="2"/>
+        </w:numPr>
+      </w:pPr>
+      <w:r>
+        <w:t xml:space="preserve">Where the reaching hand ends up decides the call.</w:t>
+      </w:r>
+    </w:p>
+    <w:p>
+      <w:pPr>
+        <w:pStyle w:val="ListParagraph"/>
+        <w:numPr>
+          <w:ilvl w:val="1"/>
+          <w:numId w:val="2"/>
+        </w:numPr>
+      </w:pPr>
+      <w:r>
+        <w:t xml:space="preserve">Into the ball handler's body, or the arm he's dribbling with, without getting the ball first: a foul nearly every time (80%), more so reaching across his body.</w:t>
+      </w:r>
+    </w:p>
+    <w:p>
+      <w:pPr>
+        <w:pStyle w:val="ListParagraph"/>
+        <w:numPr>
+          <w:ilvl w:val="1"/>
+          <w:numId w:val="2"/>
+        </w:numPr>
+      </w:pPr>
+      <w:r>
+        <w:t xml:space="preserve">Hand on the ball first: all ball. There's a rare call on the follow-through.</w:t>
+      </w:r>
+    </w:p>
+    <w:p>
+      <w:pPr>
+        <w:pStyle w:val="ListParagraph"/>
+        <w:numPr>
+          <w:ilvl w:val="1"/>
+          <w:numId w:val="2"/>
+        </w:numPr>
+      </w:pPr>
+      <w:r>
+        <w:t xml:space="preserve">A reach that touches nothing is never a foul. Before, roughly 1 failed reach in 10 drew a foul, contact or not.</w:t>
+      </w:r>
+    </w:p>
+    <w:p>
+      <w:pPr>
+        <w:pStyle w:val="ListParagraph"/>
+        <w:numPr>
+          <w:ilvl w:val="0"/>
+          <w:numId w:val="2"/>
+        </w:numPr>
+      </w:pPr>
+      <w:r>
+        <w:rPr>
+          <w:b/>
+          <w:bCs/>
+        </w:rPr>
+        <w:t xml:space="preserve">Smart AI defenders don't reach through you to a ball you're shielding.</w:t>
+      </w:r>
+      <w:r>
+        <w:t xml:space="preserve"> The less smart ones still do, and get called for it.</w:t>
+      </w:r>
+    </w:p>
+    <w:p>
+      <w:pPr>
+        <w:pStyle w:val="ListParagraph"/>
+        <w:numPr>
+          <w:ilvl w:val="0"/>
+          <w:numId w:val="2"/>
+        </w:numPr>
+      </w:pPr>
+      <w:r>
+        <w:t xml:space="preserve">In AI Pro-Am games the number of reach-in fouls stayed about the same (about 3 a game), but every one of them now comes from real contact.</w:t>
+      </w:r>
+    </w:p>
+    <w:p>
+      <w:pPr>
+        <w:pStyle w:val="Heading2"/>
+      </w:pPr>
+      <w:r>
+        <w:t xml:space="preserve">The AI stays in bounds</w:t>
+      </w:r>
+    </w:p>
+    <w:p>
+      <w:pPr>
+        <w:pStyle w:val="ListParagraph"/>
+        <w:numPr>
+          <w:ilvl w:val="0"/>
+          <w:numId w:val="2"/>
+        </w:numPr>
+      </w:pPr>
+      <w:r>
+        <w:rPr>
+          <w:b/>
+          <w:bCs/>
+        </w:rPr>
+        <w:t xml:space="preserve">Chasing a pass:</w:t>
+      </w:r>
+      <w:r>
+        <w:t xml:space="preserve"> an AI player only chases the part of a pass that's in bounds. A pass heading out is met at the line.</w:t>
+      </w:r>
+    </w:p>
+    <w:p>
+      <w:pPr>
+        <w:pStyle w:val="ListParagraph"/>
+        <w:numPr>
+          <w:ilvl w:val="0"/>
+          <w:numId w:val="2"/>
+        </w:numPr>
+      </w:pPr>
+      <w:r>
+        <w:rPr>
+          <w:b/>
+          <w:bCs/>
+        </w:rPr>
+        <w:t xml:space="preserve">No running through the lines:</w:t>
+      </w:r>
+      <w:r>
+        <w:t xml:space="preserve"> AI players never run at a spot out of bounds, and they ease off near a sideline or baseline in time to stop.</w:t>
+      </w:r>
+    </w:p>
+    <w:p>
+      <w:pPr>
+        <w:pStyle w:val="ListParagraph"/>
+        <w:numPr>
+          <w:ilvl w:val="0"/>
+          <w:numId w:val="2"/>
+        </w:numPr>
+      </w:pPr>
+      <w:r>
+        <w:t xml:space="preserve">In AI park games, time spent standing out of bounds dropped from 1.4 to 0.1 seconds a game, and passes caught out of bounds went to zero.</w:t>
+      </w:r>
+    </w:p>
+    <w:p>
+      <w:pPr>
+        <w:pStyle w:val="Heading2"/>
+      </w:pPr>
+      <w:r>
+        <w:t xml:space="preserve">Defensive assignment arrows</w:t>
+      </w:r>
+    </w:p>
+    <w:p>
+      <w:pPr>
+        <w:pStyle w:val="ListParagraph"/>
+        <w:numPr>
+          <w:ilvl w:val="0"/>
+          <w:numId w:val="2"/>
+        </w:numPr>
+      </w:pPr>
+      <w:r>
+        <w:rPr>
+          <w:b/>
+          <w:bCs/>
+        </w:rPr>
+        <w:t xml:space="preserve">On defense, an arrow at the edge of your ring points at the man you should be guarding.</w:t>
+      </w:r>
+      <w:r>
+        <w:t xml:space="preserve"> That's your matchup, the one your AI teammates leave to you. A matching arrow at his feet points back at you.</w:t>
+      </w:r>
+    </w:p>
+    <w:p>
+      <w:pPr>
+        <w:pStyle w:val="ListParagraph"/>
+        <w:numPr>
+          <w:ilvl w:val="1"/>
+          <w:numId w:val="2"/>
+        </w:numPr>
+      </w:pPr>
+      <w:r>
+        <w:t xml:space="preserve">They grow a little the further off him you are.</w:t>
+      </w:r>
+    </w:p>
+    <w:p>
+      <w:pPr>
+        <w:pStyle w:val="ListParagraph"/>
+        <w:numPr>
+          <w:ilvl w:val="1"/>
+          <w:numId w:val="2"/>
+        </w:numPr>
+      </w:pPr>
+      <w:r>
+        <w:t xml:space="preserve">They fade out once you're on him (inside about 2 metres).</w:t>
+      </w:r>
+    </w:p>
+    <w:p>
+      <w:pPr>
+        <w:pStyle w:val="ListParagraph"/>
+        <w:numPr>
+          <w:ilvl w:val="0"/>
+          <w:numId w:val="2"/>
+        </w:numPr>
+      </w:pPr>
+      <w:r>
+        <w:t xml:space="preserve">You can turn them off in Settings (</w:t>
+      </w:r>
+      <w:r>
+        <w:rPr>
+          <w:b/>
+          <w:bCs/>
+        </w:rPr>
+        <w:t xml:space="preserve">Defense arrows</w:t>
+      </w:r>
+      <w:r>
+        <w:t xml:space="preserve">).</w:t>
+      </w:r>
+    </w:p>
+    <w:p>
+      <w:pPr>
+        <w:pStyle w:val="Heading2"/>
+      </w:pPr>
+      <w:r>
+        <w:t xml:space="preserve">Sprinting looked faster sideways</w:t>
+      </w:r>
+    </w:p>
+    <w:p>
+      <w:pPr>
+        <w:pStyle w:val="ListParagraph"/>
+        <w:numPr>
+          <w:ilvl w:val="0"/>
+          <w:numId w:val="2"/>
+        </w:numPr>
+      </w:pPr>
+      <w:r>
+        <w:rPr>
+          <w:b/>
+          <w:bCs/>
+        </w:rPr>
+        <w:t xml:space="preserve">The speed was always the same in every direction.</w:t>
+      </w:r>
+      <w:r>
+        <w:t xml:space="preserve"> I measured it in the game: 5.86 m/s up, down, sideways and diagonal alike.</w:t>
+      </w:r>
+    </w:p>
+    <w:p>
+      <w:pPr>
+        <w:pStyle w:val="ListParagraph"/>
+        <w:numPr>
+          <w:ilvl w:val="0"/>
+          <w:numId w:val="2"/>
+        </w:numPr>
+      </w:pPr>
+      <w:r>
+        <w:rPr>
+          <w:b/>
+          <w:bCs/>
+        </w:rPr>
+        <w:t xml:space="preserve">Two things in the 2K Cam made it look different:</w:t>
+      </w:r>
+    </w:p>
+    <w:p>
+      <w:pPr>
+        <w:pStyle w:val="ListParagraph"/>
+        <w:numPr>
+          <w:ilvl w:val="1"/>
+          <w:numId w:val="2"/>
+        </w:numPr>
+      </w:pPr>
+      <w:r>
+        <w:t xml:space="preserve">The camera followed a run up the floor one-for-one, so you stayed put on screen. It followed only a third of a sideways run, so you streaked across the screen.</w:t>
+      </w:r>
+    </w:p>
+    <w:p>
+      <w:pPr>
+        <w:pStyle w:val="ListParagraph"/>
+        <w:numPr>
+          <w:ilvl w:val="1"/>
+          <w:numId w:val="2"/>
+        </w:numPr>
+      </w:pPr>
+      <w:r>
+        <w:t xml:space="preserve">From a low angle, a run toward the basket is foreshortened.</w:t>
+      </w:r>
+    </w:p>
+    <w:p>
+      <w:pPr>
+        <w:pStyle w:val="ListParagraph"/>
+        <w:numPr>
+          <w:ilvl w:val="0"/>
+          <w:numId w:val="2"/>
+        </w:numPr>
+      </w:pPr>
+      <w:r>
+        <w:rPr>
+          <w:b/>
+          <w:bCs/>
+        </w:rPr>
+        <w:t xml:space="preserve">The fix:</w:t>
+      </w:r>
+      <w:r>
+        <w:t xml:space="preserve"> the 2K Cam now follows sideways runs much more closely and sits a little higher, so a sprint reads at the same pace whichever way you run.</w:t>
+      </w:r>
+    </w:p>
+    <w:p>
+      <w:pPr>
+        <w:pStyle w:val="Heading2"/>
+      </w:pPr>
+      <w:r>
+        <w:t xml:space="preserve">The AI reacts faster</w:t>
+      </w:r>
+    </w:p>
+    <w:p>
+      <w:pPr>
+        <w:spacing w:after="120"/>
+      </w:pPr>
+      <w:r>
+        <w:rPr>
+          <w:b/>
+          <w:bCs/>
+        </w:rPr>
+        <w:t xml:space="preserve">AI players (teammates, opponents and auto-play) now react quickly in the moments that decide a possession.</w:t>
+      </w:r>
+    </w:p>
+    <w:p>
+      <w:pPr>
+        <w:pStyle w:val="ListParagraph"/>
+        <w:numPr>
+          <w:ilvl w:val="0"/>
+          <w:numId w:val="2"/>
+        </w:numPr>
+      </w:pPr>
+      <w:r>
+        <w:rPr>
+          <w:b/>
+          <w:bCs/>
+        </w:rPr>
+        <w:t xml:space="preserve">Off the pass, on offense:</w:t>
+      </w:r>
+      <w:r>
+        <w:t xml:space="preserve"> an AI player reads the floor the moment he catches it: the open shot, the drive or the next pass. Before, he held it for most of a second first.</w:t>
+      </w:r>
+    </w:p>
+    <w:p>
+      <w:pPr>
+        <w:pStyle w:val="ListParagraph"/>
+        <w:numPr>
+          <w:ilvl w:val="0"/>
+          <w:numId w:val="2"/>
+        </w:numPr>
+      </w:pPr>
+      <w:r>
+        <w:rPr>
+          <w:b/>
+          <w:bCs/>
+        </w:rPr>
+        <w:t xml:space="preserve">Off the pass, on defense:</w:t>
+      </w:r>
+      <w:r>
+        <w:t xml:space="preserve"> the man the ball is thrown to gets closed out while the pass is in the air, and the defender's hands come up as he gets there. Everyone else rotates to where the ball is going, not where it was.</w:t>
+      </w:r>
+    </w:p>
+    <w:p>
+      <w:pPr>
+        <w:pStyle w:val="ListParagraph"/>
+        <w:numPr>
+          <w:ilvl w:val="0"/>
+          <w:numId w:val="2"/>
+        </w:numPr>
+      </w:pPr>
+      <w:r>
+        <w:rPr>
+          <w:b/>
+          <w:bCs/>
+        </w:rPr>
+        <w:t xml:space="preserve">Dribble moves that make space:</w:t>
+      </w:r>
+    </w:p>
+    <w:p>
+      <w:pPr>
+        <w:pStyle w:val="ListParagraph"/>
+        <w:numPr>
+          <w:ilvl w:val="1"/>
+          <w:numId w:val="2"/>
+        </w:numPr>
+      </w:pPr>
+      <w:r>
+        <w:t xml:space="preserve">When an AI handler's move leaves his man a step behind (or stumbling), he uses it right away.</w:t>
+      </w:r>
+    </w:p>
+    <w:p>
+      <w:pPr>
+        <w:pStyle w:val="ListParagraph"/>
+        <w:numPr>
+          <w:ilvl w:val="1"/>
+          <w:numId w:val="2"/>
+        </w:numPr>
+      </w:pPr>
+      <w:r>
+        <w:t xml:space="preserve">AI defenders read a handler's dribble move sooner. One who is left a step behind runs to recover instead of sliding after him.</w:t>
+      </w:r>
+    </w:p>
+    <w:p>
+      <w:pPr>
+        <w:pStyle w:val="ListParagraph"/>
+        <w:numPr>
+          <w:ilvl w:val="0"/>
+          <w:numId w:val="2"/>
+        </w:numPr>
+      </w:pPr>
+      <w:r>
+        <w:rPr>
+          <w:b/>
+          <w:bCs/>
+        </w:rPr>
+        <w:t xml:space="preserve">Open lanes:</w:t>
+      </w:r>
+    </w:p>
+    <w:p>
+      <w:pPr>
+        <w:pStyle w:val="ListParagraph"/>
+        <w:numPr>
+          <w:ilvl w:val="1"/>
+          <w:numId w:val="2"/>
+        </w:numPr>
+      </w:pPr>
+      <w:r>
+        <w:t xml:space="preserve">A lane that opens while an AI handler is probing gets attacked straight away, not at his next read.</w:t>
+      </w:r>
+    </w:p>
+    <w:p>
+      <w:pPr>
+        <w:pStyle w:val="ListParagraph"/>
+        <w:numPr>
+          <w:ilvl w:val="1"/>
+          <w:numId w:val="2"/>
+        </w:numPr>
+      </w:pPr>
+      <w:r>
+        <w:t xml:space="preserve">Help comes earlier: as soon as the lane to the rim is open, from about 6.5 m out.</w:t>
+      </w:r>
+    </w:p>
+    <w:p>
+      <w:pPr>
+        <w:pStyle w:val="ListParagraph"/>
+        <w:numPr>
+          <w:ilvl w:val="0"/>
+          <w:numId w:val="2"/>
+        </w:numPr>
+      </w:pPr>
+      <w:r>
+        <w:rPr>
+          <w:b/>
+          <w:bCs/>
+        </w:rPr>
+        <w:t xml:space="preserve">Fast breaks:</w:t>
+      </w:r>
+    </w:p>
+    <w:p>
+      <w:pPr>
+        <w:pStyle w:val="ListParagraph"/>
+        <w:numPr>
+          <w:ilvl w:val="1"/>
+          <w:numId w:val="2"/>
+        </w:numPr>
+      </w:pPr>
+      <w:r>
+        <w:t xml:space="preserve">Defenders sprint back the moment the ball changes hands, outlet passes and loose balls included.</w:t>
+      </w:r>
+    </w:p>
+    <w:p>
+      <w:pPr>
+        <w:pStyle w:val="ListParagraph"/>
+        <w:numPr>
+          <w:ilvl w:val="1"/>
+          <w:numId w:val="2"/>
+        </w:numPr>
+      </w:pPr>
+      <w:r>
+        <w:t xml:space="preserve">With the numbers, the handler goes straight at the rim.</w:t>
+      </w:r>
+    </w:p>
+    <w:p>
+      <w:pPr>
+        <w:pStyle w:val="ListParagraph"/>
+        <w:numPr>
+          <w:ilvl w:val="1"/>
+          <w:numId w:val="2"/>
+        </w:numPr>
+      </w:pPr>
+      <w:r>
+        <w:t xml:space="preserve">A big who pulls the rebound outlets it to a guard, and a man open up the floor gets the ball sooner.</w:t>
+      </w:r>
+    </w:p>
+    <w:p>
+      <w:pPr>
+        <w:pStyle w:val="ListParagraph"/>
+        <w:numPr>
+          <w:ilvl w:val="0"/>
+          <w:numId w:val="2"/>
+        </w:numPr>
+      </w:pPr>
+      <w:r>
+        <w:rPr>
+          <w:b/>
+          <w:bCs/>
+        </w:rPr>
+        <w:t xml:space="preserve">Shot choices look ahead at closeouts.</w:t>
+      </w:r>
+      <w:r>
+        <w:t xml:space="preserve"> They look 0.5 s ahead, the time a jumper takes to get off, so the quicker closeouts don't bait the AI into bad threes.</w:t>
+      </w:r>
+    </w:p>
+    <w:p>
+      <w:pPr>
+        <w:pStyle w:val="ListParagraph"/>
+        <w:numPr>
+          <w:ilvl w:val="0"/>
+          <w:numId w:val="2"/>
+        </w:numPr>
+      </w:pPr>
+      <w:r>
+        <w:rPr>
+          <w:b/>
+          <w:bCs/>
+        </w:rPr>
+        <w:t xml:space="preserve">Measured in AI games</w:t>
+      </w:r>
+      <w:r>
+        <w:t xml:space="preserve"> (24 park games, 8–10 Pro-Am games):</w:t>
+      </w:r>
+    </w:p>
+    <w:tbl>
+      <w:tblPr>
+        <w:tblW w:type="dxa" w:w="9360"/>
+        <w:tblBorders>
+          <w:top w:val="single" w:color="auto" w:sz="4"/>
+          <w:left w:val="single" w:color="auto" w:sz="4"/>
+          <w:bottom w:val="single" w:color="auto" w:sz="4"/>
+          <w:right w:val="single" w:color="auto" w:sz="4"/>
+          <w:insideH w:val="single" w:color="auto" w:sz="4"/>
+          <w:insideV w:val="single" w:color="auto" w:sz="4"/>
+        </w:tblBorders>
+      </w:tblPr>
+      <w:tblGrid>
+        <w:gridCol w:w="3120"/>
+        <w:gridCol w:w="3120"/>
+        <w:gridCol w:w="3120"/>
+      </w:tblGrid>
+      <w:tr>
+        <w:trPr>
+          <w:tblHeader/>
+        </w:trPr>
+        <w:tc>
+          <w:tcPr>
+            <w:tcW w:type="dxa" w:w="3120"/>
+            <w:shd w:fill="DCE6F1" w:color="auto" w:val="clear"/>
+            <w:tcMar>
+              <w:top w:type="dxa" w:w="60"/>
+              <w:left w:type="dxa" w:w="100"/>
+              <w:bottom w:type="dxa" w:w="60"/>
+              <w:right w:type="dxa" w:w="100"/>
+            </w:tcMar>
+          </w:tcPr>
+          <w:p/>
+        </w:tc>
+        <w:tc>
+          <w:tcPr>
+            <w:tcW w:type="dxa" w:w="3120"/>
+            <w:shd w:fill="DCE6F1" w:color="auto" w:val="clear"/>
+            <w:tcMar>
+              <w:top w:type="dxa" w:w="60"/>
+              <w:left w:type="dxa" w:w="100"/>
+              <w:bottom w:type="dxa" w:w="60"/>
+              <w:right w:type="dxa" w:w="100"/>
+            </w:tcMar>
+          </w:tcPr>
+          <w:p>
+            <w:r>
+              <w:rPr>
+                <w:b/>
+                <w:bCs/>
+              </w:rPr>
+              <w:t xml:space="preserve">Before</w:t>
+            </w:r>
+          </w:p>
+        </w:tc>
+        <w:tc>
+          <w:tcPr>
+            <w:tcW w:type="dxa" w:w="3120"/>
+            <w:shd w:fill="DCE6F1" w:color="auto" w:val="clear"/>
+            <w:tcMar>
+              <w:top w:type="dxa" w:w="60"/>
+              <w:left w:type="dxa" w:w="100"/>
+              <w:bottom w:type="dxa" w:w="60"/>
+              <w:right w:type="dxa" w:w="100"/>
+            </w:tcMar>
+          </w:tcPr>
+          <w:p>
+            <w:r>
+              <w:rPr>
+                <w:b/>
+                <w:bCs/>
+              </w:rPr>
+              <w:t xml:space="preserve">Now</w:t>
+            </w:r>
+          </w:p>
+        </w:tc>
+      </w:tr>
+      <w:tr>
+        <w:trPr>
+          <w:tblHeader w:val="false"/>
+        </w:trPr>
+        <w:tc>
+          <w:tcPr>
+            <w:tcW w:type="dxa" w:w="3120"/>
+            <w:tcMar>
+              <w:top w:type="dxa" w:w="60"/>
+              <w:left w:type="dxa" w:w="100"/>
+              <w:bottom w:type="dxa" w:w="60"/>
+              <w:right w:type="dxa" w:w="100"/>
+            </w:tcMar>
+          </w:tcPr>
+          <w:p>
+            <w:r>
+              <w:t xml:space="preserve">Catch to the first real play (shot, pass, drive or move), park</w:t>
+            </w:r>
+          </w:p>
+        </w:tc>
+        <w:tc>
+          <w:tcPr>
+            <w:tcW w:type="dxa" w:w="3120"/>
+            <w:tcMar>
+              <w:top w:type="dxa" w:w="60"/>
+              <w:left w:type="dxa" w:w="100"/>
+              <w:bottom w:type="dxa" w:w="60"/>
+              <w:right w:type="dxa" w:w="100"/>
+            </w:tcMar>
+          </w:tcPr>
+          <w:p>
+            <w:r>
+              <w:t xml:space="preserve">0.85 s</w:t>
+            </w:r>
+          </w:p>
+        </w:tc>
+        <w:tc>
+          <w:tcPr>
+            <w:tcW w:type="dxa" w:w="3120"/>
+            <w:tcMar>
+              <w:top w:type="dxa" w:w="60"/>
+              <w:left w:type="dxa" w:w="100"/>
+              <w:bottom w:type="dxa" w:w="60"/>
+              <w:right w:type="dxa" w:w="100"/>
+            </w:tcMar>
+          </w:tcPr>
+          <w:p>
+            <w:r>
+              <w:t xml:space="preserve">0.32 s</w:t>
+            </w:r>
+          </w:p>
+        </w:tc>
+      </w:tr>
+      <w:tr>
+        <w:trPr>
+          <w:tblHeader w:val="false"/>
+        </w:trPr>
+        <w:tc>
+          <w:tcPr>
+            <w:tcW w:type="dxa" w:w="3120"/>
+            <w:tcMar>
+              <w:top w:type="dxa" w:w="60"/>
+              <w:left w:type="dxa" w:w="100"/>
+              <w:bottom w:type="dxa" w:w="60"/>
+              <w:right w:type="dxa" w:w="100"/>
+            </w:tcMar>
+          </w:tcPr>
+          <w:p>
+            <w:r>
+              <w:t xml:space="preserve">Same, Pro-Am</w:t>
+            </w:r>
+          </w:p>
+        </w:tc>
+        <w:tc>
+          <w:tcPr>
+            <w:tcW w:type="dxa" w:w="3120"/>
+            <w:tcMar>
+              <w:top w:type="dxa" w:w="60"/>
+              <w:left w:type="dxa" w:w="100"/>
+              <w:bottom w:type="dxa" w:w="60"/>
+              <w:right w:type="dxa" w:w="100"/>
+            </w:tcMar>
+          </w:tcPr>
+          <w:p>
+            <w:r>
+              <w:t xml:space="preserve">0.97 s</w:t>
+            </w:r>
+          </w:p>
+        </w:tc>
+        <w:tc>
+          <w:tcPr>
+            <w:tcW w:type="dxa" w:w="3120"/>
+            <w:tcMar>
+              <w:top w:type="dxa" w:w="60"/>
+              <w:left w:type="dxa" w:w="100"/>
+              <w:bottom w:type="dxa" w:w="60"/>
+              <w:right w:type="dxa" w:w="100"/>
+            </w:tcMar>
+          </w:tcPr>
+          <w:p>
+            <w:r>
+              <w:t xml:space="preserve">0.54 s</w:t>
+            </w:r>
+          </w:p>
+        </w:tc>
+      </w:tr>
+      <w:tr>
+        <w:trPr>
+          <w:tblHeader w:val="false"/>
+        </w:trPr>
+        <w:tc>
+          <w:tcPr>
+            <w:tcW w:type="dxa" w:w="3120"/>
+            <w:tcMar>
+              <w:top w:type="dxa" w:w="60"/>
+              <w:left w:type="dxa" w:w="100"/>
+              <w:bottom w:type="dxa" w:w="60"/>
+              <w:right w:type="dxa" w:w="100"/>
+            </w:tcMar>
+          </w:tcPr>
+          <w:p>
+            <w:r>
+              <w:t xml:space="preserve">Nearest defender when a pass is caught</w:t>
+            </w:r>
+          </w:p>
+        </w:tc>
+        <w:tc>
+          <w:tcPr>
+            <w:tcW w:type="dxa" w:w="3120"/>
+            <w:tcMar>
+              <w:top w:type="dxa" w:w="60"/>
+              <w:left w:type="dxa" w:w="100"/>
+              <w:bottom w:type="dxa" w:w="60"/>
+              <w:right w:type="dxa" w:w="100"/>
+            </w:tcMar>
+          </w:tcPr>
+          <w:p>
+            <w:r>
+              <w:t xml:space="preserve">2.8 m</w:t>
+            </w:r>
+          </w:p>
+        </w:tc>
+        <w:tc>
+          <w:tcPr>
+            <w:tcW w:type="dxa" w:w="3120"/>
+            <w:tcMar>
+              <w:top w:type="dxa" w:w="60"/>
+              <w:left w:type="dxa" w:w="100"/>
+              <w:bottom w:type="dxa" w:w="60"/>
+              <w:right w:type="dxa" w:w="100"/>
+            </w:tcMar>
+          </w:tcPr>
+          <w:p>
+            <w:r>
+              <w:t xml:space="preserve">2.2 m</w:t>
+            </w:r>
+          </w:p>
+        </w:tc>
+      </w:tr>
+      <w:tr>
+        <w:trPr>
+          <w:tblHeader w:val="false"/>
+        </w:trPr>
+        <w:tc>
+          <w:tcPr>
+            <w:tcW w:type="dxa" w:w="3120"/>
+            <w:tcMar>
+              <w:top w:type="dxa" w:w="60"/>
+              <w:left w:type="dxa" w:w="100"/>
+              <w:bottom w:type="dxa" w:w="60"/>
+              <w:right w:type="dxa" w:w="100"/>
+            </w:tcMar>
+          </w:tcPr>
+          <w:p>
+            <w:r>
+              <w:t xml:space="preserve">On-ball defender left 2 m behind, back on his man</w:t>
+            </w:r>
+          </w:p>
+        </w:tc>
+        <w:tc>
+          <w:tcPr>
+            <w:tcW w:type="dxa" w:w="3120"/>
+            <w:tcMar>
+              <w:top w:type="dxa" w:w="60"/>
+              <w:left w:type="dxa" w:w="100"/>
+              <w:bottom w:type="dxa" w:w="60"/>
+              <w:right w:type="dxa" w:w="100"/>
+            </w:tcMar>
+          </w:tcPr>
+          <w:p>
+            <w:r>
+              <w:t xml:space="preserve">0.57 s</w:t>
+            </w:r>
+          </w:p>
+        </w:tc>
+        <w:tc>
+          <w:tcPr>
+            <w:tcW w:type="dxa" w:w="3120"/>
+            <w:tcMar>
+              <w:top w:type="dxa" w:w="60"/>
+              <w:left w:type="dxa" w:w="100"/>
+              <w:bottom w:type="dxa" w:w="60"/>
+              <w:right w:type="dxa" w:w="100"/>
+            </w:tcMar>
+          </w:tcPr>
+          <w:p>
+            <w:r>
+              <w:t xml:space="preserve">0.48 s</w:t>
+            </w:r>
+          </w:p>
+        </w:tc>
+      </w:tr>
+      <w:tr>
+        <w:trPr>
+          <w:tblHeader w:val="false"/>
+        </w:trPr>
+        <w:tc>
+          <w:tcPr>
+            <w:tcW w:type="dxa" w:w="3120"/>
+            <w:tcMar>
+              <w:top w:type="dxa" w:w="60"/>
+              <w:left w:type="dxa" w:w="100"/>
+              <w:bottom w:type="dxa" w:w="60"/>
+              <w:right w:type="dxa" w:w="100"/>
+            </w:tcMar>
+          </w:tcPr>
+          <w:p>
+            <w:r>
+              <w:t xml:space="preserve">Help reaching a drive inside 6 m</w:t>
+            </w:r>
+          </w:p>
+        </w:tc>
+        <w:tc>
+          <w:tcPr>
+            <w:tcW w:type="dxa" w:w="3120"/>
+            <w:tcMar>
+              <w:top w:type="dxa" w:w="60"/>
+              <w:left w:type="dxa" w:w="100"/>
+              <w:bottom w:type="dxa" w:w="60"/>
+              <w:right w:type="dxa" w:w="100"/>
+            </w:tcMar>
+          </w:tcPr>
+          <w:p>
+            <w:r>
+              <w:t xml:space="preserve">0.31 s</w:t>
+            </w:r>
+          </w:p>
+        </w:tc>
+        <w:tc>
+          <w:tcPr>
+            <w:tcW w:type="dxa" w:w="3120"/>
+            <w:tcMar>
+              <w:top w:type="dxa" w:w="60"/>
+              <w:left w:type="dxa" w:w="100"/>
+              <w:bottom w:type="dxa" w:w="60"/>
+              <w:right w:type="dxa" w:w="100"/>
+            </w:tcMar>
+          </w:tcPr>
+          <w:p>
+            <w:r>
+              <w:t xml:space="preserve">0.26 s</w:t>
+            </w:r>
+          </w:p>
+        </w:tc>
+      </w:tr>
+      <w:tr>
+        <w:trPr>
+          <w:tblHeader w:val="false"/>
+        </w:trPr>
+        <w:tc>
+          <w:tcPr>
+            <w:tcW w:type="dxa" w:w="3120"/>
+            <w:tcMar>
+              <w:top w:type="dxa" w:w="60"/>
+              <w:left w:type="dxa" w:w="100"/>
+              <w:bottom w:type="dxa" w:w="60"/>
+              <w:right w:type="dxa" w:w="100"/>
+            </w:tcMar>
+          </w:tcPr>
+          <w:p>
+            <w:r>
+              <w:t xml:space="preserve">All five back after a turnover or long rebound (Pro-Am)</w:t>
+            </w:r>
+          </w:p>
+        </w:tc>
+        <w:tc>
+          <w:tcPr>
+            <w:tcW w:type="dxa" w:w="3120"/>
+            <w:tcMar>
+              <w:top w:type="dxa" w:w="60"/>
+              <w:left w:type="dxa" w:w="100"/>
+              <w:bottom w:type="dxa" w:w="60"/>
+              <w:right w:type="dxa" w:w="100"/>
+            </w:tcMar>
+          </w:tcPr>
+          <w:p>
+            <w:r>
+              <w:t xml:space="preserve">2.4 s</w:t>
+            </w:r>
+          </w:p>
+        </w:tc>
+        <w:tc>
+          <w:tcPr>
+            <w:tcW w:type="dxa" w:w="3120"/>
+            <w:tcMar>
+              <w:top w:type="dxa" w:w="60"/>
+              <w:left w:type="dxa" w:w="100"/>
+              <w:bottom w:type="dxa" w:w="60"/>
+              <w:right w:type="dxa" w:w="100"/>
+            </w:tcMar>
+          </w:tcPr>
+          <w:p>
+            <w:r>
+              <w:t xml:space="preserve">1.6 s</w:t>
+            </w:r>
+          </w:p>
+        </w:tc>
+      </w:tr>
+      <w:tr>
+        <w:trPr>
+          <w:tblHeader w:val="false"/>
+        </w:trPr>
+        <w:tc>
+          <w:tcPr>
+            <w:tcW w:type="dxa" w:w="3120"/>
+            <w:tcMar>
+              <w:top w:type="dxa" w:w="60"/>
+              <w:left w:type="dxa" w:w="100"/>
+              <w:bottom w:type="dxa" w:w="60"/>
+              <w:right w:type="dxa" w:w="100"/>
+            </w:tcMar>
+          </w:tcPr>
+          <w:p>
+            <w:r>
+              <w:t xml:space="preserve">Ball over half court after the change of possession (Pro-Am)</w:t>
+            </w:r>
+          </w:p>
+        </w:tc>
+        <w:tc>
+          <w:tcPr>
+            <w:tcW w:type="dxa" w:w="3120"/>
+            <w:tcMar>
+              <w:top w:type="dxa" w:w="60"/>
+              <w:left w:type="dxa" w:w="100"/>
+              <w:bottom w:type="dxa" w:w="60"/>
+              <w:right w:type="dxa" w:w="100"/>
+            </w:tcMar>
+          </w:tcPr>
+          <w:p>
+            <w:r>
+              <w:t xml:space="preserve">3.6 s</w:t>
+            </w:r>
+          </w:p>
+        </w:tc>
+        <w:tc>
+          <w:tcPr>
+            <w:tcW w:type="dxa" w:w="3120"/>
+            <w:tcMar>
+              <w:top w:type="dxa" w:w="60"/>
+              <w:left w:type="dxa" w:w="100"/>
+              <w:bottom w:type="dxa" w:w="60"/>
+              <w:right w:type="dxa" w:w="100"/>
+            </w:tcMar>
+          </w:tcPr>
+          <w:p>
+            <w:r>
+              <w:t xml:space="preserve">3.2 s</w:t>
+            </w:r>
+          </w:p>
+        </w:tc>
+      </w:tr>
+      <w:tr>
+        <w:trPr>
+          <w:tblHeader w:val="false"/>
+        </w:trPr>
+        <w:tc>
+          <w:tcPr>
+            <w:tcW w:type="dxa" w:w="3120"/>
+            <w:tcMar>
+              <w:top w:type="dxa" w:w="60"/>
+              <w:left w:type="dxa" w:w="100"/>
+              <w:bottom w:type="dxa" w:w="60"/>
+              <w:right w:type="dxa" w:w="100"/>
+            </w:tcMar>
+          </w:tcPr>
+          <w:p>
+            <w:r>
+              <w:t xml:space="preserve">Points in the first 7 s of a possession (Pro-Am)</w:t>
+            </w:r>
+          </w:p>
+        </w:tc>
+        <w:tc>
+          <w:tcPr>
+            <w:tcW w:type="dxa" w:w="3120"/>
+            <w:tcMar>
+              <w:top w:type="dxa" w:w="60"/>
+              <w:left w:type="dxa" w:w="100"/>
+              <w:bottom w:type="dxa" w:w="60"/>
+              <w:right w:type="dxa" w:w="100"/>
+            </w:tcMar>
+          </w:tcPr>
+          <w:p>
+            <w:r>
+              <w:t xml:space="preserve">0.12</w:t>
+            </w:r>
+          </w:p>
+        </w:tc>
+        <w:tc>
+          <w:tcPr>
+            <w:tcW w:type="dxa" w:w="3120"/>
+            <w:tcMar>
+              <w:top w:type="dxa" w:w="60"/>
+              <w:left w:type="dxa" w:w="100"/>
+              <w:bottom w:type="dxa" w:w="60"/>
+              <w:right w:type="dxa" w:w="100"/>
+            </w:tcMar>
+          </w:tcPr>
+          <w:p>
+            <w:r>
+              <w:t xml:space="preserve">0.17</w:t>
+            </w:r>
+          </w:p>
+        </w:tc>
+      </w:tr>
+    </w:tbl>
+    <w:p>
+      <w:pPr>
+        <w:spacing w:after="60"/>
+      </w:pPr>
+    </w:p>
+    <w:p>
+      <w:pPr>
+        <w:pStyle w:val="ListParagraph"/>
+        <w:numPr>
+          <w:ilvl w:val="0"/>
+          <w:numId w:val="2"/>
+        </w:numPr>
+      </w:pPr>
+      <w:r>
+        <w:rPr>
+          <w:b/>
+          <w:bCs/>
+        </w:rPr>
+        <w:t xml:space="preserve">What it does to the scoring:</w:t>
+      </w:r>
+    </w:p>
+    <w:p>
+      <w:pPr>
+        <w:pStyle w:val="ListParagraph"/>
+        <w:numPr>
+          <w:ilvl w:val="1"/>
+          <w:numId w:val="2"/>
+        </w:numPr>
+      </w:pPr>
+      <w:r>
+        <w:t xml:space="preserve">The faster defense took a little off the AI's percentages, so its timing compensation was raised a touch: mid-range 1.55 → 1.65, layups 1.8 → 1.98.</w:t>
+      </w:r>
+    </w:p>
+    <w:p>
+      <w:pPr>
+        <w:pStyle w:val="ListParagraph"/>
+        <w:numPr>
+          <w:ilvl w:val="1"/>
+          <w:numId w:val="2"/>
+        </w:numPr>
+      </w:pPr>
+      <w:r>
+        <w:t xml:space="preserve">Park rates: mid-range 38.3%, layups 52.5%, threes 26.9%. On the same test before, they were 35.6%, 52.2% and 24.5%.</w:t>
+      </w:r>
+    </w:p>
+    <w:p>
+      <w:pPr>
+        <w:pStyle w:val="ListParagraph"/>
+        <w:numPr>
+          <w:ilvl w:val="1"/>
+          <w:numId w:val="2"/>
+        </w:numPr>
+      </w:pPr>
+      <w:r>
+        <w:t xml:space="preserve">Games move quicker. A park game to 21 takes about 4.5 minutes of game time instead of 6.2.</w:t>
+      </w:r>
+    </w:p>
+    <w:p>
+      <w:pPr>
+        <w:pStyle w:val="ListParagraph"/>
+        <w:numPr>
+          <w:ilvl w:val="1"/>
+          <w:numId w:val="2"/>
+        </w:numPr>
+      </w:pPr>
+      <w:r>
+        <w:t xml:space="preserve">Pro-Am scores are about 15% higher, because there are more possessions.</w:t>
+      </w:r>
+    </w:p>
+    <w:p>
+      <w:pPr>
+        <w:pStyle w:val="Heading2"/>
+      </w:pPr>
+      <w:r>
+        <w:t xml:space="preserve">Stamina</w:t>
+      </w:r>
+    </w:p>
+    <w:p>
+      <w:pPr>
+        <w:pStyle w:val="ListParagraph"/>
+        <w:numPr>
+          <w:ilvl w:val="0"/>
+          <w:numId w:val="2"/>
+        </w:numPr>
+      </w:pPr>
+      <w:r>
+        <w:rPr>
+          <w:b/>
+          <w:bCs/>
+        </w:rPr>
+        <w:t xml:space="preserve">Moving without the sprint button is stamina-neutral.</w:t>
+      </w:r>
+      <w:r>
+        <w:t xml:space="preserve"> It used to cost a little at full jog.</w:t>
+      </w:r>
+    </w:p>
+    <w:p>
+      <w:pPr>
+        <w:pStyle w:val="ListParagraph"/>
+        <w:numPr>
+          <w:ilvl w:val="1"/>
+          <w:numId w:val="2"/>
+        </w:numPr>
+      </w:pPr>
+      <w:r>
+        <w:t xml:space="preserve">Sprinting, sliding in a defensive stance and hands-up defense still cost.</w:t>
+      </w:r>
+    </w:p>
+    <w:p>
+      <w:pPr>
+        <w:pStyle w:val="ListParagraph"/>
+        <w:numPr>
+          <w:ilvl w:val="1"/>
+          <w:numId w:val="2"/>
+        </w:numPr>
+      </w:pPr>
+      <w:r>
+        <w:t xml:space="preserve">Standing still and drifting recover.</w:t>
+      </w:r>
+    </w:p>
+    <w:p>
+      <w:pPr>
+        <w:pStyle w:val="ListParagraph"/>
+        <w:numPr>
+          <w:ilvl w:val="0"/>
+          <w:numId w:val="2"/>
+        </w:numPr>
+      </w:pPr>
+      <w:r>
+        <w:rPr>
+          <w:b/>
+          <w:bCs/>
+        </w:rPr>
+        <w:t xml:space="preserve">Recovery is 1.2× faster</w:t>
+      </w:r>
+      <w:r>
+        <w:t xml:space="preserve"> for everyone. That's on top of the Lock-In grade, hot-streak and good-play bonuses.</w:t>
+      </w:r>
+    </w:p>
+    <w:p>
+      <w:pPr>
+        <w:pStyle w:val="Heading1"/>
+      </w:pPr>
+      <w:r>
+        <w:t xml:space="preserve">Progression: Icon Legend, up to 99</w:t>
+      </w:r>
+    </w:p>
+    <w:p>
+      <w:pPr>
+        <w:pStyle w:val="ListParagraph"/>
+        <w:numPr>
+          <w:ilvl w:val="0"/>
+          <w:numId w:val="2"/>
+        </w:numPr>
+      </w:pPr>
+      <w:r>
+        <w:rPr>
+          <w:b/>
+          <w:bCs/>
+        </w:rPr>
+        <w:t xml:space="preserve">Once a build has its Icon badge, every 2 Pro Run games you play to the end raise its overall by 1, up to 99.</w:t>
+      </w:r>
+    </w:p>
+    <w:p>
+      <w:pPr>
+        <w:pStyle w:val="ListParagraph"/>
+        <w:numPr>
+          <w:ilvl w:val="1"/>
+          <w:numId w:val="2"/>
+        </w:numPr>
+      </w:pPr>
+      <w:r>
+        <w:t xml:space="preserve">Simmed games, forfeits and other modes don't count.</w:t>
+      </w:r>
+    </w:p>
+    <w:p>
+      <w:pPr>
+        <w:pStyle w:val="ListParagraph"/>
+        <w:numPr>
+          <w:ilvl w:val="1"/>
+          <w:numId w:val="2"/>
+        </w:numPr>
+      </w:pPr>
+      <w:r>
+        <w:t xml:space="preserve">The game that unlocks the Icon doesn't count either.</w:t>
+      </w:r>
+    </w:p>
+    <w:p>
+      <w:pPr>
+        <w:pStyle w:val="ListParagraph"/>
+        <w:numPr>
+          <w:ilvl w:val="0"/>
+          <w:numId w:val="2"/>
+        </w:numPr>
+      </w:pPr>
+      <w:r>
+        <w:rPr>
+          <w:b/>
+          <w:bCs/>
+        </w:rPr>
+        <w:t xml:space="preserve">No stat picking:</w:t>
+      </w:r>
+      <w:r>
+        <w:t xml:space="preserve"> the build system places each +1 itself.</w:t>
+      </w:r>
+    </w:p>
+    <w:p>
+      <w:pPr>
+        <w:pStyle w:val="ListParagraph"/>
+        <w:numPr>
+          <w:ilvl w:val="1"/>
+          <w:numId w:val="2"/>
+        </w:numPr>
+      </w:pPr>
+      <w:r>
+        <w:t xml:space="preserve">It raises the attributes your build leans on most: the shape its caps come from (archetype, size and weight) and what your position's overall counts most.</w:t>
+      </w:r>
+    </w:p>
+    <w:p>
+      <w:pPr>
+        <w:pStyle w:val="ListParagraph"/>
+        <w:numPr>
+          <w:ilvl w:val="1"/>
+          <w:numId w:val="2"/>
+        </w:numPr>
+      </w:pPr>
+      <w:r>
+        <w:t xml:space="preserve">It goes a point at a time across the top half of that list until the overall is up by one.</w:t>
+      </w:r>
+    </w:p>
+    <w:p>
+      <w:pPr>
+        <w:pStyle w:val="ListParagraph"/>
+        <w:numPr>
+          <w:ilvl w:val="1"/>
+          <w:numId w:val="2"/>
+        </w:numPr>
+      </w:pPr>
+      <w:r>
+        <w:t xml:space="preserve">Attributes at 99 are never touched, and your caps rise with the upgrades.</w:t>
+      </w:r>
+    </w:p>
+    <w:p>
+      <w:pPr>
+        <w:pStyle w:val="ListParagraph"/>
+        <w:numPr>
+          <w:ilvl w:val="1"/>
+          <w:numId w:val="2"/>
+        </w:numPr>
+      </w:pPr>
+      <w:r>
+        <w:t xml:space="preserve">Example: a Sharpshooter's shooting reaches 99 first, and a Glass Cleaner's rebounding and interior defense do.</w:t>
+      </w:r>
+    </w:p>
+    <w:p>
+      <w:pPr>
+        <w:pStyle w:val="ListParagraph"/>
+        <w:numPr>
+          <w:ilvl w:val="0"/>
+          <w:numId w:val="2"/>
+        </w:numPr>
+      </w:pPr>
+      <w:r>
+        <w:rPr>
+          <w:b/>
+          <w:bCs/>
+        </w:rPr>
+        <w:t xml:space="preserve">After a game that earns one, a card shows the new overall and every attribute that went up.</w:t>
+      </w:r>
+    </w:p>
+    <w:p>
+      <w:pPr>
+        <w:pStyle w:val="ListParagraph"/>
+        <w:numPr>
+          <w:ilvl w:val="0"/>
+          <w:numId w:val="2"/>
+        </w:numPr>
+      </w:pPr>
+      <w:r>
+        <w:rPr>
+          <w:b/>
+          <w:bCs/>
+        </w:rPr>
+        <w:t xml:space="preserve">Where to see it:</w:t>
+      </w:r>
+    </w:p>
+    <w:p>
+      <w:pPr>
+        <w:pStyle w:val="ListParagraph"/>
+        <w:numPr>
+          <w:ilvl w:val="1"/>
+          <w:numId w:val="2"/>
+        </w:numPr>
+      </w:pPr>
+      <w:r>
+        <w:t xml:space="preserve">MyPlayer → Attributes, under the max OVR track, shows your progress to the next +1.</w:t>
+      </w:r>
+    </w:p>
+    <w:p>
+      <w:pPr>
+        <w:pStyle w:val="ListParagraph"/>
+        <w:numPr>
+          <w:ilvl w:val="1"/>
+          <w:numId w:val="2"/>
+        </w:numPr>
+      </w:pPr>
+      <w:r>
+        <w:t xml:space="preserve">The Pro Run screen shows it too.</w:t>
+      </w:r>
+    </w:p>
+    <w:p>
+      <w:pPr>
+        <w:pStyle w:val="Heading1"/>
+      </w:pPr>
+      <w:r>
+        <w:t xml:space="preserve">The look</w:t>
+      </w:r>
+    </w:p>
+    <w:p>
+      <w:pPr>
+        <w:pStyle w:val="Heading2"/>
+      </w:pPr>
+      <w:r>
+        <w:t xml:space="preserve">Jersey straps (fixed properly this time)</w:t>
+      </w:r>
+    </w:p>
+    <w:p>
+      <w:pPr>
+        <w:pStyle w:val="ListParagraph"/>
+        <w:numPr>
+          <w:ilvl w:val="0"/>
+          <w:numId w:val="2"/>
+        </w:numPr>
+      </w:pPr>
+      <w:r>
+        <w:rPr>
+          <w:b/>
+          <w:bCs/>
+        </w:rPr>
+        <w:t xml:space="preserve">Why they never showed:</w:t>
+      </w:r>
+      <w:r>
+        <w:t xml:space="preserve"> the strap mesh added in v0.4.7.5 was built, but never drawn. Players in the game and the menus are built in stages, and the staged build never passed the straps on. That's why jerseys still looked strapless.</w:t>
+      </w:r>
+    </w:p>
+    <w:p>
+      <w:pPr>
+        <w:pStyle w:val="ListParagraph"/>
+        <w:numPr>
+          <w:ilvl w:val="0"/>
+          <w:numId w:val="2"/>
+        </w:numPr>
+      </w:pPr>
+      <w:r>
+        <w:rPr>
+          <w:b/>
+          <w:bCs/>
+        </w:rPr>
+        <w:t xml:space="preserve">What a strap is now:</w:t>
+      </w:r>
+      <w:r>
+        <w:t xml:space="preserve"> a real band of fabric. It carries on from the top of the front panel, goes up over the trapezius (midway between the neck and the point of the shoulder) and comes down into the top of the back panel.</w:t>
+      </w:r>
+    </w:p>
+    <w:p>
+      <w:pPr>
+        <w:pStyle w:val="ListParagraph"/>
+        <w:numPr>
+          <w:ilvl w:val="1"/>
+          <w:numId w:val="2"/>
+        </w:numPr>
+      </w:pPr>
+      <w:r>
+        <w:t xml:space="preserve">It has a rolled binding down both edges.</w:t>
+      </w:r>
+    </w:p>
+    <w:p>
+      <w:pPr>
+        <w:pStyle w:val="ListParagraph"/>
+        <w:numPr>
+          <w:ilvl w:val="1"/>
+          <w:numId w:val="2"/>
+        </w:numPr>
+      </w:pPr>
+      <w:r>
+        <w:t xml:space="preserve">It moves with the shoulders.</w:t>
+      </w:r>
+    </w:p>
+    <w:p>
+      <w:pPr>
+        <w:pStyle w:val="ListParagraph"/>
+        <w:numPr>
+          <w:ilvl w:val="1"/>
+          <w:numId w:val="2"/>
+        </w:numPr>
+      </w:pPr>
+      <w:r>
+        <w:t xml:space="preserve">It's drawn just over the skin, so a shrug never shows through it.</w:t>
+      </w:r>
+    </w:p>
+    <w:p>
+      <w:pPr>
+        <w:pStyle w:val="ListParagraph"/>
+        <w:numPr>
+          <w:ilvl w:val="1"/>
+          <w:numId w:val="2"/>
+        </w:numPr>
+      </w:pPr>
+      <w:r>
+        <w:t xml:space="preserve">The fabric's mesh weave runs true to size along it.</w:t>
+      </w:r>
+    </w:p>
+    <w:p>
+      <w:pPr>
+        <w:pStyle w:val="Heading2"/>
+      </w:pPr>
+      <w:r>
+        <w:t xml:space="preserve">Dunks</w:t>
+      </w:r>
+    </w:p>
+    <w:p>
+      <w:pPr>
+        <w:pStyle w:val="ListParagraph"/>
+        <w:numPr>
+          <w:ilvl w:val="0"/>
+          <w:numId w:val="2"/>
+        </w:numPr>
+      </w:pPr>
+      <w:r>
+        <w:rPr>
+          <w:b/>
+          <w:bCs/>
+        </w:rPr>
+        <w:t xml:space="preserve">Less repetition across packages.</w:t>
+      </w:r>
+      <w:r>
+        <w:t xml:space="preserve"> Every package now has its signature finish plus one other (High Flyer has two).</w:t>
+      </w:r>
+    </w:p>
+    <w:p>
+      <w:pPr>
+        <w:pStyle w:val="ListParagraph"/>
+        <w:numPr>
+          <w:ilvl w:val="1"/>
+          <w:numId w:val="2"/>
+        </w:numPr>
+      </w:pPr>
+      <w:r>
+        <w:t xml:space="preserve">No generic finish is shared by more than 4 packages. Before, reverse slams showed up in 15 packages and double clutches in 14.</w:t>
+      </w:r>
+    </w:p>
+    <w:p>
+      <w:pPr>
+        <w:pStyle w:val="ListParagraph"/>
+        <w:numPr>
+          <w:ilvl w:val="1"/>
+          <w:numId w:val="2"/>
+        </w:numPr>
+      </w:pPr>
+      <w:r>
+        <w:t xml:space="preserve">Every signature belongs to one package only. The Spin Mill no longer borrows the Eastbay.</w:t>
+      </w:r>
+    </w:p>
+    <w:p>
+      <w:pPr>
+        <w:pStyle w:val="ListParagraph"/>
+        <w:numPr>
+          <w:ilvl w:val="0"/>
+          <w:numId w:val="2"/>
+        </w:numPr>
+      </w:pPr>
+      <w:r>
+        <w:rPr>
+          <w:b/>
+          <w:bCs/>
+        </w:rPr>
+        <w:t xml:space="preserve">Windmills:</w:t>
+      </w:r>
+      <w:r>
+        <w:t xml:space="preserve"> the arm now goes round straight from the shoulder, at full length, through the jump.</w:t>
+      </w:r>
+    </w:p>
+    <w:p>
+      <w:pPr>
+        <w:pStyle w:val="ListParagraph"/>
+        <w:numPr>
+          <w:ilvl w:val="1"/>
+          <w:numId w:val="2"/>
+        </w:numPr>
+      </w:pPr>
+      <w:r>
+        <w:t xml:space="preserve">Before, the circle sat above the shoulder, so the elbow folded at the bottom, the arm over-stretched at the top and most of the circle happened during the gather.</w:t>
+      </w:r>
+    </w:p>
+    <w:p>
+      <w:pPr>
+        <w:pStyle w:val="ListParagraph"/>
+        <w:numPr>
+          <w:ilvl w:val="1"/>
+          <w:numId w:val="2"/>
+        </w:numPr>
+      </w:pPr>
+      <w:r>
+        <w:t xml:space="preserve">It comes over the top and down at the rim with the ball still in the hand.</w:t>
+      </w:r>
+    </w:p>
+    <w:p>
+      <w:pPr>
+        <w:pStyle w:val="ListParagraph"/>
+        <w:numPr>
+          <w:ilvl w:val="0"/>
+          <w:numId w:val="2"/>
+        </w:numPr>
+      </w:pPr>
+      <w:r>
+        <w:rPr>
+          <w:b/>
+          <w:bCs/>
+        </w:rPr>
+        <w:t xml:space="preserve">The Eastbay really goes between the legs, in the air.</w:t>
+      </w:r>
+    </w:p>
+    <w:p>
+      <w:pPr>
+        <w:pStyle w:val="ListParagraph"/>
+        <w:numPr>
+          <w:ilvl w:val="1"/>
+          <w:numId w:val="2"/>
+        </w:numPr>
+      </w:pPr>
+      <w:r>
+        <w:t xml:space="preserve">The right hand takes the ball down in front and through the gap under the pelvis between the split legs.</w:t>
+      </w:r>
+    </w:p>
+    <w:p>
+      <w:pPr>
+        <w:pStyle w:val="ListParagraph"/>
+        <w:numPr>
+          <w:ilvl w:val="1"/>
+          <w:numId w:val="2"/>
+        </w:numPr>
+      </w:pPr>
+      <w:r>
+        <w:t xml:space="preserve">The left hand takes it on the far side and carries it up to the rim.</w:t>
+      </w:r>
+    </w:p>
+    <w:p>
+      <w:pPr>
+        <w:pStyle w:val="ListParagraph"/>
+        <w:numPr>
+          <w:ilvl w:val="1"/>
+          <w:numId w:val="2"/>
+        </w:numPr>
+      </w:pPr>
+      <w:r>
+        <w:t xml:space="preserve">Before, it was timed from the gather, so most of it happened on the floor, and the ball dipped in front of the right thigh instead of going through.</w:t>
+      </w:r>
+    </w:p>
+    <w:p>
+      <w:pPr>
+        <w:pStyle w:val="Heading2"/>
+      </w:pPr>
+      <w:r>
+        <w:t xml:space="preserve">Celebrations</w:t>
+      </w:r>
+    </w:p>
+    <w:p>
+      <w:pPr>
+        <w:pStyle w:val="ListParagraph"/>
+        <w:numPr>
+          <w:ilvl w:val="0"/>
+          <w:numId w:val="2"/>
+        </w:numPr>
+      </w:pPr>
+      <w:r>
+        <w:rPr>
+          <w:b/>
+          <w:bCs/>
+        </w:rPr>
+        <w:t xml:space="preserve">They work in games now.</w:t>
+      </w:r>
+    </w:p>
+    <w:p>
+      <w:pPr>
+        <w:pStyle w:val="ListParagraph"/>
+        <w:numPr>
+          <w:ilvl w:val="1"/>
+          <w:numId w:val="2"/>
+        </w:numPr>
+      </w:pPr>
+      <w:r>
+        <w:t xml:space="preserve">Before, they only worked if you pressed G / D-pad up during the second and a half of dead ball after a basket while your player was doing nothing, and the check then cut them off.</w:t>
+      </w:r>
+    </w:p>
+    <w:p>
+      <w:pPr>
+        <w:pStyle w:val="ListParagraph"/>
+        <w:numPr>
+          <w:ilvl w:val="1"/>
+          <w:numId w:val="2"/>
+        </w:numPr>
+      </w:pPr>
+      <w:r>
+        <w:t xml:space="preserve">Now a press waits up to 2.5 seconds for your player to be free (follow-through, landing, hanging on the rim).</w:t>
+      </w:r>
+    </w:p>
+    <w:p>
+      <w:pPr>
+        <w:pStyle w:val="ListParagraph"/>
+        <w:numPr>
+          <w:ilvl w:val="1"/>
+          <w:numId w:val="2"/>
+        </w:numPr>
+      </w:pPr>
+      <w:r>
+        <w:t xml:space="preserve">They play in any dead ball, check or inbound (unless you have the ball) and for 3 seconds after your team scores.</w:t>
+      </w:r>
+    </w:p>
+    <w:p>
+      <w:pPr>
+        <w:pStyle w:val="ListParagraph"/>
+        <w:numPr>
+          <w:ilvl w:val="1"/>
+          <w:numId w:val="2"/>
+        </w:numPr>
+      </w:pPr>
+      <w:r>
+        <w:t xml:space="preserve">Whoever has the ball stops for the check; everyone else finishes.</w:t>
+      </w:r>
+    </w:p>
+    <w:p>
+      <w:pPr>
+        <w:pStyle w:val="ListParagraph"/>
+        <w:numPr>
+          <w:ilvl w:val="0"/>
+          <w:numId w:val="2"/>
+        </w:numPr>
+      </w:pPr>
+      <w:r>
+        <w:rPr>
+          <w:b/>
+          <w:bCs/>
+        </w:rPr>
+        <w:t xml:space="preserve">Controllers:</w:t>
+      </w:r>
+      <w:r>
+        <w:t xml:space="preserve"> pads the browser doesn't map to the standard layout send the D-pad as axes. The game now reads those too, so D-pad up works on them.</w:t>
+      </w:r>
+    </w:p>
+    <w:p>
+      <w:pPr>
+        <w:pStyle w:val="ListParagraph"/>
+        <w:numPr>
+          <w:ilvl w:val="0"/>
+          <w:numId w:val="2"/>
+        </w:numPr>
+      </w:pPr>
+      <w:r>
+        <w:rPr>
+          <w:b/>
+          <w:bCs/>
+        </w:rPr>
+        <w:t xml:space="preserve">No more arms through the body:</w:t>
+      </w:r>
+      <w:r>
+        <w:t xml:space="preserve"> Chest Thump, Heart, Dust Off, Archer and Sleep put a hand or forearm through the chest. Each was fixed and every celebration was re-checked on three builds: none clip now.</w:t>
+      </w:r>
+    </w:p>
+    <w:p>
+      <w:pPr>
+        <w:pStyle w:val="Heading2"/>
+      </w:pPr>
+      <w:r>
+        <w:t xml:space="preserve">Posterizer and Contact Finisher</w:t>
+      </w:r>
+    </w:p>
+    <w:p>
+      <w:pPr>
+        <w:pStyle w:val="ListParagraph"/>
+        <w:numPr>
+          <w:ilvl w:val="0"/>
+          <w:numId w:val="2"/>
+        </w:numPr>
+      </w:pPr>
+      <w:r>
+        <w:rPr>
+          <w:b/>
+          <w:bCs/>
+        </w:rPr>
+        <w:t xml:space="preserve">Posterizer only fires on a dunk that gets to the rim.</w:t>
+      </w:r>
+    </w:p>
+    <w:p>
+      <w:pPr>
+        <w:pStyle w:val="ListParagraph"/>
+        <w:numPr>
+          <w:ilvl w:val="1"/>
+          <w:numId w:val="2"/>
+        </w:numPr>
+      </w:pPr>
+      <w:r>
+        <w:t xml:space="preserve">Winning the contact on the way up now waits for the slam.</w:t>
+      </w:r>
+    </w:p>
+    <w:p>
+      <w:pPr>
+        <w:pStyle w:val="ListParagraph"/>
+        <w:numPr>
+          <w:ilvl w:val="1"/>
+          <w:numId w:val="2"/>
+        </w:numPr>
+      </w:pPr>
+      <w:r>
+        <w:t xml:space="preserve">The knockdown happens if he throws it down. If he rims it out, it's a bump.</w:t>
+      </w:r>
+    </w:p>
+    <w:p>
+      <w:pPr>
+        <w:pStyle w:val="ListParagraph"/>
+        <w:numPr>
+          <w:ilvl w:val="1"/>
+          <w:numId w:val="2"/>
+        </w:numPr>
+      </w:pPr>
+      <w:r>
+        <w:t xml:space="preserve">If he never gets to the rim and has to flip it up, it's a layup, and a Contact Finisher's push-off (or a plain bump) takes over instead of a poster.</w:t>
+      </w:r>
+    </w:p>
+    <w:p>
+      <w:pPr>
+        <w:pStyle w:val="ListParagraph"/>
+        <w:numPr>
+          <w:ilvl w:val="1"/>
+          <w:numId w:val="2"/>
+        </w:numPr>
+      </w:pPr>
+      <w:r>
+        <w:t xml:space="preserve">Before, the poster fired at the contact, even when the dunk then turned into a layup.</w:t>
+      </w:r>
+    </w:p>
+    <w:p>
+      <w:pPr>
+        <w:pStyle w:val="Heading1"/>
+      </w:pPr>
+      <w:r>
+        <w:t xml:space="preserve">Store, menus and HUD</w:t>
+      </w:r>
+    </w:p>
+    <w:p>
+      <w:pPr>
+        <w:pStyle w:val="ListParagraph"/>
+        <w:numPr>
+          <w:ilvl w:val="0"/>
+          <w:numId w:val="2"/>
+        </w:numPr>
+      </w:pPr>
+      <w:r>
+        <w:rPr>
+          <w:b/>
+          <w:bCs/>
+        </w:rPr>
+        <w:t xml:space="preserve">Twice the apparel</w:t>
+      </w:r>
+      <w:r>
+        <w:t xml:space="preserve">, Daily Spin exclusives included. 95 new items, all original:</w:t>
+      </w:r>
+    </w:p>
+    <w:tbl>
+      <w:tblPr>
+        <w:tblW w:type="dxa" w:w="9360"/>
+        <w:tblBorders>
+          <w:top w:val="single" w:color="auto" w:sz="4"/>
+          <w:left w:val="single" w:color="auto" w:sz="4"/>
+          <w:bottom w:val="single" w:color="auto" w:sz="4"/>
+          <w:right w:val="single" w:color="auto" w:sz="4"/>
+          <w:insideH w:val="single" w:color="auto" w:sz="4"/>
+          <w:insideV w:val="single" w:color="auto" w:sz="4"/>
+        </w:tblBorders>
+      </w:tblPr>
+      <w:tblGrid>
+        <w:gridCol w:w="3120"/>
+        <w:gridCol w:w="3120"/>
+        <w:gridCol w:w="3120"/>
+      </w:tblGrid>
+      <w:tr>
+        <w:trPr>
+          <w:tblHeader/>
+        </w:trPr>
+        <w:tc>
+          <w:tcPr>
+            <w:tcW w:type="dxa" w:w="3120"/>
+            <w:shd w:fill="DCE6F1" w:color="auto" w:val="clear"/>
+            <w:tcMar>
+              <w:top w:type="dxa" w:w="60"/>
+              <w:left w:type="dxa" w:w="100"/>
+              <w:bottom w:type="dxa" w:w="60"/>
+              <w:right w:type="dxa" w:w="100"/>
+            </w:tcMar>
+          </w:tcPr>
+          <w:p>
+            <w:r>
+              <w:rPr>
+                <w:b/>
+                <w:bCs/>
+              </w:rPr>
+              <w:t xml:space="preserve">Item</w:t>
+            </w:r>
+          </w:p>
+        </w:tc>
+        <w:tc>
+          <w:tcPr>
+            <w:tcW w:type="dxa" w:w="3120"/>
+            <w:shd w:fill="DCE6F1" w:color="auto" w:val="clear"/>
+            <w:tcMar>
+              <w:top w:type="dxa" w:w="60"/>
+              <w:left w:type="dxa" w:w="100"/>
+              <w:bottom w:type="dxa" w:w="60"/>
+              <w:right w:type="dxa" w:w="100"/>
+            </w:tcMar>
+          </w:tcPr>
+          <w:p>
+            <w:r>
+              <w:rPr>
+                <w:b/>
+                <w:bCs/>
+              </w:rPr>
+              <w:t xml:space="preserve">Before</w:t>
+            </w:r>
+          </w:p>
+        </w:tc>
+        <w:tc>
+          <w:tcPr>
+            <w:tcW w:type="dxa" w:w="3120"/>
+            <w:shd w:fill="DCE6F1" w:color="auto" w:val="clear"/>
+            <w:tcMar>
+              <w:top w:type="dxa" w:w="60"/>
+              <w:left w:type="dxa" w:w="100"/>
+              <w:bottom w:type="dxa" w:w="60"/>
+              <w:right w:type="dxa" w:w="100"/>
+            </w:tcMar>
+          </w:tcPr>
+          <w:p>
+            <w:r>
+              <w:rPr>
+                <w:b/>
+                <w:bCs/>
+              </w:rPr>
+              <w:t xml:space="preserve">Now</w:t>
+            </w:r>
+          </w:p>
+        </w:tc>
+      </w:tr>
+      <w:tr>
+        <w:trPr>
+          <w:tblHeader w:val="false"/>
+        </w:trPr>
+        <w:tc>
+          <w:tcPr>
+            <w:tcW w:type="dxa" w:w="3120"/>
+            <w:tcMar>
+              <w:top w:type="dxa" w:w="60"/>
+              <w:left w:type="dxa" w:w="100"/>
+              <w:bottom w:type="dxa" w:w="60"/>
+              <w:right w:type="dxa" w:w="100"/>
+            </w:tcMar>
+          </w:tcPr>
+          <w:p>
+            <w:r>
+              <w:t xml:space="preserve">Tops</w:t>
+            </w:r>
+          </w:p>
+        </w:tc>
+        <w:tc>
+          <w:tcPr>
+            <w:tcW w:type="dxa" w:w="3120"/>
+            <w:tcMar>
+              <w:top w:type="dxa" w:w="60"/>
+              <w:left w:type="dxa" w:w="100"/>
+              <w:bottom w:type="dxa" w:w="60"/>
+              <w:right w:type="dxa" w:w="100"/>
+            </w:tcMar>
+          </w:tcPr>
+          <w:p>
+            <w:r>
+              <w:t xml:space="preserve">31</w:t>
+            </w:r>
+          </w:p>
+        </w:tc>
+        <w:tc>
+          <w:tcPr>
+            <w:tcW w:type="dxa" w:w="3120"/>
+            <w:tcMar>
+              <w:top w:type="dxa" w:w="60"/>
+              <w:left w:type="dxa" w:w="100"/>
+              <w:bottom w:type="dxa" w:w="60"/>
+              <w:right w:type="dxa" w:w="100"/>
+            </w:tcMar>
+          </w:tcPr>
+          <w:p>
+            <w:r>
+              <w:t xml:space="preserve">62</w:t>
+            </w:r>
+          </w:p>
+        </w:tc>
+      </w:tr>
+      <w:tr>
+        <w:trPr>
+          <w:tblHeader w:val="false"/>
+        </w:trPr>
+        <w:tc>
+          <w:tcPr>
+            <w:tcW w:type="dxa" w:w="3120"/>
+            <w:tcMar>
+              <w:top w:type="dxa" w:w="60"/>
+              <w:left w:type="dxa" w:w="100"/>
+              <w:bottom w:type="dxa" w:w="60"/>
+              <w:right w:type="dxa" w:w="100"/>
+            </w:tcMar>
+          </w:tcPr>
+          <w:p>
+            <w:r>
+              <w:t xml:space="preserve">Bottoms</w:t>
+            </w:r>
+          </w:p>
+        </w:tc>
+        <w:tc>
+          <w:tcPr>
+            <w:tcW w:type="dxa" w:w="3120"/>
+            <w:tcMar>
+              <w:top w:type="dxa" w:w="60"/>
+              <w:left w:type="dxa" w:w="100"/>
+              <w:bottom w:type="dxa" w:w="60"/>
+              <w:right w:type="dxa" w:w="100"/>
+            </w:tcMar>
+          </w:tcPr>
+          <w:p>
+            <w:r>
+              <w:t xml:space="preserve">18</w:t>
+            </w:r>
+          </w:p>
+        </w:tc>
+        <w:tc>
+          <w:tcPr>
+            <w:tcW w:type="dxa" w:w="3120"/>
+            <w:tcMar>
+              <w:top w:type="dxa" w:w="60"/>
+              <w:left w:type="dxa" w:w="100"/>
+              <w:bottom w:type="dxa" w:w="60"/>
+              <w:right w:type="dxa" w:w="100"/>
+            </w:tcMar>
+          </w:tcPr>
+          <w:p>
+            <w:r>
+              <w:t xml:space="preserve">36</w:t>
+            </w:r>
+          </w:p>
+        </w:tc>
+      </w:tr>
+      <w:tr>
+        <w:trPr>
+          <w:tblHeader w:val="false"/>
+        </w:trPr>
+        <w:tc>
+          <w:tcPr>
+            <w:tcW w:type="dxa" w:w="3120"/>
+            <w:tcMar>
+              <w:top w:type="dxa" w:w="60"/>
+              <w:left w:type="dxa" w:w="100"/>
+              <w:bottom w:type="dxa" w:w="60"/>
+              <w:right w:type="dxa" w:w="100"/>
+            </w:tcMar>
+          </w:tcPr>
+          <w:p>
+            <w:r>
+              <w:t xml:space="preserve">Shoes</w:t>
+            </w:r>
+          </w:p>
+        </w:tc>
+        <w:tc>
+          <w:tcPr>
+            <w:tcW w:type="dxa" w:w="3120"/>
+            <w:tcMar>
+              <w:top w:type="dxa" w:w="60"/>
+              <w:left w:type="dxa" w:w="100"/>
+              <w:bottom w:type="dxa" w:w="60"/>
+              <w:right w:type="dxa" w:w="100"/>
+            </w:tcMar>
+          </w:tcPr>
+          <w:p>
+            <w:r>
+              <w:t xml:space="preserve">18</w:t>
+            </w:r>
+          </w:p>
+        </w:tc>
+        <w:tc>
+          <w:tcPr>
+            <w:tcW w:type="dxa" w:w="3120"/>
+            <w:tcMar>
+              <w:top w:type="dxa" w:w="60"/>
+              <w:left w:type="dxa" w:w="100"/>
+              <w:bottom w:type="dxa" w:w="60"/>
+              <w:right w:type="dxa" w:w="100"/>
+            </w:tcMar>
+          </w:tcPr>
+          <w:p>
+            <w:r>
+              <w:t xml:space="preserve">36</w:t>
+            </w:r>
+          </w:p>
+        </w:tc>
+      </w:tr>
+      <w:tr>
+        <w:trPr>
+          <w:tblHeader w:val="false"/>
+        </w:trPr>
+        <w:tc>
+          <w:tcPr>
+            <w:tcW w:type="dxa" w:w="3120"/>
+            <w:tcMar>
+              <w:top w:type="dxa" w:w="60"/>
+              <w:left w:type="dxa" w:w="100"/>
+              <w:bottom w:type="dxa" w:w="60"/>
+              <w:right w:type="dxa" w:w="100"/>
+            </w:tcMar>
+          </w:tcPr>
+          <w:p>
+            <w:r>
+              <w:t xml:space="preserve">Headbands</w:t>
+            </w:r>
+          </w:p>
+        </w:tc>
+        <w:tc>
+          <w:tcPr>
+            <w:tcW w:type="dxa" w:w="3120"/>
+            <w:tcMar>
+              <w:top w:type="dxa" w:w="60"/>
+              <w:left w:type="dxa" w:w="100"/>
+              <w:bottom w:type="dxa" w:w="60"/>
+              <w:right w:type="dxa" w:w="100"/>
+            </w:tcMar>
+          </w:tcPr>
+          <w:p>
+            <w:r>
+              <w:t xml:space="preserve">8</w:t>
+            </w:r>
+          </w:p>
+        </w:tc>
+        <w:tc>
+          <w:tcPr>
+            <w:tcW w:type="dxa" w:w="3120"/>
+            <w:tcMar>
+              <w:top w:type="dxa" w:w="60"/>
+              <w:left w:type="dxa" w:w="100"/>
+              <w:bottom w:type="dxa" w:w="60"/>
+              <w:right w:type="dxa" w:w="100"/>
+            </w:tcMar>
+          </w:tcPr>
+          <w:p>
+            <w:r>
+              <w:t xml:space="preserve">16</w:t>
+            </w:r>
+          </w:p>
+        </w:tc>
+      </w:tr>
+      <w:tr>
+        <w:trPr>
+          <w:tblHeader w:val="false"/>
+        </w:trPr>
+        <w:tc>
+          <w:tcPr>
+            <w:tcW w:type="dxa" w:w="3120"/>
+            <w:tcMar>
+              <w:top w:type="dxa" w:w="60"/>
+              <w:left w:type="dxa" w:w="100"/>
+              <w:bottom w:type="dxa" w:w="60"/>
+              <w:right w:type="dxa" w:w="100"/>
+            </w:tcMar>
+          </w:tcPr>
+          <w:p>
+            <w:r>
+              <w:t xml:space="preserve">Sleeves</w:t>
+            </w:r>
+          </w:p>
+        </w:tc>
+        <w:tc>
+          <w:tcPr>
+            <w:tcW w:type="dxa" w:w="3120"/>
+            <w:tcMar>
+              <w:top w:type="dxa" w:w="60"/>
+              <w:left w:type="dxa" w:w="100"/>
+              <w:bottom w:type="dxa" w:w="60"/>
+              <w:right w:type="dxa" w:w="100"/>
+            </w:tcMar>
+          </w:tcPr>
+          <w:p>
+            <w:r>
+              <w:t xml:space="preserve">6</w:t>
+            </w:r>
+          </w:p>
+        </w:tc>
+        <w:tc>
+          <w:tcPr>
+            <w:tcW w:type="dxa" w:w="3120"/>
+            <w:tcMar>
+              <w:top w:type="dxa" w:w="60"/>
+              <w:left w:type="dxa" w:w="100"/>
+              <w:bottom w:type="dxa" w:w="60"/>
+              <w:right w:type="dxa" w:w="100"/>
+            </w:tcMar>
+          </w:tcPr>
+          <w:p>
+            <w:r>
+              <w:t xml:space="preserve">12</w:t>
+            </w:r>
+          </w:p>
+        </w:tc>
+      </w:tr>
+      <w:tr>
+        <w:trPr>
+          <w:tblHeader w:val="false"/>
+        </w:trPr>
+        <w:tc>
+          <w:tcPr>
+            <w:tcW w:type="dxa" w:w="3120"/>
+            <w:tcMar>
+              <w:top w:type="dxa" w:w="60"/>
+              <w:left w:type="dxa" w:w="100"/>
+              <w:bottom w:type="dxa" w:w="60"/>
+              <w:right w:type="dxa" w:w="100"/>
+            </w:tcMar>
+          </w:tcPr>
+          <w:p>
+            <w:r>
+              <w:t xml:space="preserve">Socks</w:t>
+            </w:r>
+          </w:p>
+        </w:tc>
+        <w:tc>
+          <w:tcPr>
+            <w:tcW w:type="dxa" w:w="3120"/>
+            <w:tcMar>
+              <w:top w:type="dxa" w:w="60"/>
+              <w:left w:type="dxa" w:w="100"/>
+              <w:bottom w:type="dxa" w:w="60"/>
+              <w:right w:type="dxa" w:w="100"/>
+            </w:tcMar>
+          </w:tcPr>
+          <w:p>
+            <w:r>
+              <w:t xml:space="preserve">5</w:t>
+            </w:r>
+          </w:p>
+        </w:tc>
+        <w:tc>
+          <w:tcPr>
+            <w:tcW w:type="dxa" w:w="3120"/>
+            <w:tcMar>
+              <w:top w:type="dxa" w:w="60"/>
+              <w:left w:type="dxa" w:w="100"/>
+              <w:bottom w:type="dxa" w:w="60"/>
+              <w:right w:type="dxa" w:w="100"/>
+            </w:tcMar>
+          </w:tcPr>
+          <w:p>
+            <w:r>
+              <w:t xml:space="preserve">10</w:t>
+            </w:r>
+          </w:p>
+        </w:tc>
+      </w:tr>
+      <w:tr>
+        <w:trPr>
+          <w:tblHeader w:val="false"/>
+        </w:trPr>
+        <w:tc>
+          <w:tcPr>
+            <w:tcW w:type="dxa" w:w="3120"/>
+            <w:tcMar>
+              <w:top w:type="dxa" w:w="60"/>
+              <w:left w:type="dxa" w:w="100"/>
+              <w:bottom w:type="dxa" w:w="60"/>
+              <w:right w:type="dxa" w:w="100"/>
+            </w:tcMar>
+          </w:tcPr>
+          <w:p>
+            <w:r>
+              <w:t xml:space="preserve">Wristbands</w:t>
+            </w:r>
+          </w:p>
+        </w:tc>
+        <w:tc>
+          <w:tcPr>
+            <w:tcW w:type="dxa" w:w="3120"/>
+            <w:tcMar>
+              <w:top w:type="dxa" w:w="60"/>
+              <w:left w:type="dxa" w:w="100"/>
+              <w:bottom w:type="dxa" w:w="60"/>
+              <w:right w:type="dxa" w:w="100"/>
+            </w:tcMar>
+          </w:tcPr>
+          <w:p>
+            <w:r>
+              <w:t xml:space="preserve">4</w:t>
+            </w:r>
+          </w:p>
+        </w:tc>
+        <w:tc>
+          <w:tcPr>
+            <w:tcW w:type="dxa" w:w="3120"/>
+            <w:tcMar>
+              <w:top w:type="dxa" w:w="60"/>
+              <w:left w:type="dxa" w:w="100"/>
+              <w:bottom w:type="dxa" w:w="60"/>
+              <w:right w:type="dxa" w:w="100"/>
+            </w:tcMar>
+          </w:tcPr>
+          <w:p>
+            <w:r>
+              <w:t xml:space="preserve">8</w:t>
+            </w:r>
+          </w:p>
+        </w:tc>
+      </w:tr>
+      <w:tr>
+        <w:trPr>
+          <w:tblHeader w:val="false"/>
+        </w:trPr>
+        <w:tc>
+          <w:tcPr>
+            <w:tcW w:type="dxa" w:w="3120"/>
+            <w:tcMar>
+              <w:top w:type="dxa" w:w="60"/>
+              <w:left w:type="dxa" w:w="100"/>
+              <w:bottom w:type="dxa" w:w="60"/>
+              <w:right w:type="dxa" w:w="100"/>
+            </w:tcMar>
+          </w:tcPr>
+          <w:p>
+            <w:r>
+              <w:t xml:space="preserve">Leg sleeves</w:t>
+            </w:r>
+          </w:p>
+        </w:tc>
+        <w:tc>
+          <w:tcPr>
+            <w:tcW w:type="dxa" w:w="3120"/>
+            <w:tcMar>
+              <w:top w:type="dxa" w:w="60"/>
+              <w:left w:type="dxa" w:w="100"/>
+              <w:bottom w:type="dxa" w:w="60"/>
+              <w:right w:type="dxa" w:w="100"/>
+            </w:tcMar>
+          </w:tcPr>
+          <w:p>
+            <w:r>
+              <w:t xml:space="preserve">2</w:t>
+            </w:r>
+          </w:p>
+        </w:tc>
+        <w:tc>
+          <w:tcPr>
+            <w:tcW w:type="dxa" w:w="3120"/>
+            <w:tcMar>
+              <w:top w:type="dxa" w:w="60"/>
+              <w:left w:type="dxa" w:w="100"/>
+              <w:bottom w:type="dxa" w:w="60"/>
+              <w:right w:type="dxa" w:w="100"/>
+            </w:tcMar>
+          </w:tcPr>
+          <w:p>
+            <w:r>
+              <w:t xml:space="preserve">4</w:t>
+            </w:r>
+          </w:p>
+        </w:tc>
+      </w:tr>
+      <w:tr>
+        <w:trPr>
+          <w:tblHeader w:val="false"/>
+        </w:trPr>
+        <w:tc>
+          <w:tcPr>
+            <w:tcW w:type="dxa" w:w="3120"/>
+            <w:tcMar>
+              <w:top w:type="dxa" w:w="60"/>
+              <w:left w:type="dxa" w:w="100"/>
+              <w:bottom w:type="dxa" w:w="60"/>
+              <w:right w:type="dxa" w:w="100"/>
+            </w:tcMar>
+          </w:tcPr>
+          <w:p>
+            <w:r>
+              <w:t xml:space="preserve">Knee pads</w:t>
+            </w:r>
+          </w:p>
+        </w:tc>
+        <w:tc>
+          <w:tcPr>
+            <w:tcW w:type="dxa" w:w="3120"/>
+            <w:tcMar>
+              <w:top w:type="dxa" w:w="60"/>
+              <w:left w:type="dxa" w:w="100"/>
+              <w:bottom w:type="dxa" w:w="60"/>
+              <w:right w:type="dxa" w:w="100"/>
+            </w:tcMar>
+          </w:tcPr>
+          <w:p>
+            <w:r>
+              <w:t xml:space="preserve">1</w:t>
+            </w:r>
+          </w:p>
+        </w:tc>
+        <w:tc>
+          <w:tcPr>
+            <w:tcW w:type="dxa" w:w="3120"/>
+            <w:tcMar>
+              <w:top w:type="dxa" w:w="60"/>
+              <w:left w:type="dxa" w:w="100"/>
+              <w:bottom w:type="dxa" w:w="60"/>
+              <w:right w:type="dxa" w:w="100"/>
+            </w:tcMar>
+          </w:tcPr>
+          <w:p>
+            <w:r>
+              <w:t xml:space="preserve">2</w:t>
+            </w:r>
+          </w:p>
+        </w:tc>
+      </w:tr>
+      <w:tr>
+        <w:trPr>
+          <w:tblHeader w:val="false"/>
+        </w:trPr>
+        <w:tc>
+          <w:tcPr>
+            <w:tcW w:type="dxa" w:w="3120"/>
+            <w:tcMar>
+              <w:top w:type="dxa" w:w="60"/>
+              <w:left w:type="dxa" w:w="100"/>
+              <w:bottom w:type="dxa" w:w="60"/>
+              <w:right w:type="dxa" w:w="100"/>
+            </w:tcMar>
+          </w:tcPr>
+          <w:p>
+            <w:r>
+              <w:t xml:space="preserve">Chains</w:t>
+            </w:r>
+          </w:p>
+        </w:tc>
+        <w:tc>
+          <w:tcPr>
+            <w:tcW w:type="dxa" w:w="3120"/>
+            <w:tcMar>
+              <w:top w:type="dxa" w:w="60"/>
+              <w:left w:type="dxa" w:w="100"/>
+              <w:bottom w:type="dxa" w:w="60"/>
+              <w:right w:type="dxa" w:w="100"/>
+            </w:tcMar>
+          </w:tcPr>
+          <w:p>
+            <w:r>
+              <w:t xml:space="preserve">2</w:t>
+            </w:r>
+          </w:p>
+        </w:tc>
+        <w:tc>
+          <w:tcPr>
+            <w:tcW w:type="dxa" w:w="3120"/>
+            <w:tcMar>
+              <w:top w:type="dxa" w:w="60"/>
+              <w:left w:type="dxa" w:w="100"/>
+              <w:bottom w:type="dxa" w:w="60"/>
+              <w:right w:type="dxa" w:w="100"/>
+            </w:tcMar>
+          </w:tcPr>
+          <w:p>
+            <w:r>
+              <w:t xml:space="preserve">4</w:t>
+            </w:r>
+          </w:p>
+        </w:tc>
+      </w:tr>
+      <w:tr>
+        <w:trPr>
+          <w:tblHeader w:val="false"/>
+        </w:trPr>
+        <w:tc>
+          <w:tcPr>
+            <w:tcW w:type="dxa" w:w="3120"/>
+            <w:tcMar>
+              <w:top w:type="dxa" w:w="60"/>
+              <w:left w:type="dxa" w:w="100"/>
+              <w:bottom w:type="dxa" w:w="60"/>
+              <w:right w:type="dxa" w:w="100"/>
+            </w:tcMar>
+          </w:tcPr>
+          <w:p>
+            <w:r>
+              <w:t xml:space="preserve">Daily Spin wearables</w:t>
+            </w:r>
+          </w:p>
+        </w:tc>
+        <w:tc>
+          <w:tcPr>
+            <w:tcW w:type="dxa" w:w="3120"/>
+            <w:tcMar>
+              <w:top w:type="dxa" w:w="60"/>
+              <w:left w:type="dxa" w:w="100"/>
+              <w:bottom w:type="dxa" w:w="60"/>
+              <w:right w:type="dxa" w:w="100"/>
+            </w:tcMar>
+          </w:tcPr>
+          <w:p>
+            <w:r>
+              <w:t xml:space="preserve">6</w:t>
+            </w:r>
+          </w:p>
+        </w:tc>
+        <w:tc>
+          <w:tcPr>
+            <w:tcW w:type="dxa" w:w="3120"/>
+            <w:tcMar>
+              <w:top w:type="dxa" w:w="60"/>
+              <w:left w:type="dxa" w:w="100"/>
+              <w:bottom w:type="dxa" w:w="60"/>
+              <w:right w:type="dxa" w:w="100"/>
+            </w:tcMar>
+          </w:tcPr>
+          <w:p>
+            <w:r>
+              <w:t xml:space="preserve">12</w:t>
+            </w:r>
+          </w:p>
+        </w:tc>
+      </w:tr>
+    </w:tbl>
+    <w:p>
+      <w:pPr>
+        <w:spacing w:after="60"/>
+      </w:pPr>
+    </w:p>
+    <w:p>
+      <w:pPr>
+        <w:spacing w:after="120"/>
+      </w:pPr>
+      <w:r>
+        <w:t xml:space="preserve">The new Daily Spin wearables are the Solstice Jersey and Shorts, Aurora Glow Headband, Rose Ice Chain, Frostbite Shooting Sleeve and Kinetic Hi / Aurora.</w:t>
+      </w:r>
+    </w:p>
+    <w:p>
+      <w:pPr>
+        <w:pStyle w:val="ListParagraph"/>
+        <w:numPr>
+          <w:ilvl w:val="0"/>
+          <w:numId w:val="2"/>
+        </w:numPr>
+      </w:pPr>
+      <w:r>
+        <w:rPr>
+          <w:b/>
+          <w:bCs/>
+        </w:rPr>
+        <w:t xml:space="preserve">The bug report's "Kind of bug" list is readable.</w:t>
+      </w:r>
+      <w:r>
+        <w:t xml:space="preserve"> An open dropdown is drawn by the system (light on Windows), and its options had inherited the menus' light text. Every dropdown in the game now opens dark with light text.</w:t>
+      </w:r>
+    </w:p>
+    <w:p>
+      <w:pPr>
+        <w:pStyle w:val="ListParagraph"/>
+        <w:numPr>
+          <w:ilvl w:val="0"/>
+          <w:numId w:val="2"/>
+        </w:numPr>
+      </w:pPr>
+      <w:r>
+        <w:rPr>
+          <w:b/>
+          <w:bCs/>
+        </w:rPr>
+        <w:t xml:space="preserve">Your line beside the Locked-In grade:</w:t>
+      </w:r>
+      <w:r>
+        <w:t xml:space="preserve"> PTS, REB, AST on top and STL, BLK, TO underneath, in a panel attached to the right of the grade.</w:t>
+      </w:r>
+    </w:p>
+    <w:p>
+      <w:pPr>
+        <w:pStyle w:val="ListParagraph"/>
+        <w:numPr>
+          <w:ilvl w:val="1"/>
+          <w:numId w:val="2"/>
+        </w:numPr>
+      </w:pPr>
+      <w:r>
+        <w:t xml:space="preserve">The panel is 1.2× the grade's width, at the same height.</w:t>
+      </w:r>
+    </w:p>
+    <w:p>
+      <w:pPr>
+        <w:pStyle w:val="ListParagraph"/>
+        <w:numPr>
+          <w:ilvl w:val="1"/>
+          <w:numId w:val="2"/>
+        </w:numPr>
+      </w:pPr>
+      <w:r>
+        <w:t xml:space="preserve">The grade itself keeps its size and moves left to make room.</w:t>
+      </w:r>
+    </w:p>
+    <w:p>
+      <w:pPr>
+        <w:pStyle w:val="ListParagraph"/>
+        <w:numPr>
+          <w:ilvl w:val="1"/>
+          <w:numId w:val="2"/>
+        </w:numPr>
+      </w:pPr>
+      <w:r>
+        <w:t xml:space="preserve">A number that goes up pulses once.</w:t>
+      </w:r>
+    </w:p>
+    <w:p>
+      <w:pPr>
+        <w:pStyle w:val="ListParagraph"/>
+        <w:numPr>
+          <w:ilvl w:val="1"/>
+          <w:numId w:val="2"/>
+        </w:numPr>
+      </w:pPr>
+      <w:r>
+        <w:t xml:space="preserve">It shows whenever the grade does (Settings → Lock-In grade).</w:t>
+      </w:r>
+    </w:p>
+    <w:p>
+      <w:pPr>
+        <w:pStyle w:val="ListParagraph"/>
+        <w:numPr>
+          <w:ilvl w:val="0"/>
+          <w:numId w:val="2"/>
+        </w:numPr>
+      </w:pPr>
+      <w:r>
+        <w:rPr>
+          <w:b/>
+          <w:bCs/>
+        </w:rPr>
+        <w:t xml:space="preserve">Volume in the pause menu:</w:t>
+      </w:r>
+      <w:r>
+        <w:t xml:space="preserve"> Music, Effects and Crowd sliders. They're in the park's pause menu, your park game's, Pro-Am / Pro Run and the Crew HQ. They apply as you drag and are saved.</w:t>
+      </w:r>
+    </w:p>
+    <w:p>
+      <w:pPr>
+        <w:pStyle w:val="ListParagraph"/>
+        <w:numPr>
+          <w:ilvl w:val="0"/>
+          <w:numId w:val="2"/>
+        </w:numPr>
+      </w:pPr>
+      <w:r>
+        <w:rPr>
+          <w:b/>
+          <w:bCs/>
+        </w:rPr>
+        <w:t xml:space="preserve">The Greeen Chant is a real crowd now.</w:t>
+      </w:r>
+    </w:p>
+    <w:p>
+      <w:pPr>
+        <w:pStyle w:val="ListParagraph"/>
+        <w:numPr>
+          <w:ilvl w:val="1"/>
+          <w:numId w:val="2"/>
+        </w:numPr>
+      </w:pPr>
+      <w:r>
+        <w:t xml:space="preserve">About a third higher in pitch.</w:t>
+      </w:r>
+    </w:p>
+    <w:p>
+      <w:pPr>
+        <w:pStyle w:val="ListParagraph"/>
+        <w:numPr>
+          <w:ilvl w:val="1"/>
+          <w:numId w:val="2"/>
+        </w:numPr>
+      </w:pPr>
+      <w:r>
+        <w:t xml:space="preserve">25 voices in 9 different throats (men, women and a couple of kids), each with its own vowel, pitch, rise, wobble, timing and length.</w:t>
+      </w:r>
+    </w:p>
+    <w:p>
+      <w:pPr>
+        <w:pStyle w:val="ListParagraph"/>
+        <w:numPr>
+          <w:ilvl w:val="1"/>
+          <w:numId w:val="2"/>
+        </w:numPr>
+      </w:pPr>
+      <w:r>
+        <w:t xml:space="preserve">A breath in each throat, and the stands throwing it back.</w:t>
+      </w:r>
+    </w:p>
+    <w:p>
+      <w:pPr>
+        <w:pStyle w:val="Heading1"/>
+      </w:pPr>
+      <w:r>
+        <w:t xml:space="preserve">Green releases: doubled and remade</w:t>
+      </w:r>
+    </w:p>
+    <w:p>
+      <w:pPr>
+        <w:pStyle w:val="ListParagraph"/>
+        <w:numPr>
+          <w:ilvl w:val="0"/>
+          <w:numId w:val="2"/>
+        </w:numPr>
+      </w:pPr>
+      <w:r>
+        <w:rPr>
+          <w:b/>
+          <w:bCs/>
+        </w:rPr>
+        <w:t xml:space="preserve">Twice as many:</w:t>
+      </w:r>
+      <w:r>
+        <w:t xml:space="preserve"> 32 sounds and 28 effects. That's 16 new sounds and 14 new effects, all original, in the VC Store under Green Sounds and Green FX.</w:t>
+      </w:r>
+    </w:p>
+    <w:p>
+      <w:pPr>
+        <w:pStyle w:val="ListParagraph"/>
+        <w:numPr>
+          <w:ilvl w:val="1"/>
+          <w:numId w:val="2"/>
+        </w:numPr>
+      </w:pPr>
+      <w:r>
+        <w:rPr>
+          <w:b/>
+          <w:bCs/>
+        </w:rPr>
+        <w:t xml:space="preserve">New sounds</w:t>
+      </w:r>
+      <w:r>
+        <w:t xml:space="preserve"> (3,500–9,500 VC): Night Owl, Wolf Howl, Steam Whistle, Victory Bells, Knockout Bell, Shattered Glass, Strike!, Rimshot, Bass Drop, Sonar Ping, Standing Ovation, Five-Alarm, Boing, Cuckoo, Royal Fanfare and Case Closed.</w:t>
+      </w:r>
+    </w:p>
+    <w:p>
+      <w:pPr>
+        <w:pStyle w:val="ListParagraph"/>
+        <w:numPr>
+          <w:ilvl w:val="1"/>
+          <w:numId w:val="2"/>
+        </w:numPr>
+      </w:pPr>
+      <w:r>
+        <w:rPr>
+          <w:b/>
+          <w:bCs/>
+        </w:rPr>
+        <w:t xml:space="preserve">New effects</w:t>
+      </w:r>
+      <w:r>
+        <w:t xml:space="preserve"> (6,000–12,000 VC): Phoenix, Make It Rain, Shockwave, Atomic, Galaxy, Ice Cold, Fire Circle, Angel Wings, Jade Dragon, Meteor Shower, Laser Show, Lucky Clover, Diamond and Supernova.</w:t>
+      </w:r>
+    </w:p>
+    <w:p>
+      <w:pPr>
+        <w:pStyle w:val="ListParagraph"/>
+        <w:numPr>
+          <w:ilvl w:val="1"/>
+          <w:numId w:val="2"/>
+        </w:numPr>
+      </w:pPr>
+      <w:r>
+        <w:t xml:space="preserve">The AI picks from all of them, still with no two alike on a floor.</w:t>
+      </w:r>
+    </w:p>
+    <w:p>
+      <w:pPr>
+        <w:pStyle w:val="ListParagraph"/>
+        <w:numPr>
+          <w:ilvl w:val="0"/>
+          <w:numId w:val="2"/>
+        </w:numPr>
+      </w:pPr>
+      <w:r>
+        <w:rPr>
+          <w:b/>
+          <w:bCs/>
+        </w:rPr>
+        <w:t xml:space="preserve">Every sound remade to sound like its name.</w:t>
+      </w:r>
+    </w:p>
+    <w:p>
+      <w:pPr>
+        <w:pStyle w:val="ListParagraph"/>
+        <w:numPr>
+          <w:ilvl w:val="1"/>
+          <w:numId w:val="2"/>
+        </w:numPr>
+      </w:pPr>
+      <w:r>
+        <w:rPr>
+          <w:b/>
+          <w:bCs/>
+        </w:rPr>
+        <w:t xml:space="preserve">Why they didn't before:</w:t>
+      </w:r>
+      <w:r>
+        <w:t xml:space="preserve"> each sound was a few plain synth tones, which is why the Eagle Screech sounded like a whistle rather than a bird.</w:t>
+      </w:r>
+    </w:p>
+    <w:p>
+      <w:pPr>
+        <w:pStyle w:val="ListParagraph"/>
+        <w:numPr>
+          <w:ilvl w:val="1"/>
+          <w:numId w:val="2"/>
+        </w:numPr>
+      </w:pPr>
+      <w:r>
+        <w:rPr>
+          <w:b/>
+          <w:bCs/>
+        </w:rPr>
+        <w:t xml:space="preserve">What changed:</w:t>
+      </w:r>
+      <w:r>
+        <w:t xml:space="preserve"> each sound is now built sample by sample, the way the real thing makes its sound.</w:t>
+      </w:r>
+    </w:p>
+    <w:p>
+      <w:pPr>
+        <w:pStyle w:val="ListParagraph"/>
+        <w:numPr>
+          <w:ilvl w:val="1"/>
+          <w:numId w:val="2"/>
+        </w:numPr>
+      </w:pPr>
+      <w:r>
+        <w:rPr>
+          <w:b/>
+          <w:bCs/>
+        </w:rPr>
+        <w:t xml:space="preserve">Eagle Screech:</w:t>
+      </w:r>
+      <w:r>
+        <w:t xml:space="preserve"> a raptor's scream.</w:t>
+      </w:r>
+    </w:p>
+    <w:p>
+      <w:pPr>
+        <w:pStyle w:val="ListParagraph"/>
+        <w:numPr>
+          <w:ilvl w:val="2"/>
+          <w:numId w:val="2"/>
+        </w:numPr>
+      </w:pPr>
+      <w:r>
+        <w:t xml:space="preserve">A quick rise into a long, high "kee-eeee-arrr" around 2.5 kHz.</w:t>
+      </w:r>
+    </w:p>
+    <w:p>
+      <w:pPr>
+        <w:pStyle w:val="ListParagraph"/>
+        <w:numPr>
+          <w:ilvl w:val="2"/>
+          <w:numId w:val="2"/>
+        </w:numPr>
+      </w:pPr>
+      <w:r>
+        <w:t xml:space="preserve">Harsh, the way a real one is: the pitch jitters from cycle to cycle, every other cycle is louder, and there's breath riding on each one.</w:t>
+      </w:r>
+    </w:p>
+    <w:p>
+      <w:pPr>
+        <w:pStyle w:val="ListParagraph"/>
+        <w:numPr>
+          <w:ilvl w:val="2"/>
+          <w:numId w:val="2"/>
+        </w:numPr>
+      </w:pPr>
+      <w:r>
+        <w:t xml:space="preserve">It tears downward at the end, then rings off the canyon walls.</w:t>
+      </w:r>
+    </w:p>
+    <w:p>
+      <w:pPr>
+        <w:pStyle w:val="ListParagraph"/>
+        <w:numPr>
+          <w:ilvl w:val="1"/>
+          <w:numId w:val="2"/>
+        </w:numPr>
+      </w:pPr>
+      <w:r>
+        <w:rPr>
+          <w:b/>
+          <w:bCs/>
+        </w:rPr>
+        <w:t xml:space="preserve">Bells, gongs, glass, coins and wood</w:t>
+      </w:r>
+      <w:r>
+        <w:t xml:space="preserve"> ring with their own partials. A church bell has its hum an octave under, its minor-third tierce and its nominal. The gong blooms up into its shimmer after the strike.</w:t>
+      </w:r>
+    </w:p>
+    <w:p>
+      <w:pPr>
+        <w:pStyle w:val="ListParagraph"/>
+        <w:numPr>
+          <w:ilvl w:val="1"/>
+          <w:numId w:val="2"/>
+        </w:numPr>
+      </w:pPr>
+      <w:r>
+        <w:rPr>
+          <w:b/>
+          <w:bCs/>
+        </w:rPr>
+        <w:t xml:space="preserve">Voices:</w:t>
+      </w:r>
+    </w:p>
+    <w:p>
+      <w:pPr>
+        <w:pStyle w:val="ListParagraph"/>
+        <w:numPr>
+          <w:ilvl w:val="2"/>
+          <w:numId w:val="2"/>
+        </w:numPr>
+      </w:pPr>
+      <w:r>
+        <w:t xml:space="preserve">The choir is four sections, each with its own vowel, singing in a cathedral with a harp under it.</w:t>
+      </w:r>
+    </w:p>
+    <w:p>
+      <w:pPr>
+        <w:pStyle w:val="ListParagraph"/>
+        <w:numPr>
+          <w:ilvl w:val="2"/>
+          <w:numId w:val="2"/>
+        </w:numPr>
+      </w:pPr>
+      <w:r>
+        <w:t xml:space="preserve">The kazoo is a hummed voice with the paper buzzing on it.</w:t>
+      </w:r>
+    </w:p>
+    <w:p>
+      <w:pPr>
+        <w:pStyle w:val="ListParagraph"/>
+        <w:numPr>
+          <w:ilvl w:val="2"/>
+          <w:numId w:val="2"/>
+        </w:numPr>
+      </w:pPr>
+      <w:r>
+        <w:t xml:space="preserve">The roar after the Greeen Chant is now crowd voices, not noise.</w:t>
+      </w:r>
+    </w:p>
+    <w:p>
+      <w:pPr>
+        <w:pStyle w:val="ListParagraph"/>
+        <w:numPr>
+          <w:ilvl w:val="1"/>
+          <w:numId w:val="2"/>
+        </w:numPr>
+      </w:pPr>
+      <w:r>
+        <w:rPr>
+          <w:b/>
+          <w:bCs/>
+        </w:rPr>
+        <w:t xml:space="preserve">Squeaks, water and weather:</w:t>
+      </w:r>
+    </w:p>
+    <w:p>
+      <w:pPr>
+        <w:pStyle w:val="ListParagraph"/>
+        <w:numPr>
+          <w:ilvl w:val="2"/>
+          <w:numId w:val="2"/>
+        </w:numPr>
+      </w:pPr>
+      <w:r>
+        <w:t xml:space="preserve">The rubber duck is a squeaker reed, wheezing in between squeezes.</w:t>
+      </w:r>
+    </w:p>
+    <w:p>
+      <w:pPr>
+        <w:pStyle w:val="ListParagraph"/>
+        <w:numPr>
+          <w:ilvl w:val="2"/>
+          <w:numId w:val="2"/>
+        </w:numPr>
+      </w:pPr>
+      <w:r>
+        <w:t xml:space="preserve">The cannonball is a slap, a kerplunk and hundreds of bubbles and drops.</w:t>
+      </w:r>
+    </w:p>
+    <w:p>
+      <w:pPr>
+        <w:pStyle w:val="ListParagraph"/>
+        <w:numPr>
+          <w:ilvl w:val="2"/>
+          <w:numId w:val="2"/>
+        </w:numPr>
+      </w:pPr>
+      <w:r>
+        <w:t xml:space="preserve">Thunder tears the air open before the boom and the roll.</w:t>
+      </w:r>
+    </w:p>
+    <w:p>
+      <w:pPr>
+        <w:pStyle w:val="ListParagraph"/>
+        <w:numPr>
+          <w:ilvl w:val="0"/>
+          <w:numId w:val="2"/>
+        </w:numPr>
+      </w:pPr>
+      <w:r>
+        <w:rPr>
+          <w:b/>
+          <w:bCs/>
+        </w:rPr>
+        <w:t xml:space="preserve">Every sound comes out equally loud</w:t>
+      </w:r>
+      <w:r>
+        <w:t xml:space="preserve"> (it's measured automatically), and none runs past 4.2 seconds.</w:t>
+      </w:r>
+    </w:p>
+    <w:p>
+      <w:pPr>
+        <w:pStyle w:val="ListParagraph"/>
+        <w:numPr>
+          <w:ilvl w:val="0"/>
+          <w:numId w:val="2"/>
+        </w:numPr>
+      </w:pPr>
+      <w:r>
+        <w:rPr>
+          <w:b/>
+          <w:bCs/>
+        </w:rPr>
+        <w:t xml:space="preserve">No hitches.</w:t>
+      </w:r>
+      <w:r>
+        <w:t xml:space="preserve"> When a game starts, the sounds everyone on the floor will need are made in the background, so a green never waits on its sound. In the store, the first "Hear it" on a sound takes a split second.</w:t>
+      </w:r>
+    </w:p>
+    <w:p>
+      <w:pPr>
+        <w:pStyle w:val="ListParagraph"/>
+        <w:numPr>
+          <w:ilvl w:val="0"/>
+          <w:numId w:val="2"/>
+        </w:numPr>
+      </w:pPr>
+      <w:r>
+        <w:rPr>
+          <w:b/>
+          <w:bCs/>
+        </w:rPr>
+        <w:t xml:space="preserve">How they were checked:</w:t>
+      </w:r>
+    </w:p>
+    <w:p>
+      <w:pPr>
+        <w:pStyle w:val="ListParagraph"/>
+        <w:numPr>
+          <w:ilvl w:val="1"/>
+          <w:numId w:val="2"/>
+        </w:numPr>
+      </w:pPr>
+      <w:r>
+        <w:t xml:space="preserve">Every sound was tuned against its spectrogram.</w:t>
+      </w:r>
+    </w:p>
+    <w:p>
+      <w:pPr>
+        <w:pStyle w:val="ListParagraph"/>
+        <w:numPr>
+          <w:ilvl w:val="1"/>
+          <w:numId w:val="2"/>
+        </w:numPr>
+      </w:pPr>
+      <w:r>
+        <w:t xml:space="preserve">Tests check what each is made of: the eagle's pitch, band, rasp and fall, the owl's low hoots, the cuckoo's two notes, the siren winding up, the air horn's short-short-long and more.</w:t>
+      </w:r>
+    </w:p>
+    <w:p>
+      <w:pPr>
+        <w:pStyle w:val="ListParagraph"/>
+        <w:numPr>
+          <w:ilvl w:val="1"/>
+          <w:numId w:val="2"/>
+        </w:numPr>
+      </w:pPr>
+      <w:r>
+        <w:t xml:space="preserve">Every new effect was captured frozen in time over a player in the studio.</w:t>
+      </w:r>
+    </w:p>
+    <w:p>
+      <w:pPr>
+        <w:pStyle w:val="Heading1"/>
+      </w:pPr>
+      <w:r>
+        <w:t xml:space="preserve">Under the hood (quick patch)</w:t>
+      </w:r>
+    </w:p>
+    <w:p>
+      <w:pPr>
+        <w:pStyle w:val="ListParagraph"/>
+        <w:numPr>
+          <w:ilvl w:val="0"/>
+          <w:numId w:val="2"/>
+        </w:numPr>
+      </w:pPr>
+      <w:r>
+        <w:rPr>
+          <w:b/>
+          <w:bCs/>
+        </w:rPr>
+        <w:t xml:space="preserve">Tests:</w:t>
+      </w:r>
+      <w:r>
+        <w:t xml:space="preserve"> 148 game tests and 40 service tests pass. The new ones cover non-shooter windows, smothered shots, the record scratch, repeat moves, diagonal moves, the straps being drawn, the apparel counts, dunk variety, the windmill and Eastbay paths, celebrations (input and clipping), reach-in contact, the AI staying in bounds, the D-pad fallback, Icon Legend, the green release counts and what each sound is made of, the AI's reaction times, stamina and the line beside the grade.</w:t>
+      </w:r>
+    </w:p>
+    <w:p>
+      <w:pPr>
+        <w:pStyle w:val="ListParagraph"/>
+        <w:numPr>
+          <w:ilvl w:val="0"/>
+          <w:numId w:val="2"/>
+        </w:numPr>
+      </w:pPr>
+      <w:r>
+        <w:rPr>
+          <w:b/>
+          <w:bCs/>
+        </w:rPr>
+        <w:t xml:space="preserve">Judgment calls I made without asking:</w:t>
+      </w:r>
+    </w:p>
+    <w:p>
+      <w:pPr>
+        <w:pStyle w:val="ListParagraph"/>
+        <w:numPr>
+          <w:ilvl w:val="1"/>
+          <w:numId w:val="2"/>
+        </w:numPr>
+      </w:pPr>
+      <w:r>
+        <w:t xml:space="preserve">"Shooters" are Sharpshooters and Stretch Bigs. The 10% smaller window for non-shooters applies to jump shots only, not layups or free throws.</w:t>
+      </w:r>
+    </w:p>
+    <w:p>
+      <w:pPr>
+        <w:pStyle w:val="ListParagraph"/>
+        <w:numPr>
+          <w:ilvl w:val="1"/>
+          <w:numId w:val="2"/>
+        </w:numPr>
+      </w:pPr>
+      <w:r>
+        <w:t xml:space="preserve">"Career mode games" for Icon Legend are Pro Run games, the same as the 80 → 90 climb.</w:t>
+      </w:r>
+    </w:p>
+    <w:p>
+      <w:pPr>
+        <w:pStyle w:val="ListParagraph"/>
+        <w:numPr>
+          <w:ilvl w:val="1"/>
+          <w:numId w:val="2"/>
+        </w:numPr>
+      </w:pPr>
+      <w:r>
+        <w:t xml:space="preserve">The smothered rule applies to every shot that can be labelled Smothered: jumpers, close shots and layups. Dunks are left to Posterizer and Contact Finisher.</w:t>
+      </w:r>
+    </w:p>
+    <w:p>
+      <w:pPr>
+        <w:pStyle w:val="ListParagraph"/>
+        <w:numPr>
+          <w:ilvl w:val="1"/>
+          <w:numId w:val="2"/>
+        </w:numPr>
+      </w:pPr>
+      <w:r>
+        <w:t xml:space="preserve">The record scratch also plays for the AI's green sounds near you.</w:t>
+      </w:r>
+    </w:p>
+    <w:p>
+      <w:pPr>
+        <w:pStyle w:val="ListParagraph"/>
+        <w:numPr>
+          <w:ilvl w:val="1"/>
+          <w:numId w:val="2"/>
+        </w:numPr>
+      </w:pPr>
+      <w:r>
+        <w:t xml:space="preserve">"Double apparel" covers clothing, shoes and accessories (everything you wear); King Tut Cup prizes weren't doubled.</w:t>
+      </w:r>
+    </w:p>
+    <w:p>
+      <w:pPr>
+        <w:pStyle w:val="ListParagraph"/>
+        <w:numPr>
+          <w:ilvl w:val="1"/>
+          <w:numId w:val="2"/>
+        </w:numPr>
+      </w:pPr>
+      <w:r>
+        <w:t xml:space="preserve">"Double the green animations and sounds" means twice as many of each, counting the King Tut Cup's (16 → 32 sounds, 14 → 28 effects). The Cup prizes themselves weren't doubled.</w:t>
+      </w:r>
+    </w:p>
+    <w:p>
+      <w:pPr>
+        <w:pStyle w:val="ListParagraph"/>
+        <w:numPr>
+          <w:ilvl w:val="1"/>
+          <w:numId w:val="2"/>
+        </w:numPr>
+      </w:pPr>
+      <w:r>
+        <w:t xml:space="preserve">"Walking without sprint" means any movement without the sprint button. Defensive slides and hands-up defense still cost a little.</w:t>
+      </w:r>
+    </w:p>
+    <w:p>
+      <w:pPr>
+        <w:pStyle w:val="ListParagraph"/>
+        <w:numPr>
+          <w:ilvl w:val="1"/>
+          <w:numId w:val="2"/>
+        </w:numPr>
+      </w:pPr>
+      <w:r>
+        <w:t xml:space="preserve">The faster AI reactions apply to every AI player: teammates, opponents and your own player on auto-play.</w:t>
       </w:r>
     </w:p>
     <w:sectPr>

</xml_diff>

<commit_message>
pick and roll patch
</commit_message>
<xml_diff>
--- a/PATCH_NOTES_v0.4.7.5.docx
+++ b/PATCH_NOTES_v0.4.7.5.docx
@@ -3526,7 +3526,7 @@
     </w:p>
     <w:bookmarkEnd w:id="41"/>
     <w:bookmarkEnd w:id="42"/>
-    <w:bookmarkStart w:id="69" w:name="quick-patch"/>
+    <w:bookmarkStart w:id="70" w:name="quick-patch"/>
     <w:p>
       <w:pPr>
         <w:pStyle w:val="Heading1"/>
@@ -4228,7 +4228,7 @@
     </w:tbl>
     <w:bookmarkEnd w:id="46"/>
     <w:bookmarkEnd w:id="47"/>
-    <w:bookmarkStart w:id="59" w:name="dribbling-passing-and-defense-1"/>
+    <w:bookmarkStart w:id="60" w:name="dribbling-passing-and-defense-1"/>
     <w:p>
       <w:pPr>
         <w:pStyle w:val="Heading2"/>
@@ -5911,8 +5911,210 @@
       </w:r>
     </w:p>
     <w:bookmarkEnd w:id="58"/>
+    <w:bookmarkStart w:id="59" w:name="screens-and-brick-wall-oct-10"/>
+    <w:p>
+      <w:pPr>
+        <w:pStyle w:val="Heading3"/>
+      </w:pPr>
+      <w:r>
+        <w:t xml:space="preserve">Screens and Brick Wall (Oct 10)</w:t>
+      </w:r>
+    </w:p>
+    <w:p>
+      <w:pPr>
+        <w:numPr>
+          <w:ilvl w:val="0"/>
+          <w:numId w:val="1068"/>
+        </w:numPr>
+        <w:pStyle w:val="Compact"/>
+      </w:pPr>
+      <w:r>
+        <w:rPr>
+          <w:bCs/>
+          <w:b/>
+        </w:rPr>
+        <w:t xml:space="preserve">Screens have a quality now,</w:t>
+      </w:r>
+      <w:r>
+        <w:t xml:space="preserve"> </w:t>
+      </w:r>
+      <w:r>
+        <w:t xml:space="preserve">and it decides what happens to the defender who runs into one. It comes from how hard he ran into it, whether the screener was planted and square to him (chest on, not a shoulder brushing past), whether the screen was called,</w:t>
+      </w:r>
+      <w:r>
+        <w:t xml:space="preserve"> </w:t>
+      </w:r>
+      <w:r>
+        <w:rPr>
+          <w:bCs/>
+          <w:b/>
+        </w:rPr>
+        <w:t xml:space="preserve">the size of both men</w:t>
+      </w:r>
+      <w:r>
+        <w:t xml:space="preserve"> </w:t>
+      </w:r>
+      <w:r>
+        <w:t xml:space="preserve">(weight, strength and height), the</w:t>
+      </w:r>
+      <w:r>
+        <w:t xml:space="preserve"> </w:t>
+      </w:r>
+      <w:r>
+        <w:rPr>
+          <w:bCs/>
+          <w:b/>
+        </w:rPr>
+        <w:t xml:space="preserve">Strength ratings</w:t>
+      </w:r>
+      <w:r>
+        <w:t xml:space="preserve"> </w:t>
+      </w:r>
+      <w:r>
+        <w:t xml:space="preserve">of both, and</w:t>
+      </w:r>
+      <w:r>
+        <w:t xml:space="preserve"> </w:t>
+      </w:r>
+      <w:r>
+        <w:rPr>
+          <w:bCs/>
+          <w:b/>
+        </w:rPr>
+        <w:t xml:space="preserve">Brick Wall</w:t>
+      </w:r>
+      <w:r>
+        <w:t xml:space="preserve"> </w:t>
+      </w:r>
+      <w:r>
+        <w:t xml:space="preserve">on either side (the screener’s makes it hit harder, the defender’s fights through it).</w:t>
+      </w:r>
+    </w:p>
+    <w:p>
+      <w:pPr>
+        <w:numPr>
+          <w:ilvl w:val="0"/>
+          <w:numId w:val="1068"/>
+        </w:numPr>
+        <w:pStyle w:val="Compact"/>
+      </w:pPr>
+      <w:r>
+        <w:rPr>
+          <w:bCs/>
+          <w:b/>
+        </w:rPr>
+        <w:t xml:space="preserve">Good screens visibly stop the defender.</w:t>
+      </w:r>
+      <w:r>
+        <w:t xml:space="preserve"> </w:t>
+      </w:r>
+      <w:r>
+        <w:t xml:space="preserve">Every real screen takes speed out of him (a glancing one a third of it, a perfect one all of it) and slows him for up to a second. A solid screen stops him dead: he’s shoved back off the screener’s chest with his feet stuck for a third to two thirds of a second. A weak one is just a stagger.</w:t>
+      </w:r>
+    </w:p>
+    <w:p>
+      <w:pPr>
+        <w:numPr>
+          <w:ilvl w:val="0"/>
+          <w:numId w:val="1068"/>
+        </w:numPr>
+        <w:pStyle w:val="Compact"/>
+      </w:pPr>
+      <w:r>
+        <w:rPr>
+          <w:bCs/>
+          <w:b/>
+        </w:rPr>
+        <w:t xml:space="preserve">Brick Wall’s perfect screen puts him on the floor.</w:t>
+      </w:r>
+      <w:r>
+        <w:t xml:space="preserve"> </w:t>
+      </w:r>
+      <w:r>
+        <w:t xml:space="preserve">A set, square screen that a defender runs into at speed, from a screener with Brick Wall, knocks him down: thrown back off the chest, onto the floor, and he has to get back up before he can recover. The bar is lower at every tier (Hall of Fame needs about two thirds of a perfect screen; Bronze needs nearly all of it), it’s higher against a defender with his own Brick Wall, and nobody is floored by a walk-in or while he’s in the air or already going for a block or a steal.</w:t>
+      </w:r>
+    </w:p>
+    <w:p>
+      <w:pPr>
+        <w:numPr>
+          <w:ilvl w:val="0"/>
+          <w:numId w:val="1068"/>
+        </w:numPr>
+        <w:pStyle w:val="Compact"/>
+      </w:pPr>
+      <w:r>
+        <w:rPr>
+          <w:bCs/>
+          <w:b/>
+        </w:rPr>
+        <w:t xml:space="preserve">The screener holds his ground.</w:t>
+      </w:r>
+      <w:r>
+        <w:t xml:space="preserve"> </w:t>
+      </w:r>
+      <w:r>
+        <w:t xml:space="preserve">A set screener’s weight in the contact goes up with Strength and Brick Wall (and more when he called it), so the defender bounces off him instead of pushing him off the spot.</w:t>
+      </w:r>
+    </w:p>
+    <w:p>
+      <w:pPr>
+        <w:numPr>
+          <w:ilvl w:val="0"/>
+          <w:numId w:val="1068"/>
+        </w:numPr>
+        <w:pStyle w:val="Compact"/>
+      </w:pPr>
+      <w:r>
+        <w:rPr>
+          <w:bCs/>
+          <w:b/>
+        </w:rPr>
+        <w:t xml:space="preserve">Brushing past a man standing in the corner isn’t a screen.</w:t>
+      </w:r>
+      <w:r>
+        <w:t xml:space="preserve"> </w:t>
+      </w:r>
+      <w:r>
+        <w:t xml:space="preserve">Incidental contact with a standing teammate costs the defender a little speed and a stagger but never a stop or a knockdown, and it no longer counts as a screen for the Lock-In grade. A screen counts when it was called (yours or the AI’s) or set square to a defender who was going for the ball.</w:t>
+      </w:r>
+    </w:p>
+    <w:p>
+      <w:pPr>
+        <w:numPr>
+          <w:ilvl w:val="0"/>
+          <w:numId w:val="1068"/>
+        </w:numPr>
+        <w:pStyle w:val="Compact"/>
+      </w:pPr>
+      <w:r>
+        <w:rPr>
+          <w:bCs/>
+          <w:b/>
+        </w:rPr>
+        <w:t xml:space="preserve">The AI squares up</w:t>
+      </w:r>
+      <w:r>
+        <w:t xml:space="preserve"> </w:t>
+      </w:r>
+      <w:r>
+        <w:t xml:space="preserve">to the defender it’s screening, so its screens hit harder too.</w:t>
+      </w:r>
+    </w:p>
+    <w:p>
+      <w:pPr>
+        <w:numPr>
+          <w:ilvl w:val="0"/>
+          <w:numId w:val="1068"/>
+        </w:numPr>
+        <w:pStyle w:val="Compact"/>
+      </w:pPr>
+      <w:r>
+        <w:t xml:space="preserve">In testing: about 23 real screens per park game, 10 of them stops and about one Brick Wall knockdown every other game; about 36 real screens, 28 stops and 1–2 knockdowns per Pro-Am game.</w:t>
+      </w:r>
+    </w:p>
     <w:bookmarkEnd w:id="59"/>
-    <w:bookmarkStart w:id="60" w:name="progression-icon-legend-up-to-99"/>
+    <w:bookmarkEnd w:id="60"/>
+    <w:bookmarkStart w:id="61" w:name="progression-icon-legend-up-to-99"/>
     <w:p>
       <w:pPr>
         <w:pStyle w:val="Heading2"/>
@@ -5925,7 +6127,7 @@
       <w:pPr>
         <w:numPr>
           <w:ilvl w:val="0"/>
-          <w:numId w:val="1068"/>
+          <w:numId w:val="1069"/>
         </w:numPr>
         <w:pStyle w:val="Compact"/>
       </w:pPr>
@@ -5941,105 +6143,105 @@
       <w:pPr>
         <w:numPr>
           <w:ilvl w:val="1"/>
+          <w:numId w:val="1070"/>
+        </w:numPr>
+        <w:pStyle w:val="Compact"/>
+      </w:pPr>
+      <w:r>
+        <w:t xml:space="preserve">Simmed games, forfeits and other modes don’t count.</w:t>
+      </w:r>
+    </w:p>
+    <w:p>
+      <w:pPr>
+        <w:numPr>
+          <w:ilvl w:val="1"/>
+          <w:numId w:val="1070"/>
+        </w:numPr>
+        <w:pStyle w:val="Compact"/>
+      </w:pPr>
+      <w:r>
+        <w:t xml:space="preserve">The game that unlocks the Icon doesn’t count either.</w:t>
+      </w:r>
+    </w:p>
+    <w:p>
+      <w:pPr>
+        <w:numPr>
+          <w:ilvl w:val="0"/>
           <w:numId w:val="1069"/>
         </w:numPr>
         <w:pStyle w:val="Compact"/>
       </w:pPr>
       <w:r>
-        <w:t xml:space="preserve">Simmed games, forfeits and other modes don’t count.</w:t>
-      </w:r>
-    </w:p>
-    <w:p>
-      <w:pPr>
-        <w:numPr>
-          <w:ilvl w:val="1"/>
+        <w:rPr>
+          <w:bCs/>
+          <w:b/>
+        </w:rPr>
+        <w:t xml:space="preserve">No stat picking:</w:t>
+      </w:r>
+      <w:r>
+        <w:t xml:space="preserve"> </w:t>
+      </w:r>
+      <w:r>
+        <w:t xml:space="preserve">the build system places each +1 itself.</w:t>
+      </w:r>
+    </w:p>
+    <w:p>
+      <w:pPr>
+        <w:numPr>
+          <w:ilvl w:val="1"/>
+          <w:numId w:val="1071"/>
+        </w:numPr>
+        <w:pStyle w:val="Compact"/>
+      </w:pPr>
+      <w:r>
+        <w:t xml:space="preserve">It raises the attributes your build leans on most: the shape its caps come from (archetype, size and weight) and what your position’s overall counts most.</w:t>
+      </w:r>
+    </w:p>
+    <w:p>
+      <w:pPr>
+        <w:numPr>
+          <w:ilvl w:val="1"/>
+          <w:numId w:val="1071"/>
+        </w:numPr>
+        <w:pStyle w:val="Compact"/>
+      </w:pPr>
+      <w:r>
+        <w:t xml:space="preserve">It goes a point at a time across the top half of that list until the overall is up by one.</w:t>
+      </w:r>
+    </w:p>
+    <w:p>
+      <w:pPr>
+        <w:numPr>
+          <w:ilvl w:val="1"/>
+          <w:numId w:val="1071"/>
+        </w:numPr>
+        <w:pStyle w:val="Compact"/>
+      </w:pPr>
+      <w:r>
+        <w:t xml:space="preserve">Attributes at 99 are never touched, and your caps rise with the upgrades.</w:t>
+      </w:r>
+    </w:p>
+    <w:p>
+      <w:pPr>
+        <w:numPr>
+          <w:ilvl w:val="1"/>
+          <w:numId w:val="1071"/>
+        </w:numPr>
+        <w:pStyle w:val="Compact"/>
+      </w:pPr>
+      <w:r>
+        <w:t xml:space="preserve">Example: a Sharpshooter’s shooting reaches 99 first, and a Glass Cleaner’s rebounding and interior defense do.</w:t>
+      </w:r>
+    </w:p>
+    <w:p>
+      <w:pPr>
+        <w:numPr>
+          <w:ilvl w:val="0"/>
           <w:numId w:val="1069"/>
         </w:numPr>
         <w:pStyle w:val="Compact"/>
       </w:pPr>
       <w:r>
-        <w:t xml:space="preserve">The game that unlocks the Icon doesn’t count either.</w:t>
-      </w:r>
-    </w:p>
-    <w:p>
-      <w:pPr>
-        <w:numPr>
-          <w:ilvl w:val="0"/>
-          <w:numId w:val="1068"/>
-        </w:numPr>
-        <w:pStyle w:val="Compact"/>
-      </w:pPr>
-      <w:r>
-        <w:rPr>
-          <w:bCs/>
-          <w:b/>
-        </w:rPr>
-        <w:t xml:space="preserve">No stat picking:</w:t>
-      </w:r>
-      <w:r>
-        <w:t xml:space="preserve"> </w:t>
-      </w:r>
-      <w:r>
-        <w:t xml:space="preserve">the build system places each +1 itself.</w:t>
-      </w:r>
-    </w:p>
-    <w:p>
-      <w:pPr>
-        <w:numPr>
-          <w:ilvl w:val="1"/>
-          <w:numId w:val="1070"/>
-        </w:numPr>
-        <w:pStyle w:val="Compact"/>
-      </w:pPr>
-      <w:r>
-        <w:t xml:space="preserve">It raises the attributes your build leans on most: the shape its caps come from (archetype, size and weight) and what your position’s overall counts most.</w:t>
-      </w:r>
-    </w:p>
-    <w:p>
-      <w:pPr>
-        <w:numPr>
-          <w:ilvl w:val="1"/>
-          <w:numId w:val="1070"/>
-        </w:numPr>
-        <w:pStyle w:val="Compact"/>
-      </w:pPr>
-      <w:r>
-        <w:t xml:space="preserve">It goes a point at a time across the top half of that list until the overall is up by one.</w:t>
-      </w:r>
-    </w:p>
-    <w:p>
-      <w:pPr>
-        <w:numPr>
-          <w:ilvl w:val="1"/>
-          <w:numId w:val="1070"/>
-        </w:numPr>
-        <w:pStyle w:val="Compact"/>
-      </w:pPr>
-      <w:r>
-        <w:t xml:space="preserve">Attributes at 99 are never touched, and your caps rise with the upgrades.</w:t>
-      </w:r>
-    </w:p>
-    <w:p>
-      <w:pPr>
-        <w:numPr>
-          <w:ilvl w:val="1"/>
-          <w:numId w:val="1070"/>
-        </w:numPr>
-        <w:pStyle w:val="Compact"/>
-      </w:pPr>
-      <w:r>
-        <w:t xml:space="preserve">Example: a Sharpshooter’s shooting reaches 99 first, and a Glass Cleaner’s rebounding and interior defense do.</w:t>
-      </w:r>
-    </w:p>
-    <w:p>
-      <w:pPr>
-        <w:numPr>
-          <w:ilvl w:val="0"/>
-          <w:numId w:val="1068"/>
-        </w:numPr>
-        <w:pStyle w:val="Compact"/>
-      </w:pPr>
-      <w:r>
         <w:rPr>
           <w:bCs/>
           <w:b/>
@@ -6051,7 +6253,7 @@
       <w:pPr>
         <w:numPr>
           <w:ilvl w:val="0"/>
-          <w:numId w:val="1068"/>
+          <w:numId w:val="1069"/>
         </w:numPr>
         <w:pStyle w:val="Compact"/>
       </w:pPr>
@@ -6067,7 +6269,7 @@
       <w:pPr>
         <w:numPr>
           <w:ilvl w:val="1"/>
-          <w:numId w:val="1071"/>
+          <w:numId w:val="1072"/>
         </w:numPr>
         <w:pStyle w:val="Compact"/>
       </w:pPr>
@@ -6079,7 +6281,7 @@
       <w:pPr>
         <w:numPr>
           <w:ilvl w:val="1"/>
-          <w:numId w:val="1071"/>
+          <w:numId w:val="1072"/>
         </w:numPr>
         <w:pStyle w:val="Compact"/>
       </w:pPr>
@@ -6087,8 +6289,8 @@
         <w:t xml:space="preserve">The Pro Run screen shows it too.</w:t>
       </w:r>
     </w:p>
-    <w:bookmarkEnd w:id="60"/>
-    <w:bookmarkStart w:id="65" w:name="the-look"/>
+    <w:bookmarkEnd w:id="61"/>
+    <w:bookmarkStart w:id="66" w:name="the-look"/>
     <w:p>
       <w:pPr>
         <w:pStyle w:val="Heading2"/>
@@ -6097,7 +6299,7 @@
         <w:t xml:space="preserve">The look</w:t>
       </w:r>
     </w:p>
-    <w:bookmarkStart w:id="61" w:name="jersey-straps-fixed-properly-this-time"/>
+    <w:bookmarkStart w:id="62" w:name="jersey-straps-fixed-properly-this-time"/>
     <w:p>
       <w:pPr>
         <w:pStyle w:val="Heading3"/>
@@ -6110,7 +6312,7 @@
       <w:pPr>
         <w:numPr>
           <w:ilvl w:val="0"/>
-          <w:numId w:val="1072"/>
+          <w:numId w:val="1073"/>
         </w:numPr>
         <w:pStyle w:val="Compact"/>
       </w:pPr>
@@ -6132,7 +6334,7 @@
       <w:pPr>
         <w:numPr>
           <w:ilvl w:val="0"/>
-          <w:numId w:val="1072"/>
+          <w:numId w:val="1073"/>
         </w:numPr>
         <w:pStyle w:val="Compact"/>
       </w:pPr>
@@ -6154,7 +6356,7 @@
       <w:pPr>
         <w:numPr>
           <w:ilvl w:val="1"/>
-          <w:numId w:val="1073"/>
+          <w:numId w:val="1074"/>
         </w:numPr>
         <w:pStyle w:val="Compact"/>
       </w:pPr>
@@ -6166,7 +6368,7 @@
       <w:pPr>
         <w:numPr>
           <w:ilvl w:val="1"/>
-          <w:numId w:val="1073"/>
+          <w:numId w:val="1074"/>
         </w:numPr>
         <w:pStyle w:val="Compact"/>
       </w:pPr>
@@ -6178,7 +6380,7 @@
       <w:pPr>
         <w:numPr>
           <w:ilvl w:val="1"/>
-          <w:numId w:val="1073"/>
+          <w:numId w:val="1074"/>
         </w:numPr>
         <w:pStyle w:val="Compact"/>
       </w:pPr>
@@ -6190,7 +6392,7 @@
       <w:pPr>
         <w:numPr>
           <w:ilvl w:val="1"/>
-          <w:numId w:val="1073"/>
+          <w:numId w:val="1074"/>
         </w:numPr>
         <w:pStyle w:val="Compact"/>
       </w:pPr>
@@ -6198,8 +6400,8 @@
         <w:t xml:space="preserve">The fabric’s mesh weave runs true to size along it.</w:t>
       </w:r>
     </w:p>
-    <w:bookmarkEnd w:id="61"/>
-    <w:bookmarkStart w:id="62" w:name="dunks"/>
+    <w:bookmarkEnd w:id="62"/>
+    <w:bookmarkStart w:id="63" w:name="dunks"/>
     <w:p>
       <w:pPr>
         <w:pStyle w:val="Heading3"/>
@@ -6212,7 +6414,7 @@
       <w:pPr>
         <w:numPr>
           <w:ilvl w:val="0"/>
-          <w:numId w:val="1074"/>
+          <w:numId w:val="1075"/>
         </w:numPr>
         <w:pStyle w:val="Compact"/>
       </w:pPr>
@@ -6234,81 +6436,81 @@
       <w:pPr>
         <w:numPr>
           <w:ilvl w:val="1"/>
+          <w:numId w:val="1076"/>
+        </w:numPr>
+        <w:pStyle w:val="Compact"/>
+      </w:pPr>
+      <w:r>
+        <w:t xml:space="preserve">No generic finish is shared by more than 4 packages. Before, reverse slams showed up in 15 packages and double clutches in 14.</w:t>
+      </w:r>
+    </w:p>
+    <w:p>
+      <w:pPr>
+        <w:numPr>
+          <w:ilvl w:val="1"/>
+          <w:numId w:val="1076"/>
+        </w:numPr>
+        <w:pStyle w:val="Compact"/>
+      </w:pPr>
+      <w:r>
+        <w:t xml:space="preserve">Every signature belongs to one package only. The Spin Mill no longer borrows the Eastbay.</w:t>
+      </w:r>
+    </w:p>
+    <w:p>
+      <w:pPr>
+        <w:numPr>
+          <w:ilvl w:val="0"/>
           <w:numId w:val="1075"/>
         </w:numPr>
         <w:pStyle w:val="Compact"/>
       </w:pPr>
       <w:r>
-        <w:t xml:space="preserve">No generic finish is shared by more than 4 packages. Before, reverse slams showed up in 15 packages and double clutches in 14.</w:t>
-      </w:r>
-    </w:p>
-    <w:p>
-      <w:pPr>
-        <w:numPr>
-          <w:ilvl w:val="1"/>
+        <w:rPr>
+          <w:bCs/>
+          <w:b/>
+        </w:rPr>
+        <w:t xml:space="preserve">Windmills:</w:t>
+      </w:r>
+      <w:r>
+        <w:t xml:space="preserve"> </w:t>
+      </w:r>
+      <w:r>
+        <w:t xml:space="preserve">the arm now goes round straight from the shoulder, at full length, through the jump.</w:t>
+      </w:r>
+    </w:p>
+    <w:p>
+      <w:pPr>
+        <w:numPr>
+          <w:ilvl w:val="1"/>
+          <w:numId w:val="1077"/>
+        </w:numPr>
+        <w:pStyle w:val="Compact"/>
+      </w:pPr>
+      <w:r>
+        <w:t xml:space="preserve">Before, the circle sat above the shoulder, so the elbow folded at the bottom, the arm over-stretched at the top and most of the circle happened during the gather.</w:t>
+      </w:r>
+    </w:p>
+    <w:p>
+      <w:pPr>
+        <w:numPr>
+          <w:ilvl w:val="1"/>
+          <w:numId w:val="1077"/>
+        </w:numPr>
+        <w:pStyle w:val="Compact"/>
+      </w:pPr>
+      <w:r>
+        <w:t xml:space="preserve">It comes over the top and down at the rim with the ball still in the hand.</w:t>
+      </w:r>
+    </w:p>
+    <w:p>
+      <w:pPr>
+        <w:numPr>
+          <w:ilvl w:val="0"/>
           <w:numId w:val="1075"/>
         </w:numPr>
         <w:pStyle w:val="Compact"/>
       </w:pPr>
       <w:r>
-        <w:t xml:space="preserve">Every signature belongs to one package only. The Spin Mill no longer borrows the Eastbay.</w:t>
-      </w:r>
-    </w:p>
-    <w:p>
-      <w:pPr>
-        <w:numPr>
-          <w:ilvl w:val="0"/>
-          <w:numId w:val="1074"/>
-        </w:numPr>
-        <w:pStyle w:val="Compact"/>
-      </w:pPr>
-      <w:r>
-        <w:rPr>
-          <w:bCs/>
-          <w:b/>
-        </w:rPr>
-        <w:t xml:space="preserve">Windmills:</w:t>
-      </w:r>
-      <w:r>
-        <w:t xml:space="preserve"> </w:t>
-      </w:r>
-      <w:r>
-        <w:t xml:space="preserve">the arm now goes round straight from the shoulder, at full length, through the jump.</w:t>
-      </w:r>
-    </w:p>
-    <w:p>
-      <w:pPr>
-        <w:numPr>
-          <w:ilvl w:val="1"/>
-          <w:numId w:val="1076"/>
-        </w:numPr>
-        <w:pStyle w:val="Compact"/>
-      </w:pPr>
-      <w:r>
-        <w:t xml:space="preserve">Before, the circle sat above the shoulder, so the elbow folded at the bottom, the arm over-stretched at the top and most of the circle happened during the gather.</w:t>
-      </w:r>
-    </w:p>
-    <w:p>
-      <w:pPr>
-        <w:numPr>
-          <w:ilvl w:val="1"/>
-          <w:numId w:val="1076"/>
-        </w:numPr>
-        <w:pStyle w:val="Compact"/>
-      </w:pPr>
-      <w:r>
-        <w:t xml:space="preserve">It comes over the top and down at the rim with the ball still in the hand.</w:t>
-      </w:r>
-    </w:p>
-    <w:p>
-      <w:pPr>
-        <w:numPr>
-          <w:ilvl w:val="0"/>
-          <w:numId w:val="1074"/>
-        </w:numPr>
-        <w:pStyle w:val="Compact"/>
-      </w:pPr>
-      <w:r>
         <w:rPr>
           <w:bCs/>
           <w:b/>
@@ -6320,7 +6522,7 @@
       <w:pPr>
         <w:numPr>
           <w:ilvl w:val="1"/>
-          <w:numId w:val="1077"/>
+          <w:numId w:val="1078"/>
         </w:numPr>
         <w:pStyle w:val="Compact"/>
       </w:pPr>
@@ -6332,7 +6534,7 @@
       <w:pPr>
         <w:numPr>
           <w:ilvl w:val="1"/>
-          <w:numId w:val="1077"/>
+          <w:numId w:val="1078"/>
         </w:numPr>
         <w:pStyle w:val="Compact"/>
       </w:pPr>
@@ -6344,7 +6546,7 @@
       <w:pPr>
         <w:numPr>
           <w:ilvl w:val="1"/>
-          <w:numId w:val="1077"/>
+          <w:numId w:val="1078"/>
         </w:numPr>
         <w:pStyle w:val="Compact"/>
       </w:pPr>
@@ -6352,8 +6554,8 @@
         <w:t xml:space="preserve">Before, it was timed from the gather, so most of it happened on the floor, and the ball dipped in front of the right thigh instead of going through.</w:t>
       </w:r>
     </w:p>
-    <w:bookmarkEnd w:id="62"/>
-    <w:bookmarkStart w:id="63" w:name="celebrations"/>
+    <w:bookmarkEnd w:id="63"/>
+    <w:bookmarkStart w:id="64" w:name="celebrations"/>
     <w:p>
       <w:pPr>
         <w:pStyle w:val="Heading3"/>
@@ -6366,7 +6568,7 @@
       <w:pPr>
         <w:numPr>
           <w:ilvl w:val="0"/>
-          <w:numId w:val="1078"/>
+          <w:numId w:val="1079"/>
         </w:numPr>
         <w:pStyle w:val="Compact"/>
       </w:pPr>
@@ -6382,81 +6584,81 @@
       <w:pPr>
         <w:numPr>
           <w:ilvl w:val="1"/>
+          <w:numId w:val="1080"/>
+        </w:numPr>
+        <w:pStyle w:val="Compact"/>
+      </w:pPr>
+      <w:r>
+        <w:t xml:space="preserve">Before, they only worked if you pressed G / D-pad up during the second and a half of dead ball after a basket while your player was doing nothing, and the check then cut them off.</w:t>
+      </w:r>
+    </w:p>
+    <w:p>
+      <w:pPr>
+        <w:numPr>
+          <w:ilvl w:val="1"/>
+          <w:numId w:val="1080"/>
+        </w:numPr>
+        <w:pStyle w:val="Compact"/>
+      </w:pPr>
+      <w:r>
+        <w:t xml:space="preserve">Now a press waits up to 2.5 seconds for your player to be free (follow-through, landing, hanging on the rim).</w:t>
+      </w:r>
+    </w:p>
+    <w:p>
+      <w:pPr>
+        <w:numPr>
+          <w:ilvl w:val="1"/>
+          <w:numId w:val="1080"/>
+        </w:numPr>
+        <w:pStyle w:val="Compact"/>
+      </w:pPr>
+      <w:r>
+        <w:t xml:space="preserve">They play in any dead ball, check or inbound (unless you have the ball) and for 3 seconds after your team scores.</w:t>
+      </w:r>
+    </w:p>
+    <w:p>
+      <w:pPr>
+        <w:numPr>
+          <w:ilvl w:val="1"/>
+          <w:numId w:val="1080"/>
+        </w:numPr>
+        <w:pStyle w:val="Compact"/>
+      </w:pPr>
+      <w:r>
+        <w:t xml:space="preserve">Whoever has the ball stops for the check; everyone else finishes.</w:t>
+      </w:r>
+    </w:p>
+    <w:p>
+      <w:pPr>
+        <w:numPr>
+          <w:ilvl w:val="0"/>
           <w:numId w:val="1079"/>
         </w:numPr>
         <w:pStyle w:val="Compact"/>
       </w:pPr>
       <w:r>
-        <w:t xml:space="preserve">Before, they only worked if you pressed G / D-pad up during the second and a half of dead ball after a basket while your player was doing nothing, and the check then cut them off.</w:t>
-      </w:r>
-    </w:p>
-    <w:p>
-      <w:pPr>
-        <w:numPr>
-          <w:ilvl w:val="1"/>
+        <w:rPr>
+          <w:bCs/>
+          <w:b/>
+        </w:rPr>
+        <w:t xml:space="preserve">Controllers:</w:t>
+      </w:r>
+      <w:r>
+        <w:t xml:space="preserve"> </w:t>
+      </w:r>
+      <w:r>
+        <w:t xml:space="preserve">pads the browser doesn’t map to the standard layout send the D-pad as axes. The game now reads those too, so D-pad up works on them.</w:t>
+      </w:r>
+    </w:p>
+    <w:p>
+      <w:pPr>
+        <w:numPr>
+          <w:ilvl w:val="0"/>
           <w:numId w:val="1079"/>
         </w:numPr>
         <w:pStyle w:val="Compact"/>
       </w:pPr>
       <w:r>
-        <w:t xml:space="preserve">Now a press waits up to 2.5 seconds for your player to be free (follow-through, landing, hanging on the rim).</w:t>
-      </w:r>
-    </w:p>
-    <w:p>
-      <w:pPr>
-        <w:numPr>
-          <w:ilvl w:val="1"/>
-          <w:numId w:val="1079"/>
-        </w:numPr>
-        <w:pStyle w:val="Compact"/>
-      </w:pPr>
-      <w:r>
-        <w:t xml:space="preserve">They play in any dead ball, check or inbound (unless you have the ball) and for 3 seconds after your team scores.</w:t>
-      </w:r>
-    </w:p>
-    <w:p>
-      <w:pPr>
-        <w:numPr>
-          <w:ilvl w:val="1"/>
-          <w:numId w:val="1079"/>
-        </w:numPr>
-        <w:pStyle w:val="Compact"/>
-      </w:pPr>
-      <w:r>
-        <w:t xml:space="preserve">Whoever has the ball stops for the check; everyone else finishes.</w:t>
-      </w:r>
-    </w:p>
-    <w:p>
-      <w:pPr>
-        <w:numPr>
-          <w:ilvl w:val="0"/>
-          <w:numId w:val="1078"/>
-        </w:numPr>
-        <w:pStyle w:val="Compact"/>
-      </w:pPr>
-      <w:r>
-        <w:rPr>
-          <w:bCs/>
-          <w:b/>
-        </w:rPr>
-        <w:t xml:space="preserve">Controllers:</w:t>
-      </w:r>
-      <w:r>
-        <w:t xml:space="preserve"> </w:t>
-      </w:r>
-      <w:r>
-        <w:t xml:space="preserve">pads the browser doesn’t map to the standard layout send the D-pad as axes. The game now reads those too, so D-pad up works on them.</w:t>
-      </w:r>
-    </w:p>
-    <w:p>
-      <w:pPr>
-        <w:numPr>
-          <w:ilvl w:val="0"/>
-          <w:numId w:val="1078"/>
-        </w:numPr>
-        <w:pStyle w:val="Compact"/>
-      </w:pPr>
-      <w:r>
         <w:rPr>
           <w:bCs/>
           <w:b/>
@@ -6470,8 +6672,8 @@
         <w:t xml:space="preserve">Chest Thump, Heart, Dust Off, Archer and Sleep put a hand or forearm through the chest. Each was fixed and every celebration was re-checked on three builds: none clip now.</w:t>
       </w:r>
     </w:p>
-    <w:bookmarkEnd w:id="63"/>
-    <w:bookmarkStart w:id="64" w:name="posterizer-and-contact-finisher"/>
+    <w:bookmarkEnd w:id="64"/>
+    <w:bookmarkStart w:id="65" w:name="posterizer-and-contact-finisher"/>
     <w:p>
       <w:pPr>
         <w:pStyle w:val="Heading3"/>
@@ -6484,7 +6686,7 @@
       <w:pPr>
         <w:numPr>
           <w:ilvl w:val="0"/>
-          <w:numId w:val="1080"/>
+          <w:numId w:val="1081"/>
         </w:numPr>
         <w:pStyle w:val="Compact"/>
       </w:pPr>
@@ -6500,7 +6702,7 @@
       <w:pPr>
         <w:numPr>
           <w:ilvl w:val="1"/>
-          <w:numId w:val="1081"/>
+          <w:numId w:val="1082"/>
         </w:numPr>
         <w:pStyle w:val="Compact"/>
       </w:pPr>
@@ -6512,7 +6714,7 @@
       <w:pPr>
         <w:numPr>
           <w:ilvl w:val="1"/>
-          <w:numId w:val="1081"/>
+          <w:numId w:val="1082"/>
         </w:numPr>
         <w:pStyle w:val="Compact"/>
       </w:pPr>
@@ -6524,7 +6726,7 @@
       <w:pPr>
         <w:numPr>
           <w:ilvl w:val="1"/>
-          <w:numId w:val="1081"/>
+          <w:numId w:val="1082"/>
         </w:numPr>
         <w:pStyle w:val="Compact"/>
       </w:pPr>
@@ -6536,7 +6738,7 @@
       <w:pPr>
         <w:numPr>
           <w:ilvl w:val="1"/>
-          <w:numId w:val="1081"/>
+          <w:numId w:val="1082"/>
         </w:numPr>
         <w:pStyle w:val="Compact"/>
       </w:pPr>
@@ -6544,9 +6746,9 @@
         <w:t xml:space="preserve">Before, the poster fired at the contact, even when the dunk then turned into a layup.</w:t>
       </w:r>
     </w:p>
-    <w:bookmarkEnd w:id="64"/>
     <w:bookmarkEnd w:id="65"/>
-    <w:bookmarkStart w:id="66" w:name="store-menus-and-hud"/>
+    <w:bookmarkEnd w:id="66"/>
+    <w:bookmarkStart w:id="67" w:name="store-menus-and-hud"/>
     <w:p>
       <w:pPr>
         <w:pStyle w:val="Heading2"/>
@@ -6559,7 +6761,7 @@
       <w:pPr>
         <w:numPr>
           <w:ilvl w:val="0"/>
-          <w:numId w:val="1082"/>
+          <w:numId w:val="1083"/>
         </w:numPr>
       </w:pPr>
       <w:r>
@@ -7061,7 +7263,7 @@
       <w:pPr>
         <w:numPr>
           <w:ilvl w:val="0"/>
-          <w:numId w:val="1082"/>
+          <w:numId w:val="1083"/>
         </w:numPr>
       </w:pPr>
       <w:r>
@@ -7124,7 +7326,7 @@
       <w:pPr>
         <w:numPr>
           <w:ilvl w:val="0"/>
-          <w:numId w:val="1082"/>
+          <w:numId w:val="1083"/>
         </w:numPr>
       </w:pPr>
       <w:r>
@@ -7145,77 +7347,77 @@
       <w:pPr>
         <w:numPr>
           <w:ilvl w:val="1"/>
+          <w:numId w:val="1084"/>
+        </w:numPr>
+        <w:pStyle w:val="Compact"/>
+      </w:pPr>
+      <w:r>
+        <w:t xml:space="preserve">The panel is 1.2× the grade’s width, at the same height.</w:t>
+      </w:r>
+    </w:p>
+    <w:p>
+      <w:pPr>
+        <w:numPr>
+          <w:ilvl w:val="1"/>
+          <w:numId w:val="1084"/>
+        </w:numPr>
+        <w:pStyle w:val="Compact"/>
+      </w:pPr>
+      <w:r>
+        <w:t xml:space="preserve">The grade itself keeps its size and moves left to make room.</w:t>
+      </w:r>
+    </w:p>
+    <w:p>
+      <w:pPr>
+        <w:numPr>
+          <w:ilvl w:val="1"/>
+          <w:numId w:val="1084"/>
+        </w:numPr>
+        <w:pStyle w:val="Compact"/>
+      </w:pPr>
+      <w:r>
+        <w:t xml:space="preserve">A number that goes up pulses once.</w:t>
+      </w:r>
+    </w:p>
+    <w:p>
+      <w:pPr>
+        <w:numPr>
+          <w:ilvl w:val="1"/>
+          <w:numId w:val="1084"/>
+        </w:numPr>
+        <w:pStyle w:val="Compact"/>
+      </w:pPr>
+      <w:r>
+        <w:t xml:space="preserve">It shows whenever the grade does (Settings → Lock-In grade).</w:t>
+      </w:r>
+    </w:p>
+    <w:p>
+      <w:pPr>
+        <w:numPr>
+          <w:ilvl w:val="0"/>
           <w:numId w:val="1083"/>
         </w:numPr>
-        <w:pStyle w:val="Compact"/>
-      </w:pPr>
-      <w:r>
-        <w:t xml:space="preserve">The panel is 1.2× the grade’s width, at the same height.</w:t>
-      </w:r>
-    </w:p>
-    <w:p>
-      <w:pPr>
-        <w:numPr>
-          <w:ilvl w:val="1"/>
+      </w:pPr>
+      <w:r>
+        <w:rPr>
+          <w:bCs/>
+          <w:b/>
+        </w:rPr>
+        <w:t xml:space="preserve">Volume in the pause menu:</w:t>
+      </w:r>
+      <w:r>
+        <w:t xml:space="preserve"> </w:t>
+      </w:r>
+      <w:r>
+        <w:t xml:space="preserve">Music, Effects and Crowd sliders. They’re in the park’s pause menu, your park game’s, Pro-Am / Pro Run and the Crew HQ. They apply as you drag and are saved.</w:t>
+      </w:r>
+    </w:p>
+    <w:p>
+      <w:pPr>
+        <w:numPr>
+          <w:ilvl w:val="0"/>
           <w:numId w:val="1083"/>
         </w:numPr>
-        <w:pStyle w:val="Compact"/>
-      </w:pPr>
-      <w:r>
-        <w:t xml:space="preserve">The grade itself keeps its size and moves left to make room.</w:t>
-      </w:r>
-    </w:p>
-    <w:p>
-      <w:pPr>
-        <w:numPr>
-          <w:ilvl w:val="1"/>
-          <w:numId w:val="1083"/>
-        </w:numPr>
-        <w:pStyle w:val="Compact"/>
-      </w:pPr>
-      <w:r>
-        <w:t xml:space="preserve">A number that goes up pulses once.</w:t>
-      </w:r>
-    </w:p>
-    <w:p>
-      <w:pPr>
-        <w:numPr>
-          <w:ilvl w:val="1"/>
-          <w:numId w:val="1083"/>
-        </w:numPr>
-        <w:pStyle w:val="Compact"/>
-      </w:pPr>
-      <w:r>
-        <w:t xml:space="preserve">It shows whenever the grade does (Settings → Lock-In grade).</w:t>
-      </w:r>
-    </w:p>
-    <w:p>
-      <w:pPr>
-        <w:numPr>
-          <w:ilvl w:val="0"/>
-          <w:numId w:val="1082"/>
-        </w:numPr>
-      </w:pPr>
-      <w:r>
-        <w:rPr>
-          <w:bCs/>
-          <w:b/>
-        </w:rPr>
-        <w:t xml:space="preserve">Volume in the pause menu:</w:t>
-      </w:r>
-      <w:r>
-        <w:t xml:space="preserve"> </w:t>
-      </w:r>
-      <w:r>
-        <w:t xml:space="preserve">Music, Effects and Crowd sliders. They’re in the park’s pause menu, your park game’s, Pro-Am / Pro Run and the Crew HQ. They apply as you drag and are saved.</w:t>
-      </w:r>
-    </w:p>
-    <w:p>
-      <w:pPr>
-        <w:numPr>
-          <w:ilvl w:val="0"/>
-          <w:numId w:val="1082"/>
-        </w:numPr>
       </w:pPr>
       <w:r>
         <w:rPr>
@@ -7229,7 +7431,7 @@
       <w:pPr>
         <w:numPr>
           <w:ilvl w:val="1"/>
-          <w:numId w:val="1084"/>
+          <w:numId w:val="1085"/>
         </w:numPr>
         <w:pStyle w:val="Compact"/>
       </w:pPr>
@@ -7241,7 +7443,7 @@
       <w:pPr>
         <w:numPr>
           <w:ilvl w:val="1"/>
-          <w:numId w:val="1084"/>
+          <w:numId w:val="1085"/>
         </w:numPr>
         <w:pStyle w:val="Compact"/>
       </w:pPr>
@@ -7253,7 +7455,7 @@
       <w:pPr>
         <w:numPr>
           <w:ilvl w:val="1"/>
-          <w:numId w:val="1084"/>
+          <w:numId w:val="1085"/>
         </w:numPr>
         <w:pStyle w:val="Compact"/>
       </w:pPr>
@@ -7261,8 +7463,8 @@
         <w:t xml:space="preserve">A breath in each throat, and the stands throwing it back.</w:t>
       </w:r>
     </w:p>
-    <w:bookmarkEnd w:id="66"/>
-    <w:bookmarkStart w:id="67" w:name="green-releases-doubled-and-remade"/>
+    <w:bookmarkEnd w:id="67"/>
+    <w:bookmarkStart w:id="68" w:name="green-releases-doubled-and-remade"/>
     <w:p>
       <w:pPr>
         <w:pStyle w:val="Heading2"/>
@@ -7275,7 +7477,7 @@
       <w:pPr>
         <w:numPr>
           <w:ilvl w:val="0"/>
-          <w:numId w:val="1085"/>
+          <w:numId w:val="1086"/>
         </w:numPr>
         <w:pStyle w:val="Compact"/>
       </w:pPr>
@@ -7297,6 +7499,62 @@
       <w:pPr>
         <w:numPr>
           <w:ilvl w:val="1"/>
+          <w:numId w:val="1087"/>
+        </w:numPr>
+        <w:pStyle w:val="Compact"/>
+      </w:pPr>
+      <w:r>
+        <w:rPr>
+          <w:bCs/>
+          <w:b/>
+        </w:rPr>
+        <w:t xml:space="preserve">New sounds</w:t>
+      </w:r>
+      <w:r>
+        <w:t xml:space="preserve"> </w:t>
+      </w:r>
+      <w:r>
+        <w:t xml:space="preserve">(3,500–9,500 VC): Night Owl, Wolf Howl, Steam Whistle, Victory Bells, Knockout Bell, Shattered Glass, Strike!, Rimshot, Bass Drop, Sonar Ping, Standing Ovation, Five-Alarm, Boing, Cuckoo, Royal Fanfare and Case Closed.</w:t>
+      </w:r>
+    </w:p>
+    <w:p>
+      <w:pPr>
+        <w:numPr>
+          <w:ilvl w:val="1"/>
+          <w:numId w:val="1087"/>
+        </w:numPr>
+        <w:pStyle w:val="Compact"/>
+      </w:pPr>
+      <w:r>
+        <w:rPr>
+          <w:bCs/>
+          <w:b/>
+        </w:rPr>
+        <w:t xml:space="preserve">New effects</w:t>
+      </w:r>
+      <w:r>
+        <w:t xml:space="preserve"> </w:t>
+      </w:r>
+      <w:r>
+        <w:t xml:space="preserve">(6,000–12,000 VC): Phoenix, Make It Rain, Shockwave, Atomic, Galaxy, Ice Cold, Fire Circle, Angel Wings, Jade Dragon, Meteor Shower, Laser Show, Lucky Clover, Diamond and Supernova.</w:t>
+      </w:r>
+    </w:p>
+    <w:p>
+      <w:pPr>
+        <w:numPr>
+          <w:ilvl w:val="1"/>
+          <w:numId w:val="1087"/>
+        </w:numPr>
+        <w:pStyle w:val="Compact"/>
+      </w:pPr>
+      <w:r>
+        <w:t xml:space="preserve">The AI picks from all of them, still with no two alike on a floor.</w:t>
+      </w:r>
+    </w:p>
+    <w:p>
+      <w:pPr>
+        <w:numPr>
+          <w:ilvl w:val="0"/>
           <w:numId w:val="1086"/>
         </w:numPr>
         <w:pStyle w:val="Compact"/>
@@ -7306,62 +7564,6 @@
           <w:bCs/>
           <w:b/>
         </w:rPr>
-        <w:t xml:space="preserve">New sounds</w:t>
-      </w:r>
-      <w:r>
-        <w:t xml:space="preserve"> </w:t>
-      </w:r>
-      <w:r>
-        <w:t xml:space="preserve">(3,500–9,500 VC): Night Owl, Wolf Howl, Steam Whistle, Victory Bells, Knockout Bell, Shattered Glass, Strike!, Rimshot, Bass Drop, Sonar Ping, Standing Ovation, Five-Alarm, Boing, Cuckoo, Royal Fanfare and Case Closed.</w:t>
-      </w:r>
-    </w:p>
-    <w:p>
-      <w:pPr>
-        <w:numPr>
-          <w:ilvl w:val="1"/>
-          <w:numId w:val="1086"/>
-        </w:numPr>
-        <w:pStyle w:val="Compact"/>
-      </w:pPr>
-      <w:r>
-        <w:rPr>
-          <w:bCs/>
-          <w:b/>
-        </w:rPr>
-        <w:t xml:space="preserve">New effects</w:t>
-      </w:r>
-      <w:r>
-        <w:t xml:space="preserve"> </w:t>
-      </w:r>
-      <w:r>
-        <w:t xml:space="preserve">(6,000–12,000 VC): Phoenix, Make It Rain, Shockwave, Atomic, Galaxy, Ice Cold, Fire Circle, Angel Wings, Jade Dragon, Meteor Shower, Laser Show, Lucky Clover, Diamond and Supernova.</w:t>
-      </w:r>
-    </w:p>
-    <w:p>
-      <w:pPr>
-        <w:numPr>
-          <w:ilvl w:val="1"/>
-          <w:numId w:val="1086"/>
-        </w:numPr>
-        <w:pStyle w:val="Compact"/>
-      </w:pPr>
-      <w:r>
-        <w:t xml:space="preserve">The AI picks from all of them, still with no two alike on a floor.</w:t>
-      </w:r>
-    </w:p>
-    <w:p>
-      <w:pPr>
-        <w:numPr>
-          <w:ilvl w:val="0"/>
-          <w:numId w:val="1085"/>
-        </w:numPr>
-        <w:pStyle w:val="Compact"/>
-      </w:pPr>
-      <w:r>
-        <w:rPr>
-          <w:bCs/>
-          <w:b/>
-        </w:rPr>
         <w:t xml:space="preserve">Every sound remade to sound like its name.</w:t>
       </w:r>
     </w:p>
@@ -7369,7 +7571,7 @@
       <w:pPr>
         <w:numPr>
           <w:ilvl w:val="1"/>
-          <w:numId w:val="1087"/>
+          <w:numId w:val="1088"/>
         </w:numPr>
         <w:pStyle w:val="Compact"/>
       </w:pPr>
@@ -7391,7 +7593,7 @@
       <w:pPr>
         <w:numPr>
           <w:ilvl w:val="1"/>
-          <w:numId w:val="1087"/>
+          <w:numId w:val="1088"/>
         </w:numPr>
         <w:pStyle w:val="Compact"/>
       </w:pPr>
@@ -7413,7 +7615,7 @@
       <w:pPr>
         <w:numPr>
           <w:ilvl w:val="1"/>
-          <w:numId w:val="1087"/>
+          <w:numId w:val="1088"/>
         </w:numPr>
         <w:pStyle w:val="Compact"/>
       </w:pPr>
@@ -7429,98 +7631,6 @@
       </w:r>
       <w:r>
         <w:t xml:space="preserve">a raptor’s scream.</w:t>
-      </w:r>
-    </w:p>
-    <w:p>
-      <w:pPr>
-        <w:numPr>
-          <w:ilvl w:val="2"/>
-          <w:numId w:val="1088"/>
-        </w:numPr>
-        <w:pStyle w:val="Compact"/>
-      </w:pPr>
-      <w:r>
-        <w:t xml:space="preserve">A quick rise into a long, high</w:t>
-      </w:r>
-      <w:r>
-        <w:t xml:space="preserve"> </w:t>
-      </w:r>
-      <w:r>
-        <w:t xml:space="preserve">“</w:t>
-      </w:r>
-      <w:r>
-        <w:t xml:space="preserve">kee-eeee-arrr</w:t>
-      </w:r>
-      <w:r>
-        <w:t xml:space="preserve">”</w:t>
-      </w:r>
-      <w:r>
-        <w:t xml:space="preserve"> </w:t>
-      </w:r>
-      <w:r>
-        <w:t xml:space="preserve">around 2.5 kHz.</w:t>
-      </w:r>
-    </w:p>
-    <w:p>
-      <w:pPr>
-        <w:numPr>
-          <w:ilvl w:val="2"/>
-          <w:numId w:val="1088"/>
-        </w:numPr>
-        <w:pStyle w:val="Compact"/>
-      </w:pPr>
-      <w:r>
-        <w:t xml:space="preserve">Harsh, the way a real one is: the pitch jitters from cycle to cycle, every other cycle is louder, and there’s breath riding on each one.</w:t>
-      </w:r>
-    </w:p>
-    <w:p>
-      <w:pPr>
-        <w:numPr>
-          <w:ilvl w:val="2"/>
-          <w:numId w:val="1088"/>
-        </w:numPr>
-        <w:pStyle w:val="Compact"/>
-      </w:pPr>
-      <w:r>
-        <w:t xml:space="preserve">It tears downward at the end, then rings off the canyon walls.</w:t>
-      </w:r>
-    </w:p>
-    <w:p>
-      <w:pPr>
-        <w:numPr>
-          <w:ilvl w:val="1"/>
-          <w:numId w:val="1087"/>
-        </w:numPr>
-        <w:pStyle w:val="Compact"/>
-      </w:pPr>
-      <w:r>
-        <w:rPr>
-          <w:bCs/>
-          <w:b/>
-        </w:rPr>
-        <w:t xml:space="preserve">Bells, gongs, glass, coins and wood</w:t>
-      </w:r>
-      <w:r>
-        <w:t xml:space="preserve"> </w:t>
-      </w:r>
-      <w:r>
-        <w:t xml:space="preserve">ring with their own partials. A church bell has its hum an octave under, its minor-third tierce and its nominal. The gong blooms up into its shimmer after the strike.</w:t>
-      </w:r>
-    </w:p>
-    <w:p>
-      <w:pPr>
-        <w:numPr>
-          <w:ilvl w:val="1"/>
-          <w:numId w:val="1087"/>
-        </w:numPr>
-        <w:pStyle w:val="Compact"/>
-      </w:pPr>
-      <w:r>
-        <w:rPr>
-          <w:bCs/>
-          <w:b/>
-        </w:rPr>
-        <w:t xml:space="preserve">Voices:</w:t>
       </w:r>
     </w:p>
     <w:p>
@@ -7532,7 +7642,25 @@
         <w:pStyle w:val="Compact"/>
       </w:pPr>
       <w:r>
-        <w:t xml:space="preserve">The choir is four sections, each with its own vowel, singing in a cathedral with a harp under it.</w:t>
+        <w:t xml:space="preserve">A quick rise into a long, high</w:t>
+      </w:r>
+      <w:r>
+        <w:t xml:space="preserve"> </w:t>
+      </w:r>
+      <w:r>
+        <w:t xml:space="preserve">“</w:t>
+      </w:r>
+      <w:r>
+        <w:t xml:space="preserve">kee-eeee-arrr</w:t>
+      </w:r>
+      <w:r>
+        <w:t xml:space="preserve">”</w:t>
+      </w:r>
+      <w:r>
+        <w:t xml:space="preserve"> </w:t>
+      </w:r>
+      <w:r>
+        <w:t xml:space="preserve">around 2.5 kHz.</w:t>
       </w:r>
     </w:p>
     <w:p>
@@ -7544,7 +7672,7 @@
         <w:pStyle w:val="Compact"/>
       </w:pPr>
       <w:r>
-        <w:t xml:space="preserve">The kazoo is a hummed voice with the paper buzzing on it.</w:t>
+        <w:t xml:space="preserve">Harsh, the way a real one is: the pitch jitters from cycle to cycle, every other cycle is louder, and there’s breath riding on each one.</w:t>
       </w:r>
     </w:p>
     <w:p>
@@ -7556,23 +7684,45 @@
         <w:pStyle w:val="Compact"/>
       </w:pPr>
       <w:r>
-        <w:t xml:space="preserve">The roar after the Greeen Chant is now crowd voices, not noise.</w:t>
-      </w:r>
-    </w:p>
-    <w:p>
-      <w:pPr>
-        <w:numPr>
-          <w:ilvl w:val="1"/>
-          <w:numId w:val="1087"/>
-        </w:numPr>
-        <w:pStyle w:val="Compact"/>
-      </w:pPr>
-      <w:r>
-        <w:rPr>
-          <w:bCs/>
-          <w:b/>
-        </w:rPr>
-        <w:t xml:space="preserve">Squeaks, water and weather:</w:t>
+        <w:t xml:space="preserve">It tears downward at the end, then rings off the canyon walls.</w:t>
+      </w:r>
+    </w:p>
+    <w:p>
+      <w:pPr>
+        <w:numPr>
+          <w:ilvl w:val="1"/>
+          <w:numId w:val="1088"/>
+        </w:numPr>
+        <w:pStyle w:val="Compact"/>
+      </w:pPr>
+      <w:r>
+        <w:rPr>
+          <w:bCs/>
+          <w:b/>
+        </w:rPr>
+        <w:t xml:space="preserve">Bells, gongs, glass, coins and wood</w:t>
+      </w:r>
+      <w:r>
+        <w:t xml:space="preserve"> </w:t>
+      </w:r>
+      <w:r>
+        <w:t xml:space="preserve">ring with their own partials. A church bell has its hum an octave under, its minor-third tierce and its nominal. The gong blooms up into its shimmer after the strike.</w:t>
+      </w:r>
+    </w:p>
+    <w:p>
+      <w:pPr>
+        <w:numPr>
+          <w:ilvl w:val="1"/>
+          <w:numId w:val="1088"/>
+        </w:numPr>
+        <w:pStyle w:val="Compact"/>
+      </w:pPr>
+      <w:r>
+        <w:rPr>
+          <w:bCs/>
+          <w:b/>
+        </w:rPr>
+        <w:t xml:space="preserve">Voices:</w:t>
       </w:r>
     </w:p>
     <w:p>
@@ -7584,7 +7734,7 @@
         <w:pStyle w:val="Compact"/>
       </w:pPr>
       <w:r>
-        <w:t xml:space="preserve">The rubber duck is a squeaker reed, wheezing in between squeezes.</w:t>
+        <w:t xml:space="preserve">The choir is four sections, each with its own vowel, singing in a cathedral with a harp under it.</w:t>
       </w:r>
     </w:p>
     <w:p>
@@ -7596,7 +7746,7 @@
         <w:pStyle w:val="Compact"/>
       </w:pPr>
       <w:r>
-        <w:t xml:space="preserve">The cannonball is a slap, a kerplunk and hundreds of bubbles and drops.</w:t>
+        <w:t xml:space="preserve">The kazoo is a hummed voice with the paper buzzing on it.</w:t>
       </w:r>
     </w:p>
     <w:p>
@@ -7608,6 +7758,58 @@
         <w:pStyle w:val="Compact"/>
       </w:pPr>
       <w:r>
+        <w:t xml:space="preserve">The roar after the Greeen Chant is now crowd voices, not noise.</w:t>
+      </w:r>
+    </w:p>
+    <w:p>
+      <w:pPr>
+        <w:numPr>
+          <w:ilvl w:val="1"/>
+          <w:numId w:val="1088"/>
+        </w:numPr>
+        <w:pStyle w:val="Compact"/>
+      </w:pPr>
+      <w:r>
+        <w:rPr>
+          <w:bCs/>
+          <w:b/>
+        </w:rPr>
+        <w:t xml:space="preserve">Squeaks, water and weather:</w:t>
+      </w:r>
+    </w:p>
+    <w:p>
+      <w:pPr>
+        <w:numPr>
+          <w:ilvl w:val="2"/>
+          <w:numId w:val="1091"/>
+        </w:numPr>
+        <w:pStyle w:val="Compact"/>
+      </w:pPr>
+      <w:r>
+        <w:t xml:space="preserve">The rubber duck is a squeaker reed, wheezing in between squeezes.</w:t>
+      </w:r>
+    </w:p>
+    <w:p>
+      <w:pPr>
+        <w:numPr>
+          <w:ilvl w:val="2"/>
+          <w:numId w:val="1091"/>
+        </w:numPr>
+        <w:pStyle w:val="Compact"/>
+      </w:pPr>
+      <w:r>
+        <w:t xml:space="preserve">The cannonball is a slap, a kerplunk and hundreds of bubbles and drops.</w:t>
+      </w:r>
+    </w:p>
+    <w:p>
+      <w:pPr>
+        <w:numPr>
+          <w:ilvl w:val="2"/>
+          <w:numId w:val="1091"/>
+        </w:numPr>
+        <w:pStyle w:val="Compact"/>
+      </w:pPr>
+      <w:r>
         <w:t xml:space="preserve">Thunder tears the air open before the boom and the roll.</w:t>
       </w:r>
     </w:p>
@@ -7615,7 +7817,7 @@
       <w:pPr>
         <w:numPr>
           <w:ilvl w:val="0"/>
-          <w:numId w:val="1085"/>
+          <w:numId w:val="1086"/>
         </w:numPr>
         <w:pStyle w:val="Compact"/>
       </w:pPr>
@@ -7637,7 +7839,7 @@
       <w:pPr>
         <w:numPr>
           <w:ilvl w:val="0"/>
-          <w:numId w:val="1085"/>
+          <w:numId w:val="1086"/>
         </w:numPr>
         <w:pStyle w:val="Compact"/>
       </w:pPr>
@@ -7677,7 +7879,7 @@
       <w:pPr>
         <w:numPr>
           <w:ilvl w:val="0"/>
-          <w:numId w:val="1085"/>
+          <w:numId w:val="1086"/>
         </w:numPr>
         <w:pStyle w:val="Compact"/>
       </w:pPr>
@@ -7693,7 +7895,7 @@
       <w:pPr>
         <w:numPr>
           <w:ilvl w:val="1"/>
-          <w:numId w:val="1091"/>
+          <w:numId w:val="1092"/>
         </w:numPr>
         <w:pStyle w:val="Compact"/>
       </w:pPr>
@@ -7705,7 +7907,7 @@
       <w:pPr>
         <w:numPr>
           <w:ilvl w:val="1"/>
-          <w:numId w:val="1091"/>
+          <w:numId w:val="1092"/>
         </w:numPr>
         <w:pStyle w:val="Compact"/>
       </w:pPr>
@@ -7717,7 +7919,7 @@
       <w:pPr>
         <w:numPr>
           <w:ilvl w:val="1"/>
-          <w:numId w:val="1091"/>
+          <w:numId w:val="1092"/>
         </w:numPr>
         <w:pStyle w:val="Compact"/>
       </w:pPr>
@@ -7725,8 +7927,8 @@
         <w:t xml:space="preserve">Every new effect was captured frozen in time over a player in the studio.</w:t>
       </w:r>
     </w:p>
-    <w:bookmarkEnd w:id="67"/>
-    <w:bookmarkStart w:id="68" w:name="under-the-hood-quick-patch"/>
+    <w:bookmarkEnd w:id="68"/>
+    <w:bookmarkStart w:id="69" w:name="under-the-hood-quick-patch"/>
     <w:p>
       <w:pPr>
         <w:pStyle w:val="Heading2"/>
@@ -7739,7 +7941,7 @@
       <w:pPr>
         <w:numPr>
           <w:ilvl w:val="0"/>
-          <w:numId w:val="1092"/>
+          <w:numId w:val="1093"/>
         </w:numPr>
         <w:pStyle w:val="Compact"/>
       </w:pPr>
@@ -7754,14 +7956,14 @@
         <w:t xml:space="preserve"> </w:t>
       </w:r>
       <w:r>
-        <w:t xml:space="preserve">149 game tests and 40 service tests pass. The new ones cover non-shooter windows, smothered shots, the record scratch, repeat moves, diagonal moves, the straps being drawn, the apparel counts, dunk variety, the windmill and Eastbay paths, celebrations (input and clipping), reach-in contact, the AI staying in bounds, the D-pad fallback, Icon Legend, the green release counts and what each sound is made of, the AI’s reaction times, stamina and the line beside the grade.</w:t>
-      </w:r>
-    </w:p>
-    <w:p>
-      <w:pPr>
-        <w:numPr>
-          <w:ilvl w:val="0"/>
-          <w:numId w:val="1092"/>
+        <w:t xml:space="preserve">154 game tests and 40 service tests pass. The new ones cover non-shooter windows, smothered shots, the record scratch, repeat moves, diagonal moves, the straps being drawn, the apparel counts, dunk variety, the windmill and Eastbay paths, celebrations (input and clipping), reach-in contact, the AI staying in bounds, the D-pad fallback, Icon Legend, the green release counts and what each sound is made of, the AI’s reaction times, stamina and the line beside the grade.</w:t>
+      </w:r>
+    </w:p>
+    <w:p>
+      <w:pPr>
+        <w:numPr>
+          <w:ilvl w:val="0"/>
+          <w:numId w:val="1093"/>
         </w:numPr>
         <w:pStyle w:val="Compact"/>
       </w:pPr>
@@ -7777,7 +7979,7 @@
       <w:pPr>
         <w:numPr>
           <w:ilvl w:val="1"/>
-          <w:numId w:val="1093"/>
+          <w:numId w:val="1094"/>
         </w:numPr>
         <w:pStyle w:val="Compact"/>
       </w:pPr>
@@ -7801,7 +8003,7 @@
       <w:pPr>
         <w:numPr>
           <w:ilvl w:val="1"/>
-          <w:numId w:val="1093"/>
+          <w:numId w:val="1094"/>
         </w:numPr>
         <w:pStyle w:val="Compact"/>
       </w:pPr>
@@ -7825,7 +8027,7 @@
       <w:pPr>
         <w:numPr>
           <w:ilvl w:val="1"/>
-          <w:numId w:val="1093"/>
+          <w:numId w:val="1094"/>
         </w:numPr>
         <w:pStyle w:val="Compact"/>
       </w:pPr>
@@ -7837,7 +8039,7 @@
       <w:pPr>
         <w:numPr>
           <w:ilvl w:val="1"/>
-          <w:numId w:val="1093"/>
+          <w:numId w:val="1094"/>
         </w:numPr>
         <w:pStyle w:val="Compact"/>
       </w:pPr>
@@ -7849,7 +8051,7 @@
       <w:pPr>
         <w:numPr>
           <w:ilvl w:val="1"/>
-          <w:numId w:val="1093"/>
+          <w:numId w:val="1094"/>
         </w:numPr>
         <w:pStyle w:val="Compact"/>
       </w:pPr>
@@ -7873,7 +8075,7 @@
       <w:pPr>
         <w:numPr>
           <w:ilvl w:val="1"/>
-          <w:numId w:val="1093"/>
+          <w:numId w:val="1094"/>
         </w:numPr>
         <w:pStyle w:val="Compact"/>
       </w:pPr>
@@ -7897,7 +8099,7 @@
       <w:pPr>
         <w:numPr>
           <w:ilvl w:val="1"/>
-          <w:numId w:val="1093"/>
+          <w:numId w:val="1094"/>
         </w:numPr>
         <w:pStyle w:val="Compact"/>
       </w:pPr>
@@ -7921,7 +8123,7 @@
       <w:pPr>
         <w:numPr>
           <w:ilvl w:val="1"/>
-          <w:numId w:val="1093"/>
+          <w:numId w:val="1094"/>
         </w:numPr>
         <w:pStyle w:val="Compact"/>
       </w:pPr>
@@ -7967,7 +8169,37 @@
       <w:pPr>
         <w:numPr>
           <w:ilvl w:val="1"/>
-          <w:numId w:val="1093"/>
+          <w:numId w:val="1094"/>
+        </w:numPr>
+        <w:pStyle w:val="Compact"/>
+      </w:pPr>
+      <w:r>
+        <w:t xml:space="preserve">Screens:</w:t>
+      </w:r>
+      <w:r>
+        <w:t xml:space="preserve"> </w:t>
+      </w:r>
+      <w:r>
+        <w:t xml:space="preserve">“</w:t>
+      </w:r>
+      <w:r>
+        <w:t xml:space="preserve">perfect</w:t>
+      </w:r>
+      <w:r>
+        <w:t xml:space="preserve">”</w:t>
+      </w:r>
+      <w:r>
+        <w:t xml:space="preserve"> </w:t>
+      </w:r>
+      <w:r>
+        <w:t xml:space="preserve">means the screen’s quality clears a bar that drops with the Brick Wall tier and rises with the defender’s own tier, and the defender came in at 1.5 m/s or more. A screen is only a screen when it was called or set square to a defender going for the ball; the rest is incidental contact.</w:t>
+      </w:r>
+    </w:p>
+    <w:p>
+      <w:pPr>
+        <w:numPr>
+          <w:ilvl w:val="1"/>
+          <w:numId w:val="1094"/>
         </w:numPr>
         <w:pStyle w:val="Compact"/>
       </w:pPr>
@@ -7975,8 +8207,8 @@
         <w:t xml:space="preserve">The faster AI reactions apply to every AI player: teammates, opponents and your own player on auto-play.</w:t>
       </w:r>
     </w:p>
-    <w:bookmarkEnd w:id="68"/>
     <w:bookmarkEnd w:id="69"/>
+    <w:bookmarkEnd w:id="70"/>
     <w:sectPr/>
   </w:body>
 </w:document>
@@ -8439,6 +8671,9 @@
     <w:abstractNumId w:val="991"/>
   </w:num>
   <w:num w:numId="1093">
+    <w:abstractNumId w:val="991"/>
+  </w:num>
+  <w:num w:numId="1094">
     <w:abstractNumId w:val="991"/>
   </w:num>
 </w:numbering>

</xml_diff>

<commit_message>
alley oop/ai passing patch
</commit_message>
<xml_diff>
--- a/PATCH_NOTES_v0.4.7.5.docx
+++ b/PATCH_NOTES_v0.4.7.5.docx
@@ -3526,7 +3526,7 @@
     </w:p>
     <w:bookmarkEnd w:id="41"/>
     <w:bookmarkEnd w:id="42"/>
-    <w:bookmarkStart w:id="70" w:name="quick-patch"/>
+    <w:bookmarkStart w:id="71" w:name="quick-patch"/>
     <w:p>
       <w:pPr>
         <w:pStyle w:val="Heading1"/>
@@ -4228,7 +4228,7 @@
     </w:tbl>
     <w:bookmarkEnd w:id="46"/>
     <w:bookmarkEnd w:id="47"/>
-    <w:bookmarkStart w:id="60" w:name="dribbling-passing-and-defense-1"/>
+    <w:bookmarkStart w:id="61" w:name="dribbling-passing-and-defense-1"/>
     <w:p>
       <w:pPr>
         <w:pStyle w:val="Heading2"/>
@@ -6113,8 +6113,163 @@
       </w:r>
     </w:p>
     <w:bookmarkEnd w:id="59"/>
+    <w:bookmarkStart w:id="60" w:name="the-break-and-your-alley-oops-oct-10"/>
+    <w:p>
+      <w:pPr>
+        <w:pStyle w:val="Heading3"/>
+      </w:pPr>
+      <w:r>
+        <w:t xml:space="preserve">The break, and your alley-oops (Oct 10)</w:t>
+      </w:r>
+    </w:p>
+    <w:p>
+      <w:pPr>
+        <w:numPr>
+          <w:ilvl w:val="0"/>
+          <w:numId w:val="1069"/>
+        </w:numPr>
+        <w:pStyle w:val="Compact"/>
+      </w:pPr>
+      <w:r>
+        <w:rPr>
+          <w:bCs/>
+          <w:b/>
+        </w:rPr>
+        <w:t xml:space="preserve">The AI sees the man running the open floor.</w:t>
+      </w:r>
+      <w:r>
+        <w:t xml:space="preserve"> </w:t>
+      </w:r>
+      <w:r>
+        <w:t xml:space="preserve">With the ball in transition (and for a couple of seconds after the break is on), the handler’s first look is a teammate well ahead of him, running at the rim, with nobody between him and the basket and nobody level with him who could recover. He gets it before anything else happens: an</w:t>
+      </w:r>
+      <w:r>
+        <w:t xml:space="preserve"> </w:t>
+      </w:r>
+      <w:r>
+        <w:rPr>
+          <w:bCs/>
+          <w:b/>
+        </w:rPr>
+        <w:t xml:space="preserve">alley-oop</w:t>
+      </w:r>
+      <w:r>
+        <w:t xml:space="preserve"> </w:t>
+      </w:r>
+      <w:r>
+        <w:t xml:space="preserve">if he can get up to the rim in time, a quicker, flatter</w:t>
+      </w:r>
+      <w:r>
+        <w:t xml:space="preserve"> </w:t>
+      </w:r>
+      <w:r>
+        <w:rPr>
+          <w:bCs/>
+          <w:b/>
+        </w:rPr>
+        <w:t xml:space="preserve">lob over the top</w:t>
+      </w:r>
+      <w:r>
+        <w:t xml:space="preserve"> </w:t>
+      </w:r>
+      <w:r>
+        <w:t xml:space="preserve">when a body is in the chest lane and he’s clear, or the fast pass ahead otherwise. Smart handlers take that look almost every time.</w:t>
+      </w:r>
+    </w:p>
+    <w:p>
+      <w:pPr>
+        <w:numPr>
+          <w:ilvl w:val="0"/>
+          <w:numId w:val="1069"/>
+        </w:numPr>
+        <w:pStyle w:val="Compact"/>
+      </w:pPr>
+      <w:r>
+        <w:rPr>
+          <w:bCs/>
+          <w:b/>
+        </w:rPr>
+        <w:t xml:space="preserve">You get the lob too.</w:t>
+      </w:r>
+      <w:r>
+        <w:t xml:space="preserve"> </w:t>
+      </w:r>
+      <w:r>
+        <w:t xml:space="preserve">Beat your man down the floor (or get free at the rim in a set) and an AI teammate will throw you the alley-oop. When he does,</w:t>
+      </w:r>
+      <w:r>
+        <w:t xml:space="preserve"> </w:t>
+      </w:r>
+      <w:r>
+        <w:rPr>
+          <w:bCs/>
+          <w:b/>
+        </w:rPr>
+        <w:t xml:space="preserve">one of the four face buttons is called at random</w:t>
+      </w:r>
+      <w:r>
+        <w:t xml:space="preserve">, shown over your player’s head: A, B, X or Y on an Xbox pad (✕ ○ □ △ on PlayStation, your own symbols on a Switch pad), or the keys they stand for (pass, bounce pass, shoot, lob) on a keyboard.</w:t>
+      </w:r>
+      <w:r>
+        <w:t xml:space="preserve"> </w:t>
+      </w:r>
+      <w:r>
+        <w:rPr>
+          <w:bCs/>
+          <w:b/>
+        </w:rPr>
+        <w:t xml:space="preserve">Hit that button while the ball is in the air</w:t>
+      </w:r>
+      <w:r>
+        <w:t xml:space="preserve"> </w:t>
+      </w:r>
+      <w:r>
+        <w:t xml:space="preserve">— the ring turns green when the window opens, about a quarter of the way to your takeoff — and you go up and finish it.</w:t>
+      </w:r>
+      <w:r>
+        <w:t xml:space="preserve"> </w:t>
+      </w:r>
+      <w:r>
+        <w:rPr>
+          <w:bCs/>
+          <w:b/>
+        </w:rPr>
+        <w:t xml:space="preserve">Miss it and the alley-oop fails:</w:t>
+      </w:r>
+      <w:r>
+        <w:t xml:space="preserve"> </w:t>
+      </w:r>
+      <w:r>
+        <w:t xml:space="preserve">the wrong button, pressing too early or not pressing at all is a mistimed jump — a beat late and short — and the ball comes off your hands or sails over your head as a loose ball.</w:t>
+      </w:r>
+    </w:p>
+    <w:p>
+      <w:pPr>
+        <w:numPr>
+          <w:ilvl w:val="0"/>
+          <w:numId w:val="1069"/>
+        </w:numPr>
+        <w:pStyle w:val="Compact"/>
+      </w:pPr>
+      <w:r>
+        <w:t xml:space="preserve">Runners free at the rim call for the ball, so you see the look when you have it.</w:t>
+      </w:r>
+    </w:p>
+    <w:p>
+      <w:pPr>
+        <w:numPr>
+          <w:ilvl w:val="0"/>
+          <w:numId w:val="1069"/>
+        </w:numPr>
+        <w:pStyle w:val="Compact"/>
+      </w:pPr>
+      <w:r>
+        <w:t xml:space="preserve">In testing (AI only): about one alley-oop a game in Pro-Am with nine in ten caught, ten lobs ahead, and points within a few percent of before; the open court is rarer in AI 3v3 park games, so most of the action there is the pass ahead. With you running the floor it comes up a lot more.</w:t>
+      </w:r>
+    </w:p>
     <w:bookmarkEnd w:id="60"/>
-    <w:bookmarkStart w:id="61" w:name="progression-icon-legend-up-to-99"/>
+    <w:bookmarkEnd w:id="61"/>
+    <w:bookmarkStart w:id="62" w:name="progression-icon-legend-up-to-99"/>
     <w:p>
       <w:pPr>
         <w:pStyle w:val="Heading2"/>
@@ -6127,7 +6282,7 @@
       <w:pPr>
         <w:numPr>
           <w:ilvl w:val="0"/>
-          <w:numId w:val="1069"/>
+          <w:numId w:val="1070"/>
         </w:numPr>
         <w:pStyle w:val="Compact"/>
       </w:pPr>
@@ -6143,105 +6298,105 @@
       <w:pPr>
         <w:numPr>
           <w:ilvl w:val="1"/>
+          <w:numId w:val="1071"/>
+        </w:numPr>
+        <w:pStyle w:val="Compact"/>
+      </w:pPr>
+      <w:r>
+        <w:t xml:space="preserve">Simmed games, forfeits and other modes don’t count.</w:t>
+      </w:r>
+    </w:p>
+    <w:p>
+      <w:pPr>
+        <w:numPr>
+          <w:ilvl w:val="1"/>
+          <w:numId w:val="1071"/>
+        </w:numPr>
+        <w:pStyle w:val="Compact"/>
+      </w:pPr>
+      <w:r>
+        <w:t xml:space="preserve">The game that unlocks the Icon doesn’t count either.</w:t>
+      </w:r>
+    </w:p>
+    <w:p>
+      <w:pPr>
+        <w:numPr>
+          <w:ilvl w:val="0"/>
           <w:numId w:val="1070"/>
         </w:numPr>
         <w:pStyle w:val="Compact"/>
       </w:pPr>
       <w:r>
-        <w:t xml:space="preserve">Simmed games, forfeits and other modes don’t count.</w:t>
-      </w:r>
-    </w:p>
-    <w:p>
-      <w:pPr>
-        <w:numPr>
-          <w:ilvl w:val="1"/>
+        <w:rPr>
+          <w:bCs/>
+          <w:b/>
+        </w:rPr>
+        <w:t xml:space="preserve">No stat picking:</w:t>
+      </w:r>
+      <w:r>
+        <w:t xml:space="preserve"> </w:t>
+      </w:r>
+      <w:r>
+        <w:t xml:space="preserve">the build system places each +1 itself.</w:t>
+      </w:r>
+    </w:p>
+    <w:p>
+      <w:pPr>
+        <w:numPr>
+          <w:ilvl w:val="1"/>
+          <w:numId w:val="1072"/>
+        </w:numPr>
+        <w:pStyle w:val="Compact"/>
+      </w:pPr>
+      <w:r>
+        <w:t xml:space="preserve">It raises the attributes your build leans on most: the shape its caps come from (archetype, size and weight) and what your position’s overall counts most.</w:t>
+      </w:r>
+    </w:p>
+    <w:p>
+      <w:pPr>
+        <w:numPr>
+          <w:ilvl w:val="1"/>
+          <w:numId w:val="1072"/>
+        </w:numPr>
+        <w:pStyle w:val="Compact"/>
+      </w:pPr>
+      <w:r>
+        <w:t xml:space="preserve">It goes a point at a time across the top half of that list until the overall is up by one.</w:t>
+      </w:r>
+    </w:p>
+    <w:p>
+      <w:pPr>
+        <w:numPr>
+          <w:ilvl w:val="1"/>
+          <w:numId w:val="1072"/>
+        </w:numPr>
+        <w:pStyle w:val="Compact"/>
+      </w:pPr>
+      <w:r>
+        <w:t xml:space="preserve">Attributes at 99 are never touched, and your caps rise with the upgrades.</w:t>
+      </w:r>
+    </w:p>
+    <w:p>
+      <w:pPr>
+        <w:numPr>
+          <w:ilvl w:val="1"/>
+          <w:numId w:val="1072"/>
+        </w:numPr>
+        <w:pStyle w:val="Compact"/>
+      </w:pPr>
+      <w:r>
+        <w:t xml:space="preserve">Example: a Sharpshooter’s shooting reaches 99 first, and a Glass Cleaner’s rebounding and interior defense do.</w:t>
+      </w:r>
+    </w:p>
+    <w:p>
+      <w:pPr>
+        <w:numPr>
+          <w:ilvl w:val="0"/>
           <w:numId w:val="1070"/>
         </w:numPr>
         <w:pStyle w:val="Compact"/>
       </w:pPr>
       <w:r>
-        <w:t xml:space="preserve">The game that unlocks the Icon doesn’t count either.</w:t>
-      </w:r>
-    </w:p>
-    <w:p>
-      <w:pPr>
-        <w:numPr>
-          <w:ilvl w:val="0"/>
-          <w:numId w:val="1069"/>
-        </w:numPr>
-        <w:pStyle w:val="Compact"/>
-      </w:pPr>
-      <w:r>
-        <w:rPr>
-          <w:bCs/>
-          <w:b/>
-        </w:rPr>
-        <w:t xml:space="preserve">No stat picking:</w:t>
-      </w:r>
-      <w:r>
-        <w:t xml:space="preserve"> </w:t>
-      </w:r>
-      <w:r>
-        <w:t xml:space="preserve">the build system places each +1 itself.</w:t>
-      </w:r>
-    </w:p>
-    <w:p>
-      <w:pPr>
-        <w:numPr>
-          <w:ilvl w:val="1"/>
-          <w:numId w:val="1071"/>
-        </w:numPr>
-        <w:pStyle w:val="Compact"/>
-      </w:pPr>
-      <w:r>
-        <w:t xml:space="preserve">It raises the attributes your build leans on most: the shape its caps come from (archetype, size and weight) and what your position’s overall counts most.</w:t>
-      </w:r>
-    </w:p>
-    <w:p>
-      <w:pPr>
-        <w:numPr>
-          <w:ilvl w:val="1"/>
-          <w:numId w:val="1071"/>
-        </w:numPr>
-        <w:pStyle w:val="Compact"/>
-      </w:pPr>
-      <w:r>
-        <w:t xml:space="preserve">It goes a point at a time across the top half of that list until the overall is up by one.</w:t>
-      </w:r>
-    </w:p>
-    <w:p>
-      <w:pPr>
-        <w:numPr>
-          <w:ilvl w:val="1"/>
-          <w:numId w:val="1071"/>
-        </w:numPr>
-        <w:pStyle w:val="Compact"/>
-      </w:pPr>
-      <w:r>
-        <w:t xml:space="preserve">Attributes at 99 are never touched, and your caps rise with the upgrades.</w:t>
-      </w:r>
-    </w:p>
-    <w:p>
-      <w:pPr>
-        <w:numPr>
-          <w:ilvl w:val="1"/>
-          <w:numId w:val="1071"/>
-        </w:numPr>
-        <w:pStyle w:val="Compact"/>
-      </w:pPr>
-      <w:r>
-        <w:t xml:space="preserve">Example: a Sharpshooter’s shooting reaches 99 first, and a Glass Cleaner’s rebounding and interior defense do.</w:t>
-      </w:r>
-    </w:p>
-    <w:p>
-      <w:pPr>
-        <w:numPr>
-          <w:ilvl w:val="0"/>
-          <w:numId w:val="1069"/>
-        </w:numPr>
-        <w:pStyle w:val="Compact"/>
-      </w:pPr>
-      <w:r>
         <w:rPr>
           <w:bCs/>
           <w:b/>
@@ -6253,7 +6408,7 @@
       <w:pPr>
         <w:numPr>
           <w:ilvl w:val="0"/>
-          <w:numId w:val="1069"/>
+          <w:numId w:val="1070"/>
         </w:numPr>
         <w:pStyle w:val="Compact"/>
       </w:pPr>
@@ -6269,7 +6424,7 @@
       <w:pPr>
         <w:numPr>
           <w:ilvl w:val="1"/>
-          <w:numId w:val="1072"/>
+          <w:numId w:val="1073"/>
         </w:numPr>
         <w:pStyle w:val="Compact"/>
       </w:pPr>
@@ -6281,7 +6436,7 @@
       <w:pPr>
         <w:numPr>
           <w:ilvl w:val="1"/>
-          <w:numId w:val="1072"/>
+          <w:numId w:val="1073"/>
         </w:numPr>
         <w:pStyle w:val="Compact"/>
       </w:pPr>
@@ -6289,8 +6444,8 @@
         <w:t xml:space="preserve">The Pro Run screen shows it too.</w:t>
       </w:r>
     </w:p>
-    <w:bookmarkEnd w:id="61"/>
-    <w:bookmarkStart w:id="66" w:name="the-look"/>
+    <w:bookmarkEnd w:id="62"/>
+    <w:bookmarkStart w:id="67" w:name="the-look"/>
     <w:p>
       <w:pPr>
         <w:pStyle w:val="Heading2"/>
@@ -6299,7 +6454,7 @@
         <w:t xml:space="preserve">The look</w:t>
       </w:r>
     </w:p>
-    <w:bookmarkStart w:id="62" w:name="jersey-straps-fixed-properly-this-time"/>
+    <w:bookmarkStart w:id="63" w:name="jersey-straps-fixed-properly-this-time"/>
     <w:p>
       <w:pPr>
         <w:pStyle w:val="Heading3"/>
@@ -6312,7 +6467,7 @@
       <w:pPr>
         <w:numPr>
           <w:ilvl w:val="0"/>
-          <w:numId w:val="1073"/>
+          <w:numId w:val="1074"/>
         </w:numPr>
         <w:pStyle w:val="Compact"/>
       </w:pPr>
@@ -6334,7 +6489,7 @@
       <w:pPr>
         <w:numPr>
           <w:ilvl w:val="0"/>
-          <w:numId w:val="1073"/>
+          <w:numId w:val="1074"/>
         </w:numPr>
         <w:pStyle w:val="Compact"/>
       </w:pPr>
@@ -6356,7 +6511,7 @@
       <w:pPr>
         <w:numPr>
           <w:ilvl w:val="1"/>
-          <w:numId w:val="1074"/>
+          <w:numId w:val="1075"/>
         </w:numPr>
         <w:pStyle w:val="Compact"/>
       </w:pPr>
@@ -6368,7 +6523,7 @@
       <w:pPr>
         <w:numPr>
           <w:ilvl w:val="1"/>
-          <w:numId w:val="1074"/>
+          <w:numId w:val="1075"/>
         </w:numPr>
         <w:pStyle w:val="Compact"/>
       </w:pPr>
@@ -6380,7 +6535,7 @@
       <w:pPr>
         <w:numPr>
           <w:ilvl w:val="1"/>
-          <w:numId w:val="1074"/>
+          <w:numId w:val="1075"/>
         </w:numPr>
         <w:pStyle w:val="Compact"/>
       </w:pPr>
@@ -6392,7 +6547,7 @@
       <w:pPr>
         <w:numPr>
           <w:ilvl w:val="1"/>
-          <w:numId w:val="1074"/>
+          <w:numId w:val="1075"/>
         </w:numPr>
         <w:pStyle w:val="Compact"/>
       </w:pPr>
@@ -6400,8 +6555,8 @@
         <w:t xml:space="preserve">The fabric’s mesh weave runs true to size along it.</w:t>
       </w:r>
     </w:p>
-    <w:bookmarkEnd w:id="62"/>
-    <w:bookmarkStart w:id="63" w:name="dunks"/>
+    <w:bookmarkEnd w:id="63"/>
+    <w:bookmarkStart w:id="64" w:name="dunks"/>
     <w:p>
       <w:pPr>
         <w:pStyle w:val="Heading3"/>
@@ -6414,7 +6569,7 @@
       <w:pPr>
         <w:numPr>
           <w:ilvl w:val="0"/>
-          <w:numId w:val="1075"/>
+          <w:numId w:val="1076"/>
         </w:numPr>
         <w:pStyle w:val="Compact"/>
       </w:pPr>
@@ -6436,81 +6591,81 @@
       <w:pPr>
         <w:numPr>
           <w:ilvl w:val="1"/>
+          <w:numId w:val="1077"/>
+        </w:numPr>
+        <w:pStyle w:val="Compact"/>
+      </w:pPr>
+      <w:r>
+        <w:t xml:space="preserve">No generic finish is shared by more than 4 packages. Before, reverse slams showed up in 15 packages and double clutches in 14.</w:t>
+      </w:r>
+    </w:p>
+    <w:p>
+      <w:pPr>
+        <w:numPr>
+          <w:ilvl w:val="1"/>
+          <w:numId w:val="1077"/>
+        </w:numPr>
+        <w:pStyle w:val="Compact"/>
+      </w:pPr>
+      <w:r>
+        <w:t xml:space="preserve">Every signature belongs to one package only. The Spin Mill no longer borrows the Eastbay.</w:t>
+      </w:r>
+    </w:p>
+    <w:p>
+      <w:pPr>
+        <w:numPr>
+          <w:ilvl w:val="0"/>
           <w:numId w:val="1076"/>
         </w:numPr>
         <w:pStyle w:val="Compact"/>
       </w:pPr>
       <w:r>
-        <w:t xml:space="preserve">No generic finish is shared by more than 4 packages. Before, reverse slams showed up in 15 packages and double clutches in 14.</w:t>
-      </w:r>
-    </w:p>
-    <w:p>
-      <w:pPr>
-        <w:numPr>
-          <w:ilvl w:val="1"/>
+        <w:rPr>
+          <w:bCs/>
+          <w:b/>
+        </w:rPr>
+        <w:t xml:space="preserve">Windmills:</w:t>
+      </w:r>
+      <w:r>
+        <w:t xml:space="preserve"> </w:t>
+      </w:r>
+      <w:r>
+        <w:t xml:space="preserve">the arm now goes round straight from the shoulder, at full length, through the jump.</w:t>
+      </w:r>
+    </w:p>
+    <w:p>
+      <w:pPr>
+        <w:numPr>
+          <w:ilvl w:val="1"/>
+          <w:numId w:val="1078"/>
+        </w:numPr>
+        <w:pStyle w:val="Compact"/>
+      </w:pPr>
+      <w:r>
+        <w:t xml:space="preserve">Before, the circle sat above the shoulder, so the elbow folded at the bottom, the arm over-stretched at the top and most of the circle happened during the gather.</w:t>
+      </w:r>
+    </w:p>
+    <w:p>
+      <w:pPr>
+        <w:numPr>
+          <w:ilvl w:val="1"/>
+          <w:numId w:val="1078"/>
+        </w:numPr>
+        <w:pStyle w:val="Compact"/>
+      </w:pPr>
+      <w:r>
+        <w:t xml:space="preserve">It comes over the top and down at the rim with the ball still in the hand.</w:t>
+      </w:r>
+    </w:p>
+    <w:p>
+      <w:pPr>
+        <w:numPr>
+          <w:ilvl w:val="0"/>
           <w:numId w:val="1076"/>
         </w:numPr>
         <w:pStyle w:val="Compact"/>
       </w:pPr>
       <w:r>
-        <w:t xml:space="preserve">Every signature belongs to one package only. The Spin Mill no longer borrows the Eastbay.</w:t>
-      </w:r>
-    </w:p>
-    <w:p>
-      <w:pPr>
-        <w:numPr>
-          <w:ilvl w:val="0"/>
-          <w:numId w:val="1075"/>
-        </w:numPr>
-        <w:pStyle w:val="Compact"/>
-      </w:pPr>
-      <w:r>
-        <w:rPr>
-          <w:bCs/>
-          <w:b/>
-        </w:rPr>
-        <w:t xml:space="preserve">Windmills:</w:t>
-      </w:r>
-      <w:r>
-        <w:t xml:space="preserve"> </w:t>
-      </w:r>
-      <w:r>
-        <w:t xml:space="preserve">the arm now goes round straight from the shoulder, at full length, through the jump.</w:t>
-      </w:r>
-    </w:p>
-    <w:p>
-      <w:pPr>
-        <w:numPr>
-          <w:ilvl w:val="1"/>
-          <w:numId w:val="1077"/>
-        </w:numPr>
-        <w:pStyle w:val="Compact"/>
-      </w:pPr>
-      <w:r>
-        <w:t xml:space="preserve">Before, the circle sat above the shoulder, so the elbow folded at the bottom, the arm over-stretched at the top and most of the circle happened during the gather.</w:t>
-      </w:r>
-    </w:p>
-    <w:p>
-      <w:pPr>
-        <w:numPr>
-          <w:ilvl w:val="1"/>
-          <w:numId w:val="1077"/>
-        </w:numPr>
-        <w:pStyle w:val="Compact"/>
-      </w:pPr>
-      <w:r>
-        <w:t xml:space="preserve">It comes over the top and down at the rim with the ball still in the hand.</w:t>
-      </w:r>
-    </w:p>
-    <w:p>
-      <w:pPr>
-        <w:numPr>
-          <w:ilvl w:val="0"/>
-          <w:numId w:val="1075"/>
-        </w:numPr>
-        <w:pStyle w:val="Compact"/>
-      </w:pPr>
-      <w:r>
         <w:rPr>
           <w:bCs/>
           <w:b/>
@@ -6522,7 +6677,7 @@
       <w:pPr>
         <w:numPr>
           <w:ilvl w:val="1"/>
-          <w:numId w:val="1078"/>
+          <w:numId w:val="1079"/>
         </w:numPr>
         <w:pStyle w:val="Compact"/>
       </w:pPr>
@@ -6534,7 +6689,7 @@
       <w:pPr>
         <w:numPr>
           <w:ilvl w:val="1"/>
-          <w:numId w:val="1078"/>
+          <w:numId w:val="1079"/>
         </w:numPr>
         <w:pStyle w:val="Compact"/>
       </w:pPr>
@@ -6546,7 +6701,7 @@
       <w:pPr>
         <w:numPr>
           <w:ilvl w:val="1"/>
-          <w:numId w:val="1078"/>
+          <w:numId w:val="1079"/>
         </w:numPr>
         <w:pStyle w:val="Compact"/>
       </w:pPr>
@@ -6554,8 +6709,8 @@
         <w:t xml:space="preserve">Before, it was timed from the gather, so most of it happened on the floor, and the ball dipped in front of the right thigh instead of going through.</w:t>
       </w:r>
     </w:p>
-    <w:bookmarkEnd w:id="63"/>
-    <w:bookmarkStart w:id="64" w:name="celebrations"/>
+    <w:bookmarkEnd w:id="64"/>
+    <w:bookmarkStart w:id="65" w:name="celebrations"/>
     <w:p>
       <w:pPr>
         <w:pStyle w:val="Heading3"/>
@@ -6568,7 +6723,7 @@
       <w:pPr>
         <w:numPr>
           <w:ilvl w:val="0"/>
-          <w:numId w:val="1079"/>
+          <w:numId w:val="1080"/>
         </w:numPr>
         <w:pStyle w:val="Compact"/>
       </w:pPr>
@@ -6584,81 +6739,81 @@
       <w:pPr>
         <w:numPr>
           <w:ilvl w:val="1"/>
+          <w:numId w:val="1081"/>
+        </w:numPr>
+        <w:pStyle w:val="Compact"/>
+      </w:pPr>
+      <w:r>
+        <w:t xml:space="preserve">Before, they only worked if you pressed G / D-pad up during the second and a half of dead ball after a basket while your player was doing nothing, and the check then cut them off.</w:t>
+      </w:r>
+    </w:p>
+    <w:p>
+      <w:pPr>
+        <w:numPr>
+          <w:ilvl w:val="1"/>
+          <w:numId w:val="1081"/>
+        </w:numPr>
+        <w:pStyle w:val="Compact"/>
+      </w:pPr>
+      <w:r>
+        <w:t xml:space="preserve">Now a press waits up to 2.5 seconds for your player to be free (follow-through, landing, hanging on the rim).</w:t>
+      </w:r>
+    </w:p>
+    <w:p>
+      <w:pPr>
+        <w:numPr>
+          <w:ilvl w:val="1"/>
+          <w:numId w:val="1081"/>
+        </w:numPr>
+        <w:pStyle w:val="Compact"/>
+      </w:pPr>
+      <w:r>
+        <w:t xml:space="preserve">They play in any dead ball, check or inbound (unless you have the ball) and for 3 seconds after your team scores.</w:t>
+      </w:r>
+    </w:p>
+    <w:p>
+      <w:pPr>
+        <w:numPr>
+          <w:ilvl w:val="1"/>
+          <w:numId w:val="1081"/>
+        </w:numPr>
+        <w:pStyle w:val="Compact"/>
+      </w:pPr>
+      <w:r>
+        <w:t xml:space="preserve">Whoever has the ball stops for the check; everyone else finishes.</w:t>
+      </w:r>
+    </w:p>
+    <w:p>
+      <w:pPr>
+        <w:numPr>
+          <w:ilvl w:val="0"/>
           <w:numId w:val="1080"/>
         </w:numPr>
         <w:pStyle w:val="Compact"/>
       </w:pPr>
       <w:r>
-        <w:t xml:space="preserve">Before, they only worked if you pressed G / D-pad up during the second and a half of dead ball after a basket while your player was doing nothing, and the check then cut them off.</w:t>
-      </w:r>
-    </w:p>
-    <w:p>
-      <w:pPr>
-        <w:numPr>
-          <w:ilvl w:val="1"/>
+        <w:rPr>
+          <w:bCs/>
+          <w:b/>
+        </w:rPr>
+        <w:t xml:space="preserve">Controllers:</w:t>
+      </w:r>
+      <w:r>
+        <w:t xml:space="preserve"> </w:t>
+      </w:r>
+      <w:r>
+        <w:t xml:space="preserve">pads the browser doesn’t map to the standard layout send the D-pad as axes. The game now reads those too, so D-pad up works on them.</w:t>
+      </w:r>
+    </w:p>
+    <w:p>
+      <w:pPr>
+        <w:numPr>
+          <w:ilvl w:val="0"/>
           <w:numId w:val="1080"/>
         </w:numPr>
         <w:pStyle w:val="Compact"/>
       </w:pPr>
       <w:r>
-        <w:t xml:space="preserve">Now a press waits up to 2.5 seconds for your player to be free (follow-through, landing, hanging on the rim).</w:t>
-      </w:r>
-    </w:p>
-    <w:p>
-      <w:pPr>
-        <w:numPr>
-          <w:ilvl w:val="1"/>
-          <w:numId w:val="1080"/>
-        </w:numPr>
-        <w:pStyle w:val="Compact"/>
-      </w:pPr>
-      <w:r>
-        <w:t xml:space="preserve">They play in any dead ball, check or inbound (unless you have the ball) and for 3 seconds after your team scores.</w:t>
-      </w:r>
-    </w:p>
-    <w:p>
-      <w:pPr>
-        <w:numPr>
-          <w:ilvl w:val="1"/>
-          <w:numId w:val="1080"/>
-        </w:numPr>
-        <w:pStyle w:val="Compact"/>
-      </w:pPr>
-      <w:r>
-        <w:t xml:space="preserve">Whoever has the ball stops for the check; everyone else finishes.</w:t>
-      </w:r>
-    </w:p>
-    <w:p>
-      <w:pPr>
-        <w:numPr>
-          <w:ilvl w:val="0"/>
-          <w:numId w:val="1079"/>
-        </w:numPr>
-        <w:pStyle w:val="Compact"/>
-      </w:pPr>
-      <w:r>
-        <w:rPr>
-          <w:bCs/>
-          <w:b/>
-        </w:rPr>
-        <w:t xml:space="preserve">Controllers:</w:t>
-      </w:r>
-      <w:r>
-        <w:t xml:space="preserve"> </w:t>
-      </w:r>
-      <w:r>
-        <w:t xml:space="preserve">pads the browser doesn’t map to the standard layout send the D-pad as axes. The game now reads those too, so D-pad up works on them.</w:t>
-      </w:r>
-    </w:p>
-    <w:p>
-      <w:pPr>
-        <w:numPr>
-          <w:ilvl w:val="0"/>
-          <w:numId w:val="1079"/>
-        </w:numPr>
-        <w:pStyle w:val="Compact"/>
-      </w:pPr>
-      <w:r>
         <w:rPr>
           <w:bCs/>
           <w:b/>
@@ -6672,8 +6827,8 @@
         <w:t xml:space="preserve">Chest Thump, Heart, Dust Off, Archer and Sleep put a hand or forearm through the chest. Each was fixed and every celebration was re-checked on three builds: none clip now.</w:t>
       </w:r>
     </w:p>
-    <w:bookmarkEnd w:id="64"/>
-    <w:bookmarkStart w:id="65" w:name="posterizer-and-contact-finisher"/>
+    <w:bookmarkEnd w:id="65"/>
+    <w:bookmarkStart w:id="66" w:name="posterizer-and-contact-finisher"/>
     <w:p>
       <w:pPr>
         <w:pStyle w:val="Heading3"/>
@@ -6686,7 +6841,7 @@
       <w:pPr>
         <w:numPr>
           <w:ilvl w:val="0"/>
-          <w:numId w:val="1081"/>
+          <w:numId w:val="1082"/>
         </w:numPr>
         <w:pStyle w:val="Compact"/>
       </w:pPr>
@@ -6702,7 +6857,7 @@
       <w:pPr>
         <w:numPr>
           <w:ilvl w:val="1"/>
-          <w:numId w:val="1082"/>
+          <w:numId w:val="1083"/>
         </w:numPr>
         <w:pStyle w:val="Compact"/>
       </w:pPr>
@@ -6714,7 +6869,7 @@
       <w:pPr>
         <w:numPr>
           <w:ilvl w:val="1"/>
-          <w:numId w:val="1082"/>
+          <w:numId w:val="1083"/>
         </w:numPr>
         <w:pStyle w:val="Compact"/>
       </w:pPr>
@@ -6726,7 +6881,7 @@
       <w:pPr>
         <w:numPr>
           <w:ilvl w:val="1"/>
-          <w:numId w:val="1082"/>
+          <w:numId w:val="1083"/>
         </w:numPr>
         <w:pStyle w:val="Compact"/>
       </w:pPr>
@@ -6738,7 +6893,7 @@
       <w:pPr>
         <w:numPr>
           <w:ilvl w:val="1"/>
-          <w:numId w:val="1082"/>
+          <w:numId w:val="1083"/>
         </w:numPr>
         <w:pStyle w:val="Compact"/>
       </w:pPr>
@@ -6746,9 +6901,9 @@
         <w:t xml:space="preserve">Before, the poster fired at the contact, even when the dunk then turned into a layup.</w:t>
       </w:r>
     </w:p>
-    <w:bookmarkEnd w:id="65"/>
     <w:bookmarkEnd w:id="66"/>
-    <w:bookmarkStart w:id="67" w:name="store-menus-and-hud"/>
+    <w:bookmarkEnd w:id="67"/>
+    <w:bookmarkStart w:id="68" w:name="store-menus-and-hud"/>
     <w:p>
       <w:pPr>
         <w:pStyle w:val="Heading2"/>
@@ -6761,7 +6916,7 @@
       <w:pPr>
         <w:numPr>
           <w:ilvl w:val="0"/>
-          <w:numId w:val="1083"/>
+          <w:numId w:val="1084"/>
         </w:numPr>
       </w:pPr>
       <w:r>
@@ -7263,7 +7418,7 @@
       <w:pPr>
         <w:numPr>
           <w:ilvl w:val="0"/>
-          <w:numId w:val="1083"/>
+          <w:numId w:val="1084"/>
         </w:numPr>
       </w:pPr>
       <w:r>
@@ -7326,7 +7481,7 @@
       <w:pPr>
         <w:numPr>
           <w:ilvl w:val="0"/>
-          <w:numId w:val="1083"/>
+          <w:numId w:val="1084"/>
         </w:numPr>
       </w:pPr>
       <w:r>
@@ -7347,77 +7502,77 @@
       <w:pPr>
         <w:numPr>
           <w:ilvl w:val="1"/>
+          <w:numId w:val="1085"/>
+        </w:numPr>
+        <w:pStyle w:val="Compact"/>
+      </w:pPr>
+      <w:r>
+        <w:t xml:space="preserve">The panel is 1.2× the grade’s width, at the same height.</w:t>
+      </w:r>
+    </w:p>
+    <w:p>
+      <w:pPr>
+        <w:numPr>
+          <w:ilvl w:val="1"/>
+          <w:numId w:val="1085"/>
+        </w:numPr>
+        <w:pStyle w:val="Compact"/>
+      </w:pPr>
+      <w:r>
+        <w:t xml:space="preserve">The grade itself keeps its size and moves left to make room.</w:t>
+      </w:r>
+    </w:p>
+    <w:p>
+      <w:pPr>
+        <w:numPr>
+          <w:ilvl w:val="1"/>
+          <w:numId w:val="1085"/>
+        </w:numPr>
+        <w:pStyle w:val="Compact"/>
+      </w:pPr>
+      <w:r>
+        <w:t xml:space="preserve">A number that goes up pulses once.</w:t>
+      </w:r>
+    </w:p>
+    <w:p>
+      <w:pPr>
+        <w:numPr>
+          <w:ilvl w:val="1"/>
+          <w:numId w:val="1085"/>
+        </w:numPr>
+        <w:pStyle w:val="Compact"/>
+      </w:pPr>
+      <w:r>
+        <w:t xml:space="preserve">It shows whenever the grade does (Settings → Lock-In grade).</w:t>
+      </w:r>
+    </w:p>
+    <w:p>
+      <w:pPr>
+        <w:numPr>
+          <w:ilvl w:val="0"/>
           <w:numId w:val="1084"/>
         </w:numPr>
-        <w:pStyle w:val="Compact"/>
-      </w:pPr>
-      <w:r>
-        <w:t xml:space="preserve">The panel is 1.2× the grade’s width, at the same height.</w:t>
-      </w:r>
-    </w:p>
-    <w:p>
-      <w:pPr>
-        <w:numPr>
-          <w:ilvl w:val="1"/>
+      </w:pPr>
+      <w:r>
+        <w:rPr>
+          <w:bCs/>
+          <w:b/>
+        </w:rPr>
+        <w:t xml:space="preserve">Volume in the pause menu:</w:t>
+      </w:r>
+      <w:r>
+        <w:t xml:space="preserve"> </w:t>
+      </w:r>
+      <w:r>
+        <w:t xml:space="preserve">Music, Effects and Crowd sliders. They’re in the park’s pause menu, your park game’s, Pro-Am / Pro Run and the Crew HQ. They apply as you drag and are saved.</w:t>
+      </w:r>
+    </w:p>
+    <w:p>
+      <w:pPr>
+        <w:numPr>
+          <w:ilvl w:val="0"/>
           <w:numId w:val="1084"/>
         </w:numPr>
-        <w:pStyle w:val="Compact"/>
-      </w:pPr>
-      <w:r>
-        <w:t xml:space="preserve">The grade itself keeps its size and moves left to make room.</w:t>
-      </w:r>
-    </w:p>
-    <w:p>
-      <w:pPr>
-        <w:numPr>
-          <w:ilvl w:val="1"/>
-          <w:numId w:val="1084"/>
-        </w:numPr>
-        <w:pStyle w:val="Compact"/>
-      </w:pPr>
-      <w:r>
-        <w:t xml:space="preserve">A number that goes up pulses once.</w:t>
-      </w:r>
-    </w:p>
-    <w:p>
-      <w:pPr>
-        <w:numPr>
-          <w:ilvl w:val="1"/>
-          <w:numId w:val="1084"/>
-        </w:numPr>
-        <w:pStyle w:val="Compact"/>
-      </w:pPr>
-      <w:r>
-        <w:t xml:space="preserve">It shows whenever the grade does (Settings → Lock-In grade).</w:t>
-      </w:r>
-    </w:p>
-    <w:p>
-      <w:pPr>
-        <w:numPr>
-          <w:ilvl w:val="0"/>
-          <w:numId w:val="1083"/>
-        </w:numPr>
-      </w:pPr>
-      <w:r>
-        <w:rPr>
-          <w:bCs/>
-          <w:b/>
-        </w:rPr>
-        <w:t xml:space="preserve">Volume in the pause menu:</w:t>
-      </w:r>
-      <w:r>
-        <w:t xml:space="preserve"> </w:t>
-      </w:r>
-      <w:r>
-        <w:t xml:space="preserve">Music, Effects and Crowd sliders. They’re in the park’s pause menu, your park game’s, Pro-Am / Pro Run and the Crew HQ. They apply as you drag and are saved.</w:t>
-      </w:r>
-    </w:p>
-    <w:p>
-      <w:pPr>
-        <w:numPr>
-          <w:ilvl w:val="0"/>
-          <w:numId w:val="1083"/>
-        </w:numPr>
       </w:pPr>
       <w:r>
         <w:rPr>
@@ -7431,7 +7586,7 @@
       <w:pPr>
         <w:numPr>
           <w:ilvl w:val="1"/>
-          <w:numId w:val="1085"/>
+          <w:numId w:val="1086"/>
         </w:numPr>
         <w:pStyle w:val="Compact"/>
       </w:pPr>
@@ -7443,7 +7598,7 @@
       <w:pPr>
         <w:numPr>
           <w:ilvl w:val="1"/>
-          <w:numId w:val="1085"/>
+          <w:numId w:val="1086"/>
         </w:numPr>
         <w:pStyle w:val="Compact"/>
       </w:pPr>
@@ -7455,7 +7610,7 @@
       <w:pPr>
         <w:numPr>
           <w:ilvl w:val="1"/>
-          <w:numId w:val="1085"/>
+          <w:numId w:val="1086"/>
         </w:numPr>
         <w:pStyle w:val="Compact"/>
       </w:pPr>
@@ -7463,8 +7618,8 @@
         <w:t xml:space="preserve">A breath in each throat, and the stands throwing it back.</w:t>
       </w:r>
     </w:p>
-    <w:bookmarkEnd w:id="67"/>
-    <w:bookmarkStart w:id="68" w:name="green-releases-doubled-and-remade"/>
+    <w:bookmarkEnd w:id="68"/>
+    <w:bookmarkStart w:id="69" w:name="green-releases-doubled-and-remade"/>
     <w:p>
       <w:pPr>
         <w:pStyle w:val="Heading2"/>
@@ -7477,7 +7632,7 @@
       <w:pPr>
         <w:numPr>
           <w:ilvl w:val="0"/>
-          <w:numId w:val="1086"/>
+          <w:numId w:val="1087"/>
         </w:numPr>
         <w:pStyle w:val="Compact"/>
       </w:pPr>
@@ -7499,6 +7654,62 @@
       <w:pPr>
         <w:numPr>
           <w:ilvl w:val="1"/>
+          <w:numId w:val="1088"/>
+        </w:numPr>
+        <w:pStyle w:val="Compact"/>
+      </w:pPr>
+      <w:r>
+        <w:rPr>
+          <w:bCs/>
+          <w:b/>
+        </w:rPr>
+        <w:t xml:space="preserve">New sounds</w:t>
+      </w:r>
+      <w:r>
+        <w:t xml:space="preserve"> </w:t>
+      </w:r>
+      <w:r>
+        <w:t xml:space="preserve">(3,500–9,500 VC): Night Owl, Wolf Howl, Steam Whistle, Victory Bells, Knockout Bell, Shattered Glass, Strike!, Rimshot, Bass Drop, Sonar Ping, Standing Ovation, Five-Alarm, Boing, Cuckoo, Royal Fanfare and Case Closed.</w:t>
+      </w:r>
+    </w:p>
+    <w:p>
+      <w:pPr>
+        <w:numPr>
+          <w:ilvl w:val="1"/>
+          <w:numId w:val="1088"/>
+        </w:numPr>
+        <w:pStyle w:val="Compact"/>
+      </w:pPr>
+      <w:r>
+        <w:rPr>
+          <w:bCs/>
+          <w:b/>
+        </w:rPr>
+        <w:t xml:space="preserve">New effects</w:t>
+      </w:r>
+      <w:r>
+        <w:t xml:space="preserve"> </w:t>
+      </w:r>
+      <w:r>
+        <w:t xml:space="preserve">(6,000–12,000 VC): Phoenix, Make It Rain, Shockwave, Atomic, Galaxy, Ice Cold, Fire Circle, Angel Wings, Jade Dragon, Meteor Shower, Laser Show, Lucky Clover, Diamond and Supernova.</w:t>
+      </w:r>
+    </w:p>
+    <w:p>
+      <w:pPr>
+        <w:numPr>
+          <w:ilvl w:val="1"/>
+          <w:numId w:val="1088"/>
+        </w:numPr>
+        <w:pStyle w:val="Compact"/>
+      </w:pPr>
+      <w:r>
+        <w:t xml:space="preserve">The AI picks from all of them, still with no two alike on a floor.</w:t>
+      </w:r>
+    </w:p>
+    <w:p>
+      <w:pPr>
+        <w:numPr>
+          <w:ilvl w:val="0"/>
           <w:numId w:val="1087"/>
         </w:numPr>
         <w:pStyle w:val="Compact"/>
@@ -7508,62 +7719,6 @@
           <w:bCs/>
           <w:b/>
         </w:rPr>
-        <w:t xml:space="preserve">New sounds</w:t>
-      </w:r>
-      <w:r>
-        <w:t xml:space="preserve"> </w:t>
-      </w:r>
-      <w:r>
-        <w:t xml:space="preserve">(3,500–9,500 VC): Night Owl, Wolf Howl, Steam Whistle, Victory Bells, Knockout Bell, Shattered Glass, Strike!, Rimshot, Bass Drop, Sonar Ping, Standing Ovation, Five-Alarm, Boing, Cuckoo, Royal Fanfare and Case Closed.</w:t>
-      </w:r>
-    </w:p>
-    <w:p>
-      <w:pPr>
-        <w:numPr>
-          <w:ilvl w:val="1"/>
-          <w:numId w:val="1087"/>
-        </w:numPr>
-        <w:pStyle w:val="Compact"/>
-      </w:pPr>
-      <w:r>
-        <w:rPr>
-          <w:bCs/>
-          <w:b/>
-        </w:rPr>
-        <w:t xml:space="preserve">New effects</w:t>
-      </w:r>
-      <w:r>
-        <w:t xml:space="preserve"> </w:t>
-      </w:r>
-      <w:r>
-        <w:t xml:space="preserve">(6,000–12,000 VC): Phoenix, Make It Rain, Shockwave, Atomic, Galaxy, Ice Cold, Fire Circle, Angel Wings, Jade Dragon, Meteor Shower, Laser Show, Lucky Clover, Diamond and Supernova.</w:t>
-      </w:r>
-    </w:p>
-    <w:p>
-      <w:pPr>
-        <w:numPr>
-          <w:ilvl w:val="1"/>
-          <w:numId w:val="1087"/>
-        </w:numPr>
-        <w:pStyle w:val="Compact"/>
-      </w:pPr>
-      <w:r>
-        <w:t xml:space="preserve">The AI picks from all of them, still with no two alike on a floor.</w:t>
-      </w:r>
-    </w:p>
-    <w:p>
-      <w:pPr>
-        <w:numPr>
-          <w:ilvl w:val="0"/>
-          <w:numId w:val="1086"/>
-        </w:numPr>
-        <w:pStyle w:val="Compact"/>
-      </w:pPr>
-      <w:r>
-        <w:rPr>
-          <w:bCs/>
-          <w:b/>
-        </w:rPr>
         <w:t xml:space="preserve">Every sound remade to sound like its name.</w:t>
       </w:r>
     </w:p>
@@ -7571,7 +7726,7 @@
       <w:pPr>
         <w:numPr>
           <w:ilvl w:val="1"/>
-          <w:numId w:val="1088"/>
+          <w:numId w:val="1089"/>
         </w:numPr>
         <w:pStyle w:val="Compact"/>
       </w:pPr>
@@ -7593,7 +7748,7 @@
       <w:pPr>
         <w:numPr>
           <w:ilvl w:val="1"/>
-          <w:numId w:val="1088"/>
+          <w:numId w:val="1089"/>
         </w:numPr>
         <w:pStyle w:val="Compact"/>
       </w:pPr>
@@ -7615,7 +7770,7 @@
       <w:pPr>
         <w:numPr>
           <w:ilvl w:val="1"/>
-          <w:numId w:val="1088"/>
+          <w:numId w:val="1089"/>
         </w:numPr>
         <w:pStyle w:val="Compact"/>
       </w:pPr>
@@ -7631,98 +7786,6 @@
       </w:r>
       <w:r>
         <w:t xml:space="preserve">a raptor’s scream.</w:t>
-      </w:r>
-    </w:p>
-    <w:p>
-      <w:pPr>
-        <w:numPr>
-          <w:ilvl w:val="2"/>
-          <w:numId w:val="1089"/>
-        </w:numPr>
-        <w:pStyle w:val="Compact"/>
-      </w:pPr>
-      <w:r>
-        <w:t xml:space="preserve">A quick rise into a long, high</w:t>
-      </w:r>
-      <w:r>
-        <w:t xml:space="preserve"> </w:t>
-      </w:r>
-      <w:r>
-        <w:t xml:space="preserve">“</w:t>
-      </w:r>
-      <w:r>
-        <w:t xml:space="preserve">kee-eeee-arrr</w:t>
-      </w:r>
-      <w:r>
-        <w:t xml:space="preserve">”</w:t>
-      </w:r>
-      <w:r>
-        <w:t xml:space="preserve"> </w:t>
-      </w:r>
-      <w:r>
-        <w:t xml:space="preserve">around 2.5 kHz.</w:t>
-      </w:r>
-    </w:p>
-    <w:p>
-      <w:pPr>
-        <w:numPr>
-          <w:ilvl w:val="2"/>
-          <w:numId w:val="1089"/>
-        </w:numPr>
-        <w:pStyle w:val="Compact"/>
-      </w:pPr>
-      <w:r>
-        <w:t xml:space="preserve">Harsh, the way a real one is: the pitch jitters from cycle to cycle, every other cycle is louder, and there’s breath riding on each one.</w:t>
-      </w:r>
-    </w:p>
-    <w:p>
-      <w:pPr>
-        <w:numPr>
-          <w:ilvl w:val="2"/>
-          <w:numId w:val="1089"/>
-        </w:numPr>
-        <w:pStyle w:val="Compact"/>
-      </w:pPr>
-      <w:r>
-        <w:t xml:space="preserve">It tears downward at the end, then rings off the canyon walls.</w:t>
-      </w:r>
-    </w:p>
-    <w:p>
-      <w:pPr>
-        <w:numPr>
-          <w:ilvl w:val="1"/>
-          <w:numId w:val="1088"/>
-        </w:numPr>
-        <w:pStyle w:val="Compact"/>
-      </w:pPr>
-      <w:r>
-        <w:rPr>
-          <w:bCs/>
-          <w:b/>
-        </w:rPr>
-        <w:t xml:space="preserve">Bells, gongs, glass, coins and wood</w:t>
-      </w:r>
-      <w:r>
-        <w:t xml:space="preserve"> </w:t>
-      </w:r>
-      <w:r>
-        <w:t xml:space="preserve">ring with their own partials. A church bell has its hum an octave under, its minor-third tierce and its nominal. The gong blooms up into its shimmer after the strike.</w:t>
-      </w:r>
-    </w:p>
-    <w:p>
-      <w:pPr>
-        <w:numPr>
-          <w:ilvl w:val="1"/>
-          <w:numId w:val="1088"/>
-        </w:numPr>
-        <w:pStyle w:val="Compact"/>
-      </w:pPr>
-      <w:r>
-        <w:rPr>
-          <w:bCs/>
-          <w:b/>
-        </w:rPr>
-        <w:t xml:space="preserve">Voices:</w:t>
       </w:r>
     </w:p>
     <w:p>
@@ -7734,7 +7797,25 @@
         <w:pStyle w:val="Compact"/>
       </w:pPr>
       <w:r>
-        <w:t xml:space="preserve">The choir is four sections, each with its own vowel, singing in a cathedral with a harp under it.</w:t>
+        <w:t xml:space="preserve">A quick rise into a long, high</w:t>
+      </w:r>
+      <w:r>
+        <w:t xml:space="preserve"> </w:t>
+      </w:r>
+      <w:r>
+        <w:t xml:space="preserve">“</w:t>
+      </w:r>
+      <w:r>
+        <w:t xml:space="preserve">kee-eeee-arrr</w:t>
+      </w:r>
+      <w:r>
+        <w:t xml:space="preserve">”</w:t>
+      </w:r>
+      <w:r>
+        <w:t xml:space="preserve"> </w:t>
+      </w:r>
+      <w:r>
+        <w:t xml:space="preserve">around 2.5 kHz.</w:t>
       </w:r>
     </w:p>
     <w:p>
@@ -7746,7 +7827,7 @@
         <w:pStyle w:val="Compact"/>
       </w:pPr>
       <w:r>
-        <w:t xml:space="preserve">The kazoo is a hummed voice with the paper buzzing on it.</w:t>
+        <w:t xml:space="preserve">Harsh, the way a real one is: the pitch jitters from cycle to cycle, every other cycle is louder, and there’s breath riding on each one.</w:t>
       </w:r>
     </w:p>
     <w:p>
@@ -7758,23 +7839,45 @@
         <w:pStyle w:val="Compact"/>
       </w:pPr>
       <w:r>
-        <w:t xml:space="preserve">The roar after the Greeen Chant is now crowd voices, not noise.</w:t>
-      </w:r>
-    </w:p>
-    <w:p>
-      <w:pPr>
-        <w:numPr>
-          <w:ilvl w:val="1"/>
-          <w:numId w:val="1088"/>
-        </w:numPr>
-        <w:pStyle w:val="Compact"/>
-      </w:pPr>
-      <w:r>
-        <w:rPr>
-          <w:bCs/>
-          <w:b/>
-        </w:rPr>
-        <w:t xml:space="preserve">Squeaks, water and weather:</w:t>
+        <w:t xml:space="preserve">It tears downward at the end, then rings off the canyon walls.</w:t>
+      </w:r>
+    </w:p>
+    <w:p>
+      <w:pPr>
+        <w:numPr>
+          <w:ilvl w:val="1"/>
+          <w:numId w:val="1089"/>
+        </w:numPr>
+        <w:pStyle w:val="Compact"/>
+      </w:pPr>
+      <w:r>
+        <w:rPr>
+          <w:bCs/>
+          <w:b/>
+        </w:rPr>
+        <w:t xml:space="preserve">Bells, gongs, glass, coins and wood</w:t>
+      </w:r>
+      <w:r>
+        <w:t xml:space="preserve"> </w:t>
+      </w:r>
+      <w:r>
+        <w:t xml:space="preserve">ring with their own partials. A church bell has its hum an octave under, its minor-third tierce and its nominal. The gong blooms up into its shimmer after the strike.</w:t>
+      </w:r>
+    </w:p>
+    <w:p>
+      <w:pPr>
+        <w:numPr>
+          <w:ilvl w:val="1"/>
+          <w:numId w:val="1089"/>
+        </w:numPr>
+        <w:pStyle w:val="Compact"/>
+      </w:pPr>
+      <w:r>
+        <w:rPr>
+          <w:bCs/>
+          <w:b/>
+        </w:rPr>
+        <w:t xml:space="preserve">Voices:</w:t>
       </w:r>
     </w:p>
     <w:p>
@@ -7786,7 +7889,7 @@
         <w:pStyle w:val="Compact"/>
       </w:pPr>
       <w:r>
-        <w:t xml:space="preserve">The rubber duck is a squeaker reed, wheezing in between squeezes.</w:t>
+        <w:t xml:space="preserve">The choir is four sections, each with its own vowel, singing in a cathedral with a harp under it.</w:t>
       </w:r>
     </w:p>
     <w:p>
@@ -7798,7 +7901,7 @@
         <w:pStyle w:val="Compact"/>
       </w:pPr>
       <w:r>
-        <w:t xml:space="preserve">The cannonball is a slap, a kerplunk and hundreds of bubbles and drops.</w:t>
+        <w:t xml:space="preserve">The kazoo is a hummed voice with the paper buzzing on it.</w:t>
       </w:r>
     </w:p>
     <w:p>
@@ -7810,6 +7913,58 @@
         <w:pStyle w:val="Compact"/>
       </w:pPr>
       <w:r>
+        <w:t xml:space="preserve">The roar after the Greeen Chant is now crowd voices, not noise.</w:t>
+      </w:r>
+    </w:p>
+    <w:p>
+      <w:pPr>
+        <w:numPr>
+          <w:ilvl w:val="1"/>
+          <w:numId w:val="1089"/>
+        </w:numPr>
+        <w:pStyle w:val="Compact"/>
+      </w:pPr>
+      <w:r>
+        <w:rPr>
+          <w:bCs/>
+          <w:b/>
+        </w:rPr>
+        <w:t xml:space="preserve">Squeaks, water and weather:</w:t>
+      </w:r>
+    </w:p>
+    <w:p>
+      <w:pPr>
+        <w:numPr>
+          <w:ilvl w:val="2"/>
+          <w:numId w:val="1092"/>
+        </w:numPr>
+        <w:pStyle w:val="Compact"/>
+      </w:pPr>
+      <w:r>
+        <w:t xml:space="preserve">The rubber duck is a squeaker reed, wheezing in between squeezes.</w:t>
+      </w:r>
+    </w:p>
+    <w:p>
+      <w:pPr>
+        <w:numPr>
+          <w:ilvl w:val="2"/>
+          <w:numId w:val="1092"/>
+        </w:numPr>
+        <w:pStyle w:val="Compact"/>
+      </w:pPr>
+      <w:r>
+        <w:t xml:space="preserve">The cannonball is a slap, a kerplunk and hundreds of bubbles and drops.</w:t>
+      </w:r>
+    </w:p>
+    <w:p>
+      <w:pPr>
+        <w:numPr>
+          <w:ilvl w:val="2"/>
+          <w:numId w:val="1092"/>
+        </w:numPr>
+        <w:pStyle w:val="Compact"/>
+      </w:pPr>
+      <w:r>
         <w:t xml:space="preserve">Thunder tears the air open before the boom and the roll.</w:t>
       </w:r>
     </w:p>
@@ -7817,7 +7972,7 @@
       <w:pPr>
         <w:numPr>
           <w:ilvl w:val="0"/>
-          <w:numId w:val="1086"/>
+          <w:numId w:val="1087"/>
         </w:numPr>
         <w:pStyle w:val="Compact"/>
       </w:pPr>
@@ -7839,7 +7994,7 @@
       <w:pPr>
         <w:numPr>
           <w:ilvl w:val="0"/>
-          <w:numId w:val="1086"/>
+          <w:numId w:val="1087"/>
         </w:numPr>
         <w:pStyle w:val="Compact"/>
       </w:pPr>
@@ -7879,7 +8034,7 @@
       <w:pPr>
         <w:numPr>
           <w:ilvl w:val="0"/>
-          <w:numId w:val="1086"/>
+          <w:numId w:val="1087"/>
         </w:numPr>
         <w:pStyle w:val="Compact"/>
       </w:pPr>
@@ -7895,7 +8050,7 @@
       <w:pPr>
         <w:numPr>
           <w:ilvl w:val="1"/>
-          <w:numId w:val="1092"/>
+          <w:numId w:val="1093"/>
         </w:numPr>
         <w:pStyle w:val="Compact"/>
       </w:pPr>
@@ -7907,7 +8062,7 @@
       <w:pPr>
         <w:numPr>
           <w:ilvl w:val="1"/>
-          <w:numId w:val="1092"/>
+          <w:numId w:val="1093"/>
         </w:numPr>
         <w:pStyle w:val="Compact"/>
       </w:pPr>
@@ -7919,7 +8074,7 @@
       <w:pPr>
         <w:numPr>
           <w:ilvl w:val="1"/>
-          <w:numId w:val="1092"/>
+          <w:numId w:val="1093"/>
         </w:numPr>
         <w:pStyle w:val="Compact"/>
       </w:pPr>
@@ -7927,8 +8082,8 @@
         <w:t xml:space="preserve">Every new effect was captured frozen in time over a player in the studio.</w:t>
       </w:r>
     </w:p>
-    <w:bookmarkEnd w:id="68"/>
-    <w:bookmarkStart w:id="69" w:name="under-the-hood-quick-patch"/>
+    <w:bookmarkEnd w:id="69"/>
+    <w:bookmarkStart w:id="70" w:name="under-the-hood-quick-patch"/>
     <w:p>
       <w:pPr>
         <w:pStyle w:val="Heading2"/>
@@ -7941,7 +8096,7 @@
       <w:pPr>
         <w:numPr>
           <w:ilvl w:val="0"/>
-          <w:numId w:val="1093"/>
+          <w:numId w:val="1094"/>
         </w:numPr>
         <w:pStyle w:val="Compact"/>
       </w:pPr>
@@ -7956,14 +8111,14 @@
         <w:t xml:space="preserve"> </w:t>
       </w:r>
       <w:r>
-        <w:t xml:space="preserve">154 game tests and 40 service tests pass. The new ones cover non-shooter windows, smothered shots, the record scratch, repeat moves, diagonal moves, the straps being drawn, the apparel counts, dunk variety, the windmill and Eastbay paths, celebrations (input and clipping), reach-in contact, the AI staying in bounds, the D-pad fallback, Icon Legend, the green release counts and what each sound is made of, the AI’s reaction times, stamina and the line beside the grade.</w:t>
-      </w:r>
-    </w:p>
-    <w:p>
-      <w:pPr>
-        <w:numPr>
-          <w:ilvl w:val="0"/>
-          <w:numId w:val="1093"/>
+        <w:t xml:space="preserve">159 game tests and 40 service tests pass. The new ones cover non-shooter windows, smothered shots, the record scratch, repeat moves, diagonal moves, the straps being drawn, the apparel counts, dunk variety, the windmill and Eastbay paths, celebrations (input and clipping), reach-in contact, the AI staying in bounds, the D-pad fallback, Icon Legend, the green release counts and what each sound is made of, the AI’s reaction times, stamina and the line beside the grade.</w:t>
+      </w:r>
+    </w:p>
+    <w:p>
+      <w:pPr>
+        <w:numPr>
+          <w:ilvl w:val="0"/>
+          <w:numId w:val="1094"/>
         </w:numPr>
         <w:pStyle w:val="Compact"/>
       </w:pPr>
@@ -7979,7 +8134,7 @@
       <w:pPr>
         <w:numPr>
           <w:ilvl w:val="1"/>
-          <w:numId w:val="1094"/>
+          <w:numId w:val="1095"/>
         </w:numPr>
         <w:pStyle w:val="Compact"/>
       </w:pPr>
@@ -8003,7 +8158,7 @@
       <w:pPr>
         <w:numPr>
           <w:ilvl w:val="1"/>
-          <w:numId w:val="1094"/>
+          <w:numId w:val="1095"/>
         </w:numPr>
         <w:pStyle w:val="Compact"/>
       </w:pPr>
@@ -8027,7 +8182,7 @@
       <w:pPr>
         <w:numPr>
           <w:ilvl w:val="1"/>
-          <w:numId w:val="1094"/>
+          <w:numId w:val="1095"/>
         </w:numPr>
         <w:pStyle w:val="Compact"/>
       </w:pPr>
@@ -8039,7 +8194,7 @@
       <w:pPr>
         <w:numPr>
           <w:ilvl w:val="1"/>
-          <w:numId w:val="1094"/>
+          <w:numId w:val="1095"/>
         </w:numPr>
         <w:pStyle w:val="Compact"/>
       </w:pPr>
@@ -8051,7 +8206,7 @@
       <w:pPr>
         <w:numPr>
           <w:ilvl w:val="1"/>
-          <w:numId w:val="1094"/>
+          <w:numId w:val="1095"/>
         </w:numPr>
         <w:pStyle w:val="Compact"/>
       </w:pPr>
@@ -8075,7 +8230,7 @@
       <w:pPr>
         <w:numPr>
           <w:ilvl w:val="1"/>
-          <w:numId w:val="1094"/>
+          <w:numId w:val="1095"/>
         </w:numPr>
         <w:pStyle w:val="Compact"/>
       </w:pPr>
@@ -8099,7 +8254,7 @@
       <w:pPr>
         <w:numPr>
           <w:ilvl w:val="1"/>
-          <w:numId w:val="1094"/>
+          <w:numId w:val="1095"/>
         </w:numPr>
         <w:pStyle w:val="Compact"/>
       </w:pPr>
@@ -8123,7 +8278,7 @@
       <w:pPr>
         <w:numPr>
           <w:ilvl w:val="1"/>
-          <w:numId w:val="1094"/>
+          <w:numId w:val="1095"/>
         </w:numPr>
         <w:pStyle w:val="Compact"/>
       </w:pPr>
@@ -8169,7 +8324,19 @@
       <w:pPr>
         <w:numPr>
           <w:ilvl w:val="1"/>
-          <w:numId w:val="1094"/>
+          <w:numId w:val="1095"/>
+        </w:numPr>
+        <w:pStyle w:val="Compact"/>
+      </w:pPr>
+      <w:r>
+        <w:t xml:space="preserve">The alley-oop press: the four face buttons are read raw (whatever your context) only while a lob to you is in the air, and that press is used for nothing else, so the shoot button can’t also jump you. The window opens a quarter of the way to the takeoff and closes 0.05 s after it. A mistimed one is 0.22 s late at 40% of the height.</w:t>
+      </w:r>
+    </w:p>
+    <w:p>
+      <w:pPr>
+        <w:numPr>
+          <w:ilvl w:val="1"/>
+          <w:numId w:val="1095"/>
         </w:numPr>
         <w:pStyle w:val="Compact"/>
       </w:pPr>
@@ -8199,7 +8366,7 @@
       <w:pPr>
         <w:numPr>
           <w:ilvl w:val="1"/>
-          <w:numId w:val="1094"/>
+          <w:numId w:val="1095"/>
         </w:numPr>
         <w:pStyle w:val="Compact"/>
       </w:pPr>
@@ -8207,8 +8374,8 @@
         <w:t xml:space="preserve">The faster AI reactions apply to every AI player: teammates, opponents and your own player on auto-play.</w:t>
       </w:r>
     </w:p>
-    <w:bookmarkEnd w:id="69"/>
     <w:bookmarkEnd w:id="70"/>
+    <w:bookmarkEnd w:id="71"/>
     <w:sectPr/>
   </w:body>
 </w:document>
@@ -8674,6 +8841,9 @@
     <w:abstractNumId w:val="991"/>
   </w:num>
   <w:num w:numId="1094">
+    <w:abstractNumId w:val="991"/>
+  </w:num>
+  <w:num w:numId="1095">
     <w:abstractNumId w:val="991"/>
   </w:num>
 </w:numbering>

</xml_diff>

<commit_message>
Rule Change Quick Patch
</commit_message>
<xml_diff>
--- a/PATCH_NOTES_v0.4.7.5.docx
+++ b/PATCH_NOTES_v0.4.7.5.docx
@@ -3526,7 +3526,7 @@
     </w:p>
     <w:bookmarkEnd w:id="41"/>
     <w:bookmarkEnd w:id="42"/>
-    <w:bookmarkStart w:id="78" w:name="quick-patch"/>
+    <w:bookmarkStart w:id="79" w:name="quick-patch"/>
     <w:p>
       <w:pPr>
         <w:pStyle w:val="Heading1"/>
@@ -4228,7 +4228,7 @@
     </w:tbl>
     <w:bookmarkEnd w:id="46"/>
     <w:bookmarkEnd w:id="47"/>
-    <w:bookmarkStart w:id="68" w:name="dribbling-passing-and-defense-1"/>
+    <w:bookmarkStart w:id="69" w:name="dribbling-passing-and-defense-1"/>
     <w:p>
       <w:pPr>
         <w:pStyle w:val="Heading2"/>
@@ -7220,12 +7220,254 @@
       </w:r>
     </w:p>
     <w:bookmarkEnd w:id="64"/>
-    <w:bookmarkStart w:id="65" w:name="who-takes-threes-oct-11"/>
+    <w:bookmarkStart w:id="65" w:name="the-rule-book-oct-11"/>
     <w:p>
       <w:pPr>
         <w:pStyle w:val="Heading3"/>
       </w:pPr>
       <w:r>
+        <w:t xml:space="preserve">The rule book (Oct 11)</w:t>
+      </w:r>
+    </w:p>
+    <w:p>
+      <w:pPr>
+        <w:numPr>
+          <w:ilvl w:val="0"/>
+          <w:numId w:val="1076"/>
+        </w:numPr>
+        <w:pStyle w:val="Compact"/>
+      </w:pPr>
+      <w:r>
+        <w:rPr>
+          <w:bCs/>
+          <w:b/>
+        </w:rPr>
+        <w:t xml:space="preserve">The Pro Run and Pro-Am play under NBA rules, all of them in the sim now.</w:t>
+      </w:r>
+      <w:r>
+        <w:t xml:space="preserve"> </w:t>
+      </w:r>
+      <w:r>
+        <w:t xml:space="preserve">New to the book:</w:t>
+      </w:r>
+      <w:r>
+        <w:t xml:space="preserve"> </w:t>
+      </w:r>
+      <w:r>
+        <w:rPr>
+          <w:bCs/>
+          <w:b/>
+        </w:rPr>
+        <w:t xml:space="preserve">offensive three seconds</w:t>
+      </w:r>
+      <w:r>
+        <w:t xml:space="preserve"> </w:t>
+      </w:r>
+      <w:r>
+        <w:t xml:space="preserve">(an attacker in the paint for three seconds without driving, shooting or leaving the floor turns it over; a shot going up resets everyone’s count),</w:t>
+      </w:r>
+      <w:r>
+        <w:t xml:space="preserve"> </w:t>
+      </w:r>
+      <w:r>
+        <w:rPr>
+          <w:bCs/>
+          <w:b/>
+        </w:rPr>
+        <w:t xml:space="preserve">defensive three seconds</w:t>
+      </w:r>
+      <w:r>
+        <w:t xml:space="preserve"> </w:t>
+      </w:r>
+      <w:r>
+        <w:t xml:space="preserve">(a defender in the paint for three seconds with no attacker within an arm’s length is a technical: the offense’s best free-throw shooter takes one and the offense keeps the ball), the</w:t>
+      </w:r>
+      <w:r>
+        <w:t xml:space="preserve"> </w:t>
+      </w:r>
+      <w:r>
+        <w:rPr>
+          <w:bCs/>
+          <w:b/>
+        </w:rPr>
+        <w:t xml:space="preserve">backcourt violation</w:t>
+      </w:r>
+      <w:r>
+        <w:t xml:space="preserve"> </w:t>
+      </w:r>
+      <w:r>
+        <w:t xml:space="preserve">(once the ball is past half court, taking it back is a turnover) and</w:t>
+      </w:r>
+      <w:r>
+        <w:t xml:space="preserve"> </w:t>
+      </w:r>
+      <w:r>
+        <w:rPr>
+          <w:bCs/>
+          <w:b/>
+        </w:rPr>
+        <w:t xml:space="preserve">8 seconds</w:t>
+      </w:r>
+      <w:r>
+        <w:t xml:space="preserve"> </w:t>
+      </w:r>
+      <w:r>
+        <w:t xml:space="preserve">to get it across, the inbounder’s</w:t>
+      </w:r>
+      <w:r>
+        <w:t xml:space="preserve"> </w:t>
+      </w:r>
+      <w:r>
+        <w:rPr>
+          <w:bCs/>
+          <w:b/>
+        </w:rPr>
+        <w:t xml:space="preserve">5 seconds</w:t>
+      </w:r>
+      <w:r>
+        <w:t xml:space="preserve"> </w:t>
+      </w:r>
+      <w:r>
+        <w:t xml:space="preserve">(a human inbounder who holds it is a turnover; the AI always passed inside five),</w:t>
+      </w:r>
+      <w:r>
+        <w:t xml:space="preserve"> </w:t>
+      </w:r>
+      <w:r>
+        <w:rPr>
+          <w:bCs/>
+          <w:b/>
+        </w:rPr>
+        <w:t xml:space="preserve">charges</w:t>
+      </w:r>
+      <w:r>
+        <w:t xml:space="preserve"> </w:t>
+      </w:r>
+      <w:r>
+        <w:t xml:space="preserve">(a driver into a set, square defender outside the restricted area is an offensive foul: the defense’s ball, no team foul) and</w:t>
+      </w:r>
+      <w:r>
+        <w:t xml:space="preserve"> </w:t>
+      </w:r>
+      <w:r>
+        <w:rPr>
+          <w:bCs/>
+          <w:b/>
+        </w:rPr>
+        <w:t xml:space="preserve">goaltending</w:t>
+      </w:r>
+      <w:r>
+        <w:t xml:space="preserve"> </w:t>
+      </w:r>
+      <w:r>
+        <w:t xml:space="preserve">(a ball touched on its way down above the rim over the basket counts). Fouls on missed shots now send the shooter to the line (before this, a shooting foul was only ever recorded when the shot went in: the foul rode on the shooter, not the ball, and the miss wiped it; it’s on the ball now). Reach-ins, shooting fouls, the shot clock, traveling, out of bounds and the free-throw lane were already in.</w:t>
+      </w:r>
+    </w:p>
+    <w:p>
+      <w:pPr>
+        <w:numPr>
+          <w:ilvl w:val="0"/>
+          <w:numId w:val="1076"/>
+        </w:numPr>
+        <w:pStyle w:val="Compact"/>
+      </w:pPr>
+      <w:r>
+        <w:rPr>
+          <w:bCs/>
+          <w:b/>
+        </w:rPr>
+        <w:t xml:space="preserve">The park plays by park rules with the contact calls kept:</w:t>
+      </w:r>
+      <w:r>
+        <w:t xml:space="preserve"> </w:t>
+      </w:r>
+      <w:r>
+        <w:t xml:space="preserve">reach-in fouls and shooting fouls are called (at three-quarters the NBA rate; no free throws — the offense keeps the ball, and an and-one still counts), and</w:t>
+      </w:r>
+      <w:r>
+        <w:t xml:space="preserve"> </w:t>
+      </w:r>
+      <w:r>
+        <w:rPr>
+          <w:bCs/>
+          <w:b/>
+        </w:rPr>
+        <w:t xml:space="preserve">offensive three seconds</w:t>
+      </w:r>
+      <w:r>
+        <w:t xml:space="preserve"> </w:t>
+      </w:r>
+      <w:r>
+        <w:t xml:space="preserve">is a turnover, same as above. Full-court 3v3 keeps backcourt and 8 seconds. No defensive three seconds, no charges, no goaltending in the park.</w:t>
+      </w:r>
+    </w:p>
+    <w:p>
+      <w:pPr>
+        <w:numPr>
+          <w:ilvl w:val="0"/>
+          <w:numId w:val="1076"/>
+        </w:numPr>
+        <w:pStyle w:val="Compact"/>
+      </w:pPr>
+      <w:r>
+        <w:rPr>
+          <w:bCs/>
+          <w:b/>
+        </w:rPr>
+        <w:t xml:space="preserve">The AI knows the rules.</w:t>
+      </w:r>
+      <w:r>
+        <w:t xml:space="preserve"> </w:t>
+      </w:r>
+      <w:r>
+        <w:t xml:space="preserve">Nobody camps in the box: a cut, a roll or a screen ends when the man has been in the paint 1.4 s, nobody screens inside it when the ball is already there, the low block spots sit outside the lane, an off-ball attacker who has been in the paint 1.2 s steps out to the lane line or the dunker spot, and a handler caught standing in it with the ball for two seconds shoots if he’s at the rim and otherwise gets it out. Help defenders stop at the lane line in Pro-Am.</w:t>
+      </w:r>
+      <w:r>
+        <w:t xml:space="preserve"> </w:t>
+      </w:r>
+      <w:r>
+        <w:rPr>
+          <w:bCs/>
+          <w:b/>
+        </w:rPr>
+        <w:t xml:space="preserve">Paint defenders guard it from the edge:</w:t>
+      </w:r>
+      <w:r>
+        <w:t xml:space="preserve"> </w:t>
+      </w:r>
+      <w:r>
+        <w:t xml:space="preserve">a defender whose man is away from the paint, or who has been in it 1.6 s, slides to the lane line between his man and the rim and strafes along it with the ball — within an arm’s length of his man if the man is near the lane — in a defensive stance, so he’s a step from the help and a step from his man as the play develops, instead of standing under the rim and picking up a technical.</w:t>
+      </w:r>
+    </w:p>
+    <w:p>
+      <w:pPr>
+        <w:numPr>
+          <w:ilvl w:val="0"/>
+          <w:numId w:val="1076"/>
+        </w:numPr>
+        <w:pStyle w:val="Compact"/>
+      </w:pPr>
+      <w:r>
+        <w:rPr>
+          <w:bCs/>
+          <w:b/>
+        </w:rPr>
+        <w:t xml:space="preserve">Measured</w:t>
+      </w:r>
+      <w:r>
+        <w:t xml:space="preserve"> </w:t>
+      </w:r>
+      <w:r>
+        <w:t xml:space="preserve">(AI only, 12 Pro-Am, 16 park, 10 full-court park): offensive three seconds 0.25 / 0.13 / 0.10 a game, defensive three seconds 0.42 a game in Pro-Am, backcourt 0.17 / 0.10, charges 0.17 a game in Pro-Am, 9.8 fouls and 3.8 free-throw attempts a game in Pro-Am (there were 0.0 FTA on missed shots before), 3.1 fouls a game in the park. Before the AI learned the rules the first pass called 31 defensive and 11.5 offensive three seconds a game and took a third off the scoring; scoring is now within a point of the old build (Pro-Am 24.8 a team a quarter-length game vs 26.1). The lane is emptier: 0.63 off-ball attackers in it on average (was 0.75) and 1.35 defenders (was 2.4).</w:t>
+      </w:r>
+    </w:p>
+    <w:bookmarkEnd w:id="65"/>
+    <w:bookmarkStart w:id="66" w:name="who-takes-threes-oct-11"/>
+    <w:p>
+      <w:pPr>
+        <w:pStyle w:val="Heading3"/>
+      </w:pPr>
+      <w:r>
         <w:t xml:space="preserve">Who takes threes (Oct 11)</w:t>
       </w:r>
     </w:p>
@@ -7233,7 +7475,7 @@
       <w:pPr>
         <w:numPr>
           <w:ilvl w:val="0"/>
-          <w:numId w:val="1076"/>
+          <w:numId w:val="1077"/>
         </w:numPr>
         <w:pStyle w:val="Compact"/>
       </w:pPr>
@@ -7251,8 +7493,8 @@
         <w:t xml:space="preserve">A three is worth less in the shot-selection read the further the rating sits under 70 (down to about a third of its value at 55 and below), bigs value it less still (easing back to full value only for a 95-rated big), a weak or big shooter talks himself out of a share of the threes he would otherwise take and keeps the ball for a couple of seconds, calls for it at the arc less, and a big rolls off his screen more than he pops. Open looks for real shooters are untouched. Measured over 100 park games: PF/C with 55–69 Three Point went from 19% of their shots being threes to 3%, sub-55 bigs from 5% to none, 55–69 guards and wings from 14% to 9%, sub-55 guards from 6% to a stray one; 70+ guards and wings stayed where they were (19–22%), and the AI’s three-point percentage rose from 32% to 39% because the bad ones are gone. Pro-Am: bigs 55–69 from 47% of their shots to 22%, 55–69 guards 31% to 21%, team scoring down about 6% with the lost threes.</w:t>
       </w:r>
     </w:p>
-    <w:bookmarkEnd w:id="65"/>
-    <w:bookmarkStart w:id="66" w:name="reach-follows-the-arms-oct-10"/>
+    <w:bookmarkEnd w:id="66"/>
+    <w:bookmarkStart w:id="67" w:name="reach-follows-the-arms-oct-10"/>
     <w:p>
       <w:pPr>
         <w:pStyle w:val="Heading3"/>
@@ -7265,7 +7507,7 @@
       <w:pPr>
         <w:numPr>
           <w:ilvl w:val="0"/>
-          <w:numId w:val="1077"/>
+          <w:numId w:val="1078"/>
         </w:numPr>
         <w:pStyle w:val="Compact"/>
       </w:pPr>
@@ -7287,7 +7529,7 @@
       <w:pPr>
         <w:numPr>
           <w:ilvl w:val="0"/>
-          <w:numId w:val="1077"/>
+          <w:numId w:val="1078"/>
         </w:numPr>
         <w:pStyle w:val="Compact"/>
       </w:pPr>
@@ -7311,8 +7553,8 @@
         <w:t xml:space="preserve">(1.8 → 0.85 a game): with the shorter reach a build needs more Vertical to get a hand to the rim, so the attack bind picks a layup more often. Verticals and contest strengths were left as they were; say the word if you’d like either re-tuned around the new reach.</w:t>
       </w:r>
     </w:p>
-    <w:bookmarkEnd w:id="66"/>
-    <w:bookmarkStart w:id="67" w:name="boosts-oct-10"/>
+    <w:bookmarkEnd w:id="67"/>
+    <w:bookmarkStart w:id="68" w:name="boosts-oct-10"/>
     <w:p>
       <w:pPr>
         <w:pStyle w:val="Heading3"/>
@@ -7325,7 +7567,7 @@
       <w:pPr>
         <w:numPr>
           <w:ilvl w:val="0"/>
-          <w:numId w:val="1078"/>
+          <w:numId w:val="1079"/>
         </w:numPr>
         <w:pStyle w:val="Compact"/>
       </w:pPr>
@@ -7343,9 +7585,9 @@
         <w:t xml:space="preserve">(it was 10). The kiosk’s packs are unchanged (1, 3 or 5 games); the buttons grey out when a pack wouldn’t fit under 35.</w:t>
       </w:r>
     </w:p>
-    <w:bookmarkEnd w:id="67"/>
     <w:bookmarkEnd w:id="68"/>
-    <w:bookmarkStart w:id="69" w:name="progression-icon-legend-up-to-99"/>
+    <w:bookmarkEnd w:id="69"/>
+    <w:bookmarkStart w:id="70" w:name="progression-icon-legend-up-to-99"/>
     <w:p>
       <w:pPr>
         <w:pStyle w:val="Heading2"/>
@@ -7358,7 +7600,7 @@
       <w:pPr>
         <w:numPr>
           <w:ilvl w:val="0"/>
-          <w:numId w:val="1079"/>
+          <w:numId w:val="1080"/>
         </w:numPr>
         <w:pStyle w:val="Compact"/>
       </w:pPr>
@@ -7374,105 +7616,105 @@
       <w:pPr>
         <w:numPr>
           <w:ilvl w:val="1"/>
+          <w:numId w:val="1081"/>
+        </w:numPr>
+        <w:pStyle w:val="Compact"/>
+      </w:pPr>
+      <w:r>
+        <w:t xml:space="preserve">Simmed games, forfeits and other modes don’t count.</w:t>
+      </w:r>
+    </w:p>
+    <w:p>
+      <w:pPr>
+        <w:numPr>
+          <w:ilvl w:val="1"/>
+          <w:numId w:val="1081"/>
+        </w:numPr>
+        <w:pStyle w:val="Compact"/>
+      </w:pPr>
+      <w:r>
+        <w:t xml:space="preserve">The game that unlocks the Icon doesn’t count either.</w:t>
+      </w:r>
+    </w:p>
+    <w:p>
+      <w:pPr>
+        <w:numPr>
+          <w:ilvl w:val="0"/>
           <w:numId w:val="1080"/>
         </w:numPr>
         <w:pStyle w:val="Compact"/>
       </w:pPr>
       <w:r>
-        <w:t xml:space="preserve">Simmed games, forfeits and other modes don’t count.</w:t>
-      </w:r>
-    </w:p>
-    <w:p>
-      <w:pPr>
-        <w:numPr>
-          <w:ilvl w:val="1"/>
+        <w:rPr>
+          <w:bCs/>
+          <w:b/>
+        </w:rPr>
+        <w:t xml:space="preserve">No stat picking:</w:t>
+      </w:r>
+      <w:r>
+        <w:t xml:space="preserve"> </w:t>
+      </w:r>
+      <w:r>
+        <w:t xml:space="preserve">the build system places each +1 itself.</w:t>
+      </w:r>
+    </w:p>
+    <w:p>
+      <w:pPr>
+        <w:numPr>
+          <w:ilvl w:val="1"/>
+          <w:numId w:val="1082"/>
+        </w:numPr>
+        <w:pStyle w:val="Compact"/>
+      </w:pPr>
+      <w:r>
+        <w:t xml:space="preserve">It raises the attributes your build leans on most: the shape its caps come from (archetype, size and weight) and what your position’s overall counts most.</w:t>
+      </w:r>
+    </w:p>
+    <w:p>
+      <w:pPr>
+        <w:numPr>
+          <w:ilvl w:val="1"/>
+          <w:numId w:val="1082"/>
+        </w:numPr>
+        <w:pStyle w:val="Compact"/>
+      </w:pPr>
+      <w:r>
+        <w:t xml:space="preserve">It goes a point at a time across the top half of that list until the overall is up by one.</w:t>
+      </w:r>
+    </w:p>
+    <w:p>
+      <w:pPr>
+        <w:numPr>
+          <w:ilvl w:val="1"/>
+          <w:numId w:val="1082"/>
+        </w:numPr>
+        <w:pStyle w:val="Compact"/>
+      </w:pPr>
+      <w:r>
+        <w:t xml:space="preserve">Attributes at 99 are never touched, and your caps rise with the upgrades.</w:t>
+      </w:r>
+    </w:p>
+    <w:p>
+      <w:pPr>
+        <w:numPr>
+          <w:ilvl w:val="1"/>
+          <w:numId w:val="1082"/>
+        </w:numPr>
+        <w:pStyle w:val="Compact"/>
+      </w:pPr>
+      <w:r>
+        <w:t xml:space="preserve">Example: a Sharpshooter’s shooting reaches 99 first, and a Glass Cleaner’s rebounding and interior defense do.</w:t>
+      </w:r>
+    </w:p>
+    <w:p>
+      <w:pPr>
+        <w:numPr>
+          <w:ilvl w:val="0"/>
           <w:numId w:val="1080"/>
         </w:numPr>
         <w:pStyle w:val="Compact"/>
       </w:pPr>
       <w:r>
-        <w:t xml:space="preserve">The game that unlocks the Icon doesn’t count either.</w:t>
-      </w:r>
-    </w:p>
-    <w:p>
-      <w:pPr>
-        <w:numPr>
-          <w:ilvl w:val="0"/>
-          <w:numId w:val="1079"/>
-        </w:numPr>
-        <w:pStyle w:val="Compact"/>
-      </w:pPr>
-      <w:r>
-        <w:rPr>
-          <w:bCs/>
-          <w:b/>
-        </w:rPr>
-        <w:t xml:space="preserve">No stat picking:</w:t>
-      </w:r>
-      <w:r>
-        <w:t xml:space="preserve"> </w:t>
-      </w:r>
-      <w:r>
-        <w:t xml:space="preserve">the build system places each +1 itself.</w:t>
-      </w:r>
-    </w:p>
-    <w:p>
-      <w:pPr>
-        <w:numPr>
-          <w:ilvl w:val="1"/>
-          <w:numId w:val="1081"/>
-        </w:numPr>
-        <w:pStyle w:val="Compact"/>
-      </w:pPr>
-      <w:r>
-        <w:t xml:space="preserve">It raises the attributes your build leans on most: the shape its caps come from (archetype, size and weight) and what your position’s overall counts most.</w:t>
-      </w:r>
-    </w:p>
-    <w:p>
-      <w:pPr>
-        <w:numPr>
-          <w:ilvl w:val="1"/>
-          <w:numId w:val="1081"/>
-        </w:numPr>
-        <w:pStyle w:val="Compact"/>
-      </w:pPr>
-      <w:r>
-        <w:t xml:space="preserve">It goes a point at a time across the top half of that list until the overall is up by one.</w:t>
-      </w:r>
-    </w:p>
-    <w:p>
-      <w:pPr>
-        <w:numPr>
-          <w:ilvl w:val="1"/>
-          <w:numId w:val="1081"/>
-        </w:numPr>
-        <w:pStyle w:val="Compact"/>
-      </w:pPr>
-      <w:r>
-        <w:t xml:space="preserve">Attributes at 99 are never touched, and your caps rise with the upgrades.</w:t>
-      </w:r>
-    </w:p>
-    <w:p>
-      <w:pPr>
-        <w:numPr>
-          <w:ilvl w:val="1"/>
-          <w:numId w:val="1081"/>
-        </w:numPr>
-        <w:pStyle w:val="Compact"/>
-      </w:pPr>
-      <w:r>
-        <w:t xml:space="preserve">Example: a Sharpshooter’s shooting reaches 99 first, and a Glass Cleaner’s rebounding and interior defense do.</w:t>
-      </w:r>
-    </w:p>
-    <w:p>
-      <w:pPr>
-        <w:numPr>
-          <w:ilvl w:val="0"/>
-          <w:numId w:val="1079"/>
-        </w:numPr>
-        <w:pStyle w:val="Compact"/>
-      </w:pPr>
-      <w:r>
         <w:rPr>
           <w:bCs/>
           <w:b/>
@@ -7484,7 +7726,7 @@
       <w:pPr>
         <w:numPr>
           <w:ilvl w:val="0"/>
-          <w:numId w:val="1079"/>
+          <w:numId w:val="1080"/>
         </w:numPr>
         <w:pStyle w:val="Compact"/>
       </w:pPr>
@@ -7500,7 +7742,7 @@
       <w:pPr>
         <w:numPr>
           <w:ilvl w:val="1"/>
-          <w:numId w:val="1082"/>
+          <w:numId w:val="1083"/>
         </w:numPr>
         <w:pStyle w:val="Compact"/>
       </w:pPr>
@@ -7512,7 +7754,7 @@
       <w:pPr>
         <w:numPr>
           <w:ilvl w:val="1"/>
-          <w:numId w:val="1082"/>
+          <w:numId w:val="1083"/>
         </w:numPr>
         <w:pStyle w:val="Compact"/>
       </w:pPr>
@@ -7520,8 +7762,8 @@
         <w:t xml:space="preserve">The Pro Run screen shows it too.</w:t>
       </w:r>
     </w:p>
-    <w:bookmarkEnd w:id="69"/>
-    <w:bookmarkStart w:id="74" w:name="the-look"/>
+    <w:bookmarkEnd w:id="70"/>
+    <w:bookmarkStart w:id="75" w:name="the-look"/>
     <w:p>
       <w:pPr>
         <w:pStyle w:val="Heading2"/>
@@ -7530,7 +7772,7 @@
         <w:t xml:space="preserve">The look</w:t>
       </w:r>
     </w:p>
-    <w:bookmarkStart w:id="70" w:name="jersey-straps-fixed-properly-this-time"/>
+    <w:bookmarkStart w:id="71" w:name="jersey-straps-fixed-properly-this-time"/>
     <w:p>
       <w:pPr>
         <w:pStyle w:val="Heading3"/>
@@ -7543,7 +7785,7 @@
       <w:pPr>
         <w:numPr>
           <w:ilvl w:val="0"/>
-          <w:numId w:val="1083"/>
+          <w:numId w:val="1084"/>
         </w:numPr>
         <w:pStyle w:val="Compact"/>
       </w:pPr>
@@ -7565,7 +7807,7 @@
       <w:pPr>
         <w:numPr>
           <w:ilvl w:val="0"/>
-          <w:numId w:val="1083"/>
+          <w:numId w:val="1084"/>
         </w:numPr>
         <w:pStyle w:val="Compact"/>
       </w:pPr>
@@ -7587,7 +7829,7 @@
       <w:pPr>
         <w:numPr>
           <w:ilvl w:val="1"/>
-          <w:numId w:val="1084"/>
+          <w:numId w:val="1085"/>
         </w:numPr>
         <w:pStyle w:val="Compact"/>
       </w:pPr>
@@ -7599,7 +7841,7 @@
       <w:pPr>
         <w:numPr>
           <w:ilvl w:val="1"/>
-          <w:numId w:val="1084"/>
+          <w:numId w:val="1085"/>
         </w:numPr>
         <w:pStyle w:val="Compact"/>
       </w:pPr>
@@ -7611,7 +7853,7 @@
       <w:pPr>
         <w:numPr>
           <w:ilvl w:val="1"/>
-          <w:numId w:val="1084"/>
+          <w:numId w:val="1085"/>
         </w:numPr>
         <w:pStyle w:val="Compact"/>
       </w:pPr>
@@ -7623,7 +7865,7 @@
       <w:pPr>
         <w:numPr>
           <w:ilvl w:val="1"/>
-          <w:numId w:val="1084"/>
+          <w:numId w:val="1085"/>
         </w:numPr>
         <w:pStyle w:val="Compact"/>
       </w:pPr>
@@ -7631,8 +7873,8 @@
         <w:t xml:space="preserve">The fabric’s mesh weave runs true to size along it.</w:t>
       </w:r>
     </w:p>
-    <w:bookmarkEnd w:id="70"/>
-    <w:bookmarkStart w:id="71" w:name="dunks"/>
+    <w:bookmarkEnd w:id="71"/>
+    <w:bookmarkStart w:id="72" w:name="dunks"/>
     <w:p>
       <w:pPr>
         <w:pStyle w:val="Heading3"/>
@@ -7645,7 +7887,7 @@
       <w:pPr>
         <w:numPr>
           <w:ilvl w:val="0"/>
-          <w:numId w:val="1085"/>
+          <w:numId w:val="1086"/>
         </w:numPr>
         <w:pStyle w:val="Compact"/>
       </w:pPr>
@@ -7667,81 +7909,81 @@
       <w:pPr>
         <w:numPr>
           <w:ilvl w:val="1"/>
+          <w:numId w:val="1087"/>
+        </w:numPr>
+        <w:pStyle w:val="Compact"/>
+      </w:pPr>
+      <w:r>
+        <w:t xml:space="preserve">No generic finish is shared by more than 4 packages. Before, reverse slams showed up in 15 packages and double clutches in 14.</w:t>
+      </w:r>
+    </w:p>
+    <w:p>
+      <w:pPr>
+        <w:numPr>
+          <w:ilvl w:val="1"/>
+          <w:numId w:val="1087"/>
+        </w:numPr>
+        <w:pStyle w:val="Compact"/>
+      </w:pPr>
+      <w:r>
+        <w:t xml:space="preserve">Every signature belongs to one package only. The Spin Mill no longer borrows the Eastbay.</w:t>
+      </w:r>
+    </w:p>
+    <w:p>
+      <w:pPr>
+        <w:numPr>
+          <w:ilvl w:val="0"/>
           <w:numId w:val="1086"/>
         </w:numPr>
         <w:pStyle w:val="Compact"/>
       </w:pPr>
       <w:r>
-        <w:t xml:space="preserve">No generic finish is shared by more than 4 packages. Before, reverse slams showed up in 15 packages and double clutches in 14.</w:t>
-      </w:r>
-    </w:p>
-    <w:p>
-      <w:pPr>
-        <w:numPr>
-          <w:ilvl w:val="1"/>
+        <w:rPr>
+          <w:bCs/>
+          <w:b/>
+        </w:rPr>
+        <w:t xml:space="preserve">Windmills:</w:t>
+      </w:r>
+      <w:r>
+        <w:t xml:space="preserve"> </w:t>
+      </w:r>
+      <w:r>
+        <w:t xml:space="preserve">the arm now goes round straight from the shoulder, at full length, through the jump.</w:t>
+      </w:r>
+    </w:p>
+    <w:p>
+      <w:pPr>
+        <w:numPr>
+          <w:ilvl w:val="1"/>
+          <w:numId w:val="1088"/>
+        </w:numPr>
+        <w:pStyle w:val="Compact"/>
+      </w:pPr>
+      <w:r>
+        <w:t xml:space="preserve">Before, the circle sat above the shoulder, so the elbow folded at the bottom, the arm over-stretched at the top and most of the circle happened during the gather.</w:t>
+      </w:r>
+    </w:p>
+    <w:p>
+      <w:pPr>
+        <w:numPr>
+          <w:ilvl w:val="1"/>
+          <w:numId w:val="1088"/>
+        </w:numPr>
+        <w:pStyle w:val="Compact"/>
+      </w:pPr>
+      <w:r>
+        <w:t xml:space="preserve">It comes over the top and down at the rim with the ball still in the hand.</w:t>
+      </w:r>
+    </w:p>
+    <w:p>
+      <w:pPr>
+        <w:numPr>
+          <w:ilvl w:val="0"/>
           <w:numId w:val="1086"/>
         </w:numPr>
         <w:pStyle w:val="Compact"/>
       </w:pPr>
       <w:r>
-        <w:t xml:space="preserve">Every signature belongs to one package only. The Spin Mill no longer borrows the Eastbay.</w:t>
-      </w:r>
-    </w:p>
-    <w:p>
-      <w:pPr>
-        <w:numPr>
-          <w:ilvl w:val="0"/>
-          <w:numId w:val="1085"/>
-        </w:numPr>
-        <w:pStyle w:val="Compact"/>
-      </w:pPr>
-      <w:r>
-        <w:rPr>
-          <w:bCs/>
-          <w:b/>
-        </w:rPr>
-        <w:t xml:space="preserve">Windmills:</w:t>
-      </w:r>
-      <w:r>
-        <w:t xml:space="preserve"> </w:t>
-      </w:r>
-      <w:r>
-        <w:t xml:space="preserve">the arm now goes round straight from the shoulder, at full length, through the jump.</w:t>
-      </w:r>
-    </w:p>
-    <w:p>
-      <w:pPr>
-        <w:numPr>
-          <w:ilvl w:val="1"/>
-          <w:numId w:val="1087"/>
-        </w:numPr>
-        <w:pStyle w:val="Compact"/>
-      </w:pPr>
-      <w:r>
-        <w:t xml:space="preserve">Before, the circle sat above the shoulder, so the elbow folded at the bottom, the arm over-stretched at the top and most of the circle happened during the gather.</w:t>
-      </w:r>
-    </w:p>
-    <w:p>
-      <w:pPr>
-        <w:numPr>
-          <w:ilvl w:val="1"/>
-          <w:numId w:val="1087"/>
-        </w:numPr>
-        <w:pStyle w:val="Compact"/>
-      </w:pPr>
-      <w:r>
-        <w:t xml:space="preserve">It comes over the top and down at the rim with the ball still in the hand.</w:t>
-      </w:r>
-    </w:p>
-    <w:p>
-      <w:pPr>
-        <w:numPr>
-          <w:ilvl w:val="0"/>
-          <w:numId w:val="1085"/>
-        </w:numPr>
-        <w:pStyle w:val="Compact"/>
-      </w:pPr>
-      <w:r>
         <w:rPr>
           <w:bCs/>
           <w:b/>
@@ -7753,7 +7995,7 @@
       <w:pPr>
         <w:numPr>
           <w:ilvl w:val="1"/>
-          <w:numId w:val="1088"/>
+          <w:numId w:val="1089"/>
         </w:numPr>
         <w:pStyle w:val="Compact"/>
       </w:pPr>
@@ -7765,7 +8007,7 @@
       <w:pPr>
         <w:numPr>
           <w:ilvl w:val="1"/>
-          <w:numId w:val="1088"/>
+          <w:numId w:val="1089"/>
         </w:numPr>
         <w:pStyle w:val="Compact"/>
       </w:pPr>
@@ -7777,7 +8019,7 @@
       <w:pPr>
         <w:numPr>
           <w:ilvl w:val="1"/>
-          <w:numId w:val="1088"/>
+          <w:numId w:val="1089"/>
         </w:numPr>
         <w:pStyle w:val="Compact"/>
       </w:pPr>
@@ -7785,8 +8027,8 @@
         <w:t xml:space="preserve">Before, it was timed from the gather, so most of it happened on the floor, and the ball dipped in front of the right thigh instead of going through.</w:t>
       </w:r>
     </w:p>
-    <w:bookmarkEnd w:id="71"/>
-    <w:bookmarkStart w:id="72" w:name="celebrations"/>
+    <w:bookmarkEnd w:id="72"/>
+    <w:bookmarkStart w:id="73" w:name="celebrations"/>
     <w:p>
       <w:pPr>
         <w:pStyle w:val="Heading3"/>
@@ -7799,7 +8041,7 @@
       <w:pPr>
         <w:numPr>
           <w:ilvl w:val="0"/>
-          <w:numId w:val="1089"/>
+          <w:numId w:val="1090"/>
         </w:numPr>
         <w:pStyle w:val="Compact"/>
       </w:pPr>
@@ -7815,81 +8057,81 @@
       <w:pPr>
         <w:numPr>
           <w:ilvl w:val="1"/>
+          <w:numId w:val="1091"/>
+        </w:numPr>
+        <w:pStyle w:val="Compact"/>
+      </w:pPr>
+      <w:r>
+        <w:t xml:space="preserve">Before, they only worked if you pressed G / D-pad up during the second and a half of dead ball after a basket while your player was doing nothing, and the check then cut them off.</w:t>
+      </w:r>
+    </w:p>
+    <w:p>
+      <w:pPr>
+        <w:numPr>
+          <w:ilvl w:val="1"/>
+          <w:numId w:val="1091"/>
+        </w:numPr>
+        <w:pStyle w:val="Compact"/>
+      </w:pPr>
+      <w:r>
+        <w:t xml:space="preserve">Now a press waits up to 2.5 seconds for your player to be free (follow-through, landing, hanging on the rim).</w:t>
+      </w:r>
+    </w:p>
+    <w:p>
+      <w:pPr>
+        <w:numPr>
+          <w:ilvl w:val="1"/>
+          <w:numId w:val="1091"/>
+        </w:numPr>
+        <w:pStyle w:val="Compact"/>
+      </w:pPr>
+      <w:r>
+        <w:t xml:space="preserve">They play in any dead ball, check or inbound (unless you have the ball) and for 3 seconds after your team scores.</w:t>
+      </w:r>
+    </w:p>
+    <w:p>
+      <w:pPr>
+        <w:numPr>
+          <w:ilvl w:val="1"/>
+          <w:numId w:val="1091"/>
+        </w:numPr>
+        <w:pStyle w:val="Compact"/>
+      </w:pPr>
+      <w:r>
+        <w:t xml:space="preserve">Whoever has the ball stops for the check; everyone else finishes.</w:t>
+      </w:r>
+    </w:p>
+    <w:p>
+      <w:pPr>
+        <w:numPr>
+          <w:ilvl w:val="0"/>
           <w:numId w:val="1090"/>
         </w:numPr>
         <w:pStyle w:val="Compact"/>
       </w:pPr>
       <w:r>
-        <w:t xml:space="preserve">Before, they only worked if you pressed G / D-pad up during the second and a half of dead ball after a basket while your player was doing nothing, and the check then cut them off.</w:t>
-      </w:r>
-    </w:p>
-    <w:p>
-      <w:pPr>
-        <w:numPr>
-          <w:ilvl w:val="1"/>
+        <w:rPr>
+          <w:bCs/>
+          <w:b/>
+        </w:rPr>
+        <w:t xml:space="preserve">Controllers:</w:t>
+      </w:r>
+      <w:r>
+        <w:t xml:space="preserve"> </w:t>
+      </w:r>
+      <w:r>
+        <w:t xml:space="preserve">pads the browser doesn’t map to the standard layout send the D-pad as axes. The game now reads those too, so D-pad up works on them.</w:t>
+      </w:r>
+    </w:p>
+    <w:p>
+      <w:pPr>
+        <w:numPr>
+          <w:ilvl w:val="0"/>
           <w:numId w:val="1090"/>
         </w:numPr>
         <w:pStyle w:val="Compact"/>
       </w:pPr>
       <w:r>
-        <w:t xml:space="preserve">Now a press waits up to 2.5 seconds for your player to be free (follow-through, landing, hanging on the rim).</w:t>
-      </w:r>
-    </w:p>
-    <w:p>
-      <w:pPr>
-        <w:numPr>
-          <w:ilvl w:val="1"/>
-          <w:numId w:val="1090"/>
-        </w:numPr>
-        <w:pStyle w:val="Compact"/>
-      </w:pPr>
-      <w:r>
-        <w:t xml:space="preserve">They play in any dead ball, check or inbound (unless you have the ball) and for 3 seconds after your team scores.</w:t>
-      </w:r>
-    </w:p>
-    <w:p>
-      <w:pPr>
-        <w:numPr>
-          <w:ilvl w:val="1"/>
-          <w:numId w:val="1090"/>
-        </w:numPr>
-        <w:pStyle w:val="Compact"/>
-      </w:pPr>
-      <w:r>
-        <w:t xml:space="preserve">Whoever has the ball stops for the check; everyone else finishes.</w:t>
-      </w:r>
-    </w:p>
-    <w:p>
-      <w:pPr>
-        <w:numPr>
-          <w:ilvl w:val="0"/>
-          <w:numId w:val="1089"/>
-        </w:numPr>
-        <w:pStyle w:val="Compact"/>
-      </w:pPr>
-      <w:r>
-        <w:rPr>
-          <w:bCs/>
-          <w:b/>
-        </w:rPr>
-        <w:t xml:space="preserve">Controllers:</w:t>
-      </w:r>
-      <w:r>
-        <w:t xml:space="preserve"> </w:t>
-      </w:r>
-      <w:r>
-        <w:t xml:space="preserve">pads the browser doesn’t map to the standard layout send the D-pad as axes. The game now reads those too, so D-pad up works on them.</w:t>
-      </w:r>
-    </w:p>
-    <w:p>
-      <w:pPr>
-        <w:numPr>
-          <w:ilvl w:val="0"/>
-          <w:numId w:val="1089"/>
-        </w:numPr>
-        <w:pStyle w:val="Compact"/>
-      </w:pPr>
-      <w:r>
         <w:rPr>
           <w:bCs/>
           <w:b/>
@@ -7903,8 +8145,8 @@
         <w:t xml:space="preserve">Chest Thump, Heart, Dust Off, Archer and Sleep put a hand or forearm through the chest. Each was fixed and every celebration was re-checked on three builds: none clip now.</w:t>
       </w:r>
     </w:p>
-    <w:bookmarkEnd w:id="72"/>
-    <w:bookmarkStart w:id="73" w:name="posterizer-and-contact-finisher"/>
+    <w:bookmarkEnd w:id="73"/>
+    <w:bookmarkStart w:id="74" w:name="posterizer-and-contact-finisher"/>
     <w:p>
       <w:pPr>
         <w:pStyle w:val="Heading3"/>
@@ -7917,7 +8159,7 @@
       <w:pPr>
         <w:numPr>
           <w:ilvl w:val="0"/>
-          <w:numId w:val="1091"/>
+          <w:numId w:val="1092"/>
         </w:numPr>
         <w:pStyle w:val="Compact"/>
       </w:pPr>
@@ -7933,7 +8175,7 @@
       <w:pPr>
         <w:numPr>
           <w:ilvl w:val="1"/>
-          <w:numId w:val="1092"/>
+          <w:numId w:val="1093"/>
         </w:numPr>
         <w:pStyle w:val="Compact"/>
       </w:pPr>
@@ -7945,7 +8187,7 @@
       <w:pPr>
         <w:numPr>
           <w:ilvl w:val="1"/>
-          <w:numId w:val="1092"/>
+          <w:numId w:val="1093"/>
         </w:numPr>
         <w:pStyle w:val="Compact"/>
       </w:pPr>
@@ -7957,7 +8199,7 @@
       <w:pPr>
         <w:numPr>
           <w:ilvl w:val="1"/>
-          <w:numId w:val="1092"/>
+          <w:numId w:val="1093"/>
         </w:numPr>
         <w:pStyle w:val="Compact"/>
       </w:pPr>
@@ -7969,7 +8211,7 @@
       <w:pPr>
         <w:numPr>
           <w:ilvl w:val="1"/>
-          <w:numId w:val="1092"/>
+          <w:numId w:val="1093"/>
         </w:numPr>
         <w:pStyle w:val="Compact"/>
       </w:pPr>
@@ -7977,9 +8219,9 @@
         <w:t xml:space="preserve">Before, the poster fired at the contact, even when the dunk then turned into a layup.</w:t>
       </w:r>
     </w:p>
-    <w:bookmarkEnd w:id="73"/>
     <w:bookmarkEnd w:id="74"/>
-    <w:bookmarkStart w:id="75" w:name="store-menus-and-hud"/>
+    <w:bookmarkEnd w:id="75"/>
+    <w:bookmarkStart w:id="76" w:name="store-menus-and-hud"/>
     <w:p>
       <w:pPr>
         <w:pStyle w:val="Heading2"/>
@@ -7992,7 +8234,7 @@
       <w:pPr>
         <w:numPr>
           <w:ilvl w:val="0"/>
-          <w:numId w:val="1093"/>
+          <w:numId w:val="1094"/>
         </w:numPr>
       </w:pPr>
       <w:r>
@@ -8494,7 +8736,7 @@
       <w:pPr>
         <w:numPr>
           <w:ilvl w:val="0"/>
-          <w:numId w:val="1093"/>
+          <w:numId w:val="1094"/>
         </w:numPr>
       </w:pPr>
       <w:r>
@@ -8557,7 +8799,7 @@
       <w:pPr>
         <w:numPr>
           <w:ilvl w:val="0"/>
-          <w:numId w:val="1093"/>
+          <w:numId w:val="1094"/>
         </w:numPr>
       </w:pPr>
       <w:r>
@@ -8578,77 +8820,77 @@
       <w:pPr>
         <w:numPr>
           <w:ilvl w:val="1"/>
+          <w:numId w:val="1095"/>
+        </w:numPr>
+        <w:pStyle w:val="Compact"/>
+      </w:pPr>
+      <w:r>
+        <w:t xml:space="preserve">The panel is 1.2× the grade’s width, at the same height.</w:t>
+      </w:r>
+    </w:p>
+    <w:p>
+      <w:pPr>
+        <w:numPr>
+          <w:ilvl w:val="1"/>
+          <w:numId w:val="1095"/>
+        </w:numPr>
+        <w:pStyle w:val="Compact"/>
+      </w:pPr>
+      <w:r>
+        <w:t xml:space="preserve">The grade itself keeps its size and moves left to make room.</w:t>
+      </w:r>
+    </w:p>
+    <w:p>
+      <w:pPr>
+        <w:numPr>
+          <w:ilvl w:val="1"/>
+          <w:numId w:val="1095"/>
+        </w:numPr>
+        <w:pStyle w:val="Compact"/>
+      </w:pPr>
+      <w:r>
+        <w:t xml:space="preserve">A number that goes up pulses once.</w:t>
+      </w:r>
+    </w:p>
+    <w:p>
+      <w:pPr>
+        <w:numPr>
+          <w:ilvl w:val="1"/>
+          <w:numId w:val="1095"/>
+        </w:numPr>
+        <w:pStyle w:val="Compact"/>
+      </w:pPr>
+      <w:r>
+        <w:t xml:space="preserve">It shows whenever the grade does (Settings → Lock-In grade).</w:t>
+      </w:r>
+    </w:p>
+    <w:p>
+      <w:pPr>
+        <w:numPr>
+          <w:ilvl w:val="0"/>
           <w:numId w:val="1094"/>
         </w:numPr>
-        <w:pStyle w:val="Compact"/>
-      </w:pPr>
-      <w:r>
-        <w:t xml:space="preserve">The panel is 1.2× the grade’s width, at the same height.</w:t>
-      </w:r>
-    </w:p>
-    <w:p>
-      <w:pPr>
-        <w:numPr>
-          <w:ilvl w:val="1"/>
+      </w:pPr>
+      <w:r>
+        <w:rPr>
+          <w:bCs/>
+          <w:b/>
+        </w:rPr>
+        <w:t xml:space="preserve">Volume in the pause menu:</w:t>
+      </w:r>
+      <w:r>
+        <w:t xml:space="preserve"> </w:t>
+      </w:r>
+      <w:r>
+        <w:t xml:space="preserve">Music, Effects and Crowd sliders. They’re in the park’s pause menu, your park game’s, Pro-Am / Pro Run and the Crew HQ. They apply as you drag and are saved.</w:t>
+      </w:r>
+    </w:p>
+    <w:p>
+      <w:pPr>
+        <w:numPr>
+          <w:ilvl w:val="0"/>
           <w:numId w:val="1094"/>
         </w:numPr>
-        <w:pStyle w:val="Compact"/>
-      </w:pPr>
-      <w:r>
-        <w:t xml:space="preserve">The grade itself keeps its size and moves left to make room.</w:t>
-      </w:r>
-    </w:p>
-    <w:p>
-      <w:pPr>
-        <w:numPr>
-          <w:ilvl w:val="1"/>
-          <w:numId w:val="1094"/>
-        </w:numPr>
-        <w:pStyle w:val="Compact"/>
-      </w:pPr>
-      <w:r>
-        <w:t xml:space="preserve">A number that goes up pulses once.</w:t>
-      </w:r>
-    </w:p>
-    <w:p>
-      <w:pPr>
-        <w:numPr>
-          <w:ilvl w:val="1"/>
-          <w:numId w:val="1094"/>
-        </w:numPr>
-        <w:pStyle w:val="Compact"/>
-      </w:pPr>
-      <w:r>
-        <w:t xml:space="preserve">It shows whenever the grade does (Settings → Lock-In grade).</w:t>
-      </w:r>
-    </w:p>
-    <w:p>
-      <w:pPr>
-        <w:numPr>
-          <w:ilvl w:val="0"/>
-          <w:numId w:val="1093"/>
-        </w:numPr>
-      </w:pPr>
-      <w:r>
-        <w:rPr>
-          <w:bCs/>
-          <w:b/>
-        </w:rPr>
-        <w:t xml:space="preserve">Volume in the pause menu:</w:t>
-      </w:r>
-      <w:r>
-        <w:t xml:space="preserve"> </w:t>
-      </w:r>
-      <w:r>
-        <w:t xml:space="preserve">Music, Effects and Crowd sliders. They’re in the park’s pause menu, your park game’s, Pro-Am / Pro Run and the Crew HQ. They apply as you drag and are saved.</w:t>
-      </w:r>
-    </w:p>
-    <w:p>
-      <w:pPr>
-        <w:numPr>
-          <w:ilvl w:val="0"/>
-          <w:numId w:val="1093"/>
-        </w:numPr>
       </w:pPr>
       <w:r>
         <w:rPr>
@@ -8662,7 +8904,7 @@
       <w:pPr>
         <w:numPr>
           <w:ilvl w:val="1"/>
-          <w:numId w:val="1095"/>
+          <w:numId w:val="1096"/>
         </w:numPr>
         <w:pStyle w:val="Compact"/>
       </w:pPr>
@@ -8674,7 +8916,7 @@
       <w:pPr>
         <w:numPr>
           <w:ilvl w:val="1"/>
-          <w:numId w:val="1095"/>
+          <w:numId w:val="1096"/>
         </w:numPr>
         <w:pStyle w:val="Compact"/>
       </w:pPr>
@@ -8686,7 +8928,7 @@
       <w:pPr>
         <w:numPr>
           <w:ilvl w:val="1"/>
-          <w:numId w:val="1095"/>
+          <w:numId w:val="1096"/>
         </w:numPr>
         <w:pStyle w:val="Compact"/>
       </w:pPr>
@@ -8694,8 +8936,8 @@
         <w:t xml:space="preserve">A breath in each throat, and the stands throwing it back.</w:t>
       </w:r>
     </w:p>
-    <w:bookmarkEnd w:id="75"/>
-    <w:bookmarkStart w:id="76" w:name="green-releases-doubled-and-remade"/>
+    <w:bookmarkEnd w:id="76"/>
+    <w:bookmarkStart w:id="77" w:name="green-releases-doubled-and-remade"/>
     <w:p>
       <w:pPr>
         <w:pStyle w:val="Heading2"/>
@@ -8708,7 +8950,7 @@
       <w:pPr>
         <w:numPr>
           <w:ilvl w:val="0"/>
-          <w:numId w:val="1096"/>
+          <w:numId w:val="1097"/>
         </w:numPr>
         <w:pStyle w:val="Compact"/>
       </w:pPr>
@@ -8730,6 +8972,62 @@
       <w:pPr>
         <w:numPr>
           <w:ilvl w:val="1"/>
+          <w:numId w:val="1098"/>
+        </w:numPr>
+        <w:pStyle w:val="Compact"/>
+      </w:pPr>
+      <w:r>
+        <w:rPr>
+          <w:bCs/>
+          <w:b/>
+        </w:rPr>
+        <w:t xml:space="preserve">New sounds</w:t>
+      </w:r>
+      <w:r>
+        <w:t xml:space="preserve"> </w:t>
+      </w:r>
+      <w:r>
+        <w:t xml:space="preserve">(3,500–9,500 VC): Night Owl, Wolf Howl, Steam Whistle, Victory Bells, Knockout Bell, Shattered Glass, Strike!, Rimshot, Bass Drop, Sonar Ping, Standing Ovation, Five-Alarm, Boing, Cuckoo, Royal Fanfare and Case Closed.</w:t>
+      </w:r>
+    </w:p>
+    <w:p>
+      <w:pPr>
+        <w:numPr>
+          <w:ilvl w:val="1"/>
+          <w:numId w:val="1098"/>
+        </w:numPr>
+        <w:pStyle w:val="Compact"/>
+      </w:pPr>
+      <w:r>
+        <w:rPr>
+          <w:bCs/>
+          <w:b/>
+        </w:rPr>
+        <w:t xml:space="preserve">New effects</w:t>
+      </w:r>
+      <w:r>
+        <w:t xml:space="preserve"> </w:t>
+      </w:r>
+      <w:r>
+        <w:t xml:space="preserve">(6,000–12,000 VC): Phoenix, Make It Rain, Shockwave, Atomic, Galaxy, Ice Cold, Fire Circle, Angel Wings, Jade Dragon, Meteor Shower, Laser Show, Lucky Clover, Diamond and Supernova.</w:t>
+      </w:r>
+    </w:p>
+    <w:p>
+      <w:pPr>
+        <w:numPr>
+          <w:ilvl w:val="1"/>
+          <w:numId w:val="1098"/>
+        </w:numPr>
+        <w:pStyle w:val="Compact"/>
+      </w:pPr>
+      <w:r>
+        <w:t xml:space="preserve">The AI picks from all of them, still with no two alike on a floor.</w:t>
+      </w:r>
+    </w:p>
+    <w:p>
+      <w:pPr>
+        <w:numPr>
+          <w:ilvl w:val="0"/>
           <w:numId w:val="1097"/>
         </w:numPr>
         <w:pStyle w:val="Compact"/>
@@ -8739,62 +9037,6 @@
           <w:bCs/>
           <w:b/>
         </w:rPr>
-        <w:t xml:space="preserve">New sounds</w:t>
-      </w:r>
-      <w:r>
-        <w:t xml:space="preserve"> </w:t>
-      </w:r>
-      <w:r>
-        <w:t xml:space="preserve">(3,500–9,500 VC): Night Owl, Wolf Howl, Steam Whistle, Victory Bells, Knockout Bell, Shattered Glass, Strike!, Rimshot, Bass Drop, Sonar Ping, Standing Ovation, Five-Alarm, Boing, Cuckoo, Royal Fanfare and Case Closed.</w:t>
-      </w:r>
-    </w:p>
-    <w:p>
-      <w:pPr>
-        <w:numPr>
-          <w:ilvl w:val="1"/>
-          <w:numId w:val="1097"/>
-        </w:numPr>
-        <w:pStyle w:val="Compact"/>
-      </w:pPr>
-      <w:r>
-        <w:rPr>
-          <w:bCs/>
-          <w:b/>
-        </w:rPr>
-        <w:t xml:space="preserve">New effects</w:t>
-      </w:r>
-      <w:r>
-        <w:t xml:space="preserve"> </w:t>
-      </w:r>
-      <w:r>
-        <w:t xml:space="preserve">(6,000–12,000 VC): Phoenix, Make It Rain, Shockwave, Atomic, Galaxy, Ice Cold, Fire Circle, Angel Wings, Jade Dragon, Meteor Shower, Laser Show, Lucky Clover, Diamond and Supernova.</w:t>
-      </w:r>
-    </w:p>
-    <w:p>
-      <w:pPr>
-        <w:numPr>
-          <w:ilvl w:val="1"/>
-          <w:numId w:val="1097"/>
-        </w:numPr>
-        <w:pStyle w:val="Compact"/>
-      </w:pPr>
-      <w:r>
-        <w:t xml:space="preserve">The AI picks from all of them, still with no two alike on a floor.</w:t>
-      </w:r>
-    </w:p>
-    <w:p>
-      <w:pPr>
-        <w:numPr>
-          <w:ilvl w:val="0"/>
-          <w:numId w:val="1096"/>
-        </w:numPr>
-        <w:pStyle w:val="Compact"/>
-      </w:pPr>
-      <w:r>
-        <w:rPr>
-          <w:bCs/>
-          <w:b/>
-        </w:rPr>
         <w:t xml:space="preserve">Every sound remade to sound like its name.</w:t>
       </w:r>
     </w:p>
@@ -8802,7 +9044,7 @@
       <w:pPr>
         <w:numPr>
           <w:ilvl w:val="1"/>
-          <w:numId w:val="1098"/>
+          <w:numId w:val="1099"/>
         </w:numPr>
         <w:pStyle w:val="Compact"/>
       </w:pPr>
@@ -8824,7 +9066,7 @@
       <w:pPr>
         <w:numPr>
           <w:ilvl w:val="1"/>
-          <w:numId w:val="1098"/>
+          <w:numId w:val="1099"/>
         </w:numPr>
         <w:pStyle w:val="Compact"/>
       </w:pPr>
@@ -8846,7 +9088,7 @@
       <w:pPr>
         <w:numPr>
           <w:ilvl w:val="1"/>
-          <w:numId w:val="1098"/>
+          <w:numId w:val="1099"/>
         </w:numPr>
         <w:pStyle w:val="Compact"/>
       </w:pPr>
@@ -8862,98 +9104,6 @@
       </w:r>
       <w:r>
         <w:t xml:space="preserve">a raptor’s scream.</w:t>
-      </w:r>
-    </w:p>
-    <w:p>
-      <w:pPr>
-        <w:numPr>
-          <w:ilvl w:val="2"/>
-          <w:numId w:val="1099"/>
-        </w:numPr>
-        <w:pStyle w:val="Compact"/>
-      </w:pPr>
-      <w:r>
-        <w:t xml:space="preserve">A quick rise into a long, high</w:t>
-      </w:r>
-      <w:r>
-        <w:t xml:space="preserve"> </w:t>
-      </w:r>
-      <w:r>
-        <w:t xml:space="preserve">“</w:t>
-      </w:r>
-      <w:r>
-        <w:t xml:space="preserve">kee-eeee-arrr</w:t>
-      </w:r>
-      <w:r>
-        <w:t xml:space="preserve">”</w:t>
-      </w:r>
-      <w:r>
-        <w:t xml:space="preserve"> </w:t>
-      </w:r>
-      <w:r>
-        <w:t xml:space="preserve">around 2.5 kHz.</w:t>
-      </w:r>
-    </w:p>
-    <w:p>
-      <w:pPr>
-        <w:numPr>
-          <w:ilvl w:val="2"/>
-          <w:numId w:val="1099"/>
-        </w:numPr>
-        <w:pStyle w:val="Compact"/>
-      </w:pPr>
-      <w:r>
-        <w:t xml:space="preserve">Harsh, the way a real one is: the pitch jitters from cycle to cycle, every other cycle is louder, and there’s breath riding on each one.</w:t>
-      </w:r>
-    </w:p>
-    <w:p>
-      <w:pPr>
-        <w:numPr>
-          <w:ilvl w:val="2"/>
-          <w:numId w:val="1099"/>
-        </w:numPr>
-        <w:pStyle w:val="Compact"/>
-      </w:pPr>
-      <w:r>
-        <w:t xml:space="preserve">It tears downward at the end, then rings off the canyon walls.</w:t>
-      </w:r>
-    </w:p>
-    <w:p>
-      <w:pPr>
-        <w:numPr>
-          <w:ilvl w:val="1"/>
-          <w:numId w:val="1098"/>
-        </w:numPr>
-        <w:pStyle w:val="Compact"/>
-      </w:pPr>
-      <w:r>
-        <w:rPr>
-          <w:bCs/>
-          <w:b/>
-        </w:rPr>
-        <w:t xml:space="preserve">Bells, gongs, glass, coins and wood</w:t>
-      </w:r>
-      <w:r>
-        <w:t xml:space="preserve"> </w:t>
-      </w:r>
-      <w:r>
-        <w:t xml:space="preserve">ring with their own partials. A church bell has its hum an octave under, its minor-third tierce and its nominal. The gong blooms up into its shimmer after the strike.</w:t>
-      </w:r>
-    </w:p>
-    <w:p>
-      <w:pPr>
-        <w:numPr>
-          <w:ilvl w:val="1"/>
-          <w:numId w:val="1098"/>
-        </w:numPr>
-        <w:pStyle w:val="Compact"/>
-      </w:pPr>
-      <w:r>
-        <w:rPr>
-          <w:bCs/>
-          <w:b/>
-        </w:rPr>
-        <w:t xml:space="preserve">Voices:</w:t>
       </w:r>
     </w:p>
     <w:p>
@@ -8965,7 +9115,25 @@
         <w:pStyle w:val="Compact"/>
       </w:pPr>
       <w:r>
-        <w:t xml:space="preserve">The choir is four sections, each with its own vowel, singing in a cathedral with a harp under it.</w:t>
+        <w:t xml:space="preserve">A quick rise into a long, high</w:t>
+      </w:r>
+      <w:r>
+        <w:t xml:space="preserve"> </w:t>
+      </w:r>
+      <w:r>
+        <w:t xml:space="preserve">“</w:t>
+      </w:r>
+      <w:r>
+        <w:t xml:space="preserve">kee-eeee-arrr</w:t>
+      </w:r>
+      <w:r>
+        <w:t xml:space="preserve">”</w:t>
+      </w:r>
+      <w:r>
+        <w:t xml:space="preserve"> </w:t>
+      </w:r>
+      <w:r>
+        <w:t xml:space="preserve">around 2.5 kHz.</w:t>
       </w:r>
     </w:p>
     <w:p>
@@ -8977,7 +9145,7 @@
         <w:pStyle w:val="Compact"/>
       </w:pPr>
       <w:r>
-        <w:t xml:space="preserve">The kazoo is a hummed voice with the paper buzzing on it.</w:t>
+        <w:t xml:space="preserve">Harsh, the way a real one is: the pitch jitters from cycle to cycle, every other cycle is louder, and there’s breath riding on each one.</w:t>
       </w:r>
     </w:p>
     <w:p>
@@ -8989,23 +9157,45 @@
         <w:pStyle w:val="Compact"/>
       </w:pPr>
       <w:r>
-        <w:t xml:space="preserve">The roar after the Greeen Chant is now crowd voices, not noise.</w:t>
-      </w:r>
-    </w:p>
-    <w:p>
-      <w:pPr>
-        <w:numPr>
-          <w:ilvl w:val="1"/>
-          <w:numId w:val="1098"/>
-        </w:numPr>
-        <w:pStyle w:val="Compact"/>
-      </w:pPr>
-      <w:r>
-        <w:rPr>
-          <w:bCs/>
-          <w:b/>
-        </w:rPr>
-        <w:t xml:space="preserve">Squeaks, water and weather:</w:t>
+        <w:t xml:space="preserve">It tears downward at the end, then rings off the canyon walls.</w:t>
+      </w:r>
+    </w:p>
+    <w:p>
+      <w:pPr>
+        <w:numPr>
+          <w:ilvl w:val="1"/>
+          <w:numId w:val="1099"/>
+        </w:numPr>
+        <w:pStyle w:val="Compact"/>
+      </w:pPr>
+      <w:r>
+        <w:rPr>
+          <w:bCs/>
+          <w:b/>
+        </w:rPr>
+        <w:t xml:space="preserve">Bells, gongs, glass, coins and wood</w:t>
+      </w:r>
+      <w:r>
+        <w:t xml:space="preserve"> </w:t>
+      </w:r>
+      <w:r>
+        <w:t xml:space="preserve">ring with their own partials. A church bell has its hum an octave under, its minor-third tierce and its nominal. The gong blooms up into its shimmer after the strike.</w:t>
+      </w:r>
+    </w:p>
+    <w:p>
+      <w:pPr>
+        <w:numPr>
+          <w:ilvl w:val="1"/>
+          <w:numId w:val="1099"/>
+        </w:numPr>
+        <w:pStyle w:val="Compact"/>
+      </w:pPr>
+      <w:r>
+        <w:rPr>
+          <w:bCs/>
+          <w:b/>
+        </w:rPr>
+        <w:t xml:space="preserve">Voices:</w:t>
       </w:r>
     </w:p>
     <w:p>
@@ -9017,7 +9207,7 @@
         <w:pStyle w:val="Compact"/>
       </w:pPr>
       <w:r>
-        <w:t xml:space="preserve">The rubber duck is a squeaker reed, wheezing in between squeezes.</w:t>
+        <w:t xml:space="preserve">The choir is four sections, each with its own vowel, singing in a cathedral with a harp under it.</w:t>
       </w:r>
     </w:p>
     <w:p>
@@ -9029,7 +9219,7 @@
         <w:pStyle w:val="Compact"/>
       </w:pPr>
       <w:r>
-        <w:t xml:space="preserve">The cannonball is a slap, a kerplunk and hundreds of bubbles and drops.</w:t>
+        <w:t xml:space="preserve">The kazoo is a hummed voice with the paper buzzing on it.</w:t>
       </w:r>
     </w:p>
     <w:p>
@@ -9041,6 +9231,58 @@
         <w:pStyle w:val="Compact"/>
       </w:pPr>
       <w:r>
+        <w:t xml:space="preserve">The roar after the Greeen Chant is now crowd voices, not noise.</w:t>
+      </w:r>
+    </w:p>
+    <w:p>
+      <w:pPr>
+        <w:numPr>
+          <w:ilvl w:val="1"/>
+          <w:numId w:val="1099"/>
+        </w:numPr>
+        <w:pStyle w:val="Compact"/>
+      </w:pPr>
+      <w:r>
+        <w:rPr>
+          <w:bCs/>
+          <w:b/>
+        </w:rPr>
+        <w:t xml:space="preserve">Squeaks, water and weather:</w:t>
+      </w:r>
+    </w:p>
+    <w:p>
+      <w:pPr>
+        <w:numPr>
+          <w:ilvl w:val="2"/>
+          <w:numId w:val="1102"/>
+        </w:numPr>
+        <w:pStyle w:val="Compact"/>
+      </w:pPr>
+      <w:r>
+        <w:t xml:space="preserve">The rubber duck is a squeaker reed, wheezing in between squeezes.</w:t>
+      </w:r>
+    </w:p>
+    <w:p>
+      <w:pPr>
+        <w:numPr>
+          <w:ilvl w:val="2"/>
+          <w:numId w:val="1102"/>
+        </w:numPr>
+        <w:pStyle w:val="Compact"/>
+      </w:pPr>
+      <w:r>
+        <w:t xml:space="preserve">The cannonball is a slap, a kerplunk and hundreds of bubbles and drops.</w:t>
+      </w:r>
+    </w:p>
+    <w:p>
+      <w:pPr>
+        <w:numPr>
+          <w:ilvl w:val="2"/>
+          <w:numId w:val="1102"/>
+        </w:numPr>
+        <w:pStyle w:val="Compact"/>
+      </w:pPr>
+      <w:r>
         <w:t xml:space="preserve">Thunder tears the air open before the boom and the roll.</w:t>
       </w:r>
     </w:p>
@@ -9048,7 +9290,7 @@
       <w:pPr>
         <w:numPr>
           <w:ilvl w:val="0"/>
-          <w:numId w:val="1096"/>
+          <w:numId w:val="1097"/>
         </w:numPr>
         <w:pStyle w:val="Compact"/>
       </w:pPr>
@@ -9070,7 +9312,7 @@
       <w:pPr>
         <w:numPr>
           <w:ilvl w:val="0"/>
-          <w:numId w:val="1096"/>
+          <w:numId w:val="1097"/>
         </w:numPr>
         <w:pStyle w:val="Compact"/>
       </w:pPr>
@@ -9110,7 +9352,7 @@
       <w:pPr>
         <w:numPr>
           <w:ilvl w:val="0"/>
-          <w:numId w:val="1096"/>
+          <w:numId w:val="1097"/>
         </w:numPr>
         <w:pStyle w:val="Compact"/>
       </w:pPr>
@@ -9126,7 +9368,7 @@
       <w:pPr>
         <w:numPr>
           <w:ilvl w:val="1"/>
-          <w:numId w:val="1102"/>
+          <w:numId w:val="1103"/>
         </w:numPr>
         <w:pStyle w:val="Compact"/>
       </w:pPr>
@@ -9138,7 +9380,7 @@
       <w:pPr>
         <w:numPr>
           <w:ilvl w:val="1"/>
-          <w:numId w:val="1102"/>
+          <w:numId w:val="1103"/>
         </w:numPr>
         <w:pStyle w:val="Compact"/>
       </w:pPr>
@@ -9150,7 +9392,7 @@
       <w:pPr>
         <w:numPr>
           <w:ilvl w:val="1"/>
-          <w:numId w:val="1102"/>
+          <w:numId w:val="1103"/>
         </w:numPr>
         <w:pStyle w:val="Compact"/>
       </w:pPr>
@@ -9158,8 +9400,8 @@
         <w:t xml:space="preserve">Every new effect was captured frozen in time over a player in the studio.</w:t>
       </w:r>
     </w:p>
-    <w:bookmarkEnd w:id="76"/>
-    <w:bookmarkStart w:id="77" w:name="under-the-hood-quick-patch"/>
+    <w:bookmarkEnd w:id="77"/>
+    <w:bookmarkStart w:id="78" w:name="under-the-hood-quick-patch"/>
     <w:p>
       <w:pPr>
         <w:pStyle w:val="Heading2"/>
@@ -9172,7 +9414,7 @@
       <w:pPr>
         <w:numPr>
           <w:ilvl w:val="0"/>
-          <w:numId w:val="1103"/>
+          <w:numId w:val="1104"/>
         </w:numPr>
         <w:pStyle w:val="Compact"/>
       </w:pPr>
@@ -9187,14 +9429,26 @@
         <w:t xml:space="preserve"> </w:t>
       </w:r>
       <w:r>
-        <w:t xml:space="preserve">170 game tests and 40 service tests pass. The new ones cover non-shooter windows, smothered shots, the record scratch, repeat moves, diagonal moves, the straps being drawn, the apparel counts, dunk variety, the windmill and Eastbay paths, celebrations (input and clipping), reach-in contact, the AI staying in bounds, the D-pad fallback, Icon Legend, the green release counts and what each sound is made of, the AI’s reaction times, stamina and the line beside the grade.</w:t>
-      </w:r>
-    </w:p>
-    <w:p>
-      <w:pPr>
-        <w:numPr>
-          <w:ilvl w:val="0"/>
-          <w:numId w:val="1103"/>
+        <w:t xml:space="preserve">190 game tests and 43 service tests pass (the rule book:</w:t>
+      </w:r>
+      <w:r>
+        <w:t xml:space="preserve"> </w:t>
+      </w:r>
+      <w:r>
+        <w:rPr>
+          <w:rStyle w:val="VerbatimChar"/>
+        </w:rPr>
+        <w:t xml:space="preserve">tests/v0475qp10.test.mjs</w:t>
+      </w:r>
+      <w:r>
+        <w:t xml:space="preserve">, 7). The new ones cover non-shooter windows, smothered shots, the record scratch, repeat moves, diagonal moves, the straps being drawn, the apparel counts, dunk variety, the windmill and Eastbay paths, celebrations (input and clipping), reach-in contact, the AI staying in bounds, the D-pad fallback, Icon Legend, the green release counts and what each sound is made of, the AI’s reaction times, stamina and the line beside the grade.</w:t>
+      </w:r>
+    </w:p>
+    <w:p>
+      <w:pPr>
+        <w:numPr>
+          <w:ilvl w:val="0"/>
+          <w:numId w:val="1104"/>
         </w:numPr>
         <w:pStyle w:val="Compact"/>
       </w:pPr>
@@ -9210,7 +9464,7 @@
       <w:pPr>
         <w:numPr>
           <w:ilvl w:val="1"/>
-          <w:numId w:val="1104"/>
+          <w:numId w:val="1105"/>
         </w:numPr>
         <w:pStyle w:val="Compact"/>
       </w:pPr>
@@ -9234,7 +9488,7 @@
       <w:pPr>
         <w:numPr>
           <w:ilvl w:val="1"/>
-          <w:numId w:val="1104"/>
+          <w:numId w:val="1105"/>
         </w:numPr>
         <w:pStyle w:val="Compact"/>
       </w:pPr>
@@ -9258,7 +9512,7 @@
       <w:pPr>
         <w:numPr>
           <w:ilvl w:val="1"/>
-          <w:numId w:val="1104"/>
+          <w:numId w:val="1105"/>
         </w:numPr>
         <w:pStyle w:val="Compact"/>
       </w:pPr>
@@ -9270,7 +9524,7 @@
       <w:pPr>
         <w:numPr>
           <w:ilvl w:val="1"/>
-          <w:numId w:val="1104"/>
+          <w:numId w:val="1105"/>
         </w:numPr>
         <w:pStyle w:val="Compact"/>
       </w:pPr>
@@ -9282,7 +9536,7 @@
       <w:pPr>
         <w:numPr>
           <w:ilvl w:val="1"/>
-          <w:numId w:val="1104"/>
+          <w:numId w:val="1105"/>
         </w:numPr>
         <w:pStyle w:val="Compact"/>
       </w:pPr>
@@ -9306,7 +9560,7 @@
       <w:pPr>
         <w:numPr>
           <w:ilvl w:val="1"/>
-          <w:numId w:val="1104"/>
+          <w:numId w:val="1105"/>
         </w:numPr>
         <w:pStyle w:val="Compact"/>
       </w:pPr>
@@ -9330,7 +9584,7 @@
       <w:pPr>
         <w:numPr>
           <w:ilvl w:val="1"/>
-          <w:numId w:val="1104"/>
+          <w:numId w:val="1105"/>
         </w:numPr>
         <w:pStyle w:val="Compact"/>
       </w:pPr>
@@ -9354,7 +9608,7 @@
       <w:pPr>
         <w:numPr>
           <w:ilvl w:val="1"/>
-          <w:numId w:val="1104"/>
+          <w:numId w:val="1105"/>
         </w:numPr>
         <w:pStyle w:val="Compact"/>
       </w:pPr>
@@ -9400,7 +9654,7 @@
       <w:pPr>
         <w:numPr>
           <w:ilvl w:val="1"/>
-          <w:numId w:val="1104"/>
+          <w:numId w:val="1105"/>
         </w:numPr>
         <w:pStyle w:val="Compact"/>
       </w:pPr>
@@ -9412,7 +9666,7 @@
       <w:pPr>
         <w:numPr>
           <w:ilvl w:val="1"/>
-          <w:numId w:val="1104"/>
+          <w:numId w:val="1105"/>
         </w:numPr>
         <w:pStyle w:val="Compact"/>
       </w:pPr>
@@ -9457,7 +9711,7 @@
       <w:pPr>
         <w:numPr>
           <w:ilvl w:val="1"/>
-          <w:numId w:val="1104"/>
+          <w:numId w:val="1105"/>
         </w:numPr>
         <w:pStyle w:val="Compact"/>
       </w:pPr>
@@ -9497,7 +9751,7 @@
       <w:pPr>
         <w:numPr>
           <w:ilvl w:val="1"/>
-          <w:numId w:val="1104"/>
+          <w:numId w:val="1105"/>
         </w:numPr>
         <w:pStyle w:val="Compact"/>
       </w:pPr>
@@ -9527,7 +9781,7 @@
       <w:pPr>
         <w:numPr>
           <w:ilvl w:val="1"/>
-          <w:numId w:val="1104"/>
+          <w:numId w:val="1105"/>
         </w:numPr>
         <w:pStyle w:val="Compact"/>
       </w:pPr>
@@ -9535,8 +9789,8 @@
         <w:t xml:space="preserve">The faster AI reactions apply to every AI player: teammates, opponents and your own player on auto-play.</w:t>
       </w:r>
     </w:p>
-    <w:bookmarkEnd w:id="77"/>
     <w:bookmarkEnd w:id="78"/>
+    <w:bookmarkEnd w:id="79"/>
     <w:sectPr/>
   </w:body>
 </w:document>
@@ -10032,6 +10286,9 @@
     <w:abstractNumId w:val="991"/>
   </w:num>
   <w:num w:numId="1104">
+    <w:abstractNumId w:val="991"/>
+  </w:num>
+  <w:num w:numId="1105">
     <w:abstractNumId w:val="991"/>
   </w:num>
 </w:numbering>

</xml_diff>

<commit_message>
Server Performance + AI Squads and Difficulty UPD
</commit_message>
<xml_diff>
--- a/PATCH_NOTES_v0.4.7.5.docx
+++ b/PATCH_NOTES_v0.4.7.5.docx
@@ -3526,7 +3526,7 @@
     </w:p>
     <w:bookmarkEnd w:id="41"/>
     <w:bookmarkEnd w:id="42"/>
-    <w:bookmarkStart w:id="86" w:name="quick-patch"/>
+    <w:bookmarkStart w:id="87" w:name="quick-patch"/>
     <w:p>
       <w:pPr>
         <w:pStyle w:val="Heading1"/>
@@ -11071,6 +11071,28 @@
           <w:bCs/>
           <w:b/>
         </w:rPr>
+        <w:t xml:space="preserve">AI squad mates in the online squad:</w:t>
+      </w:r>
+      <w:r>
+        <w:t xml:space="preserve"> </w:t>
+      </w:r>
+      <w:r>
+        <w:t xml:space="preserve">the AI friends each player has in his own squad come with him: everyone at the park sees them walking with him (and lined up on his squad’s Got Next spot), the squad lists them with him, and they play for the squad, on its Got Next line after the real players and before any park-goers, and on its Pro-Am team. They play with their own IQ (AI in online games used to play with a default one), and they’re off the park on their owner’s screen until the game is over.</w:t>
+      </w:r>
+    </w:p>
+    <w:p>
+      <w:pPr>
+        <w:numPr>
+          <w:ilvl w:val="0"/>
+          <w:numId w:val="1111"/>
+        </w:numPr>
+        <w:pStyle w:val="Compact"/>
+      </w:pPr>
+      <w:r>
+        <w:rPr>
+          <w:bCs/>
+          <w:b/>
+        </w:rPr>
         <w:t xml:space="preserve">Got Next with real squads:</w:t>
       </w:r>
       <w:r>
@@ -11984,13 +12006,13 @@
       </w:r>
     </w:p>
     <w:bookmarkEnd w:id="84"/>
-    <w:bookmarkStart w:id="85" w:name="under-the-hood-quick-patch"/>
+    <w:bookmarkStart w:id="85" w:name="online-performance-oct-12"/>
     <w:p>
       <w:pPr>
         <w:pStyle w:val="Heading2"/>
       </w:pPr>
       <w:r>
-        <w:t xml:space="preserve">Under the hood (quick patch)</w:t>
+        <w:t xml:space="preserve">Online performance (Oct 12)</w:t>
       </w:r>
     </w:p>
     <w:p>
@@ -12006,98 +12028,26 @@
           <w:bCs/>
           <w:b/>
         </w:rPr>
-        <w:t xml:space="preserve">Tests:</w:t>
-      </w:r>
-      <w:r>
-        <w:t xml:space="preserve"> </w:t>
-      </w:r>
-      <w:r>
-        <w:t xml:space="preserve">217 game tests and 66 service tests pass (the rule book:</w:t>
-      </w:r>
-      <w:r>
-        <w:t xml:space="preserve"> </w:t>
-      </w:r>
-      <w:r>
-        <w:rPr>
-          <w:rStyle w:val="VerbatimChar"/>
-        </w:rPr>
-        <w:t xml:space="preserve">tests/v0475qp10.test.mjs</w:t>
-      </w:r>
-      <w:r>
-        <w:t xml:space="preserve">, 7; the Jungle Ballers:</w:t>
-      </w:r>
-      <w:r>
-        <w:t xml:space="preserve"> </w:t>
-      </w:r>
-      <w:r>
-        <w:rPr>
-          <w:rStyle w:val="VerbatimChar"/>
-        </w:rPr>
-        <w:t xml:space="preserve">tests/v0475qp11.test.mjs</w:t>
-      </w:r>
-      <w:r>
-        <w:t xml:space="preserve">, 7, and two service tests for the schedule and the Jungle’s ante-ups and prizes; post moves, the Event Park hall, volume, wide-open layups, online lockstep and the own-copy socket:</w:t>
-      </w:r>
-      <w:r>
-        <w:t xml:space="preserve"> </w:t>
-      </w:r>
-      <w:r>
-        <w:rPr>
-          <w:rStyle w:val="VerbatimChar"/>
-        </w:rPr>
-        <w:t xml:space="preserve">tests/v0475qp12.test.mjs</w:t>
-      </w:r>
-      <w:r>
-        <w:t xml:space="preserve">, 14; online friends, the join code, the park’s people, squads, claims, kings, watching, Pro-Am challenges, online crews, own-copy sign-in, links and the build fingerprint:</w:t>
-      </w:r>
-      <w:r>
-        <w:t xml:space="preserve"> </w:t>
-      </w:r>
-      <w:r>
-        <w:rPr>
-          <w:rStyle w:val="VerbatimChar"/>
-        </w:rPr>
-        <w:t xml:space="preserve">tests/test_online.py</w:t>
-      </w:r>
-      <w:r>
-        <w:t xml:space="preserve">, 9; the online park, squads, setups, watching and crew XP:</w:t>
-      </w:r>
-      <w:r>
-        <w:t xml:space="preserve"> </w:t>
-      </w:r>
-      <w:r>
-        <w:rPr>
-          <w:rStyle w:val="VerbatimChar"/>
-        </w:rPr>
-        <w:t xml:space="preserve">tests/v0475qp13.test.mjs</w:t>
-      </w:r>
-      <w:r>
-        <w:t xml:space="preserve">, 5; the router opening the port, against a fake router:</w:t>
-      </w:r>
-      <w:r>
-        <w:t xml:space="preserve"> </w:t>
-      </w:r>
-      <w:r>
-        <w:rPr>
-          <w:rStyle w:val="VerbatimChar"/>
-        </w:rPr>
-        <w:t xml:space="preserve">tests/test_upnp.py</w:t>
-      </w:r>
-      <w:r>
-        <w:t xml:space="preserve">, 7). Online play was also run end to end in three browsers on one hosted service: a squad of two calling Got Next on a 2v2 court while the third watched their game from the sideline (the watcher’s game matched the players’ at every check), the squad holding the court, the third calling next on it and the squad’s leader running it back against him (three people in one game); the squad playing Pro-Am together, then a Pro-Am challenge squad against squad; a crew brought online with two friends, a crew run against each other in the HQ with the third walking in late to watch, and a member’s crew XP landing in the founder’s save; a game on your own with someone walking in (the court shown in use with its score, then handed back), and the squad following its leader to another park. Then from</w:t>
-      </w:r>
-      <w:r>
-        <w:t xml:space="preserve"> </w:t>
-      </w:r>
-      <w:r>
-        <w:rPr>
-          <w:bCs/>
-          <w:b/>
-        </w:rPr>
-        <w:t xml:space="preserve">two separate games and saves</w:t>
-      </w:r>
-      <w:r>
-        <w:t xml:space="preserve">: the friend’s own game linked to the host’s, made his online account, played a 2v2 against the host with his own build, and the result went into his own save (the host’s save has no players or games for him); his game reconnected by itself after a restart, and a copy with one changed file was turned away with both versions shown. The two screens’ state checks matched every time. The new ones cover non-shooter windows, smothered shots, the record scratch, repeat moves, diagonal moves, the straps being drawn, the apparel counts, dunk variety, the windmill and Eastbay paths, celebrations (input and clipping), reach-in contact, the AI staying in bounds, the D-pad fallback, Icon Legend, the green release counts and what each sound is made of, the AI’s reaction times, stamina and the line beside the grade.</w:t>
+        <w:t xml:space="preserve">A tenth of the traffic:</w:t>
+      </w:r>
+      <w:r>
+        <w:t xml:space="preserve"> </w:t>
+      </w:r>
+      <w:r>
+        <w:t xml:space="preserve">a player’s input used to go out whole (about 200 bytes) for every 1/70 s tick. Now it goes out as only what changed since the tick before (the stick rounded to 1/1000, which nobody can feel; nothing at all when nothing changed), with a frame’s ticks in one message. Measured on a 10-player game with 10 people watching: the service sends</w:t>
+      </w:r>
+      <w:r>
+        <w:t xml:space="preserve"> </w:t>
+      </w:r>
+      <w:r>
+        <w:rPr>
+          <w:bCs/>
+          <w:b/>
+        </w:rPr>
+        <w:t xml:space="preserve">324 KB/s instead of 3.3 MB/s</w:t>
+      </w:r>
+      <w:r>
+        <w:t xml:space="preserve">, a player downloads 23 KB/s instead of 155, a watcher 9 KB/s in 11 messages a second instead of 172 KB/s in 600.</w:t>
       </w:r>
     </w:p>
     <w:p>
@@ -12113,181 +12063,296 @@
           <w:bCs/>
           <w:b/>
         </w:rPr>
-        <w:t xml:space="preserve">Judgment calls I made without asking:</w:t>
-      </w:r>
-    </w:p>
-    <w:p>
-      <w:pPr>
-        <w:numPr>
-          <w:ilvl w:val="1"/>
-          <w:numId w:val="1114"/>
-        </w:numPr>
-        <w:pStyle w:val="Compact"/>
-      </w:pPr>
-      <w:r>
-        <w:t xml:space="preserve">“</w:t>
-      </w:r>
-      <w:r>
-        <w:t xml:space="preserve">Shooters</w:t>
-      </w:r>
-      <w:r>
-        <w:t xml:space="preserve">”</w:t>
-      </w:r>
-      <w:r>
-        <w:t xml:space="preserve"> </w:t>
-      </w:r>
-      <w:r>
-        <w:t xml:space="preserve">are Sharpshooters and Stretch Bigs. The 10% smaller window for non-shooters applies to jump shots only, not layups or free throws.</w:t>
-      </w:r>
-    </w:p>
-    <w:p>
-      <w:pPr>
-        <w:numPr>
-          <w:ilvl w:val="1"/>
-          <w:numId w:val="1114"/>
-        </w:numPr>
-        <w:pStyle w:val="Compact"/>
-      </w:pPr>
-      <w:r>
-        <w:t xml:space="preserve">“</w:t>
-      </w:r>
-      <w:r>
-        <w:t xml:space="preserve">Career mode games</w:t>
-      </w:r>
-      <w:r>
-        <w:t xml:space="preserve">”</w:t>
-      </w:r>
-      <w:r>
-        <w:t xml:space="preserve"> </w:t>
-      </w:r>
-      <w:r>
-        <w:t xml:space="preserve">for Icon Legend are Pro Run games, the same as the 80 → 90 climb.</w:t>
-      </w:r>
-    </w:p>
-    <w:p>
-      <w:pPr>
-        <w:numPr>
-          <w:ilvl w:val="1"/>
-          <w:numId w:val="1114"/>
-        </w:numPr>
-        <w:pStyle w:val="Compact"/>
-      </w:pPr>
-      <w:r>
-        <w:t xml:space="preserve">The smothered rule applies to every shot that can be labelled Smothered: jumpers, close shots and layups. Dunks are left to Posterizer and Contact Finisher.</w:t>
-      </w:r>
-    </w:p>
-    <w:p>
-      <w:pPr>
-        <w:numPr>
-          <w:ilvl w:val="1"/>
-          <w:numId w:val="1114"/>
-        </w:numPr>
-        <w:pStyle w:val="Compact"/>
-      </w:pPr>
-      <w:r>
-        <w:t xml:space="preserve">The record scratch also plays for the AI’s green sounds near you.</w:t>
-      </w:r>
-    </w:p>
-    <w:p>
-      <w:pPr>
-        <w:numPr>
-          <w:ilvl w:val="1"/>
-          <w:numId w:val="1114"/>
-        </w:numPr>
-        <w:pStyle w:val="Compact"/>
-      </w:pPr>
-      <w:r>
-        <w:t xml:space="preserve">“</w:t>
-      </w:r>
-      <w:r>
-        <w:t xml:space="preserve">Double apparel</w:t>
-      </w:r>
-      <w:r>
-        <w:t xml:space="preserve">”</w:t>
-      </w:r>
-      <w:r>
-        <w:t xml:space="preserve"> </w:t>
-      </w:r>
-      <w:r>
-        <w:t xml:space="preserve">covers clothing, shoes and accessories (everything you wear); King Tut Cup prizes weren’t doubled.</w:t>
-      </w:r>
-    </w:p>
-    <w:p>
-      <w:pPr>
-        <w:numPr>
-          <w:ilvl w:val="1"/>
-          <w:numId w:val="1114"/>
-        </w:numPr>
-        <w:pStyle w:val="Compact"/>
-      </w:pPr>
-      <w:r>
-        <w:t xml:space="preserve">“</w:t>
-      </w:r>
-      <w:r>
-        <w:t xml:space="preserve">Double the green animations and sounds</w:t>
-      </w:r>
-      <w:r>
-        <w:t xml:space="preserve">”</w:t>
-      </w:r>
-      <w:r>
-        <w:t xml:space="preserve"> </w:t>
-      </w:r>
-      <w:r>
-        <w:t xml:space="preserve">means twice as many of each, counting the King Tut Cup’s (16 → 32 sounds, 14 → 28 effects). The Cup prizes themselves weren’t doubled.</w:t>
-      </w:r>
-    </w:p>
-    <w:p>
-      <w:pPr>
-        <w:numPr>
-          <w:ilvl w:val="1"/>
-          <w:numId w:val="1114"/>
-        </w:numPr>
-        <w:pStyle w:val="Compact"/>
-      </w:pPr>
-      <w:r>
-        <w:t xml:space="preserve">“</w:t>
-      </w:r>
-      <w:r>
-        <w:t xml:space="preserve">Walking without sprint</w:t>
-      </w:r>
-      <w:r>
-        <w:t xml:space="preserve">”</w:t>
-      </w:r>
-      <w:r>
-        <w:t xml:space="preserve"> </w:t>
-      </w:r>
-      <w:r>
-        <w:t xml:space="preserve">means any movement without the sprint button. Defensive slides still cost a little; since stamina part 3, hands-up defense on the floor is neutral.</w:t>
-      </w:r>
-    </w:p>
-    <w:p>
-      <w:pPr>
-        <w:numPr>
-          <w:ilvl w:val="1"/>
-          <w:numId w:val="1114"/>
-        </w:numPr>
-        <w:pStyle w:val="Compact"/>
-      </w:pPr>
-      <w:r>
-        <w:t xml:space="preserve">Stamina part 3:</w:t>
-      </w:r>
-      <w:r>
-        <w:t xml:space="preserve"> </w:t>
-      </w:r>
-      <w:r>
-        <w:t xml:space="preserve">“</w:t>
-      </w:r>
-      <w:r>
-        <w:t xml:space="preserve">very minimally positive</w:t>
-      </w:r>
-      <w:r>
-        <w:t xml:space="preserve">”</w:t>
-      </w:r>
-      <w:r>
-        <w:t xml:space="preserve"> </w:t>
-      </w:r>
-      <w:r>
-        <w:t xml:space="preserve">for walking and jogging is a tenth of the old resting rate (so about a thirtieth of the new one). Hands up while</w:t>
+        <w:t xml:space="preserve">Watchers get bundles:</w:t>
+      </w:r>
+      <w:r>
+        <w:t xml:space="preserve"> </w:t>
+      </w:r>
+      <w:r>
+        <w:t xml:space="preserve">the people watching from the sideline get everyone’s inputs ten times a second and play a fifth of a second behind, speeding up or easing off a touch to stay there, so their game runs steadily instead of stopping and starting with every late input.</w:t>
+      </w:r>
+    </w:p>
+    <w:p>
+      <w:pPr>
+        <w:numPr>
+          <w:ilvl w:val="0"/>
+          <w:numId w:val="1113"/>
+        </w:numPr>
+        <w:pStyle w:val="Compact"/>
+      </w:pPr>
+      <w:r>
+        <w:rPr>
+          <w:bCs/>
+          <w:b/>
+        </w:rPr>
+        <w:t xml:space="preserve">No more chain reactions:</w:t>
+      </w:r>
+      <w:r>
+        <w:t xml:space="preserve"> </w:t>
+      </w:r>
+      <w:r>
+        <w:t xml:space="preserve">your inputs keep going out on time while your game waits on someone else’s (a game used to stop sending while it waited, so one late input made everybody else late in turn), and after a wait the game catches up over a few frames instead of in one jump. In a simulation of four players with one on shaky Wi-Fi (90 ms, ±35 ms, the odd spike), the frames that had to wait for an input went from</w:t>
+      </w:r>
+      <w:r>
+        <w:t xml:space="preserve"> </w:t>
+      </w:r>
+      <w:r>
+        <w:rPr>
+          <w:bCs/>
+          <w:b/>
+        </w:rPr>
+        <w:t xml:space="preserve">48% to 3–10%</w:t>
+      </w:r>
+      <w:r>
+        <w:t xml:space="preserve">, and the game ran at full speed instead of 97% of it; with one laptop at 30 fps at the Jungle, from</w:t>
+      </w:r>
+      <w:r>
+        <w:t xml:space="preserve"> </w:t>
+      </w:r>
+      <w:r>
+        <w:rPr>
+          <w:bCs/>
+          <w:b/>
+        </w:rPr>
+        <w:t xml:space="preserve">6–17% to 2–3%</w:t>
+      </w:r>
+      <w:r>
+        <w:t xml:space="preserve">.</w:t>
+      </w:r>
+    </w:p>
+    <w:p>
+      <w:pPr>
+        <w:numPr>
+          <w:ilvl w:val="0"/>
+          <w:numId w:val="1113"/>
+        </w:numPr>
+        <w:pStyle w:val="Compact"/>
+      </w:pPr>
+      <w:r>
+        <w:rPr>
+          <w:bCs/>
+          <w:b/>
+        </w:rPr>
+        <w:t xml:space="preserve">Slow PCs and slow connections send further ahead by themselves:</w:t>
+      </w:r>
+      <w:r>
+        <w:t xml:space="preserve"> </w:t>
+      </w:r>
+      <w:r>
+        <w:t xml:space="preserve">a PC whose frames run slow sends its input a tick or more further ahead, so the others don’t wait on its frames; and every screen tells the others, with its state check every 2 s, how long it waited on each of them, so a player whose inputs keep arriving late (his Wi-Fi, or yours) sends them further ahead too, until nobody’s waiting on him. It comes back down by itself (on good connections it stays at nothing extra). The extra goes with the input, so</w:t>
+      </w:r>
+      <w:r>
+        <w:t xml:space="preserve"> </w:t>
+      </w:r>
+      <w:r>
+        <w:rPr>
+          <w:bCs/>
+          <w:b/>
+        </w:rPr>
+        <w:t xml:space="preserve">the green window still counts from the moment you let go on your screen</w:t>
+      </w:r>
+      <w:r>
+        <w:t xml:space="preserve">.</w:t>
+      </w:r>
+    </w:p>
+    <w:p>
+      <w:pPr>
+        <w:numPr>
+          <w:ilvl w:val="0"/>
+          <w:numId w:val="1113"/>
+        </w:numPr>
+        <w:pStyle w:val="Compact"/>
+      </w:pPr>
+      <w:r>
+        <w:rPr>
+          <w:bCs/>
+          <w:b/>
+        </w:rPr>
+        <w:t xml:space="preserve">The service never waits on one connection:</w:t>
+      </w:r>
+      <w:r>
+        <w:t xml:space="preserve"> </w:t>
+      </w:r>
+      <w:r>
+        <w:t xml:space="preserve">every player’s connection has its own queue, written by its own thread, many messages in one go. Before, one connection that stopped taking data (a phone that lost its Wi-Fi, a frozen tab) could freeze</w:t>
+      </w:r>
+      <w:r>
+        <w:t xml:space="preserve"> </w:t>
+      </w:r>
+      <w:r>
+        <w:rPr>
+          <w:bCs/>
+          <w:b/>
+        </w:rPr>
+        <w:t xml:space="preserve">every</w:t>
+      </w:r>
+      <w:r>
+        <w:t xml:space="preserve"> </w:t>
+      </w:r>
+      <w:r>
+        <w:t xml:space="preserve">game on the server once its buffer filled; in the load test, two such watchers stopped the game for everyone. Now the others don’t notice, and a connection that’s 10 seconds or 8 MB behind is cut off and his player handed to the AI. Every message is encoded once for all its readers, the WebSocket frames are unmasked a whole number at a time instead of a byte at a time, and a change in someone’s round trip goes out as one small message instead of everyone’s friends lists. In the load test the service’s CPU</w:t>
+      </w:r>
+      <w:r>
+        <w:t xml:space="preserve"> </w:t>
+      </w:r>
+      <w:r>
+        <w:rPr>
+          <w:bCs/>
+          <w:b/>
+        </w:rPr>
+        <w:t xml:space="preserve">halved (31% → 17% of a core)</w:t>
+      </w:r>
+      <w:r>
+        <w:t xml:space="preserve"> </w:t>
+      </w:r>
+      <w:r>
+        <w:t xml:space="preserve">and an input reaches the other players in</w:t>
+      </w:r>
+      <w:r>
+        <w:t xml:space="preserve"> </w:t>
+      </w:r>
+      <w:r>
+        <w:rPr>
+          <w:bCs/>
+          <w:b/>
+        </w:rPr>
+        <w:t xml:space="preserve">2.4 ms instead of 5.9</w:t>
+      </w:r>
+      <w:r>
+        <w:t xml:space="preserve"> </w:t>
+      </w:r>
+      <w:r>
+        <w:t xml:space="preserve">(worst 7 ms instead of 17) on the server itself.</w:t>
+      </w:r>
+    </w:p>
+    <w:p>
+      <w:pPr>
+        <w:numPr>
+          <w:ilvl w:val="0"/>
+          <w:numId w:val="1113"/>
+        </w:numPr>
+        <w:pStyle w:val="Compact"/>
+      </w:pPr>
+      <w:r>
+        <w:rPr>
+          <w:bCs/>
+          <w:b/>
+        </w:rPr>
+        <w:t xml:space="preserve">The game’s files:</w:t>
+      </w:r>
+      <w:r>
+        <w:t xml:space="preserve"> </w:t>
+      </w:r>
+      <w:r>
+        <w:t xml:space="preserve">the service keeps them in memory and sends them gzipped (session.js: 100 KB → 25 KB), so a friend loading the game from a home PC’s upload gets it about four times faster.</w:t>
+      </w:r>
+    </w:p>
+    <w:p>
+      <w:pPr>
+        <w:numPr>
+          <w:ilvl w:val="0"/>
+          <w:numId w:val="1113"/>
+        </w:numPr>
+        <w:pStyle w:val="Compact"/>
+      </w:pPr>
+      <w:r>
+        <w:rPr>
+          <w:bCs/>
+          <w:b/>
+        </w:rPr>
+        <w:t xml:space="preserve">Lighter frames at the park (the Jungle most of all):</w:t>
+      </w:r>
+      <w:r>
+        <w:t xml:space="preserve"> </w:t>
+      </w:r>
+      <w:r>
+        <w:t xml:space="preserve">a park is sixty-odd people, and posing them was the biggest thing your PC did each frame. Now only the people the camera can see are posed (the ones past the far-model distance every other frame, moved every frame), the hoops of courts you can’t see are left alone, and while you play, the AI games on courts you can’t see barely move (they fast-forwarded before). Measured on the park’s CPU work per frame:</w:t>
+      </w:r>
+      <w:r>
+        <w:t xml:space="preserve"> </w:t>
+      </w:r>
+      <w:r>
+        <w:rPr>
+          <w:bCs/>
+          <w:b/>
+        </w:rPr>
+        <w:t xml:space="preserve">14.3 → 5.3 ms</w:t>
+      </w:r>
+      <w:r>
+        <w:t xml:space="preserve"> </w:t>
+      </w:r>
+      <w:r>
+        <w:t xml:space="preserve">walking around Harbor Point,</w:t>
+      </w:r>
+      <w:r>
+        <w:t xml:space="preserve"> </w:t>
+      </w:r>
+      <w:r>
+        <w:rPr>
+          <w:bCs/>
+          <w:b/>
+        </w:rPr>
+        <w:t xml:space="preserve">7.8 → 4.5 ms</w:t>
+      </w:r>
+      <w:r>
+        <w:t xml:space="preserve"> </w:t>
+      </w:r>
+      <w:r>
+        <w:t xml:space="preserve">in a game there, about the same at the Jungle.</w:t>
+      </w:r>
+    </w:p>
+    <w:p>
+      <w:pPr>
+        <w:numPr>
+          <w:ilvl w:val="0"/>
+          <w:numId w:val="1113"/>
+        </w:numPr>
+        <w:pStyle w:val="Compact"/>
+      </w:pPr>
+      <w:r>
+        <w:rPr>
+          <w:bCs/>
+          <w:b/>
+        </w:rPr>
+        <w:t xml:space="preserve">Far models:</w:t>
+      </w:r>
+      <w:r>
+        <w:t xml:space="preserve"> </w:t>
+      </w:r>
+      <w:r>
+        <w:t xml:space="preserve">people past 14 m (Balanced; 10 / 18 / 26 m on Performance / High / Ultra) are drawn with a far model: a third of the triangles or less, the same textures and bones, no eyes (side by side at 8–10 m nobody could tell them apart). The other players in your own game switch half as far again out. Every park athlete used to be 40–70 thousand triangles, drawn twice (with the shadows).</w:t>
+      </w:r>
+    </w:p>
+    <w:p>
+      <w:pPr>
+        <w:numPr>
+          <w:ilvl w:val="0"/>
+          <w:numId w:val="1113"/>
+        </w:numPr>
+        <w:pStyle w:val="Compact"/>
+      </w:pPr>
+      <w:r>
+        <w:rPr>
+          <w:bCs/>
+          <w:b/>
+        </w:rPr>
+        <w:t xml:space="preserve">Online games keep their frame rate:</w:t>
+      </w:r>
+      <w:r>
+        <w:t xml:space="preserve"> </w:t>
+      </w:r>
+      <w:r>
+        <w:t xml:space="preserve">when your frames run slow in an online game (the slowest one in ten over a second past 22 ms), the far models come in closer and then the picture renders at a lower resolution, a step a second (down to 60% of your preset), and goes back up once your frames are quick again. The first step down says so in the feed.</w:t>
+      </w:r>
+      <w:r>
+        <w:t xml:space="preserve"> </w:t>
+      </w:r>
+      <w:r>
+        <w:rPr>
+          <w:bCs/>
+          <w:b/>
+        </w:rPr>
+        <w:t xml:space="preserve">Settings → Online games:</w:t>
       </w:r>
       <w:r>
         <w:t xml:space="preserve"> </w:t>
@@ -12297,94 +12362,13 @@
           <w:iCs/>
           <w:i/>
         </w:rPr>
-        <w:t xml:space="preserve">sliding</w:t>
-      </w:r>
-      <w:r>
-        <w:t xml:space="preserve"> </w:t>
-      </w:r>
-      <w:r>
-        <w:t xml:space="preserve">still costs the slide; only hands up with the feet planted is neutral.</w:t>
-      </w:r>
-    </w:p>
-    <w:p>
-      <w:pPr>
-        <w:numPr>
-          <w:ilvl w:val="1"/>
-          <w:numId w:val="1114"/>
-        </w:numPr>
-        <w:pStyle w:val="Compact"/>
-      </w:pPr>
-      <w:r>
-        <w:t xml:space="preserve">The alley-oop press: the four face buttons are read raw (whatever your context) only while a lob to you is in the air, and that press is used for nothing else, so the shoot button can’t also jump you. The window opens a quarter of the way to the takeoff and closes 0.05 s after it. A mistimed one is 0.22 s late at 40% of the height.</w:t>
-      </w:r>
-    </w:p>
-    <w:p>
-      <w:pPr>
-        <w:numPr>
-          <w:ilvl w:val="1"/>
-          <w:numId w:val="1114"/>
-        </w:numPr>
-        <w:pStyle w:val="Compact"/>
-      </w:pPr>
-      <w:r>
-        <w:t xml:space="preserve">The bad step is drawn at</w:t>
-      </w:r>
-      <w:r>
-        <w:t xml:space="preserve"> </w:t>
-      </w:r>
-      <w:r>
-        <w:rPr>
-          <w:rStyle w:val="VerbatimChar"/>
-        </w:rPr>
-        <w:t xml:space="preserve">MISTAKE.rate</w:t>
-      </w:r>
-      <w:r>
-        <w:t xml:space="preserve"> </w:t>
-      </w:r>
-      <w:r>
-        <w:t xml:space="preserve">× (1.3 − skill) per second while the man moves faster than 2 m/s;</w:t>
-      </w:r>
-      <w:r>
-        <w:t xml:space="preserve"> </w:t>
-      </w:r>
-      <w:r>
-        <w:t xml:space="preserve">“</w:t>
-      </w:r>
-      <w:r>
-        <w:t xml:space="preserve">2.75% more escapes</w:t>
-      </w:r>
-      <w:r>
-        <w:t xml:space="preserve">”</w:t>
-      </w:r>
-      <w:r>
-        <w:t xml:space="preserve"> </w:t>
-      </w:r>
-      <w:r>
-        <w:t xml:space="preserve">is relative (7.35% → ~7.55% of guarded dribbling spells end with the handler two metres clear within 1.2 s, in AI park games).</w:t>
-      </w:r>
-    </w:p>
-    <w:p>
-      <w:pPr>
-        <w:numPr>
-          <w:ilvl w:val="1"/>
-          <w:numId w:val="1114"/>
-        </w:numPr>
-        <w:pStyle w:val="Compact"/>
-      </w:pPr>
-      <w:r>
-        <w:t xml:space="preserve">“</w:t>
-      </w:r>
-      <w:r>
-        <w:t xml:space="preserve">True to scale</w:t>
-      </w:r>
-      <w:r>
-        <w:t xml:space="preserve">”</w:t>
-      </w:r>
-      <w:r>
-        <w:t xml:space="preserve"> </w:t>
-      </w:r>
-      <w:r>
-        <w:t xml:space="preserve">was taken to mean the model’s standing height and wingspan; the standing</w:t>
+        <w:t xml:space="preserve">Keep them smooth</w:t>
+      </w:r>
+      <w:r>
+        <w:t xml:space="preserve"> </w:t>
+      </w:r>
+      <w:r>
+        <w:t xml:space="preserve">(the default) or</w:t>
       </w:r>
       <w:r>
         <w:t xml:space="preserve"> </w:t>
@@ -12394,6 +12378,999 @@
           <w:iCs/>
           <w:i/>
         </w:rPr>
+        <w:t xml:space="preserve">Full graphics</w:t>
+      </w:r>
+      <w:r>
+        <w:t xml:space="preserve">.</w:t>
+      </w:r>
+    </w:p>
+    <w:p>
+      <w:pPr>
+        <w:numPr>
+          <w:ilvl w:val="0"/>
+          <w:numId w:val="1113"/>
+        </w:numPr>
+        <w:pStyle w:val="Compact"/>
+      </w:pPr>
+      <w:r>
+        <w:rPr>
+          <w:bCs/>
+          <w:b/>
+        </w:rPr>
+        <w:t xml:space="preserve">Your own server:</w:t>
+      </w:r>
+      <w:r>
+        <w:t xml:space="preserve"> </w:t>
+      </w:r>
+      <w:r>
+        <w:t xml:space="preserve">the game service runs first in line for the CPU and the disk (the nightly backup and the updates go last), with room for plenty of connections, and with network settings for many small messages that can’t wait (fq and BBR, no slow restart after a quiet moment, little unsent data held per connection, TCP Fast Open). The service applies them each time it starts, so a server you set up before gets them with its next update by itself.</w:t>
+      </w:r>
+    </w:p>
+    <w:p>
+      <w:pPr>
+        <w:numPr>
+          <w:ilvl w:val="0"/>
+          <w:numId w:val="1113"/>
+        </w:numPr>
+        <w:pStyle w:val="Compact"/>
+      </w:pPr>
+      <w:r>
+        <w:rPr>
+          <w:bCs/>
+          <w:b/>
+        </w:rPr>
+        <w:t xml:space="preserve">Under the hood:</w:t>
+      </w:r>
+      <w:r>
+        <w:t xml:space="preserve"> </w:t>
+      </w:r>
+      <w:r>
+        <w:rPr>
+          <w:rStyle w:val="VerbatimChar"/>
+        </w:rPr>
+        <w:t xml:space="preserve">client/js/sim/wire.js</w:t>
+      </w:r>
+      <w:r>
+        <w:t xml:space="preserve"> </w:t>
+      </w:r>
+      <w:r>
+        <w:t xml:space="preserve">(normIntent, intentDelta, applyDelta, takeInputs),</w:t>
+      </w:r>
+      <w:r>
+        <w:t xml:space="preserve"> </w:t>
+      </w:r>
+      <w:r>
+        <w:rPr>
+          <w:rStyle w:val="VerbatimChar"/>
+        </w:rPr>
+        <w:t xml:space="preserve">game/session.js</w:t>
+      </w:r>
+      <w:r>
+        <w:t xml:space="preserve"> </w:t>
+      </w:r>
+      <w:r>
+        <w:t xml:space="preserve">(sendOnline, paceOnline, lateReport, calmOnline, takeInputs, the watchers’ pace),</w:t>
+      </w:r>
+      <w:r>
+        <w:t xml:space="preserve"> </w:t>
+      </w:r>
+      <w:r>
+        <w:rPr>
+          <w:rStyle w:val="VerbatimChar"/>
+        </w:rPr>
+        <w:t xml:space="preserve">sim/game.js</w:t>
+      </w:r>
+      <w:r>
+        <w:t xml:space="preserve"> </w:t>
+      </w:r>
+      <w:r>
+        <w:t xml:space="preserve">(</w:t>
+      </w:r>
+      <w:r>
+        <w:rPr>
+          <w:rStyle w:val="VerbatimChar"/>
+        </w:rPr>
+        <w:t xml:space="preserve">lagOf</w:t>
+      </w:r>
+      <w:r>
+        <w:t xml:space="preserve">: the game’s delay plus the input’s</w:t>
+      </w:r>
+      <w:r>
+        <w:t xml:space="preserve"> </w:t>
+      </w:r>
+      <w:r>
+        <w:rPr>
+          <w:rStyle w:val="VerbatimChar"/>
+        </w:rPr>
+        <w:t xml:space="preserve">dl</w:t>
+      </w:r>
+      <w:r>
+        <w:t xml:space="preserve">),</w:t>
+      </w:r>
+      <w:r>
+        <w:t xml:space="preserve"> </w:t>
+      </w:r>
+      <w:r>
+        <w:rPr>
+          <w:rStyle w:val="VerbatimChar"/>
+        </w:rPr>
+        <w:t xml:space="preserve">core/netplay.js</w:t>
+      </w:r>
+      <w:r>
+        <w:t xml:space="preserve"> </w:t>
+      </w:r>
+      <w:r>
+        <w:t xml:space="preserve">(</w:t>
+      </w:r>
+      <w:r>
+        <w:rPr>
+          <w:rStyle w:val="VerbatimChar"/>
+        </w:rPr>
+        <w:t xml:space="preserve">inw</w:t>
+      </w:r>
+      <w:r>
+        <w:t xml:space="preserve">,</w:t>
+      </w:r>
+      <w:r>
+        <w:t xml:space="preserve"> </w:t>
+      </w:r>
+      <w:r>
+        <w:rPr>
+          <w:rStyle w:val="VerbatimChar"/>
+        </w:rPr>
+        <w:t xml:space="preserve">rtt</w:t>
+      </w:r>
+      <w:r>
+        <w:t xml:space="preserve">),</w:t>
+      </w:r>
+      <w:r>
+        <w:t xml:space="preserve"> </w:t>
+      </w:r>
+      <w:r>
+        <w:rPr>
+          <w:rStyle w:val="VerbatimChar"/>
+        </w:rPr>
+        <w:t xml:space="preserve">server/online.py</w:t>
+      </w:r>
+      <w:r>
+        <w:t xml:space="preserve"> </w:t>
+      </w:r>
+      <w:r>
+        <w:t xml:space="preserve">(per-socket writer threads,</w:t>
+      </w:r>
+      <w:r>
+        <w:t xml:space="preserve"> </w:t>
+      </w:r>
+      <w:r>
+        <w:rPr>
+          <w:rStyle w:val="VerbatimChar"/>
+        </w:rPr>
+        <w:t xml:space="preserve">send_frame</w:t>
+      </w:r>
+      <w:r>
+        <w:t xml:space="preserve">,</w:t>
+      </w:r>
+      <w:r>
+        <w:t xml:space="preserve"> </w:t>
+      </w:r>
+      <w:r>
+        <w:rPr>
+          <w:rStyle w:val="VerbatimChar"/>
+        </w:rPr>
+        <w:t xml:space="preserve">encode</w:t>
+      </w:r>
+      <w:r>
+        <w:t xml:space="preserve">,</w:t>
+      </w:r>
+      <w:r>
+        <w:t xml:space="preserve"> </w:t>
+      </w:r>
+      <w:r>
+        <w:rPr>
+          <w:rStyle w:val="VerbatimChar"/>
+        </w:rPr>
+        <w:t xml:space="preserve">unmask</w:t>
+      </w:r>
+      <w:r>
+        <w:t xml:space="preserve">,</w:t>
+      </w:r>
+      <w:r>
+        <w:t xml:space="preserve"> </w:t>
+      </w:r>
+      <w:r>
+        <w:rPr>
+          <w:rStyle w:val="VerbatimChar"/>
+        </w:rPr>
+        <w:t xml:space="preserve">MAX_BACKLOG</w:t>
+      </w:r>
+      <w:r>
+        <w:t xml:space="preserve"> </w:t>
+      </w:r>
+      <w:r>
+        <w:t xml:space="preserve">8 MB /</w:t>
+      </w:r>
+      <w:r>
+        <w:t xml:space="preserve"> </w:t>
+      </w:r>
+      <w:r>
+        <w:rPr>
+          <w:rStyle w:val="VerbatimChar"/>
+        </w:rPr>
+        <w:t xml:space="preserve">MAX_STALL</w:t>
+      </w:r>
+      <w:r>
+        <w:t xml:space="preserve"> </w:t>
+      </w:r>
+      <w:r>
+        <w:t xml:space="preserve">10 s, batched</w:t>
+      </w:r>
+      <w:r>
+        <w:t xml:space="preserve"> </w:t>
+      </w:r>
+      <w:r>
+        <w:rPr>
+          <w:rStyle w:val="VerbatimChar"/>
+        </w:rPr>
+        <w:t xml:space="preserve">in</w:t>
+      </w:r>
+      <w:r>
+        <w:t xml:space="preserve"> </w:t>
+      </w:r>
+      <w:r>
+        <w:t xml:space="preserve">relay that checks every tick comes once and in order, watchers’</w:t>
+      </w:r>
+      <w:r>
+        <w:t xml:space="preserve"> </w:t>
+      </w:r>
+      <w:r>
+        <w:rPr>
+          <w:rStyle w:val="VerbatimChar"/>
+        </w:rPr>
+        <w:t xml:space="preserve">inw</w:t>
+      </w:r>
+      <w:r>
+        <w:t xml:space="preserve"> </w:t>
+      </w:r>
+      <w:r>
+        <w:t xml:space="preserve">bundles every 0.1 s,</w:t>
+      </w:r>
+      <w:r>
+        <w:t xml:space="preserve"> </w:t>
+      </w:r>
+      <w:r>
+        <w:rPr>
+          <w:rStyle w:val="VerbatimChar"/>
+        </w:rPr>
+        <w:t xml:space="preserve">rtt</w:t>
+      </w:r>
+      <w:r>
+        <w:t xml:space="preserve">, waits passed on with the state check),</w:t>
+      </w:r>
+      <w:r>
+        <w:t xml:space="preserve"> </w:t>
+      </w:r>
+      <w:r>
+        <w:rPr>
+          <w:rStyle w:val="VerbatimChar"/>
+        </w:rPr>
+        <w:t xml:space="preserve">server/app.py</w:t>
+      </w:r>
+      <w:r>
+        <w:t xml:space="preserve"> </w:t>
+      </w:r>
+      <w:r>
+        <w:t xml:space="preserve">(static files from memory, gzip),</w:t>
+      </w:r>
+      <w:r>
+        <w:t xml:space="preserve"> </w:t>
+      </w:r>
+      <w:r>
+        <w:rPr>
+          <w:rStyle w:val="VerbatimChar"/>
+        </w:rPr>
+        <w:t xml:space="preserve">gfx/renderer.js</w:t>
+      </w:r>
+      <w:r>
+        <w:t xml:space="preserve"> </w:t>
+      </w:r>
+      <w:r>
+        <w:t xml:space="preserve">(QUALITY</w:t>
+      </w:r>
+      <w:r>
+        <w:t xml:space="preserve"> </w:t>
+      </w:r>
+      <w:r>
+        <w:rPr>
+          <w:rStyle w:val="VerbatimChar"/>
+        </w:rPr>
+        <w:t xml:space="preserve">lod</w:t>
+      </w:r>
+      <w:r>
+        <w:t xml:space="preserve">,</w:t>
+      </w:r>
+      <w:r>
+        <w:t xml:space="preserve"> </w:t>
+      </w:r>
+      <w:r>
+        <w:rPr>
+          <w:rStyle w:val="VerbatimChar"/>
+        </w:rPr>
+        <w:t xml:space="preserve">lodScale</w:t>
+      </w:r>
+      <w:r>
+        <w:t xml:space="preserve">,</w:t>
+      </w:r>
+      <w:r>
+        <w:t xml:space="preserve"> </w:t>
+      </w:r>
+      <w:r>
+        <w:rPr>
+          <w:rStyle w:val="VerbatimChar"/>
+        </w:rPr>
+        <w:t xml:space="preserve">govern</w:t>
+      </w:r>
+      <w:r>
+        <w:t xml:space="preserve">/</w:t>
+      </w:r>
+      <w:r>
+        <w:rPr>
+          <w:rStyle w:val="VerbatimChar"/>
+        </w:rPr>
+        <w:t xml:space="preserve">resetGovern</w:t>
+      </w:r>
+      <w:r>
+        <w:t xml:space="preserve">,</w:t>
+      </w:r>
+      <w:r>
+        <w:t xml:space="preserve"> </w:t>
+      </w:r>
+      <w:r>
+        <w:rPr>
+          <w:rStyle w:val="VerbatimChar"/>
+        </w:rPr>
+        <w:t xml:space="preserve">dynScale</w:t>
+      </w:r>
+      <w:r>
+        <w:t xml:space="preserve">),</w:t>
+      </w:r>
+      <w:r>
+        <w:t xml:space="preserve"> </w:t>
+      </w:r>
+      <w:r>
+        <w:rPr>
+          <w:rStyle w:val="VerbatimChar"/>
+        </w:rPr>
+        <w:t xml:space="preserve">char/view.js</w:t>
+      </w:r>
+      <w:r>
+        <w:t xml:space="preserve"> </w:t>
+      </w:r>
+      <w:r>
+        <w:t xml:space="preserve">(the far model,</w:t>
+      </w:r>
+      <w:r>
+        <w:t xml:space="preserve"> </w:t>
+      </w:r>
+      <w:r>
+        <w:rPr>
+          <w:rStyle w:val="VerbatimChar"/>
+        </w:rPr>
+        <w:t xml:space="preserve">move</w:t>
+      </w:r>
+      <w:r>
+        <w:t xml:space="preserve">),</w:t>
+      </w:r>
+      <w:r>
+        <w:t xml:space="preserve"> </w:t>
+      </w:r>
+      <w:r>
+        <w:rPr>
+          <w:rStyle w:val="VerbatimChar"/>
+        </w:rPr>
+        <w:t xml:space="preserve">game/park.js</w:t>
+      </w:r>
+      <w:r>
+        <w:t xml:space="preserve"> </w:t>
+      </w:r>
+      <w:r>
+        <w:t xml:space="preserve">(</w:t>
+      </w:r>
+      <w:r>
+        <w:rPr>
+          <w:rStyle w:val="VerbatimChar"/>
+        </w:rPr>
+        <w:t xml:space="preserve">viewTick</w:t>
+      </w:r>
+      <w:r>
+        <w:t xml:space="preserve">,</w:t>
+      </w:r>
+      <w:r>
+        <w:t xml:space="preserve"> </w:t>
+      </w:r>
+      <w:r>
+        <w:rPr>
+          <w:rStyle w:val="VerbatimChar"/>
+        </w:rPr>
+        <w:t xml:space="preserve">animDt</w:t>
+      </w:r>
+      <w:r>
+        <w:t xml:space="preserve">),</w:t>
+      </w:r>
+      <w:r>
+        <w:t xml:space="preserve"> </w:t>
+      </w:r>
+      <w:r>
+        <w:rPr>
+          <w:rStyle w:val="VerbatimChar"/>
+        </w:rPr>
+        <w:t xml:space="preserve">game/vispool.js</w:t>
+      </w:r>
+      <w:r>
+        <w:t xml:space="preserve"> </w:t>
+      </w:r>
+      <w:r>
+        <w:t xml:space="preserve">(the far model is part of the pool key),</w:t>
+      </w:r>
+      <w:r>
+        <w:t xml:space="preserve"> </w:t>
+      </w:r>
+      <w:r>
+        <w:rPr>
+          <w:rStyle w:val="VerbatimChar"/>
+        </w:rPr>
+        <w:t xml:space="preserve">deploy/sysctl-afterhours16.conf</w:t>
+      </w:r>
+      <w:r>
+        <w:t xml:space="preserve">,</w:t>
+      </w:r>
+      <w:r>
+        <w:t xml:space="preserve"> </w:t>
+      </w:r>
+      <w:r>
+        <w:rPr>
+          <w:rStyle w:val="VerbatimChar"/>
+        </w:rPr>
+        <w:t xml:space="preserve">deploy/afterhours16.sh</w:t>
+      </w:r>
+      <w:r>
+        <w:t xml:space="preserve"> </w:t>
+      </w:r>
+      <w:r>
+        <w:t xml:space="preserve">(</w:t>
+      </w:r>
+      <w:r>
+        <w:rPr>
+          <w:rStyle w:val="VerbatimChar"/>
+        </w:rPr>
+        <w:t xml:space="preserve">tune</w:t>
+      </w:r>
+      <w:r>
+        <w:t xml:space="preserve">),</w:t>
+      </w:r>
+      <w:r>
+        <w:t xml:space="preserve"> </w:t>
+      </w:r>
+      <w:r>
+        <w:rPr>
+          <w:rStyle w:val="VerbatimChar"/>
+        </w:rPr>
+        <w:t xml:space="preserve">deploy/systemd/*</w:t>
+      </w:r>
+      <w:r>
+        <w:t xml:space="preserve"> </w:t>
+      </w:r>
+      <w:r>
+        <w:t xml:space="preserve">(Nice, IO priority, LimitNOFILE,</w:t>
+      </w:r>
+      <w:r>
+        <w:t xml:space="preserve"> </w:t>
+      </w:r>
+      <w:r>
+        <w:rPr>
+          <w:rStyle w:val="VerbatimChar"/>
+        </w:rPr>
+        <w:t xml:space="preserve">ExecStartPre=-+… tune</w:t>
+      </w:r>
+      <w:r>
+        <w:t xml:space="preserve">).</w:t>
+      </w:r>
+    </w:p>
+    <w:p>
+      <w:pPr>
+        <w:numPr>
+          <w:ilvl w:val="0"/>
+          <w:numId w:val="1113"/>
+        </w:numPr>
+        <w:pStyle w:val="Compact"/>
+      </w:pPr>
+      <w:r>
+        <w:rPr>
+          <w:bCs/>
+          <w:b/>
+        </w:rPr>
+        <w:t xml:space="preserve">Tests:</w:t>
+      </w:r>
+      <w:r>
+        <w:t xml:space="preserve"> </w:t>
+      </w:r>
+      <w:r>
+        <w:rPr>
+          <w:rStyle w:val="VerbatimChar"/>
+        </w:rPr>
+        <w:t xml:space="preserve">tests/v0475qp14.test.mjs</w:t>
+      </w:r>
+      <w:r>
+        <w:t xml:space="preserve"> </w:t>
+      </w:r>
+      <w:r>
+        <w:t xml:space="preserve">(7: the wire format; two screens in lockstep through it with a slow PC sending further ahead; the frame and network send-ahead; the socket client’s bundles and round trips),</w:t>
+      </w:r>
+      <w:r>
+        <w:t xml:space="preserve"> </w:t>
+      </w:r>
+      <w:r>
+        <w:rPr>
+          <w:rStyle w:val="VerbatimChar"/>
+        </w:rPr>
+        <w:t xml:space="preserve">tests/test_online.py</w:t>
+      </w:r>
+      <w:r>
+        <w:t xml:space="preserve"> </w:t>
+      </w:r>
+      <w:r>
+        <w:t xml:space="preserve">(+1: a connection that stops taking data holds nobody up and is cut off; round trips alone),</w:t>
+      </w:r>
+      <w:r>
+        <w:t xml:space="preserve"> </w:t>
+      </w:r>
+      <w:r>
+        <w:rPr>
+          <w:rStyle w:val="VerbatimChar"/>
+        </w:rPr>
+        <w:t xml:space="preserve">tests/load_hub.py</w:t>
+      </w:r>
+      <w:r>
+        <w:t xml:space="preserve"> </w:t>
+      </w:r>
+      <w:r>
+        <w:t xml:space="preserve">(the load test). Online play was run again end to end in three browsers (a squad game with a watcher: 13 of 13 state checks the same on all three screens; run it back real against real; Pro-Am with a squad and a challenge; AI squad mates; the online server through Caddy over</w:t>
+      </w:r>
+      <w:r>
+        <w:t xml:space="preserve"> </w:t>
+      </w:r>
+      <w:r>
+        <w:rPr>
+          <w:rStyle w:val="VerbatimChar"/>
+        </w:rPr>
+        <w:t xml:space="preserve">wss://</w:t>
+      </w:r>
+      <w:r>
+        <w:t xml:space="preserve">: 5 of 5).</w:t>
+      </w:r>
+    </w:p>
+    <w:bookmarkEnd w:id="85"/>
+    <w:bookmarkStart w:id="86" w:name="under-the-hood-quick-patch"/>
+    <w:p>
+      <w:pPr>
+        <w:pStyle w:val="Heading2"/>
+      </w:pPr>
+      <w:r>
+        <w:t xml:space="preserve">Under the hood (quick patch)</w:t>
+      </w:r>
+    </w:p>
+    <w:p>
+      <w:pPr>
+        <w:numPr>
+          <w:ilvl w:val="0"/>
+          <w:numId w:val="1114"/>
+        </w:numPr>
+        <w:pStyle w:val="Compact"/>
+      </w:pPr>
+      <w:r>
+        <w:rPr>
+          <w:bCs/>
+          <w:b/>
+        </w:rPr>
+        <w:t xml:space="preserve">Tests:</w:t>
+      </w:r>
+      <w:r>
+        <w:t xml:space="preserve"> </w:t>
+      </w:r>
+      <w:r>
+        <w:t xml:space="preserve">225 game tests and 68 service tests pass (online performance:</w:t>
+      </w:r>
+      <w:r>
+        <w:t xml:space="preserve"> </w:t>
+      </w:r>
+      <w:r>
+        <w:rPr>
+          <w:rStyle w:val="VerbatimChar"/>
+        </w:rPr>
+        <w:t xml:space="preserve">tests/v0475qp14.test.mjs</w:t>
+      </w:r>
+      <w:r>
+        <w:t xml:space="preserve">, 7, and one more service test; the rule book:</w:t>
+      </w:r>
+      <w:r>
+        <w:t xml:space="preserve"> </w:t>
+      </w:r>
+      <w:r>
+        <w:rPr>
+          <w:rStyle w:val="VerbatimChar"/>
+        </w:rPr>
+        <w:t xml:space="preserve">tests/v0475qp10.test.mjs</w:t>
+      </w:r>
+      <w:r>
+        <w:t xml:space="preserve">, 7; the Jungle Ballers:</w:t>
+      </w:r>
+      <w:r>
+        <w:t xml:space="preserve"> </w:t>
+      </w:r>
+      <w:r>
+        <w:rPr>
+          <w:rStyle w:val="VerbatimChar"/>
+        </w:rPr>
+        <w:t xml:space="preserve">tests/v0475qp11.test.mjs</w:t>
+      </w:r>
+      <w:r>
+        <w:t xml:space="preserve">, 7, and two service tests for the schedule and the Jungle’s ante-ups and prizes; post moves, the Event Park hall, volume, wide-open layups, online lockstep and the own-copy socket:</w:t>
+      </w:r>
+      <w:r>
+        <w:t xml:space="preserve"> </w:t>
+      </w:r>
+      <w:r>
+        <w:rPr>
+          <w:rStyle w:val="VerbatimChar"/>
+        </w:rPr>
+        <w:t xml:space="preserve">tests/v0475qp12.test.mjs</w:t>
+      </w:r>
+      <w:r>
+        <w:t xml:space="preserve">, 14; online friends, the join code, the park’s people, squads, claims, kings, watching, Pro-Am challenges, online crews, own-copy sign-in, links and the build fingerprint:</w:t>
+      </w:r>
+      <w:r>
+        <w:t xml:space="preserve"> </w:t>
+      </w:r>
+      <w:r>
+        <w:rPr>
+          <w:rStyle w:val="VerbatimChar"/>
+        </w:rPr>
+        <w:t xml:space="preserve">tests/test_online.py</w:t>
+      </w:r>
+      <w:r>
+        <w:t xml:space="preserve">, 9; the online park, squads, setups, watching and crew XP:</w:t>
+      </w:r>
+      <w:r>
+        <w:t xml:space="preserve"> </w:t>
+      </w:r>
+      <w:r>
+        <w:rPr>
+          <w:rStyle w:val="VerbatimChar"/>
+        </w:rPr>
+        <w:t xml:space="preserve">tests/v0475qp13.test.mjs</w:t>
+      </w:r>
+      <w:r>
+        <w:t xml:space="preserve">, 5; the router opening the port, against a fake router:</w:t>
+      </w:r>
+      <w:r>
+        <w:t xml:space="preserve"> </w:t>
+      </w:r>
+      <w:r>
+        <w:rPr>
+          <w:rStyle w:val="VerbatimChar"/>
+        </w:rPr>
+        <w:t xml:space="preserve">tests/test_upnp.py</w:t>
+      </w:r>
+      <w:r>
+        <w:t xml:space="preserve">, 7). Online play was also run end to end in three browsers on one hosted service: a squad of two calling Got Next on a 2v2 court while the third watched their game from the sideline (the watcher’s game matched the players’ at every check), the squad holding the court, the third calling next on it and the squad’s leader running it back against him (three people in one game); the squad playing Pro-Am together, then a Pro-Am challenge squad against squad; a crew brought online with two friends, a crew run against each other in the HQ with the third walking in late to watch, and a member’s crew XP landing in the founder’s save; a game on your own with someone walking in (the court shown in use with its score, then handed back), and the squad following its leader to another park. Then from</w:t>
+      </w:r>
+      <w:r>
+        <w:t xml:space="preserve"> </w:t>
+      </w:r>
+      <w:r>
+        <w:rPr>
+          <w:bCs/>
+          <w:b/>
+        </w:rPr>
+        <w:t xml:space="preserve">two separate games and saves</w:t>
+      </w:r>
+      <w:r>
+        <w:t xml:space="preserve">: the friend’s own game linked to the host’s, made his online account, played a 2v2 against the host with his own build, and the result went into his own save (the host’s save has no players or games for him); his game reconnected by itself after a restart, and a copy with one changed file was turned away with both versions shown. The two screens’ state checks matched every time. The new ones cover non-shooter windows, smothered shots, the record scratch, repeat moves, diagonal moves, the straps being drawn, the apparel counts, dunk variety, the windmill and Eastbay paths, celebrations (input and clipping), reach-in contact, the AI staying in bounds, the D-pad fallback, Icon Legend, the green release counts and what each sound is made of, the AI’s reaction times, stamina and the line beside the grade.</w:t>
+      </w:r>
+    </w:p>
+    <w:p>
+      <w:pPr>
+        <w:numPr>
+          <w:ilvl w:val="0"/>
+          <w:numId w:val="1114"/>
+        </w:numPr>
+        <w:pStyle w:val="Compact"/>
+      </w:pPr>
+      <w:r>
+        <w:rPr>
+          <w:bCs/>
+          <w:b/>
+        </w:rPr>
+        <w:t xml:space="preserve">Judgment calls I made without asking:</w:t>
+      </w:r>
+    </w:p>
+    <w:p>
+      <w:pPr>
+        <w:numPr>
+          <w:ilvl w:val="1"/>
+          <w:numId w:val="1115"/>
+        </w:numPr>
+        <w:pStyle w:val="Compact"/>
+      </w:pPr>
+      <w:r>
+        <w:t xml:space="preserve">“</w:t>
+      </w:r>
+      <w:r>
+        <w:t xml:space="preserve">Shooters</w:t>
+      </w:r>
+      <w:r>
+        <w:t xml:space="preserve">”</w:t>
+      </w:r>
+      <w:r>
+        <w:t xml:space="preserve"> </w:t>
+      </w:r>
+      <w:r>
+        <w:t xml:space="preserve">are Sharpshooters and Stretch Bigs. The 10% smaller window for non-shooters applies to jump shots only, not layups or free throws.</w:t>
+      </w:r>
+    </w:p>
+    <w:p>
+      <w:pPr>
+        <w:numPr>
+          <w:ilvl w:val="1"/>
+          <w:numId w:val="1115"/>
+        </w:numPr>
+        <w:pStyle w:val="Compact"/>
+      </w:pPr>
+      <w:r>
+        <w:t xml:space="preserve">“</w:t>
+      </w:r>
+      <w:r>
+        <w:t xml:space="preserve">Career mode games</w:t>
+      </w:r>
+      <w:r>
+        <w:t xml:space="preserve">”</w:t>
+      </w:r>
+      <w:r>
+        <w:t xml:space="preserve"> </w:t>
+      </w:r>
+      <w:r>
+        <w:t xml:space="preserve">for Icon Legend are Pro Run games, the same as the 80 → 90 climb.</w:t>
+      </w:r>
+    </w:p>
+    <w:p>
+      <w:pPr>
+        <w:numPr>
+          <w:ilvl w:val="1"/>
+          <w:numId w:val="1115"/>
+        </w:numPr>
+        <w:pStyle w:val="Compact"/>
+      </w:pPr>
+      <w:r>
+        <w:t xml:space="preserve">The smothered rule applies to every shot that can be labelled Smothered: jumpers, close shots and layups. Dunks are left to Posterizer and Contact Finisher.</w:t>
+      </w:r>
+    </w:p>
+    <w:p>
+      <w:pPr>
+        <w:numPr>
+          <w:ilvl w:val="1"/>
+          <w:numId w:val="1115"/>
+        </w:numPr>
+        <w:pStyle w:val="Compact"/>
+      </w:pPr>
+      <w:r>
+        <w:t xml:space="preserve">The record scratch also plays for the AI’s green sounds near you.</w:t>
+      </w:r>
+    </w:p>
+    <w:p>
+      <w:pPr>
+        <w:numPr>
+          <w:ilvl w:val="1"/>
+          <w:numId w:val="1115"/>
+        </w:numPr>
+        <w:pStyle w:val="Compact"/>
+      </w:pPr>
+      <w:r>
+        <w:t xml:space="preserve">“</w:t>
+      </w:r>
+      <w:r>
+        <w:t xml:space="preserve">Double apparel</w:t>
+      </w:r>
+      <w:r>
+        <w:t xml:space="preserve">”</w:t>
+      </w:r>
+      <w:r>
+        <w:t xml:space="preserve"> </w:t>
+      </w:r>
+      <w:r>
+        <w:t xml:space="preserve">covers clothing, shoes and accessories (everything you wear); King Tut Cup prizes weren’t doubled.</w:t>
+      </w:r>
+    </w:p>
+    <w:p>
+      <w:pPr>
+        <w:numPr>
+          <w:ilvl w:val="1"/>
+          <w:numId w:val="1115"/>
+        </w:numPr>
+        <w:pStyle w:val="Compact"/>
+      </w:pPr>
+      <w:r>
+        <w:t xml:space="preserve">“</w:t>
+      </w:r>
+      <w:r>
+        <w:t xml:space="preserve">Double the green animations and sounds</w:t>
+      </w:r>
+      <w:r>
+        <w:t xml:space="preserve">”</w:t>
+      </w:r>
+      <w:r>
+        <w:t xml:space="preserve"> </w:t>
+      </w:r>
+      <w:r>
+        <w:t xml:space="preserve">means twice as many of each, counting the King Tut Cup’s (16 → 32 sounds, 14 → 28 effects). The Cup prizes themselves weren’t doubled.</w:t>
+      </w:r>
+    </w:p>
+    <w:p>
+      <w:pPr>
+        <w:numPr>
+          <w:ilvl w:val="1"/>
+          <w:numId w:val="1115"/>
+        </w:numPr>
+        <w:pStyle w:val="Compact"/>
+      </w:pPr>
+      <w:r>
+        <w:t xml:space="preserve">“</w:t>
+      </w:r>
+      <w:r>
+        <w:t xml:space="preserve">Walking without sprint</w:t>
+      </w:r>
+      <w:r>
+        <w:t xml:space="preserve">”</w:t>
+      </w:r>
+      <w:r>
+        <w:t xml:space="preserve"> </w:t>
+      </w:r>
+      <w:r>
+        <w:t xml:space="preserve">means any movement without the sprint button. Defensive slides still cost a little; since stamina part 3, hands-up defense on the floor is neutral.</w:t>
+      </w:r>
+    </w:p>
+    <w:p>
+      <w:pPr>
+        <w:numPr>
+          <w:ilvl w:val="1"/>
+          <w:numId w:val="1115"/>
+        </w:numPr>
+        <w:pStyle w:val="Compact"/>
+      </w:pPr>
+      <w:r>
+        <w:t xml:space="preserve">Stamina part 3:</w:t>
+      </w:r>
+      <w:r>
+        <w:t xml:space="preserve"> </w:t>
+      </w:r>
+      <w:r>
+        <w:t xml:space="preserve">“</w:t>
+      </w:r>
+      <w:r>
+        <w:t xml:space="preserve">very minimally positive</w:t>
+      </w:r>
+      <w:r>
+        <w:t xml:space="preserve">”</w:t>
+      </w:r>
+      <w:r>
+        <w:t xml:space="preserve"> </w:t>
+      </w:r>
+      <w:r>
+        <w:t xml:space="preserve">for walking and jogging is a tenth of the old resting rate (so about a thirtieth of the new one). Hands up while</w:t>
+      </w:r>
+      <w:r>
+        <w:t xml:space="preserve"> </w:t>
+      </w:r>
+      <w:r>
+        <w:rPr>
+          <w:iCs/>
+          <w:i/>
+        </w:rPr>
+        <w:t xml:space="preserve">sliding</w:t>
+      </w:r>
+      <w:r>
+        <w:t xml:space="preserve"> </w:t>
+      </w:r>
+      <w:r>
+        <w:t xml:space="preserve">still costs the slide; only hands up with the feet planted is neutral.</w:t>
+      </w:r>
+    </w:p>
+    <w:p>
+      <w:pPr>
+        <w:numPr>
+          <w:ilvl w:val="1"/>
+          <w:numId w:val="1115"/>
+        </w:numPr>
+        <w:pStyle w:val="Compact"/>
+      </w:pPr>
+      <w:r>
+        <w:t xml:space="preserve">The alley-oop press: the four face buttons are read raw (whatever your context) only while a lob to you is in the air, and that press is used for nothing else, so the shoot button can’t also jump you. The window opens a quarter of the way to the takeoff and closes 0.05 s after it. A mistimed one is 0.22 s late at 40% of the height.</w:t>
+      </w:r>
+    </w:p>
+    <w:p>
+      <w:pPr>
+        <w:numPr>
+          <w:ilvl w:val="1"/>
+          <w:numId w:val="1115"/>
+        </w:numPr>
+        <w:pStyle w:val="Compact"/>
+      </w:pPr>
+      <w:r>
+        <w:t xml:space="preserve">The bad step is drawn at</w:t>
+      </w:r>
+      <w:r>
+        <w:t xml:space="preserve"> </w:t>
+      </w:r>
+      <w:r>
+        <w:rPr>
+          <w:rStyle w:val="VerbatimChar"/>
+        </w:rPr>
+        <w:t xml:space="preserve">MISTAKE.rate</w:t>
+      </w:r>
+      <w:r>
+        <w:t xml:space="preserve"> </w:t>
+      </w:r>
+      <w:r>
+        <w:t xml:space="preserve">× (1.3 − skill) per second while the man moves faster than 2 m/s;</w:t>
+      </w:r>
+      <w:r>
+        <w:t xml:space="preserve"> </w:t>
+      </w:r>
+      <w:r>
+        <w:t xml:space="preserve">“</w:t>
+      </w:r>
+      <w:r>
+        <w:t xml:space="preserve">2.75% more escapes</w:t>
+      </w:r>
+      <w:r>
+        <w:t xml:space="preserve">”</w:t>
+      </w:r>
+      <w:r>
+        <w:t xml:space="preserve"> </w:t>
+      </w:r>
+      <w:r>
+        <w:t xml:space="preserve">is relative (7.35% → ~7.55% of guarded dribbling spells end with the handler two metres clear within 1.2 s, in AI park games).</w:t>
+      </w:r>
+    </w:p>
+    <w:p>
+      <w:pPr>
+        <w:numPr>
+          <w:ilvl w:val="1"/>
+          <w:numId w:val="1115"/>
+        </w:numPr>
+        <w:pStyle w:val="Compact"/>
+      </w:pPr>
+      <w:r>
+        <w:t xml:space="preserve">“</w:t>
+      </w:r>
+      <w:r>
+        <w:t xml:space="preserve">True to scale</w:t>
+      </w:r>
+      <w:r>
+        <w:t xml:space="preserve">”</w:t>
+      </w:r>
+      <w:r>
+        <w:t xml:space="preserve"> </w:t>
+      </w:r>
+      <w:r>
+        <w:t xml:space="preserve">was taken to mean the model’s standing height and wingspan; the standing</w:t>
+      </w:r>
+      <w:r>
+        <w:t xml:space="preserve"> </w:t>
+      </w:r>
+      <w:r>
+        <w:rPr>
+          <w:iCs/>
+          <w:i/>
+        </w:rPr>
         <w:t xml:space="preserve">reach</w:t>
       </w:r>
       <w:r>
@@ -12407,7 +13384,7 @@
       <w:pPr>
         <w:numPr>
           <w:ilvl w:val="1"/>
-          <w:numId w:val="1114"/>
+          <w:numId w:val="1115"/>
         </w:numPr>
         <w:pStyle w:val="Compact"/>
       </w:pPr>
@@ -12437,7 +13414,7 @@
       <w:pPr>
         <w:numPr>
           <w:ilvl w:val="1"/>
-          <w:numId w:val="1114"/>
+          <w:numId w:val="1115"/>
         </w:numPr>
         <w:pStyle w:val="Compact"/>
       </w:pPr>
@@ -12449,7 +13426,7 @@
       <w:pPr>
         <w:numPr>
           <w:ilvl w:val="1"/>
-          <w:numId w:val="1114"/>
+          <w:numId w:val="1115"/>
         </w:numPr>
         <w:pStyle w:val="Compact"/>
       </w:pPr>
@@ -12479,7 +13456,7 @@
       <w:pPr>
         <w:numPr>
           <w:ilvl w:val="1"/>
-          <w:numId w:val="1114"/>
+          <w:numId w:val="1115"/>
         </w:numPr>
         <w:pStyle w:val="Compact"/>
       </w:pPr>
@@ -12506,7 +13483,7 @@
       <w:pPr>
         <w:numPr>
           <w:ilvl w:val="1"/>
-          <w:numId w:val="1114"/>
+          <w:numId w:val="1115"/>
         </w:numPr>
         <w:pStyle w:val="Compact"/>
       </w:pPr>
@@ -12518,7 +13495,7 @@
       <w:pPr>
         <w:numPr>
           <w:ilvl w:val="1"/>
-          <w:numId w:val="1114"/>
+          <w:numId w:val="1115"/>
         </w:numPr>
         <w:pStyle w:val="Compact"/>
       </w:pPr>
@@ -12530,7 +13507,7 @@
       <w:pPr>
         <w:numPr>
           <w:ilvl w:val="1"/>
-          <w:numId w:val="1114"/>
+          <w:numId w:val="1115"/>
         </w:numPr>
         <w:pStyle w:val="Compact"/>
       </w:pPr>
@@ -12569,7 +13546,7 @@
       <w:pPr>
         <w:numPr>
           <w:ilvl w:val="1"/>
-          <w:numId w:val="1114"/>
+          <w:numId w:val="1115"/>
         </w:numPr>
         <w:pStyle w:val="Compact"/>
       </w:pPr>
@@ -12581,7 +13558,7 @@
       <w:pPr>
         <w:numPr>
           <w:ilvl w:val="1"/>
-          <w:numId w:val="1114"/>
+          <w:numId w:val="1115"/>
         </w:numPr>
         <w:pStyle w:val="Compact"/>
       </w:pPr>
@@ -12593,7 +13570,7 @@
       <w:pPr>
         <w:numPr>
           <w:ilvl w:val="1"/>
-          <w:numId w:val="1114"/>
+          <w:numId w:val="1115"/>
         </w:numPr>
         <w:pStyle w:val="Compact"/>
       </w:pPr>
@@ -12623,7 +13600,7 @@
       <w:pPr>
         <w:numPr>
           <w:ilvl w:val="1"/>
-          <w:numId w:val="1114"/>
+          <w:numId w:val="1115"/>
         </w:numPr>
         <w:pStyle w:val="Compact"/>
       </w:pPr>
@@ -12631,8 +13608,8 @@
         <w:t xml:space="preserve">Online, Pro-Am and crews (part 3): a Pro-Am challenge goes to the challenged friend’s squad leader; the challenger’s game sets it up; the AI on both sides comes from the challenger’s world. An online crew is the founder’s own crew (from his save); members’ crew XP is worked out like a crew of their own (30% of the game’s Rep × the mode weight, ×2 with crew mates on their side) and waits on the hosted game until the founder’s game collects it. Taking the crew offline puts everyone out of it. In the HQ, the crew run picks sides from who’s there: together (up to five people on one side) or against each other (alternating).</w:t>
       </w:r>
     </w:p>
-    <w:bookmarkEnd w:id="85"/>
     <w:bookmarkEnd w:id="86"/>
+    <w:bookmarkEnd w:id="87"/>
     <w:sectPr/>
   </w:body>
 </w:document>
@@ -13158,6 +14135,9 @@
     <w:abstractNumId w:val="991"/>
   </w:num>
   <w:num w:numId="1114">
+    <w:abstractNumId w:val="991"/>
+  </w:num>
+  <w:num w:numId="1115">
     <w:abstractNumId w:val="991"/>
   </w:num>
 </w:numbering>

</xml_diff>